<commit_message>
vault backup: 2025-09-26 23:31:45
</commit_message>
<xml_diff>
--- a/学校/文件/刘非凡-文献综述v2.docx
+++ b/学校/文件/刘非凡-文献综述v2.docx
@@ -1129,6 +1129,7 @@
         </w:rPr>
         <w:t xml:space="preserve"> </w:t>
       </w:r>
+      <w:proofErr w:type="gramStart"/>
       <w:r>
         <w:rPr>
           <w:rFonts w:ascii="宋体" w:hAnsi="宋体" w:hint="eastAsia"/>
@@ -1141,6 +1142,7 @@
         </w:rPr>
         <w:t>车生兵</w:t>
       </w:r>
+      <w:proofErr w:type="gramEnd"/>
       <w:r>
         <w:rPr>
           <w:rFonts w:ascii="宋体" w:hAnsi="宋体" w:hint="eastAsia"/>
@@ -1430,6 +1432,7 @@
         </w:rPr>
         <w:t xml:space="preserve">填写日期：   </w:t>
       </w:r>
+      <w:proofErr w:type="gramStart"/>
       <w:r>
         <w:rPr>
           <w:rFonts w:ascii="宋体" w:hAnsi="宋体"/>
@@ -1461,7 +1464,19 @@
           <w:sz w:val="32"/>
           <w:szCs w:val="32"/>
         </w:rPr>
-        <w:t xml:space="preserve">  年 </w:t>
+        <w:t xml:space="preserve">  年</w:t>
+      </w:r>
+      <w:proofErr w:type="gramEnd"/>
+      <w:r>
+        <w:rPr>
+          <w:rFonts w:ascii="宋体" w:hAnsi="宋体" w:hint="eastAsia"/>
+          <w:b/>
+          <w:color w:val="000000" w:themeColor="text1"/>
+          <w:kern w:val="0"/>
+          <w:sz w:val="32"/>
+          <w:szCs w:val="32"/>
+        </w:rPr>
+        <w:t xml:space="preserve"> </w:t>
       </w:r>
       <w:r>
         <w:rPr>
@@ -1496,6 +1511,7 @@
         </w:rPr>
         <w:t xml:space="preserve"> </w:t>
       </w:r>
+      <w:proofErr w:type="gramStart"/>
       <w:r>
         <w:rPr>
           <w:rFonts w:ascii="宋体" w:hAnsi="宋体" w:hint="eastAsia"/>
@@ -1529,6 +1545,7 @@
         </w:rPr>
         <w:t>20</w:t>
       </w:r>
+      <w:proofErr w:type="gramEnd"/>
       <w:r>
         <w:rPr>
           <w:rFonts w:ascii="宋体" w:hAnsi="宋体" w:hint="eastAsia"/>
@@ -1612,7 +1629,61 @@
           <w:color w:val="000000" w:themeColor="text1"/>
           <w:sz w:val="24"/>
         </w:rPr>
-        <w:t>道路病害检测对于保障交通安全与实现基础设施的智能化维护至关重要。本文首先论述了传统人工巡检方式的局限性，进而系统综述了自动化检测技术的发展脉络。内容涵盖了从基于边缘检测、阈值分割等传统图像处理方法，到以卷积神经网络（CNN）为核心的深度学习方法的范式革命。在深度学习技术路线中，本文重点对比分析了以Faster R-CNN为代表的两阶段检测算法和以YOLO系列为代表的单阶段检测算法，并阐明了后者在实时检测任务中的主流地位。针对当前最先进模型（如YOLOv12）在部署于车载等边缘计算设备时面临的计算资源瓶颈，本文进一步探讨了两大关键优化技术：一是以GhostNet为代表的模型轻量化设计，旨在降低模型参数量与计算复杂度；二是以无参数注意力机制SimAM为代表的特征增强策略，用于弥补轻量化可能带来的精度损失并提升对小目标的识别能力。最后，本综述指出现有研究在模型轻量化与特定任务精度优化之间的平衡仍有提升空间，从而引出本课题的研究动机：通过对YOLOv12模型进行轻量化改造并融合高效注意力机制，研发一种在精度、速度和模型大小上达到更优平衡的道路病害实时检测新方法，以满足真实场景的部署需求。</w:t>
+        <w:t>道路病害检测对于保障交通安全与实现基础设施的智能化维护至关重要。本文首先论述了传统人工巡检方式的局限性，进而系统综述了自动化检测技术的发展脉络。内容涵盖了从基于边缘检测、阈值分割等传统图像处理方法，到以卷积神经网络（CNN）为核心的深度学习方法的范式革命。在深度学习技术路线中，本文重点对比分析了以Faster R-CNN为代表的两阶段检测算法和以YOLO系列为代表的</w:t>
+      </w:r>
+      <w:proofErr w:type="gramStart"/>
+      <w:r>
+        <w:rPr>
+          <w:rFonts w:ascii="宋体" w:hAnsi="宋体"/>
+          <w:color w:val="000000" w:themeColor="text1"/>
+          <w:sz w:val="24"/>
+        </w:rPr>
+        <w:t>单阶段</w:t>
+      </w:r>
+      <w:proofErr w:type="gramEnd"/>
+      <w:r>
+        <w:rPr>
+          <w:rFonts w:ascii="宋体" w:hAnsi="宋体"/>
+          <w:color w:val="000000" w:themeColor="text1"/>
+          <w:sz w:val="24"/>
+        </w:rPr>
+        <w:t>检测算法，并阐明了后者在实时检测任务中的主流地位。针对当前最先进模型（如YOLOv12）在部署于</w:t>
+      </w:r>
+      <w:proofErr w:type="gramStart"/>
+      <w:r>
+        <w:rPr>
+          <w:rFonts w:ascii="宋体" w:hAnsi="宋体"/>
+          <w:color w:val="000000" w:themeColor="text1"/>
+          <w:sz w:val="24"/>
+        </w:rPr>
+        <w:t>车载等</w:t>
+      </w:r>
+      <w:proofErr w:type="gramEnd"/>
+      <w:r>
+        <w:rPr>
+          <w:rFonts w:ascii="宋体" w:hAnsi="宋体"/>
+          <w:color w:val="000000" w:themeColor="text1"/>
+          <w:sz w:val="24"/>
+        </w:rPr>
+        <w:t>边缘计算设备时面临的计算资源瓶颈，本文进一步探讨了两大关键优化技术：一是以</w:t>
+      </w:r>
+      <w:proofErr w:type="spellStart"/>
+      <w:r>
+        <w:rPr>
+          <w:rFonts w:ascii="宋体" w:hAnsi="宋体"/>
+          <w:color w:val="000000" w:themeColor="text1"/>
+          <w:sz w:val="24"/>
+        </w:rPr>
+        <w:t>GhostNet</w:t>
+      </w:r>
+      <w:proofErr w:type="spellEnd"/>
+      <w:r>
+        <w:rPr>
+          <w:rFonts w:ascii="宋体" w:hAnsi="宋体"/>
+          <w:color w:val="000000" w:themeColor="text1"/>
+          <w:sz w:val="24"/>
+        </w:rPr>
+        <w:t>为代表的模型轻量化设计，旨在降低模型参数量与计算复杂度；二是以无参数注意力机制SimAM为代表的特征增强策略，用于弥补轻量化可能带来的精度损失并提升对小目标的识别能力。最后，本综述指出现有研究在模型轻量化与特定任务精度优化之间的平衡仍有提升空间，从而引出本课题的研究动机：通过对YOLOv12模型进行轻量化改造并融合高效注意力机制，研发一种在精度、速度和模型大小上达到更优平衡的道路病害实时检测新方法，以满足真实场景的部署需求。</w:t>
       </w:r>
       <w:r>
         <w:rPr>
@@ -1776,7 +1847,25 @@
           <w:color w:val="000000" w:themeColor="text1"/>
           <w:sz w:val="24"/>
         </w:rPr>
-        <w:t xml:space="preserve">Pavement distress detection is crucial for ensuring traffic safety and enabling intelligent infrastructure maintenance. This paper begins by discussing the limitations of traditional manual inspection methods and then provides a systematic review of the evolution of automated detection technologies. The review covers the paradigm shift from conventional image processing techniques, such as edge detection and thresholding, to deep learning methods centered on Convolutional Neural Networks (CNNs). Within the deep learning approaches, this paper focuses on comparing two-stage detectors, represented by Faster R-CNN, and one-stage detectors, represented by the YOLO series, clarifying the latter's dominance in real-time detection tasks. Addressing the computational bottlenecks faced when deploying state-of-the-art models like YOLOv12 on resource-constrained edge devices (e.g., in-vehicle systems), this paper further explores two key optimization technologies. The first is model lightweighting, exemplified by architectures like GhostNet, which aims to reduce model parameters and computational complexity. The second is feature enhancement strategies, such as the parameter-free attention mechanism SimAM, used to compensate for potential accuracy degradation from lightweighting and improve the detection of small targets. Finally, this review identifies a research gap in balancing model efficiency with task-specific accuracy. This motivates the current research project: </w:t>
+        <w:t xml:space="preserve">Pavement distress detection is crucial for ensuring traffic safety and enabling intelligent infrastructure maintenance. This paper begins by discussing the limitations of traditional manual inspection methods and then provides a systematic review of the evolution of automated detection technologies. The review covers the paradigm shift from conventional image processing techniques, such as edge detection and thresholding, to deep learning methods centered on Convolutional Neural Networks (CNNs). Within the deep learning approaches, this paper focuses on comparing two-stage detectors, represented by Faster R-CNN, and one-stage detectors, represented by the YOLO series, clarifying the latter's dominance in real-time detection tasks. Addressing the computational bottlenecks faced when deploying state-of-the-art models like YOLOv12 on resource-constrained edge devices (e.g., in-vehicle systems), this paper further explores two key optimization technologies. The first is model lightweighting, exemplified by architectures like </w:t>
+      </w:r>
+      <w:proofErr w:type="spellStart"/>
+      <w:r>
+        <w:rPr>
+          <w:rFonts w:eastAsia="黑体"/>
+          <w:color w:val="000000" w:themeColor="text1"/>
+          <w:sz w:val="24"/>
+        </w:rPr>
+        <w:t>GhostNet</w:t>
+      </w:r>
+      <w:proofErr w:type="spellEnd"/>
+      <w:r>
+        <w:rPr>
+          <w:rFonts w:eastAsia="黑体"/>
+          <w:color w:val="000000" w:themeColor="text1"/>
+          <w:sz w:val="24"/>
+        </w:rPr>
+        <w:t xml:space="preserve">, which aims to reduce model parameters and computational complexity. The second is feature enhancement strategies, such as the parameter-free attention mechanism SimAM, used to compensate for potential accuracy degradation from lightweighting and improve the detection of small targets. Finally, this review identifies a research gap in balancing model efficiency with task-specific accuracy. This motivates the current research project: </w:t>
       </w:r>
       <w:r>
         <w:rPr>
@@ -1949,7 +2038,23 @@
           <w:rFonts w:hint="eastAsia"/>
           <w:lang/>
         </w:rPr>
-        <w:t>着全球城市化进程的不断加速和机动车保有量的持续攀升，现代社会对交通运输系统的依赖达到了前所未有的高度。在这一背景下，道路作为最基础的交通基础设施，其健康状况直接关系到交通安全、通行效率乃至区域经济发展。然而，道路结构在其生命周期中，长期承受车辆荷载与自然环境的综合作用，不可避免地会产生裂缝、坑洞等多种形式的病害</w:t>
+        <w:t>着全球城市化进程的不断加速和机动车保有量的持续攀升，现代社会对交通运输系统的依赖达到了前所未有的高度。在这一背景下，道路作为</w:t>
+      </w:r>
+      <w:proofErr w:type="gramStart"/>
+      <w:r>
+        <w:rPr>
+          <w:rFonts w:hint="eastAsia"/>
+          <w:lang/>
+        </w:rPr>
+        <w:t>最</w:t>
+      </w:r>
+      <w:proofErr w:type="gramEnd"/>
+      <w:r>
+        <w:rPr>
+          <w:rFonts w:hint="eastAsia"/>
+          <w:lang/>
+        </w:rPr>
+        <w:t>基础的交通基础设施，其健康状况直接关系到交通安全、通行效率乃至区域经济发展。然而，道路结构在其生命周期中，长期承受车辆荷载与自然环境的综合作用，不可避免地会产生裂缝、坑洞等多种形式的病害</w:t>
       </w:r>
       <w:r>
         <w:rPr>
@@ -1963,7 +2068,23 @@
           <w:rFonts w:hint="eastAsia"/>
           <w:lang/>
         </w:rPr>
-        <w:t>。这些病害若未能得到及时发现与修复，不仅严重影响行车体验，更对行车安全构成直接威胁。研究表明，恶劣的路面状况甚至会导致燃油消耗和碳排放的增加，对环境造成负面影响</w:t>
+        <w:t>。这些病害若未能得到及时发现与修复，不仅严重影响行车体验，更对行车安全构成直接威胁。研究表明，恶劣的路面状况甚至会导致燃油消耗和</w:t>
+      </w:r>
+      <w:proofErr w:type="gramStart"/>
+      <w:r>
+        <w:rPr>
+          <w:rFonts w:hint="eastAsia"/>
+          <w:lang/>
+        </w:rPr>
+        <w:t>碳排放</w:t>
+      </w:r>
+      <w:proofErr w:type="gramEnd"/>
+      <w:r>
+        <w:rPr>
+          <w:rFonts w:hint="eastAsia"/>
+          <w:lang/>
+        </w:rPr>
+        <w:t>的增加，对环境造成负面影响</w:t>
       </w:r>
       <w:r>
         <w:rPr>
@@ -2859,20 +2980,30 @@
         </w:rPr>
         <w:t>年</w:t>
       </w:r>
+      <w:proofErr w:type="spellStart"/>
       <w:r>
         <w:rPr>
           <w:kern w:val="44"/>
           <w:sz w:val="24"/>
           <w:lang w:bidi="ar"/>
         </w:rPr>
-        <w:t xml:space="preserve">AlexNet </w:t>
-      </w:r>
+        <w:t>AlexNet</w:t>
+      </w:r>
+      <w:proofErr w:type="spellEnd"/>
       <w:r>
         <w:rPr>
           <w:kern w:val="44"/>
           <w:sz w:val="24"/>
           <w:lang w:bidi="ar"/>
         </w:rPr>
+        <w:t xml:space="preserve"> </w:t>
+      </w:r>
+      <w:r>
+        <w:rPr>
+          <w:kern w:val="44"/>
+          <w:sz w:val="24"/>
+          <w:lang w:bidi="ar"/>
+        </w:rPr>
         <w:t>在</w:t>
       </w:r>
       <w:r>
@@ -2969,7 +3100,25 @@
           <w:sz w:val="24"/>
           <w:lang w:bidi="ar"/>
         </w:rPr>
-        <w:t>。目前，该领域的方法主要可以分为两阶段检测算法和单阶段检测算法两大技术路线</w:t>
+        <w:t>。目前，该领域的方法主要可以分为两阶段检测算法和</w:t>
+      </w:r>
+      <w:proofErr w:type="gramStart"/>
+      <w:r>
+        <w:rPr>
+          <w:kern w:val="44"/>
+          <w:sz w:val="24"/>
+          <w:lang w:bidi="ar"/>
+        </w:rPr>
+        <w:t>单阶段</w:t>
+      </w:r>
+      <w:proofErr w:type="gramEnd"/>
+      <w:r>
+        <w:rPr>
+          <w:kern w:val="44"/>
+          <w:sz w:val="24"/>
+          <w:lang w:bidi="ar"/>
+        </w:rPr>
+        <w:t>检测算法两大技术路线</w:t>
       </w:r>
       <w:r>
         <w:rPr>
@@ -3298,7 +3447,27 @@
           <w:sz w:val="24"/>
           <w:lang/>
         </w:rPr>
-        <w:t>）对这些特征进行分类，并用一个边界框回归器对位置进行微调</w:t>
+        <w:t>）对这些特征进行分类，并用一个边界</w:t>
+      </w:r>
+      <w:proofErr w:type="gramStart"/>
+      <w:r>
+        <w:rPr>
+          <w:rFonts w:ascii="宋体" w:hAnsi="宋体" w:cs="宋体" w:hint="eastAsia"/>
+          <w:kern w:val="0"/>
+          <w:sz w:val="24"/>
+          <w:lang/>
+        </w:rPr>
+        <w:t>框回归器</w:t>
+      </w:r>
+      <w:proofErr w:type="gramEnd"/>
+      <w:r>
+        <w:rPr>
+          <w:rFonts w:ascii="宋体" w:hAnsi="宋体" w:cs="宋体" w:hint="eastAsia"/>
+          <w:kern w:val="0"/>
+          <w:sz w:val="24"/>
+          <w:lang/>
+        </w:rPr>
+        <w:t>对位置进行微调</w:t>
       </w:r>
       <w:r>
         <w:rPr>
@@ -3561,8 +3730,39 @@
           <w:sz w:val="24"/>
           <w:lang/>
         </w:rPr>
-        <w:t>的层从特征图中为每个候选区域提取一个固定大小的特征向量。这些特征向量随后被送入全连接层进行分类和边界框回归</w:t>
-      </w:r>
+        <w:t>的层从特征图中为每个候选区域提取一个固定大小的特征向量。这些特征向量随后被</w:t>
+      </w:r>
+      <w:proofErr w:type="gramStart"/>
+      <w:r>
+        <w:rPr>
+          <w:rFonts w:ascii="宋体" w:hAnsi="宋体" w:cs="宋体" w:hint="eastAsia"/>
+          <w:kern w:val="0"/>
+          <w:sz w:val="24"/>
+          <w:lang/>
+        </w:rPr>
+        <w:t>送入全</w:t>
+      </w:r>
+      <w:proofErr w:type="gramEnd"/>
+      <w:r>
+        <w:rPr>
+          <w:rFonts w:ascii="宋体" w:hAnsi="宋体" w:cs="宋体" w:hint="eastAsia"/>
+          <w:kern w:val="0"/>
+          <w:sz w:val="24"/>
+          <w:lang/>
+        </w:rPr>
+        <w:t>连接层进行分类和边界</w:t>
+      </w:r>
+      <w:proofErr w:type="gramStart"/>
+      <w:r>
+        <w:rPr>
+          <w:rFonts w:ascii="宋体" w:hAnsi="宋体" w:cs="宋体" w:hint="eastAsia"/>
+          <w:kern w:val="0"/>
+          <w:sz w:val="24"/>
+          <w:lang/>
+        </w:rPr>
+        <w:t>框回归</w:t>
+      </w:r>
+      <w:proofErr w:type="gramEnd"/>
       <w:r>
         <w:rPr>
           <w:rFonts w:eastAsia="Times New Roman"/>
@@ -3761,7 +3961,27 @@
           <w:sz w:val="24"/>
           <w:lang/>
         </w:rPr>
-        <w:t>首次实现了近乎实时的端到端目标检测，成为后续许多两阶段检测算法的基石</w:t>
+        <w:t>首次实现了近乎实时的端到</w:t>
+      </w:r>
+      <w:proofErr w:type="gramStart"/>
+      <w:r>
+        <w:rPr>
+          <w:rFonts w:ascii="宋体" w:hAnsi="宋体" w:cs="宋体" w:hint="eastAsia"/>
+          <w:kern w:val="0"/>
+          <w:sz w:val="24"/>
+          <w:lang/>
+        </w:rPr>
+        <w:t>端目标</w:t>
+      </w:r>
+      <w:proofErr w:type="gramEnd"/>
+      <w:r>
+        <w:rPr>
+          <w:rFonts w:ascii="宋体" w:hAnsi="宋体" w:cs="宋体" w:hint="eastAsia"/>
+          <w:kern w:val="0"/>
+          <w:sz w:val="24"/>
+          <w:lang/>
+        </w:rPr>
+        <w:t>检测，成为后续许多两阶段检测算法的基石</w:t>
       </w:r>
       <w:r>
         <w:rPr>
@@ -3818,7 +4038,23 @@
           <w:rFonts w:hint="eastAsia"/>
           <w:lang/>
         </w:rPr>
-        <w:t>为代表的两阶段检测算法通常能够达到很高的检测精度，因为它们将定位和分类任务解耦，可以对候选区域进行精细的调整和识别。然而，其多步骤的流程依然带来了较大的计算开销，推理速度相对较慢，难以完全满足道路巡检等需要高帧率实时处理的任务要求</w:t>
+        <w:t>为代表的两阶段检测算法通常能够达到很高的检测精度，因为它们将定位和分类任务解耦，可以对候选区域进行精细的调整和识别。然而，其多步骤的流程依然带来了较大的计算开销，推理速度相对较慢，难以完全满足道路巡检等需要</w:t>
+      </w:r>
+      <w:proofErr w:type="gramStart"/>
+      <w:r>
+        <w:rPr>
+          <w:rFonts w:hint="eastAsia"/>
+          <w:lang/>
+        </w:rPr>
+        <w:t>高帧率</w:t>
+      </w:r>
+      <w:proofErr w:type="gramEnd"/>
+      <w:r>
+        <w:rPr>
+          <w:rFonts w:hint="eastAsia"/>
+          <w:lang/>
+        </w:rPr>
+        <w:t>实时处理的任务要求</w:t>
       </w:r>
       <w:r>
         <w:rPr>
@@ -3909,7 +4145,55 @@
           <w:rFonts w:hint="eastAsia"/>
           <w:lang/>
         </w:rPr>
-        <w:t>为了解决两阶段算法的速度瓶颈，研究者们提出了将目标检测视为一个端到端回归问题的单阶段检测算法。该流派的核心思想是取消了显式的候选区域生成步骤，直接在整张图像上密集地预测目标的类别和位置，从而极大地简化了检测流程并提升了速度</w:t>
+        <w:t>为了解决两阶段算法的速度瓶颈，研究者们提出了将目标检测视为一个端到</w:t>
+      </w:r>
+      <w:proofErr w:type="gramStart"/>
+      <w:r>
+        <w:rPr>
+          <w:rFonts w:hint="eastAsia"/>
+          <w:lang/>
+        </w:rPr>
+        <w:t>端回归</w:t>
+      </w:r>
+      <w:proofErr w:type="gramEnd"/>
+      <w:r>
+        <w:rPr>
+          <w:rFonts w:hint="eastAsia"/>
+          <w:lang/>
+        </w:rPr>
+        <w:t>问题的</w:t>
+      </w:r>
+      <w:proofErr w:type="gramStart"/>
+      <w:r>
+        <w:rPr>
+          <w:rFonts w:hint="eastAsia"/>
+          <w:lang/>
+        </w:rPr>
+        <w:t>单阶段</w:t>
+      </w:r>
+      <w:proofErr w:type="gramEnd"/>
+      <w:r>
+        <w:rPr>
+          <w:rFonts w:hint="eastAsia"/>
+          <w:lang/>
+        </w:rPr>
+        <w:t>检测算法。该流派的核心思想是</w:t>
+      </w:r>
+      <w:proofErr w:type="gramStart"/>
+      <w:r>
+        <w:rPr>
+          <w:rFonts w:hint="eastAsia"/>
+          <w:lang/>
+        </w:rPr>
+        <w:t>取消了显式</w:t>
+      </w:r>
+      <w:proofErr w:type="gramEnd"/>
+      <w:r>
+        <w:rPr>
+          <w:rFonts w:hint="eastAsia"/>
+          <w:lang/>
+        </w:rPr>
+        <w:t>的候选区域生成步骤，直接在整张图像上密集地预测目标的类别和位置，从而极大地简化了检测流程并提升了速度</w:t>
       </w:r>
       <w:r>
         <w:rPr>
@@ -4431,6 +4715,7 @@
                 <w:sz w:val="24"/>
               </w:rPr>
             </w:pPr>
+            <w:proofErr w:type="spellStart"/>
             <w:r>
               <w:rPr>
                 <w:rFonts w:eastAsia="Times New Roman"/>
@@ -4439,6 +4724,7 @@
               </w:rPr>
               <w:t>模型版本</w:t>
             </w:r>
+            <w:proofErr w:type="spellEnd"/>
           </w:p>
         </w:tc>
         <w:tc>
@@ -4456,6 +4742,7 @@
                 <w:bCs/>
               </w:rPr>
             </w:pPr>
+            <w:proofErr w:type="spellStart"/>
             <w:r>
               <w:rPr>
                 <w:rFonts w:eastAsia="Times New Roman"/>
@@ -4464,6 +4751,7 @@
               </w:rPr>
               <w:t>提出年份</w:t>
             </w:r>
+            <w:proofErr w:type="spellEnd"/>
           </w:p>
         </w:tc>
         <w:tc>
@@ -4481,6 +4769,7 @@
                 <w:bCs/>
               </w:rPr>
             </w:pPr>
+            <w:proofErr w:type="spellStart"/>
             <w:r>
               <w:rPr>
                 <w:rFonts w:eastAsia="Times New Roman"/>
@@ -4489,6 +4778,7 @@
               </w:rPr>
               <w:t>核心贡献与创新点</w:t>
             </w:r>
+            <w:proofErr w:type="spellEnd"/>
           </w:p>
         </w:tc>
         <w:tc>
@@ -4506,6 +4796,7 @@
                 <w:bCs/>
               </w:rPr>
             </w:pPr>
+            <w:proofErr w:type="spellStart"/>
             <w:r>
               <w:rPr>
                 <w:rFonts w:eastAsia="Times New Roman"/>
@@ -4514,6 +4805,7 @@
               </w:rPr>
               <w:t>主要参考文献</w:t>
             </w:r>
+            <w:proofErr w:type="spellEnd"/>
           </w:p>
         </w:tc>
       </w:tr>
@@ -4578,11 +4870,19 @@
                 <w:rFonts w:eastAsia="Times New Roman"/>
               </w:rPr>
             </w:pPr>
+            <w:proofErr w:type="spellStart"/>
             <w:r>
               <w:rPr>
                 <w:rFonts w:eastAsia="Times New Roman"/>
               </w:rPr>
-              <w:t>将目标检测统一为单个回归问题，实现端到端的实时检测。</w:t>
+              <w:t>将目标检测统一为单个回归问题，实现端到端的实时检测</w:t>
+            </w:r>
+            <w:proofErr w:type="spellEnd"/>
+            <w:r>
+              <w:rPr>
+                <w:rFonts w:eastAsia="Times New Roman"/>
+              </w:rPr>
+              <w:t>。</w:t>
             </w:r>
           </w:p>
         </w:tc>
@@ -4851,11 +5151,71 @@
                 <w:rFonts w:eastAsia="Times New Roman"/>
               </w:rPr>
             </w:pPr>
+            <w:proofErr w:type="spellStart"/>
+            <w:proofErr w:type="gramStart"/>
             <w:r>
               <w:rPr>
                 <w:rFonts w:eastAsia="Times New Roman"/>
               </w:rPr>
-              <w:t>提出“Bag of Freebies”和“Bag of Specials”概念，系统性地集成了当时最先进的技术（如CSPNet、Mish激活、Mosaic数据增强等）。</w:t>
+              <w:t>提出“</w:t>
+            </w:r>
+            <w:proofErr w:type="gramEnd"/>
+            <w:r>
+              <w:rPr>
+                <w:rFonts w:eastAsia="Times New Roman"/>
+              </w:rPr>
+              <w:t>Bag</w:t>
+            </w:r>
+            <w:proofErr w:type="spellEnd"/>
+            <w:r>
+              <w:rPr>
+                <w:rFonts w:eastAsia="Times New Roman"/>
+              </w:rPr>
+              <w:t xml:space="preserve"> of </w:t>
+            </w:r>
+            <w:proofErr w:type="spellStart"/>
+            <w:proofErr w:type="gramStart"/>
+            <w:r>
+              <w:rPr>
+                <w:rFonts w:eastAsia="Times New Roman"/>
+              </w:rPr>
+              <w:t>Freebies”和</w:t>
+            </w:r>
+            <w:proofErr w:type="gramEnd"/>
+            <w:r>
+              <w:rPr>
+                <w:rFonts w:eastAsia="Times New Roman"/>
+              </w:rPr>
+              <w:t>“Bag</w:t>
+            </w:r>
+            <w:proofErr w:type="spellEnd"/>
+            <w:r>
+              <w:rPr>
+                <w:rFonts w:eastAsia="Times New Roman"/>
+              </w:rPr>
+              <w:t xml:space="preserve"> of </w:t>
+            </w:r>
+            <w:proofErr w:type="spellStart"/>
+            <w:proofErr w:type="gramStart"/>
+            <w:r>
+              <w:rPr>
+                <w:rFonts w:eastAsia="Times New Roman"/>
+              </w:rPr>
+              <w:t>Specials”概念</w:t>
+            </w:r>
+            <w:proofErr w:type="gramEnd"/>
+            <w:r>
+              <w:rPr>
+                <w:rFonts w:eastAsia="Times New Roman"/>
+              </w:rPr>
+              <w:t>，系统性地集成了当时最先进的技术（如CSPNet、Mish激活、Mosaic数据增强等</w:t>
+            </w:r>
+            <w:proofErr w:type="spellEnd"/>
+            <w:r>
+              <w:rPr>
+                <w:rFonts w:eastAsia="Times New Roman"/>
+              </w:rPr>
+              <w:t>）。</w:t>
             </w:r>
           </w:p>
         </w:tc>
@@ -4872,11 +5232,19 @@
                 <w:rFonts w:eastAsia="Times New Roman"/>
               </w:rPr>
             </w:pPr>
+            <w:proofErr w:type="spellStart"/>
             <w:r>
               <w:rPr>
                 <w:rFonts w:eastAsia="Times New Roman"/>
               </w:rPr>
-              <w:t>Bochkovskiy et al.</w:t>
+              <w:t>Bochkovskiy</w:t>
+            </w:r>
+            <w:proofErr w:type="spellEnd"/>
+            <w:r>
+              <w:rPr>
+                <w:rFonts w:eastAsia="Times New Roman"/>
+              </w:rPr>
+              <w:t xml:space="preserve"> et al.</w:t>
             </w:r>
           </w:p>
         </w:tc>
@@ -4942,11 +5310,19 @@
                 <w:rFonts w:eastAsia="Times New Roman"/>
               </w:rPr>
             </w:pPr>
+            <w:proofErr w:type="spellStart"/>
             <w:r>
               <w:rPr>
                 <w:rFonts w:eastAsia="Times New Roman"/>
               </w:rPr>
-              <w:t>由Ultralytics公司推出，基于PyTorch实现，注重易用性、工程实践和持续迭代，引入了自适应锚框计算等特性。</w:t>
+              <w:t>由Ultralytics公司推出，基于PyTorch实现，注重易用性、工程实践和持续迭代，引入了自适应锚框计算等特性</w:t>
+            </w:r>
+            <w:proofErr w:type="spellEnd"/>
+            <w:r>
+              <w:rPr>
+                <w:rFonts w:eastAsia="Times New Roman"/>
+              </w:rPr>
+              <w:t>。</w:t>
             </w:r>
           </w:p>
         </w:tc>
@@ -4963,12 +5339,14 @@
                 <w:rFonts w:eastAsia="Times New Roman"/>
               </w:rPr>
             </w:pPr>
+            <w:proofErr w:type="spellStart"/>
             <w:r>
               <w:rPr>
                 <w:rFonts w:eastAsia="Times New Roman"/>
               </w:rPr>
               <w:t>Ultralytics</w:t>
             </w:r>
+            <w:proofErr w:type="spellEnd"/>
           </w:p>
         </w:tc>
       </w:tr>
@@ -5054,12 +5432,14 @@
                 <w:rFonts w:eastAsia="Times New Roman"/>
               </w:rPr>
             </w:pPr>
+            <w:proofErr w:type="spellStart"/>
             <w:r>
               <w:rPr>
                 <w:rFonts w:eastAsia="Times New Roman"/>
               </w:rPr>
               <w:t>Ultralytics</w:t>
             </w:r>
+            <w:proofErr w:type="spellEnd"/>
           </w:p>
         </w:tc>
       </w:tr>
@@ -5124,11 +5504,33 @@
                 <w:rFonts w:eastAsia="Times New Roman"/>
               </w:rPr>
             </w:pPr>
+            <w:proofErr w:type="spellStart"/>
             <w:r>
               <w:rPr>
                 <w:rFonts w:eastAsia="Times New Roman"/>
               </w:rPr>
-              <w:t>提出可编程梯度信息（PGI）和通用高效层聚合网络（GELAN），旨在解决深度网络中的信息瓶颈问题，取得了新的SOTA性能。</w:t>
+              <w:t>提出可编程梯度信息（PGI）和通用高效层聚合网络（GELAN</w:t>
+            </w:r>
+            <w:proofErr w:type="spellEnd"/>
+            <w:r>
+              <w:rPr>
+                <w:rFonts w:eastAsia="Times New Roman"/>
+              </w:rPr>
+              <w:t>），</w:t>
+            </w:r>
+            <w:proofErr w:type="spellStart"/>
+            <w:r>
+              <w:rPr>
+                <w:rFonts w:eastAsia="Times New Roman"/>
+              </w:rPr>
+              <w:t>旨在解决深度网络中的信息瓶颈问题，取得了新的SOTA性能</w:t>
+            </w:r>
+            <w:proofErr w:type="spellEnd"/>
+            <w:r>
+              <w:rPr>
+                <w:rFonts w:eastAsia="Times New Roman"/>
+              </w:rPr>
+              <w:t>。</w:t>
             </w:r>
           </w:p>
         </w:tc>
@@ -5463,7 +5865,23 @@
           <w:rFonts w:hint="eastAsia"/>
           <w:lang/>
         </w:rPr>
-        <w:t>这种将检测速度与精度进行有效平衡的设计，使得单阶段检测器，特别是</w:t>
+        <w:t>这种将检测速度与精度进行有效平衡的设计，使得</w:t>
+      </w:r>
+      <w:proofErr w:type="gramStart"/>
+      <w:r>
+        <w:rPr>
+          <w:rFonts w:hint="eastAsia"/>
+          <w:lang/>
+        </w:rPr>
+        <w:t>单阶段</w:t>
+      </w:r>
+      <w:proofErr w:type="gramEnd"/>
+      <w:r>
+        <w:rPr>
+          <w:rFonts w:hint="eastAsia"/>
+          <w:lang/>
+        </w:rPr>
+        <w:t>检测器，特别是</w:t>
       </w:r>
       <w:r>
         <w:rPr>
@@ -5563,7 +5981,39 @@
           <w:rFonts w:hint="eastAsia"/>
           <w:lang/>
         </w:rPr>
-        <w:t>为代表的深度学习模型性能强大，但在实际部署中，尤其是在算力、内存和功耗均受限的车载边缘计算设备上，模型的大小和计算复杂度成为关键瓶颈。为此，学术界和工业界正积极探索模型优化技术，旨在实现一个能够在精度、速度和模型大小之间取得更优平衡的解决方案。这一研究方向的成熟，体现了计算机视觉领域从追求纯粹的理论精度，向关注实际应用部署的范式转变。两个主要的研究方向是模型轻量化和注意力机制</w:t>
+        <w:t>为代表的深度学习模型性能强大，但在实际部署中，尤其是在算力、内存和</w:t>
+      </w:r>
+      <w:proofErr w:type="gramStart"/>
+      <w:r>
+        <w:rPr>
+          <w:rFonts w:hint="eastAsia"/>
+          <w:lang/>
+        </w:rPr>
+        <w:t>功耗均</w:t>
+      </w:r>
+      <w:proofErr w:type="gramEnd"/>
+      <w:r>
+        <w:rPr>
+          <w:rFonts w:hint="eastAsia"/>
+          <w:lang/>
+        </w:rPr>
+        <w:t>受限的车载边缘计算设备上，模型的大小和计算复杂</w:t>
+      </w:r>
+      <w:proofErr w:type="gramStart"/>
+      <w:r>
+        <w:rPr>
+          <w:rFonts w:hint="eastAsia"/>
+          <w:lang/>
+        </w:rPr>
+        <w:t>度成为</w:t>
+      </w:r>
+      <w:proofErr w:type="gramEnd"/>
+      <w:r>
+        <w:rPr>
+          <w:rFonts w:hint="eastAsia"/>
+          <w:lang/>
+        </w:rPr>
+        <w:t>关键瓶颈。为此，学术界和工业界正积极探索模型优化技术，旨在实现一个能够在精度、速度和模型大小之间取得更优平衡的解决方案。这一研究方向的成熟，体现了计算机视觉领域从追求纯粹的理论精度，向关注实际应用部署的范式转变。两个主要的研究方向是模型轻量化和注意力机制</w:t>
       </w:r>
       <w:r>
         <w:rPr>
@@ -5833,7 +6283,27 @@
           <w:sz w:val="24"/>
           <w:lang/>
         </w:rPr>
-        <w:t>在此基础上引入了倒置残差（</w:t>
+        <w:t>在此基础上引入</w:t>
+      </w:r>
+      <w:proofErr w:type="gramStart"/>
+      <w:r>
+        <w:rPr>
+          <w:rFonts w:ascii="宋体" w:hAnsi="宋体" w:cs="宋体" w:hint="eastAsia"/>
+          <w:kern w:val="0"/>
+          <w:sz w:val="24"/>
+          <w:lang/>
+        </w:rPr>
+        <w:t>了倒</w:t>
+      </w:r>
+      <w:proofErr w:type="gramEnd"/>
+      <w:r>
+        <w:rPr>
+          <w:rFonts w:ascii="宋体" w:hAnsi="宋体" w:cs="宋体" w:hint="eastAsia"/>
+          <w:kern w:val="0"/>
+          <w:sz w:val="24"/>
+          <w:lang/>
+        </w:rPr>
+        <w:t>置残差（</w:t>
       </w:r>
       <w:r>
         <w:rPr>
@@ -6740,7 +7210,7 @@
       <w:pPr>
         <w:spacing w:before="100" w:beforeAutospacing="1" w:after="100" w:afterAutospacing="1"/>
         <w:rPr>
-          <w:rFonts w:eastAsia="Times New Roman"/>
+          <w:rFonts w:eastAsiaTheme="minorEastAsia" w:hint="eastAsia"/>
           <w:kern w:val="0"/>
           <w:sz w:val="24"/>
           <w:lang/>
@@ -6843,7 +7313,27 @@
           <w:sz w:val="24"/>
           <w:lang/>
         </w:rPr>
-        <w:t>的突出特点是无需任何额外的参数。它基于神经科学中的空间抑制理论，为特征图中的每个神经元（即每个位置的每个通道）定义一个能量函数。通过最小化该能量函数，</w:t>
+        <w:t>的突出特点是无需任何额外的参数。它基于神经科学中的空间抑制理论，为特征图中的每个神经元（即每个位置的每个通道）定义一个能量函数。通过</w:t>
+      </w:r>
+      <w:proofErr w:type="gramStart"/>
+      <w:r>
+        <w:rPr>
+          <w:rFonts w:ascii="宋体" w:hAnsi="宋体" w:cs="宋体" w:hint="eastAsia"/>
+          <w:kern w:val="0"/>
+          <w:sz w:val="24"/>
+          <w:lang/>
+        </w:rPr>
+        <w:t>最小化该能量</w:t>
+      </w:r>
+      <w:proofErr w:type="gramEnd"/>
+      <w:r>
+        <w:rPr>
+          <w:rFonts w:ascii="宋体" w:hAnsi="宋体" w:cs="宋体" w:hint="eastAsia"/>
+          <w:kern w:val="0"/>
+          <w:sz w:val="24"/>
+          <w:lang/>
+        </w:rPr>
+        <w:t>函数，</w:t>
       </w:r>
       <w:r>
         <w:rPr>
@@ -6879,8 +7369,19 @@
           <w:sz w:val="24"/>
           <w:lang/>
         </w:rPr>
-        <w:t>注意力权重，从而在不增加模型参数的情况下实现对特征的精细化调整</w:t>
-      </w:r>
+        <w:t>注意力权重，从而在不增加模型参数的情况下实现对特征的精细</w:t>
+      </w:r>
+      <w:proofErr w:type="gramStart"/>
+      <w:r>
+        <w:rPr>
+          <w:rFonts w:ascii="宋体" w:hAnsi="宋体" w:cs="宋体" w:hint="eastAsia"/>
+          <w:kern w:val="0"/>
+          <w:sz w:val="24"/>
+          <w:lang/>
+        </w:rPr>
+        <w:t>化调整</w:t>
+      </w:r>
+      <w:proofErr w:type="gramEnd"/>
       <w:r>
         <w:rPr>
           <w:rFonts w:eastAsia="Times New Roman"/>
@@ -6926,44 +7427,12 @@
         </w:rPr>
         <w:t xml:space="preserve">   </w:t>
       </w:r>
-    </w:p>
-    <w:p>
-      <w:pPr>
-        <w:spacing w:before="100" w:beforeAutospacing="1" w:after="100" w:afterAutospacing="1"/>
-        <w:rPr>
-          <w:rFonts w:eastAsia="Times New Roman"/>
-          <w:kern w:val="0"/>
-          <w:sz w:val="24"/>
-          <w:lang/>
-        </w:rPr>
-      </w:pPr>
     </w:p>
     <w:p>
       <w:pPr>
         <w:spacing w:beforeLines="50" w:before="218" w:afterLines="50" w:after="218"/>
         <w:jc w:val="both"/>
         <w:rPr>
-          <w:rFonts w:eastAsia="黑体" w:hint="eastAsia"/>
-          <w:color w:val="000000" w:themeColor="text1"/>
-          <w:sz w:val="24"/>
-          <w:lang/>
-        </w:rPr>
-      </w:pPr>
-      <w:r>
-        <w:rPr>
-          <w:rFonts w:eastAsia="黑体" w:hint="eastAsia"/>
-          <w:color w:val="000000" w:themeColor="text1"/>
-          <w:sz w:val="24"/>
-          <w:lang/>
-        </w:rPr>
-        <w:t xml:space="preserve">2.2.3 </w:t>
-      </w:r>
-    </w:p>
-    <w:p>
-      <w:pPr>
-        <w:spacing w:beforeLines="50" w:before="218" w:afterLines="50" w:after="218"/>
-        <w:jc w:val="both"/>
-        <w:rPr>
           <w:rFonts w:eastAsia="黑体"/>
           <w:color w:val="000000" w:themeColor="text1"/>
           <w:sz w:val="28"/>
@@ -7011,857 +7480,623 @@
       <w:pPr>
         <w:pStyle w:val="ac"/>
         <w:rPr>
-          <w:rFonts w:eastAsia="Times New Roman"/>
-          <w:lang/>
-        </w:rPr>
-      </w:pPr>
-      <w:r>
-        <w:rPr>
-          <w:color w:val="000000" w:themeColor="text1"/>
-        </w:rPr>
-        <w:t>道路病害检测领域的研究不可避免地依赖于大规模的公开数据集。其中，国际权威的RDD2022（Road Damage Detection 2022）是目前常用的数据集之一 。该数据集包含了来自全球多个国家的超过4万张道路图像，涵盖了多种类型和不同严重程度的病害，场景多样，极具挑战性 。这些数据集中通常包含一些常见的检测挑战，例如：病害目标尺寸小（如早期裂缝）、形态不规则、与背景对比度低、部分被阴影或水渍遮挡等 。</w:t>
-      </w:r>
-    </w:p>
-    <w:p>
-      <w:pPr>
-        <w:ind w:firstLine="420"/>
-        <w:jc w:val="both"/>
-        <w:rPr>
-          <w:color w:val="000000" w:themeColor="text1"/>
-          <w:sz w:val="24"/>
-          <w:lang/>
-        </w:rPr>
-      </w:pPr>
+          <w:rFonts w:ascii="Times New Roman" w:eastAsia="Times New Roman" w:hAnsi="Times New Roman" w:cs="Times New Roman"/>
+          <w:lang/>
+        </w:rPr>
+      </w:pPr>
+      <w:r>
+        <w:rPr>
+          <w:rFonts w:hint="eastAsia"/>
+          <w:lang/>
+        </w:rPr>
+        <w:t>深度学习模型的研发与进步离不开大规模、高质量的公开数据集，它们为算法的训练、验证和公平比较提供了基石。在道路病害检测领域，一个国际权威且被广泛使用的数据集是</w:t>
+      </w:r>
+      <w:r>
+        <w:rPr>
+          <w:rFonts w:ascii="Times New Roman" w:eastAsia="Times New Roman" w:hAnsi="Times New Roman" w:cs="Times New Roman"/>
+          <w:lang/>
+        </w:rPr>
+        <w:t>RDD2022</w:t>
+      </w:r>
+      <w:r>
+        <w:rPr>
+          <w:rFonts w:hint="eastAsia"/>
+          <w:lang/>
+        </w:rPr>
+        <w:t>（</w:t>
+      </w:r>
+      <w:r>
+        <w:rPr>
+          <w:rFonts w:ascii="Times New Roman" w:eastAsia="Times New Roman" w:hAnsi="Times New Roman" w:cs="Times New Roman"/>
+          <w:lang/>
+        </w:rPr>
+        <w:t>Road Damage Detection 2022</w:t>
+      </w:r>
+      <w:r>
+        <w:rPr>
+          <w:rFonts w:hint="eastAsia"/>
+          <w:lang/>
+        </w:rPr>
+        <w:t>）。该数据集由</w:t>
+      </w:r>
+      <w:r>
+        <w:rPr>
+          <w:rFonts w:ascii="Times New Roman" w:eastAsia="Times New Roman" w:hAnsi="Times New Roman" w:cs="Times New Roman"/>
+          <w:lang/>
+        </w:rPr>
+        <w:t>Arya</w:t>
+      </w:r>
+      <w:r>
+        <w:rPr>
+          <w:rFonts w:hint="eastAsia"/>
+          <w:lang/>
+        </w:rPr>
+        <w:t>等人于</w:t>
+      </w:r>
+      <w:r>
+        <w:rPr>
+          <w:rFonts w:ascii="Times New Roman" w:eastAsia="Times New Roman" w:hAnsi="Times New Roman" w:cs="Times New Roman"/>
+          <w:lang/>
+        </w:rPr>
+        <w:t>2022</w:t>
+      </w:r>
+      <w:r>
+        <w:rPr>
+          <w:rFonts w:hint="eastAsia"/>
+          <w:lang/>
+        </w:rPr>
+        <w:t>年发布，包含了来自全球六个国家（日本、印度、捷克、挪威、美国和中国）的超过</w:t>
+      </w:r>
+      <w:r>
+        <w:rPr>
+          <w:rFonts w:ascii="Times New Roman" w:eastAsia="Times New Roman" w:hAnsi="Times New Roman" w:cs="Times New Roman"/>
+          <w:lang/>
+        </w:rPr>
+        <w:t>47,000</w:t>
+      </w:r>
+      <w:r>
+        <w:rPr>
+          <w:rFonts w:hint="eastAsia"/>
+          <w:lang/>
+        </w:rPr>
+        <w:t>张道路图像，标注了超过</w:t>
+      </w:r>
+      <w:r>
+        <w:rPr>
+          <w:rFonts w:ascii="Times New Roman" w:eastAsia="Times New Roman" w:hAnsi="Times New Roman" w:cs="Times New Roman"/>
+          <w:lang/>
+        </w:rPr>
+        <w:t>55,000</w:t>
+      </w:r>
+      <w:r>
+        <w:rPr>
+          <w:rFonts w:hint="eastAsia"/>
+          <w:lang/>
+        </w:rPr>
+        <w:t>个病害实例</w:t>
+      </w:r>
+      <w:r>
+        <w:rPr>
+          <w:rFonts w:ascii="Times New Roman" w:eastAsia="Times New Roman" w:hAnsi="Times New Roman" w:cs="Times New Roman"/>
+          <w:lang/>
+        </w:rPr>
+        <w:t xml:space="preserve"> </w:t>
+      </w:r>
+      <w:r>
+        <w:rPr>
+          <w:rFonts w:hint="eastAsia"/>
+          <w:lang/>
+        </w:rPr>
+        <w:t>。其场景的多样性和病害类型的丰富性，使其极具挑战性，有力地推动了该领域的研究进展。这些数据集中通常包含一些常见的检测挑战，例如：病害目标尺寸小（如早期裂缝）、形态不规则、与背景对比度低、部分被阴影或水渍遮挡等</w:t>
+      </w:r>
+      <w:r>
+        <w:rPr>
+          <w:rFonts w:ascii="Times New Roman" w:eastAsia="Times New Roman" w:hAnsi="Times New Roman" w:cs="Times New Roman"/>
+          <w:lang/>
+        </w:rPr>
+        <w:t xml:space="preserve"> </w:t>
+      </w:r>
+      <w:r>
+        <w:rPr>
+          <w:rFonts w:hint="eastAsia"/>
+          <w:lang/>
+        </w:rPr>
+        <w:t>。</w:t>
+      </w:r>
+      <w:r>
+        <w:rPr>
+          <w:rFonts w:ascii="Times New Roman" w:eastAsia="Times New Roman" w:hAnsi="Times New Roman" w:cs="Times New Roman"/>
+          <w:lang/>
+        </w:rPr>
+        <w:t xml:space="preserve">   </w:t>
+      </w:r>
+    </w:p>
+    <w:p>
+      <w:pPr>
+        <w:spacing w:before="100" w:beforeAutospacing="1" w:after="100" w:afterAutospacing="1"/>
+        <w:rPr>
+          <w:rFonts w:eastAsia="Times New Roman"/>
+          <w:kern w:val="0"/>
+          <w:sz w:val="24"/>
+          <w:lang/>
+        </w:rPr>
+      </w:pPr>
+      <w:r>
+        <w:rPr>
+          <w:rFonts w:ascii="宋体" w:hAnsi="宋体" w:cs="宋体" w:hint="eastAsia"/>
+          <w:kern w:val="0"/>
+          <w:sz w:val="24"/>
+          <w:lang/>
+        </w:rPr>
+        <w:t>在评估指标方面，道路病害检测任务通常采用目标检测领域的标准评价体系。这一体系的建立很大程度上归功于</w:t>
+      </w:r>
+      <w:r>
+        <w:rPr>
+          <w:rFonts w:eastAsia="Times New Roman"/>
+          <w:kern w:val="0"/>
+          <w:sz w:val="24"/>
+          <w:lang/>
+        </w:rPr>
+        <w:t>PASCAL VOC</w:t>
+      </w:r>
+      <w:r>
+        <w:rPr>
+          <w:rFonts w:ascii="宋体" w:hAnsi="宋体" w:cs="宋体" w:hint="eastAsia"/>
+          <w:kern w:val="0"/>
+          <w:sz w:val="24"/>
+          <w:lang/>
+        </w:rPr>
+        <w:t>（</w:t>
+      </w:r>
+      <w:r>
+        <w:rPr>
+          <w:rFonts w:eastAsia="Times New Roman"/>
+          <w:kern w:val="0"/>
+          <w:sz w:val="24"/>
+          <w:lang/>
+        </w:rPr>
+        <w:t>Visual Object Classes</w:t>
+      </w:r>
+      <w:r>
+        <w:rPr>
+          <w:rFonts w:ascii="宋体" w:hAnsi="宋体" w:cs="宋体" w:hint="eastAsia"/>
+          <w:kern w:val="0"/>
+          <w:sz w:val="24"/>
+          <w:lang/>
+        </w:rPr>
+        <w:t>）挑战赛</w:t>
+      </w:r>
+      <w:r>
+        <w:rPr>
+          <w:rFonts w:eastAsia="Times New Roman"/>
+          <w:kern w:val="0"/>
+          <w:sz w:val="24"/>
+          <w:lang/>
+        </w:rPr>
+        <w:t xml:space="preserve"> </w:t>
+      </w:r>
+      <w:r>
+        <w:rPr>
+          <w:rFonts w:ascii="宋体" w:hAnsi="宋体" w:cs="宋体" w:hint="eastAsia"/>
+          <w:kern w:val="0"/>
+          <w:sz w:val="24"/>
+          <w:lang/>
+        </w:rPr>
+        <w:t>，该赛事自</w:t>
+      </w:r>
+      <w:r>
+        <w:rPr>
+          <w:rFonts w:eastAsia="Times New Roman"/>
+          <w:kern w:val="0"/>
+          <w:sz w:val="24"/>
+          <w:lang/>
+        </w:rPr>
+        <w:t>2005</w:t>
+      </w:r>
+      <w:r>
+        <w:rPr>
+          <w:rFonts w:ascii="宋体" w:hAnsi="宋体" w:cs="宋体" w:hint="eastAsia"/>
+          <w:kern w:val="0"/>
+          <w:sz w:val="24"/>
+          <w:lang/>
+        </w:rPr>
+        <w:t>年起，系统性地定义并推广了至今仍在广泛使用的评估标准</w:t>
+      </w:r>
+      <w:r>
+        <w:rPr>
+          <w:rFonts w:eastAsia="Times New Roman"/>
+          <w:kern w:val="0"/>
+          <w:sz w:val="24"/>
+          <w:lang/>
+        </w:rPr>
+        <w:t xml:space="preserve"> </w:t>
+      </w:r>
+      <w:r>
+        <w:rPr>
+          <w:rFonts w:ascii="宋体" w:hAnsi="宋体" w:cs="宋体" w:hint="eastAsia"/>
+          <w:kern w:val="0"/>
+          <w:sz w:val="24"/>
+          <w:lang/>
+        </w:rPr>
+        <w:t>。</w:t>
+      </w:r>
+      <w:r>
+        <w:rPr>
+          <w:rFonts w:eastAsia="Times New Roman"/>
+          <w:kern w:val="0"/>
+          <w:sz w:val="24"/>
+          <w:lang/>
+        </w:rPr>
+        <w:t xml:space="preserve">   </w:t>
+      </w:r>
+    </w:p>
+    <w:p>
+      <w:pPr>
+        <w:spacing w:before="100" w:beforeAutospacing="1" w:after="100" w:afterAutospacing="1"/>
+        <w:rPr>
+          <w:rFonts w:eastAsia="Times New Roman"/>
+          <w:kern w:val="0"/>
+          <w:sz w:val="24"/>
+          <w:lang/>
+        </w:rPr>
+      </w:pPr>
+      <w:r>
+        <w:rPr>
+          <w:rFonts w:ascii="宋体" w:hAnsi="宋体" w:cs="宋体" w:hint="eastAsia"/>
+          <w:kern w:val="0"/>
+          <w:sz w:val="24"/>
+          <w:lang/>
+        </w:rPr>
+        <w:t>常用的基础指标包括精确率（</w:t>
+      </w:r>
+      <w:r>
+        <w:rPr>
+          <w:rFonts w:eastAsia="Times New Roman"/>
+          <w:kern w:val="0"/>
+          <w:sz w:val="24"/>
+          <w:lang/>
+        </w:rPr>
+        <w:t>Precision</w:t>
+      </w:r>
+      <w:r>
+        <w:rPr>
+          <w:rFonts w:ascii="宋体" w:hAnsi="宋体" w:cs="宋体" w:hint="eastAsia"/>
+          <w:kern w:val="0"/>
+          <w:sz w:val="24"/>
+          <w:lang/>
+        </w:rPr>
+        <w:t>）和召回率（</w:t>
+      </w:r>
+      <w:r>
+        <w:rPr>
+          <w:rFonts w:eastAsia="Times New Roman"/>
+          <w:kern w:val="0"/>
+          <w:sz w:val="24"/>
+          <w:lang/>
+        </w:rPr>
+        <w:t>Recall</w:t>
+      </w:r>
+      <w:r>
+        <w:rPr>
+          <w:rFonts w:ascii="宋体" w:hAnsi="宋体" w:cs="宋体" w:hint="eastAsia"/>
+          <w:kern w:val="0"/>
+          <w:sz w:val="24"/>
+          <w:lang/>
+        </w:rPr>
+        <w:t>）。精确率衡量的是模型预测为正例的样本中有多少是真正的正例，而召回率衡量的是所有真正的正例中有多少被模型成功预测出来。这两个指标通常是相互制约的。</w:t>
+      </w:r>
+      <w:r>
+        <w:rPr>
+          <w:rFonts w:eastAsia="Times New Roman"/>
+          <w:kern w:val="0"/>
+          <w:sz w:val="24"/>
+          <w:lang/>
+        </w:rPr>
+        <w:t>F1</w:t>
+      </w:r>
+      <w:r>
+        <w:rPr>
+          <w:rFonts w:ascii="宋体" w:hAnsi="宋体" w:cs="宋体" w:hint="eastAsia"/>
+          <w:kern w:val="0"/>
+          <w:sz w:val="24"/>
+          <w:lang/>
+        </w:rPr>
+        <w:t>分数（</w:t>
+      </w:r>
+      <w:r>
+        <w:rPr>
+          <w:rFonts w:eastAsia="Times New Roman"/>
+          <w:kern w:val="0"/>
+          <w:sz w:val="24"/>
+          <w:lang/>
+        </w:rPr>
+        <w:t>F1-Score</w:t>
+      </w:r>
+      <w:r>
+        <w:rPr>
+          <w:rFonts w:ascii="宋体" w:hAnsi="宋体" w:cs="宋体" w:hint="eastAsia"/>
+          <w:kern w:val="0"/>
+          <w:sz w:val="24"/>
+          <w:lang/>
+        </w:rPr>
+        <w:t>）是精确率和召回率的调和平均数，用于综合评价两者</w:t>
+      </w:r>
+      <w:r>
+        <w:rPr>
+          <w:rFonts w:ascii="宋体" w:hAnsi="宋体" w:cs="宋体"/>
+          <w:kern w:val="0"/>
+          <w:sz w:val="24"/>
+          <w:lang/>
+        </w:rPr>
+        <w:t>。</w:t>
+      </w:r>
+    </w:p>
+    <w:p>
+      <w:pPr>
+        <w:spacing w:before="100" w:beforeAutospacing="1" w:after="100" w:afterAutospacing="1"/>
+        <w:rPr>
+          <w:rFonts w:eastAsia="Times New Roman"/>
+          <w:kern w:val="0"/>
+          <w:sz w:val="24"/>
+          <w:lang/>
+        </w:rPr>
+      </w:pPr>
+      <w:r>
+        <w:rPr>
+          <w:rFonts w:ascii="宋体" w:hAnsi="宋体" w:cs="宋体" w:hint="eastAsia"/>
+          <w:kern w:val="0"/>
+          <w:sz w:val="24"/>
+          <w:lang/>
+        </w:rPr>
+        <w:t>然而，在目标检测任务中，</w:t>
+      </w:r>
+      <w:proofErr w:type="gramStart"/>
+      <w:r>
+        <w:rPr>
+          <w:rFonts w:ascii="宋体" w:hAnsi="宋体" w:cs="宋体" w:hint="eastAsia"/>
+          <w:kern w:val="0"/>
+          <w:sz w:val="24"/>
+          <w:lang/>
+        </w:rPr>
+        <w:t>最</w:t>
+      </w:r>
+      <w:proofErr w:type="gramEnd"/>
+      <w:r>
+        <w:rPr>
+          <w:rFonts w:ascii="宋体" w:hAnsi="宋体" w:cs="宋体" w:hint="eastAsia"/>
+          <w:kern w:val="0"/>
+          <w:sz w:val="24"/>
+          <w:lang/>
+        </w:rPr>
+        <w:t>核心的综合性能指标是平均精度均值（</w:t>
+      </w:r>
+      <w:r>
+        <w:rPr>
+          <w:rFonts w:eastAsia="Times New Roman"/>
+          <w:kern w:val="0"/>
+          <w:sz w:val="24"/>
+          <w:lang/>
+        </w:rPr>
+        <w:t>mean Average Precision, mAP</w:t>
+      </w:r>
+      <w:r>
+        <w:rPr>
+          <w:rFonts w:ascii="宋体" w:hAnsi="宋体" w:cs="宋体" w:hint="eastAsia"/>
+          <w:kern w:val="0"/>
+          <w:sz w:val="24"/>
+          <w:lang/>
+        </w:rPr>
+        <w:t>）。</w:t>
+      </w:r>
+      <w:r>
+        <w:rPr>
+          <w:rFonts w:eastAsia="Times New Roman"/>
+          <w:kern w:val="0"/>
+          <w:sz w:val="24"/>
+          <w:lang/>
+        </w:rPr>
+        <w:t>mAP</w:t>
+      </w:r>
+      <w:r>
+        <w:rPr>
+          <w:rFonts w:ascii="宋体" w:hAnsi="宋体" w:cs="宋体" w:hint="eastAsia"/>
+          <w:kern w:val="0"/>
+          <w:sz w:val="24"/>
+          <w:lang/>
+        </w:rPr>
+        <w:t>通过计算在所有类别上的平均精度（</w:t>
+      </w:r>
+      <w:r>
+        <w:rPr>
+          <w:rFonts w:eastAsia="Times New Roman"/>
+          <w:kern w:val="0"/>
+          <w:sz w:val="24"/>
+          <w:lang/>
+        </w:rPr>
+        <w:t>Average Precision, AP</w:t>
+      </w:r>
+      <w:r>
+        <w:rPr>
+          <w:rFonts w:ascii="宋体" w:hAnsi="宋体" w:cs="宋体" w:hint="eastAsia"/>
+          <w:kern w:val="0"/>
+          <w:sz w:val="24"/>
+          <w:lang/>
+        </w:rPr>
+        <w:t>）的均值得到。而单个类别的</w:t>
+      </w:r>
+      <w:r>
+        <w:rPr>
+          <w:rFonts w:eastAsia="Times New Roman"/>
+          <w:kern w:val="0"/>
+          <w:sz w:val="24"/>
+          <w:lang/>
+        </w:rPr>
+        <w:t>AP</w:t>
+      </w:r>
+      <w:r>
+        <w:rPr>
+          <w:rFonts w:ascii="宋体" w:hAnsi="宋体" w:cs="宋体" w:hint="eastAsia"/>
+          <w:kern w:val="0"/>
+          <w:sz w:val="24"/>
+          <w:lang/>
+        </w:rPr>
+        <w:t>则是通过在不同置信度阈值下计算出的精确率</w:t>
+      </w:r>
+      <w:r>
+        <w:rPr>
+          <w:rFonts w:eastAsia="Times New Roman"/>
+          <w:kern w:val="0"/>
+          <w:sz w:val="24"/>
+          <w:lang/>
+        </w:rPr>
+        <w:t>-</w:t>
+      </w:r>
+      <w:r>
+        <w:rPr>
+          <w:rFonts w:ascii="宋体" w:hAnsi="宋体" w:cs="宋体" w:hint="eastAsia"/>
+          <w:kern w:val="0"/>
+          <w:sz w:val="24"/>
+          <w:lang/>
+        </w:rPr>
+        <w:t>召回率曲线下的面积来获得的。它综合了模型在不同置信度下的表现，能够更全面地衡量模型的检测性能</w:t>
+      </w:r>
+      <w:r>
+        <w:rPr>
+          <w:rFonts w:eastAsia="Times New Roman"/>
+          <w:kern w:val="0"/>
+          <w:sz w:val="24"/>
+          <w:lang/>
+        </w:rPr>
+        <w:t xml:space="preserve"> </w:t>
+      </w:r>
+      <w:r>
+        <w:rPr>
+          <w:rFonts w:ascii="宋体" w:hAnsi="宋体" w:cs="宋体" w:hint="eastAsia"/>
+          <w:kern w:val="0"/>
+          <w:sz w:val="24"/>
+          <w:lang/>
+        </w:rPr>
+        <w:t>。</w:t>
+      </w:r>
+      <w:r>
+        <w:rPr>
+          <w:rFonts w:eastAsia="Times New Roman"/>
+          <w:kern w:val="0"/>
+          <w:sz w:val="24"/>
+          <w:lang/>
+        </w:rPr>
+        <w:t xml:space="preserve">   </w:t>
+      </w:r>
+    </w:p>
+    <w:p>
+      <w:pPr>
+        <w:spacing w:before="100" w:beforeAutospacing="1" w:after="100" w:afterAutospacing="1"/>
+        <w:rPr>
+          <w:rFonts w:eastAsia="Times New Roman"/>
+          <w:kern w:val="0"/>
+          <w:sz w:val="24"/>
+          <w:lang/>
+        </w:rPr>
+      </w:pPr>
+      <w:r>
+        <w:rPr>
+          <w:rFonts w:ascii="宋体" w:hAnsi="宋体" w:cs="宋体" w:hint="eastAsia"/>
+          <w:kern w:val="0"/>
+          <w:sz w:val="24"/>
+          <w:lang/>
+        </w:rPr>
+        <w:t>此外，对于道路巡检这类要求实时性的应用场景，模型的推理速度是一个至关重要的评估维度。该指标通常用每秒处理的图像帧数（</w:t>
+      </w:r>
+      <w:r>
+        <w:rPr>
+          <w:rFonts w:eastAsia="Times New Roman"/>
+          <w:kern w:val="0"/>
+          <w:sz w:val="24"/>
+          <w:lang/>
+        </w:rPr>
+        <w:t>Frames Per Second, FPS</w:t>
+      </w:r>
+      <w:r>
+        <w:rPr>
+          <w:rFonts w:ascii="宋体" w:hAnsi="宋体" w:cs="宋体" w:hint="eastAsia"/>
+          <w:kern w:val="0"/>
+          <w:sz w:val="24"/>
+          <w:lang/>
+        </w:rPr>
+        <w:t>）来衡量</w:t>
+      </w:r>
+      <w:r>
+        <w:rPr>
+          <w:rFonts w:eastAsia="Times New Roman"/>
+          <w:kern w:val="0"/>
+          <w:sz w:val="24"/>
+          <w:lang/>
+        </w:rPr>
+        <w:t xml:space="preserve"> </w:t>
+      </w:r>
+      <w:r>
+        <w:rPr>
+          <w:rFonts w:ascii="宋体" w:hAnsi="宋体" w:cs="宋体" w:hint="eastAsia"/>
+          <w:kern w:val="0"/>
+          <w:sz w:val="24"/>
+          <w:lang/>
+        </w:rPr>
+        <w:t>。一个优秀的实时检测模型，必须在</w:t>
+      </w:r>
+      <w:r>
+        <w:rPr>
+          <w:rFonts w:eastAsia="Times New Roman"/>
+          <w:kern w:val="0"/>
+          <w:sz w:val="24"/>
+          <w:lang/>
+        </w:rPr>
+        <w:t>mAP</w:t>
+      </w:r>
+      <w:r>
+        <w:rPr>
+          <w:rFonts w:ascii="宋体" w:hAnsi="宋体" w:cs="宋体" w:hint="eastAsia"/>
+          <w:kern w:val="0"/>
+          <w:sz w:val="24"/>
+          <w:lang/>
+        </w:rPr>
+        <w:t>和</w:t>
+      </w:r>
+      <w:r>
+        <w:rPr>
+          <w:rFonts w:eastAsia="Times New Roman"/>
+          <w:kern w:val="0"/>
+          <w:sz w:val="24"/>
+          <w:lang/>
+        </w:rPr>
+        <w:t>FPS</w:t>
+      </w:r>
+      <w:r>
+        <w:rPr>
+          <w:rFonts w:ascii="宋体" w:hAnsi="宋体" w:cs="宋体" w:hint="eastAsia"/>
+          <w:kern w:val="0"/>
+          <w:sz w:val="24"/>
+          <w:lang/>
+        </w:rPr>
+        <w:t>这两个关键指标之间取得良好的平衡</w:t>
+      </w:r>
+      <w:r>
+        <w:rPr>
+          <w:rFonts w:ascii="宋体" w:hAnsi="宋体" w:cs="宋体"/>
+          <w:kern w:val="0"/>
+          <w:sz w:val="24"/>
+          <w:lang/>
+        </w:rPr>
+        <w:t>。</w:t>
+      </w:r>
     </w:p>
     <w:p>
       <w:pPr>
         <w:pStyle w:val="ac"/>
         <w:rPr>
-          <w:rFonts w:ascii="Times New Roman" w:eastAsia="Times New Roman" w:hAnsi="Times New Roman" w:cs="Times New Roman"/>
-          <w:lang/>
-        </w:rPr>
-      </w:pPr>
-      <w:r>
-        <w:rPr>
-          <w:color w:val="000000" w:themeColor="text1"/>
-        </w:rPr>
-        <w:t>在评估指标方面，通常采用目标检测领域的标准指标。常用的有精确率（Precision）、召回率（Recall）和F1分数（F1-Score） 。其中，平均精度均值（mean Average Precision, mAP）是衡量模型综合性能的核心指标，它综合了不同置信度阈值下的精确率和召回率表现 。此外，对于实时检测任务，模型的推理速度，通常用每秒帧数（FPS）来衡量，也是一个至关重要的评估维度 。</w:t>
-      </w:r>
-      <w:r>
-        <w:rPr>
-          <w:rFonts w:hint="eastAsia"/>
-          <w:lang/>
-        </w:rPr>
-        <w:t>两阶段检测算法以</w:t>
-      </w:r>
-      <w:r>
-        <w:rPr>
-          <w:rFonts w:ascii="Times New Roman" w:eastAsia="Times New Roman" w:hAnsi="Times New Roman" w:cs="Times New Roman"/>
-          <w:lang/>
-        </w:rPr>
-        <w:t>R-CNN</w:t>
-      </w:r>
-      <w:r>
-        <w:rPr>
-          <w:rFonts w:hint="eastAsia"/>
-          <w:lang/>
-        </w:rPr>
-        <w:t>系列为代表，其核心思想是</w:t>
-      </w:r>
-      <w:r>
-        <w:rPr>
-          <w:rFonts w:ascii="Times New Roman" w:eastAsia="Times New Roman" w:hAnsi="Times New Roman" w:cs="Times New Roman"/>
-          <w:lang/>
-        </w:rPr>
-        <w:t>“</w:t>
-      </w:r>
-      <w:r>
-        <w:rPr>
-          <w:rFonts w:hint="eastAsia"/>
-          <w:lang/>
-        </w:rPr>
-        <w:t>先提议后分类</w:t>
-      </w:r>
-      <w:r>
-        <w:rPr>
-          <w:rFonts w:ascii="Times New Roman" w:eastAsia="Times New Roman" w:hAnsi="Times New Roman" w:cs="Times New Roman"/>
-          <w:lang/>
-        </w:rPr>
-        <w:t>”</w:t>
-      </w:r>
-      <w:r>
-        <w:rPr>
-          <w:rFonts w:hint="eastAsia"/>
-          <w:lang/>
-        </w:rPr>
-        <w:t>（</w:t>
-      </w:r>
-      <w:r>
-        <w:rPr>
-          <w:rFonts w:ascii="Times New Roman" w:eastAsia="Times New Roman" w:hAnsi="Times New Roman" w:cs="Times New Roman"/>
-          <w:lang/>
-        </w:rPr>
-        <w:t>propose-then-classify</w:t>
-      </w:r>
-      <w:r>
-        <w:rPr>
-          <w:rFonts w:hint="eastAsia"/>
-          <w:lang/>
-        </w:rPr>
-        <w:t>），将检测任务分解为两个主要步骤</w:t>
-      </w:r>
-      <w:r>
-        <w:rPr>
-          <w:lang/>
-        </w:rPr>
-        <w:t>。</w:t>
-      </w:r>
-    </w:p>
-    <w:p>
-      <w:pPr>
-        <w:spacing w:before="100" w:beforeAutospacing="1" w:after="100" w:afterAutospacing="1"/>
-        <w:rPr>
-          <w:rFonts w:eastAsia="Times New Roman"/>
-          <w:kern w:val="0"/>
-          <w:sz w:val="24"/>
-          <w:lang/>
-        </w:rPr>
-      </w:pPr>
-      <w:r>
-        <w:rPr>
-          <w:rFonts w:ascii="宋体" w:hAnsi="宋体" w:cs="宋体" w:hint="eastAsia"/>
-          <w:kern w:val="0"/>
-          <w:sz w:val="24"/>
-          <w:lang/>
-        </w:rPr>
-        <w:t>该系列的开山之作是</w:t>
-      </w:r>
-      <w:r>
-        <w:rPr>
-          <w:rFonts w:eastAsia="Times New Roman"/>
-          <w:kern w:val="0"/>
-          <w:sz w:val="24"/>
-          <w:lang/>
-        </w:rPr>
-        <w:t>Girshick</w:t>
-      </w:r>
-      <w:r>
-        <w:rPr>
-          <w:rFonts w:ascii="宋体" w:hAnsi="宋体" w:cs="宋体" w:hint="eastAsia"/>
-          <w:kern w:val="0"/>
-          <w:sz w:val="24"/>
-          <w:lang/>
-        </w:rPr>
-        <w:t>等人于</w:t>
-      </w:r>
-      <w:r>
-        <w:rPr>
-          <w:rFonts w:eastAsia="Times New Roman"/>
-          <w:kern w:val="0"/>
-          <w:sz w:val="24"/>
-          <w:lang/>
-        </w:rPr>
-        <w:t>2014</w:t>
-      </w:r>
-      <w:r>
-        <w:rPr>
-          <w:rFonts w:ascii="宋体" w:hAnsi="宋体" w:cs="宋体" w:hint="eastAsia"/>
-          <w:kern w:val="0"/>
-          <w:sz w:val="24"/>
-          <w:lang/>
-        </w:rPr>
-        <w:t>年提出的</w:t>
-      </w:r>
-      <w:r>
-        <w:rPr>
-          <w:rFonts w:eastAsia="Times New Roman"/>
-          <w:kern w:val="0"/>
-          <w:sz w:val="24"/>
-          <w:lang/>
-        </w:rPr>
-        <w:t>R-CNN</w:t>
-      </w:r>
-      <w:r>
-        <w:rPr>
-          <w:rFonts w:ascii="宋体" w:hAnsi="宋体" w:cs="宋体" w:hint="eastAsia"/>
-          <w:kern w:val="0"/>
-          <w:sz w:val="24"/>
-          <w:lang/>
-        </w:rPr>
-        <w:t>（</w:t>
-      </w:r>
-      <w:r>
-        <w:rPr>
-          <w:rFonts w:eastAsia="Times New Roman"/>
-          <w:kern w:val="0"/>
-          <w:sz w:val="24"/>
-          <w:lang/>
-        </w:rPr>
-        <w:t>Regions with CNN features</w:t>
-      </w:r>
-      <w:r>
-        <w:rPr>
-          <w:rFonts w:ascii="宋体" w:hAnsi="宋体" w:cs="宋体" w:hint="eastAsia"/>
-          <w:kern w:val="0"/>
-          <w:sz w:val="24"/>
-          <w:lang/>
-        </w:rPr>
-        <w:t>）。</w:t>
-      </w:r>
-      <w:r>
-        <w:rPr>
-          <w:rFonts w:eastAsia="Times New Roman"/>
-          <w:kern w:val="0"/>
-          <w:sz w:val="24"/>
-          <w:lang/>
-        </w:rPr>
-        <w:t>R-CNN</w:t>
-      </w:r>
-      <w:r>
-        <w:rPr>
-          <w:rFonts w:ascii="宋体" w:hAnsi="宋体" w:cs="宋体" w:hint="eastAsia"/>
-          <w:kern w:val="0"/>
-          <w:sz w:val="24"/>
-          <w:lang/>
-        </w:rPr>
-        <w:t>首先使用一种与类别无关的区域提议算法（如</w:t>
-      </w:r>
-      <w:r>
-        <w:rPr>
-          <w:rFonts w:eastAsia="Times New Roman"/>
-          <w:kern w:val="0"/>
-          <w:sz w:val="24"/>
-          <w:lang/>
-        </w:rPr>
-        <w:t>Selective Search</w:t>
-      </w:r>
-      <w:r>
-        <w:rPr>
-          <w:rFonts w:ascii="宋体" w:hAnsi="宋体" w:cs="宋体" w:hint="eastAsia"/>
-          <w:kern w:val="0"/>
-          <w:sz w:val="24"/>
-          <w:lang/>
-        </w:rPr>
-        <w:t>）在输入图像上生成约</w:t>
-      </w:r>
-      <w:r>
-        <w:rPr>
-          <w:rFonts w:eastAsia="Times New Roman"/>
-          <w:kern w:val="0"/>
-          <w:sz w:val="24"/>
-          <w:lang/>
-        </w:rPr>
-        <w:t>2000</w:t>
-      </w:r>
-      <w:r>
-        <w:rPr>
-          <w:rFonts w:ascii="宋体" w:hAnsi="宋体" w:cs="宋体" w:hint="eastAsia"/>
-          <w:kern w:val="0"/>
-          <w:sz w:val="24"/>
-          <w:lang/>
-        </w:rPr>
-        <w:t>个可能包含目标的候选区域（</w:t>
-      </w:r>
-      <w:r>
-        <w:rPr>
-          <w:rFonts w:eastAsia="Times New Roman"/>
-          <w:kern w:val="0"/>
-          <w:sz w:val="24"/>
-          <w:lang/>
-        </w:rPr>
-        <w:t>Region of Interest, RoI</w:t>
-      </w:r>
-      <w:r>
-        <w:rPr>
-          <w:rFonts w:ascii="宋体" w:hAnsi="宋体" w:cs="宋体" w:hint="eastAsia"/>
-          <w:kern w:val="0"/>
-          <w:sz w:val="24"/>
-          <w:lang/>
-        </w:rPr>
-        <w:t>）。然后，每个候选区域被缩放到固定尺寸，并独立地送入一个</w:t>
-      </w:r>
-      <w:r>
-        <w:rPr>
-          <w:rFonts w:eastAsia="Times New Roman"/>
-          <w:kern w:val="0"/>
-          <w:sz w:val="24"/>
-          <w:lang/>
-        </w:rPr>
-        <w:t>CNN</w:t>
-      </w:r>
-      <w:r>
-        <w:rPr>
-          <w:rFonts w:ascii="宋体" w:hAnsi="宋体" w:cs="宋体" w:hint="eastAsia"/>
-          <w:kern w:val="0"/>
-          <w:sz w:val="24"/>
-          <w:lang/>
-        </w:rPr>
-        <w:t>中提取特征。最后，使用一组线性的支持向量机（</w:t>
-      </w:r>
-      <w:r>
-        <w:rPr>
-          <w:rFonts w:eastAsia="Times New Roman"/>
-          <w:kern w:val="0"/>
-          <w:sz w:val="24"/>
-          <w:lang/>
-        </w:rPr>
-        <w:t>SVM</w:t>
-      </w:r>
-      <w:r>
-        <w:rPr>
-          <w:rFonts w:ascii="宋体" w:hAnsi="宋体" w:cs="宋体" w:hint="eastAsia"/>
-          <w:kern w:val="0"/>
-          <w:sz w:val="24"/>
-          <w:lang/>
-        </w:rPr>
-        <w:t>）对这些特征进行分类，并用一个边界框回归器对位置进行微调</w:t>
-      </w:r>
-      <w:r>
-        <w:rPr>
-          <w:rFonts w:eastAsia="Times New Roman"/>
-          <w:kern w:val="0"/>
-          <w:sz w:val="24"/>
-          <w:lang/>
-        </w:rPr>
-        <w:t xml:space="preserve"> </w:t>
-      </w:r>
-      <w:r>
-        <w:rPr>
-          <w:rFonts w:ascii="宋体" w:hAnsi="宋体" w:cs="宋体" w:hint="eastAsia"/>
-          <w:kern w:val="0"/>
-          <w:sz w:val="24"/>
-          <w:lang/>
-        </w:rPr>
-        <w:t>。</w:t>
-      </w:r>
-      <w:r>
-        <w:rPr>
-          <w:rFonts w:eastAsia="Times New Roman"/>
-          <w:kern w:val="0"/>
-          <w:sz w:val="24"/>
-          <w:lang/>
-        </w:rPr>
-        <w:t>R-CNN</w:t>
-      </w:r>
-      <w:r>
-        <w:rPr>
-          <w:rFonts w:ascii="宋体" w:hAnsi="宋体" w:cs="宋体" w:hint="eastAsia"/>
-          <w:kern w:val="0"/>
-          <w:sz w:val="24"/>
-          <w:lang/>
-        </w:rPr>
-        <w:t>的提出，首次将</w:t>
-      </w:r>
-      <w:r>
-        <w:rPr>
-          <w:rFonts w:eastAsia="Times New Roman"/>
-          <w:kern w:val="0"/>
-          <w:sz w:val="24"/>
-          <w:lang/>
-        </w:rPr>
-        <w:t>CNN</w:t>
-      </w:r>
-      <w:r>
-        <w:rPr>
-          <w:rFonts w:ascii="宋体" w:hAnsi="宋体" w:cs="宋体" w:hint="eastAsia"/>
-          <w:kern w:val="0"/>
-          <w:sz w:val="24"/>
-          <w:lang/>
-        </w:rPr>
-        <w:t>的强大特征表示能力引入目标检测，在</w:t>
-      </w:r>
-      <w:r>
-        <w:rPr>
-          <w:rFonts w:eastAsia="Times New Roman"/>
-          <w:kern w:val="0"/>
-          <w:sz w:val="24"/>
-          <w:lang/>
-        </w:rPr>
-        <w:t>PASCAL VOC</w:t>
-      </w:r>
-      <w:r>
-        <w:rPr>
-          <w:rFonts w:ascii="宋体" w:hAnsi="宋体" w:cs="宋体" w:hint="eastAsia"/>
-          <w:kern w:val="0"/>
-          <w:sz w:val="24"/>
-          <w:lang/>
-        </w:rPr>
-        <w:t>等基准测试上取得了前所未有的性能提升</w:t>
-      </w:r>
-      <w:r>
-        <w:rPr>
-          <w:rFonts w:eastAsia="Times New Roman"/>
-          <w:kern w:val="0"/>
-          <w:sz w:val="24"/>
-          <w:lang/>
-        </w:rPr>
-        <w:t xml:space="preserve"> </w:t>
-      </w:r>
-      <w:r>
-        <w:rPr>
-          <w:rFonts w:ascii="宋体" w:hAnsi="宋体" w:cs="宋体" w:hint="eastAsia"/>
-          <w:kern w:val="0"/>
-          <w:sz w:val="24"/>
-          <w:lang/>
-        </w:rPr>
-        <w:t>。然而，其计算成本极为高昂，因为需要对数千个重叠的候选区域独立进行</w:t>
-      </w:r>
-      <w:r>
-        <w:rPr>
-          <w:rFonts w:eastAsia="Times New Roman"/>
-          <w:kern w:val="0"/>
-          <w:sz w:val="24"/>
-          <w:lang/>
-        </w:rPr>
-        <w:t>CNN</w:t>
-      </w:r>
-      <w:r>
-        <w:rPr>
-          <w:rFonts w:ascii="宋体" w:hAnsi="宋体" w:cs="宋体" w:hint="eastAsia"/>
-          <w:kern w:val="0"/>
-          <w:sz w:val="24"/>
-          <w:lang/>
-        </w:rPr>
-        <w:t>前向传播，导致训练和推理速度非常缓慢</w:t>
-      </w:r>
-      <w:r>
-        <w:rPr>
-          <w:rFonts w:eastAsia="Times New Roman"/>
-          <w:kern w:val="0"/>
-          <w:sz w:val="24"/>
-          <w:lang/>
-        </w:rPr>
-        <w:t xml:space="preserve"> </w:t>
-      </w:r>
-      <w:r>
-        <w:rPr>
-          <w:rFonts w:ascii="宋体" w:hAnsi="宋体" w:cs="宋体" w:hint="eastAsia"/>
-          <w:kern w:val="0"/>
-          <w:sz w:val="24"/>
-          <w:lang/>
-        </w:rPr>
-        <w:t>。</w:t>
-      </w:r>
-      <w:r>
-        <w:rPr>
-          <w:rFonts w:eastAsia="Times New Roman"/>
-          <w:kern w:val="0"/>
-          <w:sz w:val="24"/>
-          <w:lang/>
-        </w:rPr>
-        <w:t xml:space="preserve">   </w:t>
-      </w:r>
-    </w:p>
-    <w:p>
-      <w:pPr>
-        <w:spacing w:before="100" w:beforeAutospacing="1" w:after="100" w:afterAutospacing="1"/>
-        <w:rPr>
-          <w:rFonts w:eastAsia="Times New Roman"/>
-          <w:kern w:val="0"/>
-          <w:sz w:val="24"/>
-          <w:lang/>
-        </w:rPr>
-      </w:pPr>
-      <w:r>
-        <w:rPr>
-          <w:rFonts w:ascii="宋体" w:hAnsi="宋体" w:cs="宋体" w:hint="eastAsia"/>
-          <w:kern w:val="0"/>
-          <w:sz w:val="24"/>
-          <w:lang/>
-        </w:rPr>
-        <w:t>为了解决</w:t>
-      </w:r>
-      <w:r>
-        <w:rPr>
-          <w:rFonts w:eastAsia="Times New Roman"/>
-          <w:kern w:val="0"/>
-          <w:sz w:val="24"/>
-          <w:lang/>
-        </w:rPr>
-        <w:t>R-CNN</w:t>
-      </w:r>
-      <w:r>
-        <w:rPr>
-          <w:rFonts w:ascii="宋体" w:hAnsi="宋体" w:cs="宋体" w:hint="eastAsia"/>
-          <w:kern w:val="0"/>
-          <w:sz w:val="24"/>
-          <w:lang/>
-        </w:rPr>
-        <w:t>的速度瓶颈，</w:t>
-      </w:r>
-      <w:r>
-        <w:rPr>
-          <w:rFonts w:eastAsia="Times New Roman"/>
-          <w:kern w:val="0"/>
-          <w:sz w:val="24"/>
-          <w:lang/>
-        </w:rPr>
-        <w:t>Girshick</w:t>
-      </w:r>
-      <w:r>
-        <w:rPr>
-          <w:rFonts w:ascii="宋体" w:hAnsi="宋体" w:cs="宋体" w:hint="eastAsia"/>
-          <w:kern w:val="0"/>
-          <w:sz w:val="24"/>
-          <w:lang/>
-        </w:rPr>
-        <w:t>在</w:t>
-      </w:r>
-      <w:r>
-        <w:rPr>
-          <w:rFonts w:eastAsia="Times New Roman"/>
-          <w:kern w:val="0"/>
-          <w:sz w:val="24"/>
-          <w:lang/>
-        </w:rPr>
-        <w:t>2015</w:t>
-      </w:r>
-      <w:r>
-        <w:rPr>
-          <w:rFonts w:ascii="宋体" w:hAnsi="宋体" w:cs="宋体" w:hint="eastAsia"/>
-          <w:kern w:val="0"/>
-          <w:sz w:val="24"/>
-          <w:lang/>
-        </w:rPr>
-        <w:t>年提出了</w:t>
-      </w:r>
-      <w:r>
-        <w:rPr>
-          <w:rFonts w:eastAsia="Times New Roman"/>
-          <w:kern w:val="0"/>
-          <w:sz w:val="24"/>
-          <w:lang/>
-        </w:rPr>
-        <w:t xml:space="preserve">Fast R-CNN </w:t>
-      </w:r>
-      <w:r>
-        <w:rPr>
-          <w:rFonts w:ascii="宋体" w:hAnsi="宋体" w:cs="宋体" w:hint="eastAsia"/>
-          <w:kern w:val="0"/>
-          <w:sz w:val="24"/>
-          <w:lang/>
-        </w:rPr>
-        <w:t>。其关键创新在于，不再独立处理每个候选区域，而是先将整张图像输入</w:t>
-      </w:r>
-      <w:r>
-        <w:rPr>
-          <w:rFonts w:eastAsia="Times New Roman"/>
-          <w:kern w:val="0"/>
-          <w:sz w:val="24"/>
-          <w:lang/>
-        </w:rPr>
-        <w:t>CNN</w:t>
-      </w:r>
-      <w:r>
-        <w:rPr>
-          <w:rFonts w:ascii="宋体" w:hAnsi="宋体" w:cs="宋体" w:hint="eastAsia"/>
-          <w:kern w:val="0"/>
-          <w:sz w:val="24"/>
-          <w:lang/>
-        </w:rPr>
-        <w:t>，生成一个全局的卷积特征图。然后，将候选区域的位置映射到这个特征图上，并通过一个称为</w:t>
-      </w:r>
-      <w:r>
-        <w:rPr>
-          <w:rFonts w:eastAsia="Times New Roman"/>
-          <w:kern w:val="0"/>
-          <w:sz w:val="24"/>
-          <w:lang/>
-        </w:rPr>
-        <w:t>RoI Pooling</w:t>
-      </w:r>
-      <w:r>
-        <w:rPr>
-          <w:rFonts w:ascii="宋体" w:hAnsi="宋体" w:cs="宋体" w:hint="eastAsia"/>
-          <w:kern w:val="0"/>
-          <w:sz w:val="24"/>
-          <w:lang/>
-        </w:rPr>
-        <w:t>的层从特征图中为每个候选区域提取一个固定大小的特征向量。这些特征向量随后被送入全连接层进行分类和边界框回归</w:t>
-      </w:r>
-      <w:r>
-        <w:rPr>
-          <w:rFonts w:eastAsia="Times New Roman"/>
-          <w:kern w:val="0"/>
-          <w:sz w:val="24"/>
-          <w:lang/>
-        </w:rPr>
-        <w:t xml:space="preserve"> </w:t>
-      </w:r>
-      <w:r>
-        <w:rPr>
-          <w:rFonts w:ascii="宋体" w:hAnsi="宋体" w:cs="宋体" w:hint="eastAsia"/>
-          <w:kern w:val="0"/>
-          <w:sz w:val="24"/>
-          <w:lang/>
-        </w:rPr>
-        <w:t>。通过在候选区域之间共享卷积计算，</w:t>
-      </w:r>
-      <w:r>
-        <w:rPr>
-          <w:rFonts w:eastAsia="Times New Roman"/>
-          <w:kern w:val="0"/>
-          <w:sz w:val="24"/>
-          <w:lang/>
-        </w:rPr>
-        <w:t>Fast R-CNN</w:t>
-      </w:r>
-      <w:r>
-        <w:rPr>
-          <w:rFonts w:ascii="宋体" w:hAnsi="宋体" w:cs="宋体" w:hint="eastAsia"/>
-          <w:kern w:val="0"/>
-          <w:sz w:val="24"/>
-          <w:lang/>
-        </w:rPr>
-        <w:t>极大地提升了训练和测试速度</w:t>
-      </w:r>
-      <w:r>
-        <w:rPr>
-          <w:rFonts w:eastAsia="Times New Roman"/>
-          <w:kern w:val="0"/>
-          <w:sz w:val="24"/>
-          <w:lang/>
-        </w:rPr>
-        <w:t xml:space="preserve"> </w:t>
-      </w:r>
-      <w:r>
-        <w:rPr>
-          <w:rFonts w:ascii="宋体" w:hAnsi="宋体" w:cs="宋体"/>
-          <w:kern w:val="0"/>
-          <w:sz w:val="24"/>
-          <w:lang/>
-        </w:rPr>
-        <w:t>。</w:t>
-      </w:r>
-    </w:p>
-    <w:p>
-      <w:pPr>
-        <w:spacing w:before="100" w:beforeAutospacing="1" w:after="100" w:afterAutospacing="1"/>
-        <w:rPr>
-          <w:rFonts w:eastAsia="Times New Roman"/>
-          <w:kern w:val="0"/>
-          <w:sz w:val="24"/>
-          <w:lang/>
-        </w:rPr>
-      </w:pPr>
-      <w:r>
-        <w:rPr>
-          <w:rFonts w:ascii="宋体" w:hAnsi="宋体" w:cs="宋体" w:hint="eastAsia"/>
-          <w:kern w:val="0"/>
-          <w:sz w:val="24"/>
-          <w:lang/>
-        </w:rPr>
-        <w:t>尽管速度有所提升，</w:t>
-      </w:r>
-      <w:r>
-        <w:rPr>
-          <w:rFonts w:eastAsia="Times New Roman"/>
-          <w:kern w:val="0"/>
-          <w:sz w:val="24"/>
-          <w:lang/>
-        </w:rPr>
-        <w:t>Fast R-CNN</w:t>
-      </w:r>
-      <w:r>
-        <w:rPr>
-          <w:rFonts w:ascii="宋体" w:hAnsi="宋体" w:cs="宋体" w:hint="eastAsia"/>
-          <w:kern w:val="0"/>
-          <w:sz w:val="24"/>
-          <w:lang/>
-        </w:rPr>
-        <w:t>的性能瓶颈转移到了外部的区域提议算法上。为了实现一个真正端到端的检测系统，</w:t>
-      </w:r>
-      <w:r>
-        <w:rPr>
-          <w:rFonts w:eastAsia="Times New Roman"/>
-          <w:kern w:val="0"/>
-          <w:sz w:val="24"/>
-          <w:lang/>
-        </w:rPr>
-        <w:t>Ren</w:t>
-      </w:r>
-      <w:r>
-        <w:rPr>
-          <w:rFonts w:ascii="宋体" w:hAnsi="宋体" w:cs="宋体" w:hint="eastAsia"/>
-          <w:kern w:val="0"/>
-          <w:sz w:val="24"/>
-          <w:lang/>
-        </w:rPr>
-        <w:t>等人于</w:t>
-      </w:r>
-      <w:r>
-        <w:rPr>
-          <w:rFonts w:eastAsia="Times New Roman"/>
-          <w:kern w:val="0"/>
-          <w:sz w:val="24"/>
-          <w:lang/>
-        </w:rPr>
-        <w:t>2015</w:t>
-      </w:r>
-      <w:r>
-        <w:rPr>
-          <w:rFonts w:ascii="宋体" w:hAnsi="宋体" w:cs="宋体" w:hint="eastAsia"/>
-          <w:kern w:val="0"/>
-          <w:sz w:val="24"/>
-          <w:lang/>
-        </w:rPr>
-        <w:t>年提出了</w:t>
-      </w:r>
-      <w:r>
-        <w:rPr>
-          <w:rFonts w:eastAsia="Times New Roman"/>
-          <w:kern w:val="0"/>
-          <w:sz w:val="24"/>
-          <w:lang/>
-        </w:rPr>
-        <w:t xml:space="preserve">Faster R-CNN </w:t>
-      </w:r>
-      <w:r>
-        <w:rPr>
-          <w:rFonts w:ascii="宋体" w:hAnsi="宋体" w:cs="宋体" w:hint="eastAsia"/>
-          <w:kern w:val="0"/>
-          <w:sz w:val="24"/>
-          <w:lang/>
-        </w:rPr>
-        <w:t>。其核心贡献是设计了一个区域提议网络（</w:t>
-      </w:r>
-      <w:r>
-        <w:rPr>
-          <w:rFonts w:eastAsia="Times New Roman"/>
-          <w:kern w:val="0"/>
-          <w:sz w:val="24"/>
-          <w:lang/>
-        </w:rPr>
-        <w:t>Region Proposal Network, RPN</w:t>
-      </w:r>
-      <w:r>
-        <w:rPr>
-          <w:rFonts w:ascii="宋体" w:hAnsi="宋体" w:cs="宋体" w:hint="eastAsia"/>
-          <w:kern w:val="0"/>
-          <w:sz w:val="24"/>
-          <w:lang/>
-        </w:rPr>
-        <w:t>），这是一个小型的全卷积网络，能够与检测网络共享卷积特征，并高效地预测出高质量的候选区域</w:t>
-      </w:r>
-      <w:r>
-        <w:rPr>
-          <w:rFonts w:eastAsia="Times New Roman"/>
-          <w:kern w:val="0"/>
-          <w:sz w:val="24"/>
-          <w:lang/>
-        </w:rPr>
-        <w:t xml:space="preserve"> </w:t>
-      </w:r>
-      <w:r>
-        <w:rPr>
-          <w:rFonts w:ascii="宋体" w:hAnsi="宋体" w:cs="宋体" w:hint="eastAsia"/>
-          <w:kern w:val="0"/>
-          <w:sz w:val="24"/>
-          <w:lang/>
-        </w:rPr>
-        <w:t>。通过将区域提议步骤集成到神经网络内部，</w:t>
-      </w:r>
-      <w:r>
-        <w:rPr>
-          <w:rFonts w:eastAsia="Times New Roman"/>
-          <w:kern w:val="0"/>
-          <w:sz w:val="24"/>
-          <w:lang/>
-        </w:rPr>
-        <w:t>Faster R-CNN</w:t>
-      </w:r>
-      <w:r>
-        <w:rPr>
-          <w:rFonts w:ascii="宋体" w:hAnsi="宋体" w:cs="宋体" w:hint="eastAsia"/>
-          <w:kern w:val="0"/>
-          <w:sz w:val="24"/>
-          <w:lang/>
-        </w:rPr>
-        <w:t>首次实现了近乎实时的端到端目标检测，成为后续许多两阶段检测算法的基石</w:t>
-      </w:r>
-      <w:r>
-        <w:rPr>
-          <w:rFonts w:eastAsia="Times New Roman"/>
-          <w:kern w:val="0"/>
-          <w:sz w:val="24"/>
-          <w:lang/>
-        </w:rPr>
-        <w:t xml:space="preserve"> </w:t>
-      </w:r>
-      <w:r>
-        <w:rPr>
-          <w:rFonts w:ascii="宋体" w:hAnsi="宋体" w:cs="宋体" w:hint="eastAsia"/>
-          <w:kern w:val="0"/>
-          <w:sz w:val="24"/>
-          <w:lang/>
-        </w:rPr>
-        <w:t>。</w:t>
-      </w:r>
-      <w:r>
-        <w:rPr>
-          <w:rFonts w:eastAsia="Times New Roman"/>
-          <w:kern w:val="0"/>
-          <w:sz w:val="24"/>
-          <w:lang/>
-        </w:rPr>
-        <w:t xml:space="preserve">   </w:t>
-      </w:r>
-    </w:p>
-    <w:p>
-      <w:pPr>
-        <w:spacing w:before="100" w:beforeAutospacing="1" w:after="100" w:afterAutospacing="1"/>
-        <w:rPr>
           <w:rFonts w:eastAsia="Times New Roman" w:hint="eastAsia"/>
-          <w:kern w:val="0"/>
-          <w:sz w:val="24"/>
-          <w:lang/>
-        </w:rPr>
-      </w:pPr>
-      <w:r>
-        <w:rPr>
-          <w:rFonts w:ascii="宋体" w:hAnsi="宋体" w:cs="宋体" w:hint="eastAsia"/>
-          <w:kern w:val="0"/>
-          <w:sz w:val="24"/>
-          <w:lang/>
-        </w:rPr>
-        <w:t>总而言之，以</w:t>
-      </w:r>
-      <w:r>
-        <w:rPr>
-          <w:rFonts w:eastAsia="Times New Roman"/>
-          <w:kern w:val="0"/>
-          <w:sz w:val="24"/>
-          <w:lang/>
-        </w:rPr>
-        <w:t>Faster R-CNN</w:t>
-      </w:r>
-      <w:r>
-        <w:rPr>
-          <w:rFonts w:ascii="宋体" w:hAnsi="宋体" w:cs="宋体" w:hint="eastAsia"/>
-          <w:kern w:val="0"/>
-          <w:sz w:val="24"/>
-          <w:lang/>
-        </w:rPr>
-        <w:t>为代表的两阶段检测算法通常能够达到很高的检测精度，因为它们将定位和分类任务解耦，可以对候选区域进行精细的调整和识别。然而，其多步骤的流程依然带来了较大的计算开销，推理速度相对较慢，难以完全满足道路巡检等需要高帧率实时处理的任务要求</w:t>
-      </w:r>
-      <w:r>
-        <w:rPr>
-          <w:rFonts w:eastAsia="Times New Roman"/>
-          <w:kern w:val="0"/>
-          <w:sz w:val="24"/>
-          <w:lang/>
-        </w:rPr>
-        <w:t xml:space="preserve"> </w:t>
-      </w:r>
-      <w:r>
-        <w:rPr>
-          <w:rFonts w:ascii="宋体" w:hAnsi="宋体" w:cs="宋体"/>
-          <w:kern w:val="0"/>
-          <w:sz w:val="24"/>
-          <w:lang/>
-        </w:rPr>
-        <w:t>。</w:t>
-      </w:r>
+          <w:lang/>
+        </w:rPr>
+      </w:pPr>
     </w:p>
     <w:p>
       <w:pPr>
@@ -7902,6 +8137,420 @@
           <w:color w:val="000000" w:themeColor="text1"/>
         </w:rPr>
         <w:t>总结</w:t>
+      </w:r>
+    </w:p>
+    <w:p>
+      <w:pPr>
+        <w:pStyle w:val="ac"/>
+        <w:rPr>
+          <w:rFonts w:ascii="Times New Roman" w:eastAsia="Times New Roman" w:hAnsi="Times New Roman" w:cs="Times New Roman"/>
+          <w:lang/>
+        </w:rPr>
+      </w:pPr>
+      <w:r>
+        <w:rPr>
+          <w:rFonts w:ascii="Times New Roman" w:hAnsi="Times New Roman"/>
+          <w:kern w:val="44"/>
+          <w:lang w:bidi="ar"/>
+        </w:rPr>
+        <w:t>通过对基于深度学习的道路病害检测的当前研究现状分析可知，当前基于卷积神经网络模型来解决该问题的方案已日趋成熟，特别是</w:t>
+      </w:r>
+      <w:r>
+        <w:rPr>
+          <w:rFonts w:ascii="Times New Roman" w:hAnsi="Times New Roman"/>
+          <w:kern w:val="44"/>
+          <w:lang w:bidi="ar"/>
+        </w:rPr>
+        <w:t>YOLO</w:t>
+      </w:r>
+      <w:r>
+        <w:rPr>
+          <w:rFonts w:ascii="Times New Roman" w:hAnsi="Times New Roman"/>
+          <w:kern w:val="44"/>
+          <w:lang w:bidi="ar"/>
+        </w:rPr>
+        <w:t>系列算法在实时性与精度上取得了良好平衡</w:t>
+      </w:r>
+      <w:r>
+        <w:rPr>
+          <w:rFonts w:ascii="Times New Roman" w:hAnsi="Times New Roman"/>
+          <w:kern w:val="44"/>
+          <w:lang w:bidi="ar"/>
+        </w:rPr>
+        <w:t xml:space="preserve"> </w:t>
+      </w:r>
+      <w:r>
+        <w:rPr>
+          <w:rFonts w:ascii="Times New Roman" w:hAnsi="Times New Roman"/>
+          <w:kern w:val="44"/>
+          <w:lang w:bidi="ar"/>
+        </w:rPr>
+        <w:t>。本文从传统方法到深度学习方法，系统地总结并分析了近年来的相关研究现状。但近些年，目标检测模型的参数量剧增，性能提升却可能微乎其微，并且占用硬件资源开销大，推理与训练时间长，并不能很好地将其直接应用于资源受限的边缘设备</w:t>
+      </w:r>
+      <w:r>
+        <w:rPr>
+          <w:rFonts w:ascii="Times New Roman" w:hAnsi="Times New Roman"/>
+          <w:kern w:val="44"/>
+          <w:lang w:bidi="ar"/>
+        </w:rPr>
+        <w:t xml:space="preserve"> </w:t>
+      </w:r>
+      <w:r>
+        <w:rPr>
+          <w:rFonts w:ascii="Times New Roman" w:hAnsi="Times New Roman"/>
+          <w:kern w:val="44"/>
+          <w:lang w:bidi="ar"/>
+        </w:rPr>
+        <w:t>。本研究拟提出的改进</w:t>
+      </w:r>
+      <w:r>
+        <w:rPr>
+          <w:rFonts w:ascii="Times New Roman" w:hAnsi="Times New Roman"/>
+          <w:kern w:val="44"/>
+          <w:lang w:bidi="ar"/>
+        </w:rPr>
+        <w:t>YOLOv12</w:t>
+      </w:r>
+      <w:r>
+        <w:rPr>
+          <w:rFonts w:ascii="Times New Roman" w:hAnsi="Times New Roman"/>
+          <w:kern w:val="44"/>
+          <w:lang w:bidi="ar"/>
+        </w:rPr>
+        <w:t>模型，正是为了解决这一挑战，通过融合轻量化设计与高效注意力机制，旨在实现一个在精度、速度和模型复杂度上更优的道路病害实时检测模型</w:t>
+      </w:r>
+      <w:r>
+        <w:rPr>
+          <w:rFonts w:ascii="Times New Roman" w:hAnsi="Times New Roman"/>
+          <w:kern w:val="44"/>
+          <w:lang w:bidi="ar"/>
+        </w:rPr>
+        <w:t xml:space="preserve"> </w:t>
+      </w:r>
+      <w:r>
+        <w:rPr>
+          <w:rFonts w:ascii="Times New Roman" w:hAnsi="Times New Roman"/>
+          <w:kern w:val="44"/>
+          <w:lang w:bidi="ar"/>
+        </w:rPr>
+        <w:t>。</w:t>
+      </w:r>
+      <w:r>
+        <w:rPr>
+          <w:rFonts w:hint="eastAsia"/>
+          <w:lang/>
+        </w:rPr>
+        <w:t>通过对基于深度学习的道路病害检测的当前研究现状分析可知，当前基于卷积神经网络模型来解决该问题的方案已日趋成熟。本文从传统图像处理方法到深度学习方法，系统地总结并分析了近年来的相关研究现状。传统方法因其对复杂环境的鲁棒性差，已基本被深度学习方法所取代。在深度学习范式下，以</w:t>
+      </w:r>
+      <w:r>
+        <w:rPr>
+          <w:rFonts w:ascii="Times New Roman" w:eastAsia="Times New Roman" w:hAnsi="Times New Roman" w:cs="Times New Roman"/>
+          <w:lang/>
+        </w:rPr>
+        <w:t>YOLO</w:t>
+      </w:r>
+      <w:r>
+        <w:rPr>
+          <w:rFonts w:hint="eastAsia"/>
+          <w:lang/>
+        </w:rPr>
+        <w:t>系列为代表的</w:t>
+      </w:r>
+      <w:proofErr w:type="gramStart"/>
+      <w:r>
+        <w:rPr>
+          <w:rFonts w:hint="eastAsia"/>
+          <w:lang/>
+        </w:rPr>
+        <w:t>单阶段</w:t>
+      </w:r>
+      <w:proofErr w:type="gramEnd"/>
+      <w:r>
+        <w:rPr>
+          <w:rFonts w:hint="eastAsia"/>
+          <w:lang/>
+        </w:rPr>
+        <w:t>目标检测算法，凭借其在实时性与精度上取得的良好平衡，已成为该领域的主流选择</w:t>
+      </w:r>
+      <w:r>
+        <w:rPr>
+          <w:rFonts w:ascii="Times New Roman" w:eastAsia="Times New Roman" w:hAnsi="Times New Roman" w:cs="Times New Roman"/>
+          <w:lang/>
+        </w:rPr>
+        <w:t xml:space="preserve"> </w:t>
+      </w:r>
+      <w:r>
+        <w:rPr>
+          <w:lang/>
+        </w:rPr>
+        <w:t>。</w:t>
+      </w:r>
+    </w:p>
+    <w:p>
+      <w:pPr>
+        <w:spacing w:before="100" w:beforeAutospacing="1" w:after="100" w:afterAutospacing="1"/>
+        <w:rPr>
+          <w:rFonts w:eastAsia="Times New Roman"/>
+          <w:kern w:val="0"/>
+          <w:sz w:val="24"/>
+          <w:lang/>
+        </w:rPr>
+      </w:pPr>
+      <w:r>
+        <w:rPr>
+          <w:rFonts w:ascii="宋体" w:hAnsi="宋体" w:cs="宋体" w:hint="eastAsia"/>
+          <w:kern w:val="0"/>
+          <w:sz w:val="24"/>
+          <w:lang/>
+        </w:rPr>
+        <w:t>然而，随着近年来目标检测模型向更深、更复杂的方向发展，一个突出的问题是模型参数量和计算量的急剧增长</w:t>
+      </w:r>
+      <w:r>
+        <w:rPr>
+          <w:rFonts w:eastAsia="Times New Roman"/>
+          <w:kern w:val="0"/>
+          <w:sz w:val="24"/>
+          <w:lang/>
+        </w:rPr>
+        <w:t xml:space="preserve"> </w:t>
+      </w:r>
+      <w:r>
+        <w:rPr>
+          <w:rFonts w:ascii="宋体" w:hAnsi="宋体" w:cs="宋体" w:hint="eastAsia"/>
+          <w:kern w:val="0"/>
+          <w:sz w:val="24"/>
+          <w:lang/>
+        </w:rPr>
+        <w:t>。这种增长虽然可能带来性能上的边际提升，但同时也导致了巨大的硬件资源开销以及漫长的训练与推理时间，使得这些先进模型难以直接部署于资源受限的边缘计算设备（如车载系统、无人机等）。这揭示了当前研究的一个核心挑战：如何在追求高检测精度的同时，有效控制模型的复杂度，以满足真实世界应用的部署需求</w:t>
+      </w:r>
+      <w:r>
+        <w:rPr>
+          <w:rFonts w:ascii="宋体" w:hAnsi="宋体" w:cs="宋体"/>
+          <w:kern w:val="0"/>
+          <w:sz w:val="24"/>
+          <w:lang/>
+        </w:rPr>
+        <w:t>。</w:t>
+      </w:r>
+    </w:p>
+    <w:p>
+      <w:pPr>
+        <w:spacing w:before="100" w:beforeAutospacing="1" w:after="100" w:afterAutospacing="1"/>
+        <w:rPr>
+          <w:rFonts w:eastAsia="Times New Roman"/>
+          <w:kern w:val="0"/>
+          <w:sz w:val="24"/>
+          <w:lang/>
+        </w:rPr>
+      </w:pPr>
+      <w:r>
+        <w:rPr>
+          <w:rFonts w:ascii="宋体" w:hAnsi="宋体" w:cs="宋体" w:hint="eastAsia"/>
+          <w:kern w:val="0"/>
+          <w:sz w:val="24"/>
+          <w:lang/>
+        </w:rPr>
+        <w:t>为了应对这一挑战，学术界和工业界已经形成了两大明确的研究方向：模型轻量化和注意力机制。前者通过设计更高效的神经网络结构（如</w:t>
+      </w:r>
+      <w:r>
+        <w:rPr>
+          <w:rFonts w:eastAsia="Times New Roman"/>
+          <w:kern w:val="0"/>
+          <w:sz w:val="24"/>
+          <w:lang/>
+        </w:rPr>
+        <w:t xml:space="preserve">MobileNet </w:t>
+      </w:r>
+      <w:r>
+        <w:rPr>
+          <w:rFonts w:ascii="宋体" w:hAnsi="宋体" w:cs="宋体" w:hint="eastAsia"/>
+          <w:kern w:val="0"/>
+          <w:sz w:val="24"/>
+          <w:lang/>
+        </w:rPr>
+        <w:t>、</w:t>
+      </w:r>
+      <w:r>
+        <w:rPr>
+          <w:rFonts w:eastAsia="Times New Roman"/>
+          <w:kern w:val="0"/>
+          <w:sz w:val="24"/>
+          <w:lang/>
+        </w:rPr>
+        <w:t xml:space="preserve">ShuffleNet </w:t>
+      </w:r>
+      <w:r>
+        <w:rPr>
+          <w:rFonts w:ascii="宋体" w:hAnsi="宋体" w:cs="宋体" w:hint="eastAsia"/>
+          <w:kern w:val="0"/>
+          <w:sz w:val="24"/>
+          <w:lang/>
+        </w:rPr>
+        <w:t>、</w:t>
+      </w:r>
+      <w:r>
+        <w:rPr>
+          <w:rFonts w:eastAsia="Times New Roman"/>
+          <w:kern w:val="0"/>
+          <w:sz w:val="24"/>
+          <w:lang/>
+        </w:rPr>
+        <w:t xml:space="preserve">GhostNet </w:t>
+      </w:r>
+      <w:r>
+        <w:rPr>
+          <w:rFonts w:ascii="宋体" w:hAnsi="宋体" w:cs="宋体" w:hint="eastAsia"/>
+          <w:kern w:val="0"/>
+          <w:sz w:val="24"/>
+          <w:lang/>
+        </w:rPr>
+        <w:t>）来从根本上降低计算成本；后者则通过模拟人类视觉系统（如</w:t>
+      </w:r>
+      <w:r>
+        <w:rPr>
+          <w:rFonts w:eastAsia="Times New Roman"/>
+          <w:kern w:val="0"/>
+          <w:sz w:val="24"/>
+          <w:lang/>
+        </w:rPr>
+        <w:t xml:space="preserve">SE-Net </w:t>
+      </w:r>
+      <w:r>
+        <w:rPr>
+          <w:rFonts w:ascii="宋体" w:hAnsi="宋体" w:cs="宋体" w:hint="eastAsia"/>
+          <w:kern w:val="0"/>
+          <w:sz w:val="24"/>
+          <w:lang/>
+        </w:rPr>
+        <w:t>、</w:t>
+      </w:r>
+      <w:r>
+        <w:rPr>
+          <w:rFonts w:eastAsia="Times New Roman"/>
+          <w:kern w:val="0"/>
+          <w:sz w:val="24"/>
+          <w:lang/>
+        </w:rPr>
+        <w:t xml:space="preserve">CBAM </w:t>
+      </w:r>
+      <w:r>
+        <w:rPr>
+          <w:rFonts w:ascii="宋体" w:hAnsi="宋体" w:cs="宋体" w:hint="eastAsia"/>
+          <w:kern w:val="0"/>
+          <w:sz w:val="24"/>
+          <w:lang/>
+        </w:rPr>
+        <w:t>、</w:t>
+      </w:r>
+      <w:r>
+        <w:rPr>
+          <w:rFonts w:eastAsia="Times New Roman"/>
+          <w:kern w:val="0"/>
+          <w:sz w:val="24"/>
+          <w:lang/>
+        </w:rPr>
+        <w:t xml:space="preserve">SimAM </w:t>
+      </w:r>
+      <w:r>
+        <w:rPr>
+          <w:rFonts w:ascii="宋体" w:hAnsi="宋体" w:cs="宋体" w:hint="eastAsia"/>
+          <w:kern w:val="0"/>
+          <w:sz w:val="24"/>
+          <w:lang/>
+        </w:rPr>
+        <w:t>），让模型以极小的代价智能地聚焦于关键信息，从而弥补轻量化可能带来的精度损失</w:t>
+      </w:r>
+      <w:r>
+        <w:rPr>
+          <w:rFonts w:ascii="宋体" w:hAnsi="宋体" w:cs="宋体"/>
+          <w:kern w:val="0"/>
+          <w:sz w:val="24"/>
+          <w:lang/>
+        </w:rPr>
+        <w:t>。</w:t>
+      </w:r>
+    </w:p>
+    <w:p>
+      <w:pPr>
+        <w:spacing w:before="100" w:beforeAutospacing="1" w:after="100" w:afterAutospacing="1"/>
+        <w:rPr>
+          <w:rFonts w:eastAsia="Times New Roman"/>
+          <w:kern w:val="0"/>
+          <w:sz w:val="24"/>
+          <w:lang/>
+        </w:rPr>
+      </w:pPr>
+      <w:r>
+        <w:rPr>
+          <w:rFonts w:ascii="宋体" w:hAnsi="宋体" w:cs="宋体" w:hint="eastAsia"/>
+          <w:kern w:val="0"/>
+          <w:sz w:val="24"/>
+          <w:lang/>
+        </w:rPr>
+        <w:t>当前的研究现状表明，未来的发展趋势并非简单地追求单一指标的极致，而是在一个多维度的优化空间中寻找最佳平衡点。一个理想的道路病害检测模型，应是在满足实际应用场景（如车载实时检测）对速度（</w:t>
+      </w:r>
+      <w:r>
+        <w:rPr>
+          <w:rFonts w:eastAsia="Times New Roman"/>
+          <w:kern w:val="0"/>
+          <w:sz w:val="24"/>
+          <w:lang/>
+        </w:rPr>
+        <w:t>FPS</w:t>
+      </w:r>
+      <w:r>
+        <w:rPr>
+          <w:rFonts w:ascii="宋体" w:hAnsi="宋体" w:cs="宋体" w:hint="eastAsia"/>
+          <w:kern w:val="0"/>
+          <w:sz w:val="24"/>
+          <w:lang/>
+        </w:rPr>
+        <w:t>）和模型大小的严格约束下，最大化其检测精度（</w:t>
+      </w:r>
+      <w:r>
+        <w:rPr>
+          <w:rFonts w:eastAsia="Times New Roman"/>
+          <w:kern w:val="0"/>
+          <w:sz w:val="24"/>
+          <w:lang/>
+        </w:rPr>
+        <w:t>mAP</w:t>
+      </w:r>
+      <w:r>
+        <w:rPr>
+          <w:rFonts w:ascii="宋体" w:hAnsi="宋体" w:cs="宋体" w:hint="eastAsia"/>
+          <w:kern w:val="0"/>
+          <w:sz w:val="24"/>
+          <w:lang/>
+        </w:rPr>
+        <w:t>）。本研究拟提出的改进</w:t>
+      </w:r>
+      <w:r>
+        <w:rPr>
+          <w:rFonts w:eastAsia="Times New Roman"/>
+          <w:kern w:val="0"/>
+          <w:sz w:val="24"/>
+          <w:lang/>
+        </w:rPr>
+        <w:t>YOLOv12</w:t>
+      </w:r>
+      <w:r>
+        <w:rPr>
+          <w:rFonts w:ascii="宋体" w:hAnsi="宋体" w:cs="宋体" w:hint="eastAsia"/>
+          <w:kern w:val="0"/>
+          <w:sz w:val="24"/>
+          <w:lang/>
+        </w:rPr>
+        <w:t>模型，正是为了解决这一挑战。通过有机地融合先进的轻量化设计理念与高效的注意力机制，本研究旨在探索一个新的、更优的架构，实现一个在精度、速度和模型复杂度上达到更佳权衡的道路病害实时检测模型</w:t>
+      </w:r>
+      <w:r>
+        <w:rPr>
+          <w:rFonts w:ascii="宋体" w:hAnsi="宋体" w:cs="宋体"/>
+          <w:kern w:val="0"/>
+          <w:sz w:val="24"/>
+          <w:lang/>
+        </w:rPr>
+        <w:t>。</w:t>
       </w:r>
     </w:p>
     <w:p>
@@ -7922,94 +8571,6 @@
           <w:docGrid w:type="lines" w:linePitch="436"/>
         </w:sectPr>
       </w:pPr>
-      <w:r>
-        <w:rPr>
-          <w:rFonts w:ascii="Times New Roman" w:hAnsi="Times New Roman"/>
-          <w:kern w:val="44"/>
-          <w:lang w:bidi="ar"/>
-        </w:rPr>
-        <w:t>通过对基于深度学习的道路病害检测的当前研究现状分析可知，当前基于卷积神经网络模型来解决该问题的方案已日趋成熟，特别是</w:t>
-      </w:r>
-      <w:r>
-        <w:rPr>
-          <w:rFonts w:ascii="Times New Roman" w:hAnsi="Times New Roman"/>
-          <w:kern w:val="44"/>
-          <w:lang w:bidi="ar"/>
-        </w:rPr>
-        <w:t>YOLO</w:t>
-      </w:r>
-      <w:r>
-        <w:rPr>
-          <w:rFonts w:ascii="Times New Roman" w:hAnsi="Times New Roman"/>
-          <w:kern w:val="44"/>
-          <w:lang w:bidi="ar"/>
-        </w:rPr>
-        <w:t>系列算法在实时性与精度上取得了良好平衡</w:t>
-      </w:r>
-      <w:r>
-        <w:rPr>
-          <w:rFonts w:ascii="Times New Roman" w:hAnsi="Times New Roman"/>
-          <w:kern w:val="44"/>
-          <w:lang w:bidi="ar"/>
-        </w:rPr>
-        <w:t xml:space="preserve"> </w:t>
-      </w:r>
-      <w:r>
-        <w:rPr>
-          <w:rFonts w:ascii="Times New Roman" w:hAnsi="Times New Roman"/>
-          <w:kern w:val="44"/>
-          <w:lang w:bidi="ar"/>
-        </w:rPr>
-        <w:t>。本文从传统方法到深度学习方法，系统地总结并分析了近年来的相关研究现状。但近些年，目标检测模型的参数量剧增，性能提升却可能微乎其微，并且占用硬件资源开销大，推理与训练时间长，并不能很好地将其直接应用于资源受限的边缘设备</w:t>
-      </w:r>
-      <w:r>
-        <w:rPr>
-          <w:rFonts w:ascii="Times New Roman" w:hAnsi="Times New Roman"/>
-          <w:kern w:val="44"/>
-          <w:lang w:bidi="ar"/>
-        </w:rPr>
-        <w:t xml:space="preserve"> </w:t>
-      </w:r>
-      <w:r>
-        <w:rPr>
-          <w:rFonts w:ascii="Times New Roman" w:hAnsi="Times New Roman"/>
-          <w:kern w:val="44"/>
-          <w:lang w:bidi="ar"/>
-        </w:rPr>
-        <w:t>。本研究拟提出的改进</w:t>
-      </w:r>
-      <w:r>
-        <w:rPr>
-          <w:rFonts w:ascii="Times New Roman" w:hAnsi="Times New Roman"/>
-          <w:kern w:val="44"/>
-          <w:lang w:bidi="ar"/>
-        </w:rPr>
-        <w:t>YOLOv12</w:t>
-      </w:r>
-      <w:r>
-        <w:rPr>
-          <w:rFonts w:ascii="Times New Roman" w:hAnsi="Times New Roman"/>
-          <w:kern w:val="44"/>
-          <w:lang w:bidi="ar"/>
-        </w:rPr>
-        <w:t>模型，正是为了解决这一挑战，通过融合轻量化设计与高效注意力机制，旨在实现一个在精度、速度和模型复杂度上更优的道路病害实时检测模型</w:t>
-      </w:r>
-      <w:r>
-        <w:rPr>
-          <w:rFonts w:ascii="Times New Roman" w:hAnsi="Times New Roman"/>
-          <w:kern w:val="44"/>
-          <w:lang w:bidi="ar"/>
-        </w:rPr>
-        <w:t xml:space="preserve"> </w:t>
-      </w:r>
-      <w:r>
-        <w:rPr>
-          <w:rFonts w:ascii="Times New Roman" w:hAnsi="Times New Roman"/>
-          <w:kern w:val="44"/>
-          <w:lang w:bidi="ar"/>
-        </w:rPr>
-        <w:t>。</w:t>
-      </w:r>
     </w:p>
     <w:p>
       <w:pPr>
@@ -8031,6 +8592,1160 @@
         </w:rPr>
         <w:t>参考文献</w:t>
       </w:r>
+    </w:p>
+    <w:p>
+      <w:pPr>
+        <w:rPr>
+          <w:noProof/>
+          <w:sz w:val="20"/>
+        </w:rPr>
+      </w:pPr>
+      <w:r>
+        <w:rPr>
+          <w:noProof/>
+          <w:sz w:val="20"/>
+        </w:rPr>
+        <w:t>Canny J. A computational approach to edge detection [J]. IEEE Transactions on pattern analysis and machine intelligence, 1986, PAMI-8(6): 679-698.</w:t>
+      </w:r>
+    </w:p>
+    <w:p>
+      <w:pPr>
+        <w:rPr>
+          <w:color w:val="000000" w:themeColor="text1"/>
+          <w:sz w:val="24"/>
+        </w:rPr>
+      </w:pPr>
+    </w:p>
+    <w:p>
+      <w:pPr>
+        <w:rPr>
+          <w:noProof/>
+          <w:sz w:val="20"/>
+        </w:rPr>
+      </w:pPr>
+      <w:r>
+        <w:rPr>
+          <w:noProof/>
+          <w:sz w:val="20"/>
+        </w:rPr>
+        <w:t>Otsu N. A threshold selection method from gray-level histograms [J]. IEEE transactions on systems, man, and cybernetics, 1979, 9(1): 62-66.</w:t>
+      </w:r>
+    </w:p>
+    <w:p>
+      <w:pPr>
+        <w:rPr>
+          <w:noProof/>
+          <w:sz w:val="20"/>
+        </w:rPr>
+      </w:pPr>
+    </w:p>
+    <w:p>
+      <w:pPr>
+        <w:rPr>
+          <w:noProof/>
+          <w:sz w:val="20"/>
+        </w:rPr>
+      </w:pPr>
+      <w:r>
+        <w:rPr>
+          <w:noProof/>
+          <w:sz w:val="20"/>
+        </w:rPr>
+        <w:t>Krizhevsky A, Sutskever I, Hinton G E. ImageNet classification with deep convolutional neural networks [C]//Advances in neural information processing systems. 2012, 25.</w:t>
+      </w:r>
+    </w:p>
+    <w:p>
+      <w:pPr>
+        <w:rPr>
+          <w:noProof/>
+          <w:sz w:val="20"/>
+        </w:rPr>
+      </w:pPr>
+    </w:p>
+    <w:p>
+      <w:pPr>
+        <w:rPr>
+          <w:noProof/>
+          <w:sz w:val="20"/>
+        </w:rPr>
+      </w:pPr>
+      <w:r>
+        <w:rPr>
+          <w:noProof/>
+          <w:sz w:val="20"/>
+        </w:rPr>
+        <w:t>Girshick R, Donahue J, Darrell T, et al. Rich feature hierarchies for accurate object detection and semantic segmentation [C]//Proceedings of the IEEE conference on computer vision and pattern recognition. 2014: 580-587.</w:t>
+      </w:r>
+    </w:p>
+    <w:p>
+      <w:pPr>
+        <w:rPr>
+          <w:noProof/>
+          <w:sz w:val="20"/>
+        </w:rPr>
+      </w:pPr>
+    </w:p>
+    <w:p>
+      <w:pPr>
+        <w:rPr>
+          <w:noProof/>
+          <w:sz w:val="20"/>
+        </w:rPr>
+      </w:pPr>
+      <w:r>
+        <w:rPr>
+          <w:noProof/>
+          <w:sz w:val="20"/>
+        </w:rPr>
+        <w:t>Girshick R. Fast r-cnn [C]//Proceedings of the IEEE international conference on computer vision. 2015: 1440-1448.</w:t>
+      </w:r>
+    </w:p>
+    <w:p>
+      <w:pPr>
+        <w:rPr>
+          <w:noProof/>
+          <w:sz w:val="20"/>
+        </w:rPr>
+      </w:pPr>
+    </w:p>
+    <w:p>
+      <w:pPr>
+        <w:rPr>
+          <w:noProof/>
+          <w:sz w:val="20"/>
+        </w:rPr>
+      </w:pPr>
+      <w:r>
+        <w:rPr>
+          <w:noProof/>
+          <w:sz w:val="20"/>
+        </w:rPr>
+        <w:t>Ren S, He K, Girshick R, et al. Faster r-cnn: Towards real-time object detection with region proposal networks [J]. Advances in neural information processing systems, 2015, 28.</w:t>
+      </w:r>
+    </w:p>
+    <w:p>
+      <w:pPr>
+        <w:rPr>
+          <w:noProof/>
+          <w:sz w:val="20"/>
+        </w:rPr>
+      </w:pPr>
+    </w:p>
+    <w:p>
+      <w:pPr>
+        <w:rPr>
+          <w:noProof/>
+          <w:sz w:val="20"/>
+        </w:rPr>
+      </w:pPr>
+      <w:r>
+        <w:rPr>
+          <w:noProof/>
+          <w:sz w:val="20"/>
+        </w:rPr>
+        <w:t>Liu W, Anguelov D, Erhan D, et al. SSD: Single shot multibox detector [C]//European conference on computer vision. Springer, Cham, 2016: 21-37.</w:t>
+      </w:r>
+    </w:p>
+    <w:p>
+      <w:pPr>
+        <w:rPr>
+          <w:noProof/>
+          <w:sz w:val="20"/>
+        </w:rPr>
+      </w:pPr>
+    </w:p>
+    <w:p>
+      <w:pPr>
+        <w:rPr>
+          <w:noProof/>
+          <w:sz w:val="20"/>
+        </w:rPr>
+      </w:pPr>
+      <w:r>
+        <w:rPr>
+          <w:noProof/>
+          <w:sz w:val="20"/>
+        </w:rPr>
+        <w:t>Redmon J, Divvala S, Girshick R, et al. You only look once: Unified, real-time object detection [C]//Proceedings of the IEEE conference on computer vision and pattern recognition. 2016: 779-788.</w:t>
+      </w:r>
+    </w:p>
+    <w:p>
+      <w:pPr>
+        <w:rPr>
+          <w:noProof/>
+          <w:sz w:val="20"/>
+        </w:rPr>
+      </w:pPr>
+    </w:p>
+    <w:p>
+      <w:pPr>
+        <w:rPr>
+          <w:noProof/>
+          <w:sz w:val="20"/>
+        </w:rPr>
+      </w:pPr>
+      <w:r>
+        <w:rPr>
+          <w:noProof/>
+          <w:sz w:val="20"/>
+        </w:rPr>
+        <w:t>Redmon J, Farhadi A. YOLO9000: better, faster, stronger [C]//Proceedings of the IEEE conference on computer vision and pattern recognition. 2017: 7263-7271.</w:t>
+      </w:r>
+    </w:p>
+    <w:p>
+      <w:pPr>
+        <w:rPr>
+          <w:noProof/>
+          <w:sz w:val="20"/>
+        </w:rPr>
+      </w:pPr>
+    </w:p>
+    <w:p>
+      <w:pPr>
+        <w:rPr>
+          <w:noProof/>
+          <w:sz w:val="20"/>
+        </w:rPr>
+      </w:pPr>
+      <w:r>
+        <w:rPr>
+          <w:noProof/>
+          <w:sz w:val="20"/>
+        </w:rPr>
+        <w:t>Redmon J, Farhadi A. YOLOv3: An incremental improvement [J]. arXiv preprint arXiv:1804.02767, 2018.</w:t>
+      </w:r>
+    </w:p>
+    <w:p>
+      <w:pPr>
+        <w:rPr>
+          <w:noProof/>
+          <w:sz w:val="20"/>
+        </w:rPr>
+      </w:pPr>
+    </w:p>
+    <w:p>
+      <w:pPr>
+        <w:rPr>
+          <w:noProof/>
+          <w:sz w:val="20"/>
+        </w:rPr>
+      </w:pPr>
+      <w:r>
+        <w:rPr>
+          <w:noProof/>
+          <w:sz w:val="20"/>
+        </w:rPr>
+        <w:t>Bochkovskiy A, Wang C Y, Liao H Y M. YOLOv4: Optimal speed and accuracy of object detection [J]. arXiv preprint arXiv:2004.10934, 2020.</w:t>
+      </w:r>
+    </w:p>
+    <w:p>
+      <w:pPr>
+        <w:rPr>
+          <w:noProof/>
+          <w:sz w:val="20"/>
+        </w:rPr>
+      </w:pPr>
+    </w:p>
+    <w:p>
+      <w:pPr>
+        <w:rPr>
+          <w:noProof/>
+          <w:sz w:val="20"/>
+        </w:rPr>
+      </w:pPr>
+      <w:r>
+        <w:rPr>
+          <w:noProof/>
+          <w:sz w:val="20"/>
+        </w:rPr>
+        <w:t>Jocher G, Chaurasia A, Stoken A, et al. ultralytics/yolov5: v7.0 - YOLOv5 SOTA Realtime Instance Segmentation. 2022. Available from: https://github.com/ultralytics/yolov5.</w:t>
+      </w:r>
+    </w:p>
+    <w:p>
+      <w:pPr>
+        <w:rPr>
+          <w:noProof/>
+          <w:sz w:val="20"/>
+        </w:rPr>
+      </w:pPr>
+    </w:p>
+    <w:p>
+      <w:pPr>
+        <w:rPr>
+          <w:noProof/>
+          <w:sz w:val="20"/>
+        </w:rPr>
+      </w:pPr>
+      <w:r>
+        <w:rPr>
+          <w:noProof/>
+          <w:sz w:val="20"/>
+        </w:rPr>
+        <w:t>Jocher G, Chaurasia A, Qiu J. ultralytics/ultralytics: YOLOv8. 2023. Available from: https://github.com/ultralytics/ultralytics.</w:t>
+      </w:r>
+    </w:p>
+    <w:p>
+      <w:pPr>
+        <w:rPr>
+          <w:noProof/>
+          <w:sz w:val="20"/>
+        </w:rPr>
+      </w:pPr>
+    </w:p>
+    <w:p>
+      <w:pPr>
+        <w:rPr>
+          <w:noProof/>
+          <w:sz w:val="20"/>
+        </w:rPr>
+      </w:pPr>
+      <w:r>
+        <w:rPr>
+          <w:noProof/>
+          <w:sz w:val="20"/>
+        </w:rPr>
+        <w:t>Wang C Y, Yeh I H, Liao H Y M. YOLOv9: Learning what you want to learn using programmable gradient information [J]. arXiv preprint arXiv:2402.13616, 2024.</w:t>
+      </w:r>
+    </w:p>
+    <w:p>
+      <w:pPr>
+        <w:rPr>
+          <w:noProof/>
+          <w:sz w:val="20"/>
+        </w:rPr>
+      </w:pPr>
+    </w:p>
+    <w:p>
+      <w:pPr>
+        <w:rPr>
+          <w:noProof/>
+          <w:sz w:val="20"/>
+        </w:rPr>
+      </w:pPr>
+      <w:r>
+        <w:rPr>
+          <w:noProof/>
+          <w:sz w:val="20"/>
+        </w:rPr>
+        <w:t>Howard A G, Zhu M, Chen B, et al. Mobilenets: Efficient convolutional neural networks for mobile vision applications [J]. arXiv preprint arXiv:1704.04861, 2017.</w:t>
+      </w:r>
+    </w:p>
+    <w:p>
+      <w:pPr>
+        <w:rPr>
+          <w:noProof/>
+          <w:sz w:val="20"/>
+        </w:rPr>
+      </w:pPr>
+    </w:p>
+    <w:p>
+      <w:pPr>
+        <w:rPr>
+          <w:noProof/>
+          <w:sz w:val="20"/>
+        </w:rPr>
+      </w:pPr>
+      <w:r>
+        <w:rPr>
+          <w:noProof/>
+          <w:sz w:val="20"/>
+        </w:rPr>
+        <w:t>Sandler M, Howard A, Zhu M, et al. Mobilenetv2: Inverted residuals and linear bottlenecks [C]//Proceedings of the IEEE conference on computer vision and pattern recognition. 2018: 4510-4520.</w:t>
+      </w:r>
+    </w:p>
+    <w:p>
+      <w:pPr>
+        <w:rPr>
+          <w:noProof/>
+          <w:sz w:val="20"/>
+        </w:rPr>
+      </w:pPr>
+    </w:p>
+    <w:p>
+      <w:pPr>
+        <w:rPr>
+          <w:noProof/>
+          <w:sz w:val="20"/>
+        </w:rPr>
+      </w:pPr>
+      <w:r>
+        <w:rPr>
+          <w:noProof/>
+          <w:sz w:val="20"/>
+        </w:rPr>
+        <w:t>Zhang X, Zhou X, Lin M, et al. Shufflenet: An extremely efficient convolutional neural network for mobile devices [C]//Proceedings of the IEEE conference on computer vision and pattern recognition. 2018: 6848-6856.</w:t>
+      </w:r>
+    </w:p>
+    <w:p>
+      <w:pPr>
+        <w:rPr>
+          <w:noProof/>
+          <w:sz w:val="20"/>
+        </w:rPr>
+      </w:pPr>
+    </w:p>
+    <w:p>
+      <w:pPr>
+        <w:rPr>
+          <w:noProof/>
+          <w:sz w:val="20"/>
+        </w:rPr>
+      </w:pPr>
+      <w:r>
+        <w:rPr>
+          <w:noProof/>
+          <w:sz w:val="20"/>
+        </w:rPr>
+        <w:t>Ma N, Zhang X, Zheng H T, et al. Shufflenet v2: Practical guidelines for efficient cnn architecture design [C]//Proceedings of the European conference on computer vision (ECCV). 2018: 116-131.</w:t>
+      </w:r>
+    </w:p>
+    <w:p>
+      <w:pPr>
+        <w:rPr>
+          <w:noProof/>
+          <w:sz w:val="20"/>
+        </w:rPr>
+      </w:pPr>
+    </w:p>
+    <w:p>
+      <w:pPr>
+        <w:rPr>
+          <w:noProof/>
+          <w:sz w:val="20"/>
+        </w:rPr>
+      </w:pPr>
+      <w:r>
+        <w:rPr>
+          <w:noProof/>
+          <w:sz w:val="20"/>
+        </w:rPr>
+        <w:t>Han K, Wang Y, Tian Q, et al. Ghostnet: More features from cheap operations [C]//Proceedings of the IEEE/CVF conference on computer vision and pattern recognition. 2020: 1580-1589.</w:t>
+      </w:r>
+    </w:p>
+    <w:p>
+      <w:pPr>
+        <w:rPr>
+          <w:noProof/>
+          <w:sz w:val="20"/>
+        </w:rPr>
+      </w:pPr>
+    </w:p>
+    <w:p>
+      <w:pPr>
+        <w:rPr>
+          <w:noProof/>
+          <w:sz w:val="20"/>
+        </w:rPr>
+      </w:pPr>
+      <w:r>
+        <w:rPr>
+          <w:noProof/>
+          <w:sz w:val="20"/>
+        </w:rPr>
+        <w:t>Hu J, Shen L, Sun G. Squeeze-and-excitation networks [C]//Proceedings of the IEEE conference on computer vision and pattern recognition. 2018: 7132-7141.</w:t>
+      </w:r>
+    </w:p>
+    <w:p>
+      <w:pPr>
+        <w:rPr>
+          <w:noProof/>
+          <w:sz w:val="20"/>
+        </w:rPr>
+      </w:pPr>
+    </w:p>
+    <w:p>
+      <w:pPr>
+        <w:rPr>
+          <w:noProof/>
+          <w:sz w:val="20"/>
+        </w:rPr>
+      </w:pPr>
+      <w:r>
+        <w:rPr>
+          <w:noProof/>
+          <w:sz w:val="20"/>
+        </w:rPr>
+        <w:t>Woo S, Park J, Lee J Y, et al. Cbam: Convolutional block attention module [C]//Proceedings of the European conference on computer vision (ECCV). 2018: 3-19.</w:t>
+      </w:r>
+    </w:p>
+    <w:p>
+      <w:pPr>
+        <w:rPr>
+          <w:noProof/>
+          <w:sz w:val="20"/>
+        </w:rPr>
+      </w:pPr>
+    </w:p>
+    <w:p>
+      <w:pPr>
+        <w:rPr>
+          <w:noProof/>
+          <w:sz w:val="20"/>
+        </w:rPr>
+      </w:pPr>
+      <w:r>
+        <w:rPr>
+          <w:noProof/>
+          <w:sz w:val="20"/>
+        </w:rPr>
+        <w:t>Yang L, Zhang R Y, Li L, et al. Simam: A simple, parameter-free attention module for convolutional neural networks [C]//Proceedings of the 38th International Conference on Machine Learning. PMLR, 2021: 11863-11874.</w:t>
+      </w:r>
+    </w:p>
+    <w:p>
+      <w:pPr>
+        <w:rPr>
+          <w:noProof/>
+          <w:sz w:val="20"/>
+        </w:rPr>
+      </w:pPr>
+    </w:p>
+    <w:p>
+      <w:pPr>
+        <w:rPr>
+          <w:noProof/>
+          <w:sz w:val="20"/>
+        </w:rPr>
+      </w:pPr>
+      <w:r>
+        <w:rPr>
+          <w:noProof/>
+          <w:sz w:val="20"/>
+        </w:rPr>
+        <w:t>Arya D, Maeda H, Ghosh S K, et al. RDD2022: A multi-national image dataset for automatic road damage detection [J]. Data in brief, 2022, 45: 108684.</w:t>
+      </w:r>
+    </w:p>
+    <w:p>
+      <w:pPr>
+        <w:rPr>
+          <w:noProof/>
+          <w:sz w:val="20"/>
+        </w:rPr>
+      </w:pPr>
+    </w:p>
+    <w:p>
+      <w:pPr>
+        <w:rPr>
+          <w:noProof/>
+          <w:sz w:val="20"/>
+        </w:rPr>
+      </w:pPr>
+      <w:r>
+        <w:rPr>
+          <w:noProof/>
+          <w:sz w:val="20"/>
+        </w:rPr>
+        <w:t>Everingham M, Van Gool L, Williams C K I, et al. The pascal visual object classes (voc) challenge [J]. International journal of computer vision, 2010, 88(2): 303-338.</w:t>
+      </w:r>
+    </w:p>
+    <w:p>
+      <w:pPr>
+        <w:rPr>
+          <w:noProof/>
+          <w:sz w:val="20"/>
+        </w:rPr>
+      </w:pPr>
+    </w:p>
+    <w:p>
+      <w:pPr>
+        <w:rPr>
+          <w:noProof/>
+          <w:sz w:val="20"/>
+        </w:rPr>
+      </w:pPr>
+      <w:r>
+        <w:rPr>
+          <w:noProof/>
+          <w:sz w:val="20"/>
+        </w:rPr>
+        <w:t>Gonzalez R C, Woods R E. Digital image processing [M]. 2nd ed. Prentice Hall, 2002.</w:t>
+      </w:r>
+    </w:p>
+    <w:p>
+      <w:pPr>
+        <w:rPr>
+          <w:noProof/>
+          <w:sz w:val="20"/>
+        </w:rPr>
+      </w:pPr>
+    </w:p>
+    <w:p>
+      <w:pPr>
+        <w:rPr>
+          <w:noProof/>
+          <w:sz w:val="20"/>
+        </w:rPr>
+      </w:pPr>
+      <w:r>
+        <w:rPr>
+          <w:noProof/>
+          <w:sz w:val="20"/>
+        </w:rPr>
+        <w:t>Gopalakrishnan K. Deep learning in data-driven pavement image analysis and automated distress detection: A review [J]. Data, 2018, 3(3): 28.</w:t>
+      </w:r>
+    </w:p>
+    <w:p>
+      <w:pPr>
+        <w:rPr>
+          <w:noProof/>
+          <w:sz w:val="20"/>
+        </w:rPr>
+      </w:pPr>
+    </w:p>
+    <w:p>
+      <w:pPr>
+        <w:rPr>
+          <w:noProof/>
+          <w:sz w:val="20"/>
+        </w:rPr>
+      </w:pPr>
+      <w:r>
+        <w:rPr>
+          <w:noProof/>
+          <w:sz w:val="20"/>
+        </w:rPr>
+        <w:t>Maeda H, Sekimoto Y, Seto T, et al. Road damage detection and classification using deep neural networks with smartphone images [J]. Computer-Aided Civil and Infrastructure Engineering, 2018, 33(12): 1127-1141.</w:t>
+      </w:r>
+    </w:p>
+    <w:p>
+      <w:pPr>
+        <w:rPr>
+          <w:noProof/>
+          <w:sz w:val="20"/>
+        </w:rPr>
+      </w:pPr>
+    </w:p>
+    <w:p>
+      <w:pPr>
+        <w:rPr>
+          <w:noProof/>
+          <w:sz w:val="20"/>
+        </w:rPr>
+      </w:pPr>
+      <w:r>
+        <w:rPr>
+          <w:noProof/>
+          <w:sz w:val="20"/>
+        </w:rPr>
+        <w:t>Zhang L, Yang F, Zhang D, et al. Road damage detection and classification with faster R-CNN [C]//2017 IEEE International Conference on Mechatronics and Automation (ICMA). IEEE, 2017: 1531-1536.</w:t>
+      </w:r>
+    </w:p>
+    <w:p>
+      <w:pPr>
+        <w:rPr>
+          <w:noProof/>
+          <w:sz w:val="20"/>
+        </w:rPr>
+      </w:pPr>
+    </w:p>
+    <w:p>
+      <w:pPr>
+        <w:rPr>
+          <w:noProof/>
+          <w:sz w:val="20"/>
+        </w:rPr>
+      </w:pPr>
+      <w:r>
+        <w:rPr>
+          <w:noProof/>
+          <w:sz w:val="20"/>
+        </w:rPr>
+        <w:t>Alfarrarjeh A, Kim S H, Kim J H, et al. A deep learning-based system for road damage detection and classification [J]. Sensors, 2020, 20(24): 7189.</w:t>
+      </w:r>
+    </w:p>
+    <w:p>
+      <w:pPr>
+        <w:rPr>
+          <w:noProof/>
+          <w:sz w:val="20"/>
+        </w:rPr>
+      </w:pPr>
+    </w:p>
+    <w:p>
+      <w:pPr>
+        <w:rPr>
+          <w:noProof/>
+          <w:sz w:val="20"/>
+        </w:rPr>
+      </w:pPr>
+      <w:r>
+        <w:rPr>
+          <w:noProof/>
+          <w:sz w:val="20"/>
+        </w:rPr>
+        <w:t>Du Y, Pan N, Xu Z, et al. Pavement distress detection and classification based on YOLO network [J]. International Journal of Pavement Engineering, 2021, 22(12): 1659-1672.</w:t>
+      </w:r>
+    </w:p>
+    <w:p>
+      <w:pPr>
+        <w:rPr>
+          <w:noProof/>
+          <w:sz w:val="20"/>
+        </w:rPr>
+      </w:pPr>
+    </w:p>
+    <w:p>
+      <w:pPr>
+        <w:rPr>
+          <w:noProof/>
+          <w:sz w:val="20"/>
+        </w:rPr>
+      </w:pPr>
+      <w:r>
+        <w:rPr>
+          <w:noProof/>
+          <w:sz w:val="20"/>
+        </w:rPr>
+        <w:t>Naddaf-Sh, M, et al. Cost-effective and accurate road damage detection and localization using a new YOLO-based method [J]. Remote Sensing, 2021, 13(24): 5158.</w:t>
+      </w:r>
+    </w:p>
+    <w:p>
+      <w:pPr>
+        <w:rPr>
+          <w:noProof/>
+          <w:sz w:val="20"/>
+        </w:rPr>
+      </w:pPr>
+    </w:p>
+    <w:p>
+      <w:pPr>
+        <w:rPr>
+          <w:noProof/>
+          <w:sz w:val="20"/>
+        </w:rPr>
+      </w:pPr>
+      <w:r>
+        <w:rPr>
+          <w:noProof/>
+          <w:sz w:val="20"/>
+        </w:rPr>
+        <w:t>Jeong D. A study on the performance of a YOLOv5-based road crack detection model using an unmanned aerial vehicle [J]. Journal of the Korean Society of Surveying, Geodesy, Photogrammetry and Cartography, 2022, 40(6): 483-491.</w:t>
+      </w:r>
+    </w:p>
+    <w:p>
+      <w:pPr>
+        <w:rPr>
+          <w:noProof/>
+          <w:sz w:val="20"/>
+        </w:rPr>
+      </w:pPr>
+    </w:p>
+    <w:p>
+      <w:pPr>
+        <w:rPr>
+          <w:noProof/>
+          <w:sz w:val="20"/>
+        </w:rPr>
+      </w:pPr>
+      <w:r>
+        <w:rPr>
+          <w:noProof/>
+          <w:sz w:val="20"/>
+        </w:rPr>
+        <w:t>Liu Z, Cao J, Gao M, et al. An improved YOLOv7-based model for road-defect detection [J]. Sustainability, 2023, 15(13): 10260.</w:t>
+      </w:r>
+    </w:p>
+    <w:p>
+      <w:pPr>
+        <w:rPr>
+          <w:noProof/>
+          <w:sz w:val="20"/>
+        </w:rPr>
+      </w:pPr>
+    </w:p>
+    <w:p>
+      <w:pPr>
+        <w:rPr>
+          <w:noProof/>
+          <w:sz w:val="20"/>
+        </w:rPr>
+      </w:pPr>
+      <w:r>
+        <w:rPr>
+          <w:noProof/>
+          <w:sz w:val="20"/>
+        </w:rPr>
+        <w:t>Doshi K, Yilmaz Y. Road damage detection using deep ensemble learning [J]. arXiv preprint arXiv:2011.00728, 2020.</w:t>
+      </w:r>
+    </w:p>
+    <w:p>
+      <w:pPr>
+        <w:rPr>
+          <w:noProof/>
+          <w:sz w:val="20"/>
+        </w:rPr>
+      </w:pPr>
+    </w:p>
+    <w:p>
+      <w:pPr>
+        <w:rPr>
+          <w:noProof/>
+          <w:sz w:val="20"/>
+        </w:rPr>
+      </w:pPr>
+      <w:r>
+        <w:rPr>
+          <w:noProof/>
+          <w:sz w:val="20"/>
+        </w:rPr>
+        <w:t>Guo G, Zhang Z. Road damage detection algorithm for improved YOLOv5 [J]. Scientific reports, 2022, 12(1): 15523.</w:t>
+      </w:r>
+    </w:p>
+    <w:p>
+      <w:pPr>
+        <w:rPr>
+          <w:noProof/>
+          <w:sz w:val="20"/>
+        </w:rPr>
+      </w:pPr>
+    </w:p>
+    <w:p>
+      <w:pPr>
+        <w:rPr>
+          <w:noProof/>
+          <w:sz w:val="20"/>
+        </w:rPr>
+      </w:pPr>
+      <w:r>
+        <w:rPr>
+          <w:noProof/>
+          <w:sz w:val="20"/>
+        </w:rPr>
+        <w:t>Zeng J, Zhong H. YOLOv8-PD: An improved road damage detection algorithm based on YOLOv8n model [J]. Scientific Reports, 2024, 14(1): 12052.</w:t>
+      </w:r>
+    </w:p>
+    <w:p>
+      <w:pPr>
+        <w:rPr>
+          <w:noProof/>
+          <w:sz w:val="20"/>
+        </w:rPr>
+      </w:pPr>
+    </w:p>
+    <w:p>
+      <w:pPr>
+        <w:rPr>
+          <w:noProof/>
+          <w:sz w:val="20"/>
+        </w:rPr>
+      </w:pPr>
+      <w:r>
+        <w:rPr>
+          <w:noProof/>
+          <w:sz w:val="20"/>
+        </w:rPr>
+        <w:t>Jiang Y. Road damage detection and classification using deep neural networks [J]. SN Applied Sciences, 2024, 6(3): 421.</w:t>
+      </w:r>
+    </w:p>
+    <w:p>
+      <w:pPr>
+        <w:rPr>
+          <w:noProof/>
+          <w:sz w:val="20"/>
+        </w:rPr>
+      </w:pPr>
+    </w:p>
+    <w:p>
+      <w:pPr>
+        <w:rPr>
+          <w:noProof/>
+          <w:sz w:val="20"/>
+        </w:rPr>
+      </w:pPr>
+      <w:r>
+        <w:rPr>
+          <w:noProof/>
+          <w:sz w:val="20"/>
+        </w:rPr>
+        <w:t>Sakamoto J. Proposal of a flood damage road detection method based on deep learning and elevation data [J]. Geomatics, Natural Hazards and Risk, 2024, 15(1): 2375545.</w:t>
+      </w:r>
+    </w:p>
+    <w:p>
+      <w:pPr>
+        <w:rPr>
+          <w:noProof/>
+          <w:sz w:val="20"/>
+        </w:rPr>
+      </w:pPr>
+    </w:p>
+    <w:p>
+      <w:pPr>
+        <w:rPr>
+          <w:noProof/>
+          <w:sz w:val="20"/>
+        </w:rPr>
+      </w:pPr>
+      <w:r>
+        <w:rPr>
+          <w:noProof/>
+          <w:sz w:val="20"/>
+        </w:rPr>
+        <w:t>Gheidar-Kheljani J, Nasiri M M. A Deep Learning Method for Road Extraction in Disaster Management to Increase the Efficiency of Health Services [J]. Advances in Industrial Engineering, 2024, 58(1): 1-12.</w:t>
+      </w:r>
+    </w:p>
+    <w:p>
+      <w:pPr>
+        <w:rPr>
+          <w:noProof/>
+          <w:sz w:val="20"/>
+        </w:rPr>
+      </w:pPr>
+    </w:p>
+    <w:p>
+      <w:pPr>
+        <w:rPr>
+          <w:noProof/>
+          <w:sz w:val="20"/>
+        </w:rPr>
+      </w:pPr>
+      <w:r>
+        <w:rPr>
+          <w:noProof/>
+          <w:sz w:val="20"/>
+        </w:rPr>
+        <w:t>Karimzadeh M, Asl M H, Sari M R. Road damage detection using deep learning techniques: a review [J]. IEEE Transactions on Intelligent Transportation Systems, 2023.</w:t>
+      </w:r>
+    </w:p>
+    <w:p>
+      <w:pPr>
+        <w:rPr>
+          <w:noProof/>
+          <w:sz w:val="20"/>
+        </w:rPr>
+      </w:pPr>
+    </w:p>
+    <w:p>
+      <w:pPr>
+        <w:rPr>
+          <w:noProof/>
+          <w:sz w:val="20"/>
+        </w:rPr>
+      </w:pPr>
+      <w:r>
+        <w:rPr>
+          <w:noProof/>
+          <w:sz w:val="20"/>
+        </w:rPr>
+        <w:t>Singh D, Saini B S, Singh M. A survey of recent trends in deep learning for road crack detection [J]. Journal of King Saud University-Computer and Information Sciences, 2022, 34(10): 8877-8893.</w:t>
+      </w:r>
+    </w:p>
+    <w:p>
+      <w:pPr>
+        <w:rPr>
+          <w:noProof/>
+          <w:sz w:val="20"/>
+        </w:rPr>
+      </w:pPr>
+    </w:p>
+    <w:p>
+      <w:pPr>
+        <w:rPr>
+          <w:noProof/>
+          <w:sz w:val="20"/>
+        </w:rPr>
+      </w:pPr>
+      <w:r>
+        <w:rPr>
+          <w:noProof/>
+          <w:sz w:val="20"/>
+        </w:rPr>
+        <w:t>Hou Y, Li Q, Zhang C, et al. A survey on deep learning for pavement distress detection [J]. Engineering Applications of Artificial Intelligence, 2021, 104: 104359.</w:t>
+      </w:r>
+    </w:p>
+    <w:p>
+      <w:pPr>
+        <w:rPr>
+          <w:noProof/>
+          <w:sz w:val="20"/>
+        </w:rPr>
+      </w:pPr>
+    </w:p>
+    <w:p>
+      <w:pPr>
+        <w:rPr>
+          <w:noProof/>
+          <w:sz w:val="20"/>
+        </w:rPr>
+      </w:pPr>
+      <w:r>
+        <w:rPr>
+          <w:noProof/>
+          <w:sz w:val="20"/>
+        </w:rPr>
+        <w:t>Fan R, Bocus M J, Zhu Y, et al. Road crack detection using deep convolutional neural networks and adaptive thresholding [J]. IEEE Transactions on Intelligent Transportation Systems, 2020, 22(8): 5006-5017.</w:t>
+      </w:r>
+    </w:p>
+    <w:p>
+      <w:pPr>
+        <w:rPr>
+          <w:noProof/>
+          <w:sz w:val="20"/>
+        </w:rPr>
+      </w:pPr>
+    </w:p>
+    <w:p>
+      <w:pPr>
+        <w:rPr>
+          <w:noProof/>
+          <w:sz w:val="20"/>
+        </w:rPr>
+      </w:pPr>
+      <w:r>
+        <w:rPr>
+          <w:noProof/>
+          <w:sz w:val="20"/>
+        </w:rPr>
+        <w:t>Wang W, Wu B, Yang S, et al. A review of deep learning for road pavement damage detection [J]. International Journal of Pavement Engineering, 2023, 24(1): 2180641.</w:t>
+      </w:r>
+    </w:p>
+    <w:p>
+      <w:pPr>
+        <w:rPr>
+          <w:noProof/>
+          <w:sz w:val="20"/>
+        </w:rPr>
+      </w:pPr>
+    </w:p>
+    <w:p>
+      <w:pPr>
+        <w:rPr>
+          <w:noProof/>
+          <w:sz w:val="20"/>
+        </w:rPr>
+      </w:pPr>
+      <w:r>
+        <w:rPr>
+          <w:noProof/>
+          <w:sz w:val="20"/>
+        </w:rPr>
+        <w:t>Ahmed S, Kamal M, Imtiaz M, et al. A survey on deep learning based road damage detection and classification [J]. Journal of King Saud University-Computer and Information Sciences, 2022, 34(10): 8401-8418.</w:t>
+      </w:r>
+    </w:p>
+    <w:p>
+      <w:pPr>
+        <w:rPr>
+          <w:noProof/>
+          <w:sz w:val="20"/>
+        </w:rPr>
+      </w:pPr>
+    </w:p>
+    <w:p>
+      <w:pPr>
+        <w:rPr>
+          <w:noProof/>
+          <w:sz w:val="20"/>
+        </w:rPr>
+      </w:pPr>
+      <w:r>
+        <w:rPr>
+          <w:noProof/>
+          <w:sz w:val="20"/>
+        </w:rPr>
+        <w:t>Stricker R, Sesselmann M, Seichter D, et al. A deep learning-based approach for road surface damage detection [J]. IEEE Transactions on Intelligent Vehicles, 2022, 7(2): 3403-3418.</w:t>
+      </w:r>
+    </w:p>
+    <w:p>
+      <w:pPr>
+        <w:rPr>
+          <w:noProof/>
+          <w:sz w:val="20"/>
+        </w:rPr>
+      </w:pPr>
+    </w:p>
+    <w:p>
+      <w:pPr>
+        <w:rPr>
+          <w:noProof/>
+          <w:sz w:val="20"/>
+        </w:rPr>
+      </w:pPr>
+      <w:r>
+        <w:rPr>
+          <w:noProof/>
+          <w:sz w:val="20"/>
+        </w:rPr>
+        <w:t>Mednis A, Strazdins G, Zviedris R, et al. Real time pothole detection using android smartphones with accelerometers [C]//2011 International conference on distributed computing in sensor systems and workshops (DCOSS). IEEE, 2011: 1-8.</w:t>
+      </w:r>
+    </w:p>
+    <w:p>
+      <w:pPr>
+        <w:rPr>
+          <w:noProof/>
+          <w:sz w:val="20"/>
+        </w:rPr>
+      </w:pPr>
+    </w:p>
+    <w:p>
+      <w:pPr>
+        <w:rPr>
+          <w:noProof/>
+          <w:sz w:val="20"/>
+        </w:rPr>
+      </w:pPr>
+      <w:r>
+        <w:rPr>
+          <w:noProof/>
+          <w:sz w:val="20"/>
+        </w:rPr>
+        <w:t>Erikson K, Papanikolopoulos N. A vision-based pothole detection system [C]//2001 IEEE intelligent transportation systems conference. 2001: 27-32.</w:t>
+      </w:r>
+    </w:p>
+    <w:p>
+      <w:pPr>
+        <w:rPr>
+          <w:noProof/>
+          <w:sz w:val="20"/>
+        </w:rPr>
+      </w:pPr>
+    </w:p>
+    <w:p>
+      <w:pPr>
+        <w:rPr>
+          <w:noProof/>
+          <w:sz w:val="20"/>
+        </w:rPr>
+      </w:pPr>
+      <w:r>
+        <w:rPr>
+          <w:noProof/>
+          <w:sz w:val="20"/>
+        </w:rPr>
+        <w:t>Koch C, Brilakis I. Pothole detection in asphalt pavement images [J]. Advanced Engineering Informatics, 2011, 25(3): 507-515.</w:t>
+      </w:r>
+    </w:p>
+    <w:p>
+      <w:pPr>
+        <w:rPr>
+          <w:noProof/>
+          <w:sz w:val="20"/>
+        </w:rPr>
+      </w:pPr>
+    </w:p>
+    <w:p>
+      <w:pPr>
+        <w:rPr>
+          <w:noProof/>
+          <w:sz w:val="20"/>
+        </w:rPr>
+      </w:pPr>
+      <w:r>
+        <w:rPr>
+          <w:noProof/>
+          <w:sz w:val="20"/>
+        </w:rPr>
+        <w:t>Mathavan S, Kamal K, Rahman M. A review of three-dimensional imaging technologies for pavement distress detection and measurements [J]. IEEE Transactions on Intelligent Transportation Systems, 2015, 16(5): 2353-2362.</w:t>
+      </w:r>
+    </w:p>
+    <w:p>
+      <w:pPr>
+        <w:pStyle w:val="EndNoteBibliography"/>
+        <w:ind w:left="720" w:hanging="720"/>
+        <w:rPr>
+          <w:rFonts w:ascii="黑体" w:eastAsia="黑体" w:hAnsi="黑体" w:hint="eastAsia"/>
+          <w:color w:val="000000" w:themeColor="text1"/>
+          <w:sz w:val="32"/>
+          <w:szCs w:val="32"/>
+        </w:rPr>
+      </w:pPr>
     </w:p>
     <w:sectPr>
       <w:pgSz w:w="11907" w:h="16840"/>

</xml_diff>

<commit_message>
vault backup: 2025-09-27 00:19:43
</commit_message>
<xml_diff>
--- a/学校/文件/刘非凡-文献综述v2.docx
+++ b/学校/文件/刘非凡-文献综述v2.docx
@@ -1129,7 +1129,6 @@
         </w:rPr>
         <w:t xml:space="preserve"> </w:t>
       </w:r>
-      <w:proofErr w:type="gramStart"/>
       <w:r>
         <w:rPr>
           <w:rFonts w:ascii="宋体" w:hAnsi="宋体" w:hint="eastAsia"/>
@@ -1142,7 +1141,6 @@
         </w:rPr>
         <w:t>车生兵</w:t>
       </w:r>
-      <w:proofErr w:type="gramEnd"/>
       <w:r>
         <w:rPr>
           <w:rFonts w:ascii="宋体" w:hAnsi="宋体" w:hint="eastAsia"/>
@@ -1432,7 +1430,6 @@
         </w:rPr>
         <w:t xml:space="preserve">填写日期：   </w:t>
       </w:r>
-      <w:proofErr w:type="gramStart"/>
       <w:r>
         <w:rPr>
           <w:rFonts w:ascii="宋体" w:hAnsi="宋体"/>
@@ -1464,9 +1461,19 @@
           <w:sz w:val="32"/>
           <w:szCs w:val="32"/>
         </w:rPr>
-        <w:t xml:space="preserve">  年</w:t>
-      </w:r>
-      <w:proofErr w:type="gramEnd"/>
+        <w:t xml:space="preserve">  年 </w:t>
+      </w:r>
+      <w:r>
+        <w:rPr>
+          <w:rFonts w:ascii="宋体" w:hAnsi="宋体"/>
+          <w:b/>
+          <w:color w:val="000000" w:themeColor="text1"/>
+          <w:kern w:val="0"/>
+          <w:sz w:val="32"/>
+          <w:szCs w:val="32"/>
+        </w:rPr>
+        <w:t xml:space="preserve"> </w:t>
+      </w:r>
       <w:r>
         <w:rPr>
           <w:rFonts w:ascii="宋体" w:hAnsi="宋体" w:hint="eastAsia"/>
@@ -1476,7 +1483,7 @@
           <w:sz w:val="32"/>
           <w:szCs w:val="32"/>
         </w:rPr>
-        <w:t xml:space="preserve"> </w:t>
+        <w:t>9</w:t>
       </w:r>
       <w:r>
         <w:rPr>
@@ -1498,7 +1505,7 @@
           <w:sz w:val="32"/>
           <w:szCs w:val="32"/>
         </w:rPr>
-        <w:t>9</w:t>
+        <w:t xml:space="preserve">月 </w:t>
       </w:r>
       <w:r>
         <w:rPr>
@@ -1511,7 +1518,6 @@
         </w:rPr>
         <w:t xml:space="preserve"> </w:t>
       </w:r>
-      <w:proofErr w:type="gramStart"/>
       <w:r>
         <w:rPr>
           <w:rFonts w:ascii="宋体" w:hAnsi="宋体" w:hint="eastAsia"/>
@@ -1521,31 +1527,8 @@
           <w:sz w:val="32"/>
           <w:szCs w:val="32"/>
         </w:rPr>
-        <w:t xml:space="preserve">月 </w:t>
-      </w:r>
-      <w:r>
-        <w:rPr>
-          <w:rFonts w:ascii="宋体" w:hAnsi="宋体"/>
-          <w:b/>
-          <w:color w:val="000000" w:themeColor="text1"/>
-          <w:kern w:val="0"/>
-          <w:sz w:val="32"/>
-          <w:szCs w:val="32"/>
-        </w:rPr>
-        <w:t xml:space="preserve"> </w:t>
-      </w:r>
-      <w:r>
-        <w:rPr>
-          <w:rFonts w:ascii="宋体" w:hAnsi="宋体" w:hint="eastAsia"/>
-          <w:b/>
-          <w:color w:val="000000" w:themeColor="text1"/>
-          <w:kern w:val="0"/>
-          <w:sz w:val="32"/>
-          <w:szCs w:val="32"/>
-        </w:rPr>
         <w:t>20</w:t>
       </w:r>
-      <w:proofErr w:type="gramEnd"/>
       <w:r>
         <w:rPr>
           <w:rFonts w:ascii="宋体" w:hAnsi="宋体" w:hint="eastAsia"/>
@@ -1629,43 +1612,7 @@
           <w:color w:val="000000" w:themeColor="text1"/>
           <w:sz w:val="24"/>
         </w:rPr>
-        <w:t>道路病害检测对于保障交通安全与实现基础设施的智能化维护至关重要。本文首先论述了传统人工巡检方式的局限性，进而系统综述了自动化检测技术的发展脉络。内容涵盖了从基于边缘检测、阈值分割等传统图像处理方法，到以卷积神经网络（CNN）为核心的深度学习方法的范式革命。在深度学习技术路线中，本文重点对比分析了以Faster R-CNN为代表的两阶段检测算法和以YOLO系列为代表的</w:t>
-      </w:r>
-      <w:proofErr w:type="gramStart"/>
-      <w:r>
-        <w:rPr>
-          <w:rFonts w:ascii="宋体" w:hAnsi="宋体"/>
-          <w:color w:val="000000" w:themeColor="text1"/>
-          <w:sz w:val="24"/>
-        </w:rPr>
-        <w:t>单阶段</w:t>
-      </w:r>
-      <w:proofErr w:type="gramEnd"/>
-      <w:r>
-        <w:rPr>
-          <w:rFonts w:ascii="宋体" w:hAnsi="宋体"/>
-          <w:color w:val="000000" w:themeColor="text1"/>
-          <w:sz w:val="24"/>
-        </w:rPr>
-        <w:t>检测算法，并阐明了后者在实时检测任务中的主流地位。针对当前最先进模型（如YOLOv12）在部署于</w:t>
-      </w:r>
-      <w:proofErr w:type="gramStart"/>
-      <w:r>
-        <w:rPr>
-          <w:rFonts w:ascii="宋体" w:hAnsi="宋体"/>
-          <w:color w:val="000000" w:themeColor="text1"/>
-          <w:sz w:val="24"/>
-        </w:rPr>
-        <w:t>车载等</w:t>
-      </w:r>
-      <w:proofErr w:type="gramEnd"/>
-      <w:r>
-        <w:rPr>
-          <w:rFonts w:ascii="宋体" w:hAnsi="宋体"/>
-          <w:color w:val="000000" w:themeColor="text1"/>
-          <w:sz w:val="24"/>
-        </w:rPr>
-        <w:t>边缘计算设备时面临的计算资源瓶颈，本文进一步探讨了两大关键优化技术：一是以</w:t>
+        <w:t>道路病害检测对于保障交通安全与实现基础设施的智能化维护至关重要。本文首先论述了传统人工巡检方式的局限性，进而系统综述了自动化检测技术的发展脉络。内容涵盖了从基于边缘检测、阈值分割等传统图像处理方法，到以卷积神经网络（CNN）为核心的深度学习方法的范式革命。在深度学习技术路线中，本文重点对比分析了以Faster R-CNN为代表的两阶段检测算法和以YOLO系列为代表的单阶段检测算法，并阐明了后者在实时检测任务中的主流地位。针对当前最先进模型（如YOLOv12）在部署于车载等边缘计算设备时面临的计算资源瓶颈，本文进一步探讨了两大关键优化技术：一是以</w:t>
       </w:r>
       <w:proofErr w:type="spellStart"/>
       <w:r>
@@ -2038,63 +1985,25 @@
           <w:rFonts w:hint="eastAsia"/>
           <w:lang/>
         </w:rPr>
-        <w:t>着全球城市化进程的不断加速和机动车保有量的持续攀升，现代社会对交通运输系统的依赖达到了前所未有的高度。在这一背景下，道路作为</w:t>
-      </w:r>
-      <w:proofErr w:type="gramStart"/>
+        <w:t>着全球城市化进程的不断加速和机动车保有量的持续攀升，现代社会对交通运输系统的依赖达到了前所未有的高度。在这一背景下，道路作为最基础的交通基础设施，其健康状况直接关系到交通安全、通行效率乃至区域经济发展。然而，道路结构在其生命周期中，长期承受车辆荷载与自然环境的综合作用，不可避免地会产生裂缝、坑洞等多种形式的病害</w:t>
+      </w:r>
       <w:r>
         <w:rPr>
           <w:rFonts w:hint="eastAsia"/>
           <w:lang/>
         </w:rPr>
-        <w:t>最</w:t>
-      </w:r>
-      <w:proofErr w:type="gramEnd"/>
+        <w:t>。</w:t>
+      </w:r>
       <w:r>
         <w:rPr>
           <w:rFonts w:hint="eastAsia"/>
           <w:lang/>
         </w:rPr>
-        <w:t>基础的交通基础设施，其健康状况直接关系到交通安全、通行效率乃至区域经济发展。然而，道路结构在其生命周期中，长期承受车辆荷载与自然环境的综合作用，不可避免地会产生裂缝、坑洞等多种形式的病害</w:t>
-      </w:r>
-      <w:r>
-        <w:rPr>
-          <w:rFonts w:ascii="Times New Roman" w:eastAsia="Times New Roman" w:hAnsi="Times New Roman" w:cs="Times New Roman"/>
-          <w:lang/>
-        </w:rPr>
-        <w:t xml:space="preserve"> </w:t>
+        <w:t>这些病害若未能得到及时发现与修复，不仅严重影响行车体验，更对行车安全构成直接威胁。研究表明，恶劣的路面状况甚至会导致燃油消耗和碳排放的增加，对环境造成负面影响</w:t>
       </w:r>
       <w:r>
         <w:rPr>
           <w:rFonts w:hint="eastAsia"/>
-          <w:lang/>
-        </w:rPr>
-        <w:t>。这些病害若未能得到及时发现与修复，不仅严重影响行车体验，更对行车安全构成直接威胁。研究表明，恶劣的路面状况甚至会导致燃油消耗和</w:t>
-      </w:r>
-      <w:proofErr w:type="gramStart"/>
-      <w:r>
-        <w:rPr>
-          <w:rFonts w:hint="eastAsia"/>
-          <w:lang/>
-        </w:rPr>
-        <w:t>碳排放</w:t>
-      </w:r>
-      <w:proofErr w:type="gramEnd"/>
-      <w:r>
-        <w:rPr>
-          <w:rFonts w:hint="eastAsia"/>
-          <w:lang/>
-        </w:rPr>
-        <w:t>的增加，对环境造成负面影响</w:t>
-      </w:r>
-      <w:r>
-        <w:rPr>
-          <w:rFonts w:ascii="Times New Roman" w:eastAsia="Times New Roman" w:hAnsi="Times New Roman" w:cs="Times New Roman"/>
-          <w:lang/>
-        </w:rPr>
-        <w:t xml:space="preserve"> </w:t>
-      </w:r>
-      <w:r>
-        <w:rPr>
           <w:lang/>
         </w:rPr>
         <w:t>。</w:t>
@@ -2122,75 +2031,75 @@
       </w:r>
       <w:r>
         <w:rPr>
-          <w:rFonts w:eastAsia="Times New Roman"/>
-          <w:kern w:val="0"/>
-          <w:sz w:val="24"/>
-          <w:lang/>
-        </w:rPr>
-        <w:t xml:space="preserve"> </w:t>
-      </w:r>
-      <w:r>
-        <w:rPr>
-          <w:rFonts w:ascii="宋体" w:hAnsi="宋体" w:cs="宋体" w:hint="eastAsia"/>
-          <w:kern w:val="0"/>
-          <w:sz w:val="24"/>
-          <w:lang/>
-        </w:rPr>
-        <w:t>。这一模式的弊端日益凸显：首先，其劳动强度大、作业效率低下，难以满足现代广阔路网的高频次、全覆盖巡查需求</w:t>
-      </w:r>
-      <w:r>
-        <w:rPr>
-          <w:rFonts w:eastAsia="Times New Roman"/>
-          <w:kern w:val="0"/>
-          <w:sz w:val="24"/>
-          <w:lang/>
-        </w:rPr>
-        <w:t xml:space="preserve"> </w:t>
-      </w:r>
-      <w:r>
-        <w:rPr>
-          <w:rFonts w:ascii="宋体" w:hAnsi="宋体" w:cs="宋体" w:hint="eastAsia"/>
-          <w:kern w:val="0"/>
-          <w:sz w:val="24"/>
-          <w:lang/>
-        </w:rPr>
-        <w:t>。其次，检测结果的准确性严重依赖巡检人员的主观判断，易受疲劳、天气等外部因素干扰，导致数据缺乏一致性和客观性</w:t>
-      </w:r>
-      <w:r>
-        <w:rPr>
-          <w:rFonts w:eastAsia="Times New Roman"/>
-          <w:kern w:val="0"/>
-          <w:sz w:val="24"/>
-          <w:lang/>
-        </w:rPr>
-        <w:t xml:space="preserve"> </w:t>
-      </w:r>
-      <w:r>
-        <w:rPr>
-          <w:rFonts w:ascii="宋体" w:hAnsi="宋体" w:cs="宋体" w:hint="eastAsia"/>
-          <w:kern w:val="0"/>
-          <w:sz w:val="24"/>
-          <w:lang/>
-        </w:rPr>
-        <w:t>。更重要的是，人工巡检往往伴随着高昂的人力成本和潜在的交通安全风险，巡检人员需在车流中作业，安全隐患极大</w:t>
-      </w:r>
-      <w:r>
-        <w:rPr>
-          <w:rFonts w:eastAsia="Times New Roman"/>
-          <w:kern w:val="0"/>
-          <w:sz w:val="24"/>
-          <w:lang/>
-        </w:rPr>
-        <w:t xml:space="preserve"> </w:t>
-      </w:r>
-      <w:r>
-        <w:rPr>
-          <w:rFonts w:ascii="宋体" w:hAnsi="宋体" w:cs="宋体" w:hint="eastAsia"/>
-          <w:kern w:val="0"/>
-          <w:sz w:val="24"/>
-          <w:lang/>
-        </w:rPr>
-        <w:t>。这种传统的、反应式的养护模式（即</w:t>
+          <w:rFonts w:ascii="宋体" w:hAnsi="宋体" w:cs="宋体" w:hint="eastAsia"/>
+          <w:kern w:val="0"/>
+          <w:sz w:val="24"/>
+          <w:lang/>
+        </w:rPr>
+        <w:t>。</w:t>
+      </w:r>
+      <w:r>
+        <w:rPr>
+          <w:rFonts w:ascii="宋体" w:hAnsi="宋体" w:cs="宋体" w:hint="eastAsia"/>
+          <w:kern w:val="0"/>
+          <w:sz w:val="24"/>
+          <w:lang/>
+        </w:rPr>
+        <w:t>这一模式的弊端日益凸显：首先，其劳动强度大、作业效率低下，难以满足现代广阔路网的高频次、全覆盖巡查需求</w:t>
+      </w:r>
+      <w:r>
+        <w:rPr>
+          <w:rFonts w:ascii="宋体" w:hAnsi="宋体" w:cs="宋体" w:hint="eastAsia"/>
+          <w:kern w:val="0"/>
+          <w:sz w:val="24"/>
+          <w:lang/>
+        </w:rPr>
+        <w:t>。</w:t>
+      </w:r>
+      <w:r>
+        <w:rPr>
+          <w:rFonts w:ascii="宋体" w:hAnsi="宋体" w:cs="宋体" w:hint="eastAsia"/>
+          <w:kern w:val="0"/>
+          <w:sz w:val="24"/>
+          <w:lang/>
+        </w:rPr>
+        <w:t>其次，检测结果的准确性严重依赖巡检人员的主观判断，易受疲劳、天气等外部因素干扰，导致数据缺乏一致性和客观性</w:t>
+      </w:r>
+      <w:r>
+        <w:rPr>
+          <w:rFonts w:ascii="宋体" w:hAnsi="宋体" w:cs="宋体" w:hint="eastAsia"/>
+          <w:kern w:val="0"/>
+          <w:sz w:val="24"/>
+          <w:lang/>
+        </w:rPr>
+        <w:t>。</w:t>
+      </w:r>
+      <w:r>
+        <w:rPr>
+          <w:rFonts w:ascii="宋体" w:hAnsi="宋体" w:cs="宋体" w:hint="eastAsia"/>
+          <w:kern w:val="0"/>
+          <w:sz w:val="24"/>
+          <w:lang/>
+        </w:rPr>
+        <w:t>更重要的是，人工巡检往往伴随着高昂的人力成本和潜在的交通安全风险，巡检人员需在车流中作业，安全隐患极大</w:t>
+      </w:r>
+      <w:r>
+        <w:rPr>
+          <w:rFonts w:ascii="宋体" w:hAnsi="宋体" w:cs="宋体" w:hint="eastAsia"/>
+          <w:kern w:val="0"/>
+          <w:sz w:val="24"/>
+          <w:lang/>
+        </w:rPr>
+        <w:t>。</w:t>
+      </w:r>
+      <w:r>
+        <w:rPr>
+          <w:rFonts w:ascii="宋体" w:hAnsi="宋体" w:cs="宋体" w:hint="eastAsia"/>
+          <w:kern w:val="0"/>
+          <w:sz w:val="24"/>
+          <w:lang/>
+        </w:rPr>
+        <w:t>这种传统的、反应式的养护模式（即</w:t>
       </w:r>
       <w:r>
         <w:rPr>
@@ -2260,6 +2169,24 @@
       </w:r>
       <w:r>
         <w:rPr>
+          <w:rFonts w:ascii="宋体" w:hAnsi="宋体" w:cs="宋体" w:hint="eastAsia"/>
+          <w:kern w:val="0"/>
+          <w:sz w:val="24"/>
+          <w:lang/>
+        </w:rPr>
+        <w:t>。</w:t>
+      </w:r>
+      <w:r>
+        <w:rPr>
+          <w:rFonts w:ascii="宋体" w:hAnsi="宋体" w:cs="宋体" w:hint="eastAsia"/>
+          <w:kern w:val="0"/>
+          <w:sz w:val="24"/>
+          <w:lang/>
+        </w:rPr>
+        <w:t>让计算机模仿人类视觉系统，自动识别并定位图像中的关键目标（即道路病害），不仅能极大提升巡检效率、降低成本，更能实现从主观、稀疏的数据采集向客观、密集的数据驱动决策的转变。这种转变是实现智能交通系统和自动化基础设施管理的关键一步，能够为道路养护部门提供前所未有的数据洞察力，从而优化资源分配，实施预防性维护，最终提升整个交通网络的安全性和耐久性</w:t>
+      </w:r>
+      <w:r>
+        <w:rPr>
           <w:rFonts w:eastAsia="Times New Roman"/>
           <w:kern w:val="0"/>
           <w:sz w:val="24"/>
@@ -2269,40 +2196,32 @@
       </w:r>
       <w:r>
         <w:rPr>
-          <w:rFonts w:ascii="宋体" w:hAnsi="宋体" w:cs="宋体" w:hint="eastAsia"/>
-          <w:kern w:val="0"/>
-          <w:sz w:val="24"/>
-          <w:lang/>
-        </w:rPr>
-        <w:t>。让计算机模仿人类视觉系统，自动识别并定位图像中的关键目标（即道路病害），不仅能极大提升巡检效率、降低成本，更能实现从主观、稀疏的数据采集向客观、密集的数据驱动决策的转变。这种转变是实现智能交通系统和自动化基础设施管理的关键一步，能够为道路养护部门提供前所未有的数据洞察力，从而优化资源分配，实施预防性维护，最终提升整个交通网络的安全性和耐久性</w:t>
-      </w:r>
-      <w:r>
-        <w:rPr>
-          <w:rFonts w:eastAsia="Times New Roman"/>
-          <w:kern w:val="0"/>
-          <w:sz w:val="24"/>
-          <w:lang/>
-        </w:rPr>
-        <w:t xml:space="preserve"> </w:t>
-      </w:r>
-      <w:r>
-        <w:rPr>
           <w:rFonts w:eastAsia="Times New Roman"/>
           <w:kern w:val="0"/>
           <w:sz w:val="24"/>
           <w:vertAlign w:val="superscript"/>
           <w:lang/>
         </w:rPr>
-        <w:t xml:space="preserve">1 </w:t>
-      </w:r>
-      <w:r>
-        <w:rPr>
-          <w:rFonts w:ascii="宋体" w:hAnsi="宋体" w:cs="宋体" w:hint="eastAsia"/>
-          <w:kern w:val="0"/>
-          <w:sz w:val="24"/>
-          <w:lang/>
-        </w:rPr>
-        <w:t>。本研究旨在深入探索并改进道路病害检测这一自动化检测技术，以期为智慧交通和自动驾驶等前沿技术提供关键的数据支持。</w:t>
+        <w:t>1</w:t>
+      </w:r>
+      <w:r>
+        <w:rPr>
+          <w:rFonts w:ascii="宋体" w:hAnsi="宋体" w:cs="宋体" w:hint="eastAsia"/>
+          <w:kern w:val="0"/>
+          <w:sz w:val="24"/>
+          <w:vertAlign w:val="superscript"/>
+          <w:lang/>
+        </w:rPr>
+        <w:t>。</w:t>
+      </w:r>
+      <w:r>
+        <w:rPr>
+          <w:rFonts w:ascii="宋体" w:hAnsi="宋体" w:cs="宋体" w:hint="eastAsia"/>
+          <w:kern w:val="0"/>
+          <w:sz w:val="24"/>
+          <w:lang/>
+        </w:rPr>
+        <w:t>本研究旨在深入探索并改进道路病害检测这一自动化检测技术，以期为智慧交通和自动驾驶等前沿技术提供关键的数据支持。</w:t>
       </w:r>
       <w:r>
         <w:rPr>
@@ -2559,7 +2478,211 @@
           <w:sz w:val="24"/>
           <w:lang/>
         </w:rPr>
-        <w:t>算子</w:t>
+        <w:t>算子，通过一对</w:t>
+      </w:r>
+      <w:r>
+        <w:rPr>
+          <w:rFonts w:eastAsia="Times New Roman"/>
+          <w:kern w:val="0"/>
+          <w:sz w:val="24"/>
+          <w:lang/>
+        </w:rPr>
+        <w:t>3x3</w:t>
+      </w:r>
+      <w:r>
+        <w:rPr>
+          <w:rFonts w:ascii="宋体" w:hAnsi="宋体" w:cs="宋体" w:hint="eastAsia"/>
+          <w:kern w:val="0"/>
+          <w:sz w:val="24"/>
+          <w:lang/>
+        </w:rPr>
+        <w:t>的卷积核来近似计算图像的梯度，从而突出显示边缘</w:t>
+      </w:r>
+      <w:r>
+        <w:rPr>
+          <w:rFonts w:ascii="宋体" w:hAnsi="宋体" w:cs="宋体" w:hint="eastAsia"/>
+          <w:kern w:val="0"/>
+          <w:sz w:val="24"/>
+          <w:lang/>
+        </w:rPr>
+        <w:t>。</w:t>
+      </w:r>
+      <w:r>
+        <w:rPr>
+          <w:rFonts w:eastAsia="Times New Roman"/>
+          <w:kern w:val="0"/>
+          <w:sz w:val="24"/>
+          <w:lang/>
+        </w:rPr>
+        <w:t>Canny</w:t>
+      </w:r>
+      <w:r>
+        <w:rPr>
+          <w:rFonts w:ascii="宋体" w:hAnsi="宋体" w:cs="宋体" w:hint="eastAsia"/>
+          <w:kern w:val="0"/>
+          <w:sz w:val="24"/>
+          <w:lang/>
+        </w:rPr>
+        <w:t>于</w:t>
+      </w:r>
+      <w:r>
+        <w:rPr>
+          <w:rFonts w:eastAsia="Times New Roman"/>
+          <w:kern w:val="0"/>
+          <w:sz w:val="24"/>
+          <w:lang/>
+        </w:rPr>
+        <w:t>1986</w:t>
+      </w:r>
+      <w:r>
+        <w:rPr>
+          <w:rFonts w:ascii="宋体" w:hAnsi="宋体" w:cs="宋体" w:hint="eastAsia"/>
+          <w:kern w:val="0"/>
+          <w:sz w:val="24"/>
+          <w:lang/>
+        </w:rPr>
+        <w:t>年提出的</w:t>
+      </w:r>
+      <w:r>
+        <w:rPr>
+          <w:rFonts w:eastAsia="Times New Roman"/>
+          <w:kern w:val="0"/>
+          <w:sz w:val="24"/>
+          <w:lang/>
+        </w:rPr>
+        <w:t>Canny</w:t>
+      </w:r>
+      <w:r>
+        <w:rPr>
+          <w:rFonts w:ascii="宋体" w:hAnsi="宋体" w:cs="宋体" w:hint="eastAsia"/>
+          <w:kern w:val="0"/>
+          <w:sz w:val="24"/>
+          <w:lang/>
+        </w:rPr>
+        <w:t>边缘检测算法则更为复杂和有效，它通过高斯滤波降噪、计算梯度强度与方向、非极大值抑制以及双阈值和滞后连接等一系列步骤，能够生成更清晰、更连续的边缘</w:t>
+      </w:r>
+      <w:r>
+        <w:rPr>
+          <w:rFonts w:ascii="宋体" w:hAnsi="宋体" w:cs="宋体"/>
+          <w:kern w:val="0"/>
+          <w:sz w:val="24"/>
+        </w:rPr>
+        <w:fldChar w:fldCharType="begin"/>
+      </w:r>
+      <w:r>
+        <w:rPr>
+          <w:rFonts w:ascii="宋体" w:hAnsi="宋体" w:cs="宋体"/>
+          <w:kern w:val="0"/>
+          <w:sz w:val="24"/>
+        </w:rPr>
+        <w:instrText xml:space="preserve"> ADDIN EN.CITE &lt;EndNote&gt;&lt;Cite&gt;&lt;Author&gt;Zhu&lt;/Author&gt;&lt;Year&gt;2014&lt;/Year&gt;&lt;RecNum&gt;27&lt;/RecNum&gt;&lt;DisplayText&gt;&lt;style face="superscript"&gt;[2]&lt;/style&gt;&lt;/DisplayText&gt;&lt;record&gt;&lt;rec-number&gt;27&lt;/rec-number&gt;&lt;foreign-keys&gt;&lt;key app="EN" db-id="r22exsavnwf02oef5eu5prfwststtzaxt0f2" timestamp="1693637848" guid="4f20af2a-d45d-4bf8-b74f-1fd22496fe4e"&gt;27&lt;/key&gt;&lt;/foreign-keys&gt;&lt;ref-type name="Journal Article"&gt;17&lt;/ref-type&gt;&lt;contributors&gt;&lt;authors&gt;&lt;author&gt;Zhu, Jun-Yan&lt;/author&gt;&lt;author&gt;Wu, Jiajun&lt;/author&gt;&lt;author&gt;Xu, Yan&lt;/author&gt;&lt;author&gt;Chang, Eric&lt;/author&gt;&lt;author&gt;Tu, Zhuowen&lt;/author&gt;&lt;/authors&gt;&lt;/contributors&gt;&lt;titles&gt;&lt;title&gt;Unsupervised object class discovery via saliency-guided multiple class learning&lt;/title&gt;&lt;secondary-title&gt;IEEE transactions on pattern analysis and machine intelligence&lt;/secondary-title&gt;&lt;/titles&gt;&lt;periodical&gt;&lt;full-title&gt;Ieee Transactions on Pattern Analysis and Machine Intelligence&lt;/full-title&gt;&lt;/periodical&gt;&lt;pages&gt;862-875&lt;/pages&gt;&lt;volume&gt;37&lt;/volume&gt;&lt;number&gt;4&lt;/number&gt;&lt;dates&gt;&lt;year&gt;2014&lt;/year&gt;&lt;/dates&gt;&lt;isbn&gt;0162-8828&lt;/isbn&gt;&lt;urls&gt;&lt;/urls&gt;&lt;/record&gt;&lt;/Cite&gt;&lt;/EndNote&gt;</w:instrText>
+      </w:r>
+      <w:r>
+        <w:rPr>
+          <w:rFonts w:ascii="宋体" w:hAnsi="宋体" w:cs="宋体"/>
+          <w:kern w:val="0"/>
+          <w:sz w:val="24"/>
+        </w:rPr>
+        <w:fldChar w:fldCharType="separate"/>
+      </w:r>
+      <w:r>
+        <w:rPr>
+          <w:rFonts w:ascii="宋体" w:hAnsi="宋体" w:cs="宋体"/>
+          <w:kern w:val="0"/>
+          <w:sz w:val="24"/>
+          <w:vertAlign w:val="superscript"/>
+        </w:rPr>
+        <w:t>[</w:t>
+      </w:r>
+      <w:r>
+        <w:rPr>
+          <w:rFonts w:ascii="宋体" w:hAnsi="宋体" w:cs="宋体" w:hint="eastAsia"/>
+          <w:kern w:val="0"/>
+          <w:sz w:val="24"/>
+          <w:vertAlign w:val="superscript"/>
+        </w:rPr>
+        <w:t>1</w:t>
+      </w:r>
+      <w:r>
+        <w:rPr>
+          <w:rFonts w:ascii="宋体" w:hAnsi="宋体" w:cs="宋体"/>
+          <w:kern w:val="0"/>
+          <w:sz w:val="24"/>
+          <w:vertAlign w:val="superscript"/>
+        </w:rPr>
+        <w:t>]</w:t>
+      </w:r>
+      <w:r>
+        <w:rPr>
+          <w:rFonts w:ascii="宋体" w:hAnsi="宋体" w:cs="宋体"/>
+          <w:kern w:val="0"/>
+          <w:sz w:val="24"/>
+          <w:lang/>
+        </w:rPr>
+        <w:fldChar w:fldCharType="end"/>
+      </w:r>
+      <w:r>
+        <w:rPr>
+          <w:rFonts w:ascii="宋体" w:hAnsi="宋体" w:cs="宋体" w:hint="eastAsia"/>
+          <w:kern w:val="0"/>
+          <w:sz w:val="24"/>
+          <w:lang/>
+        </w:rPr>
+        <w:t>。另一种常用技术是阈值分割，其目的是将图像根据像素强度分为前景和背景。</w:t>
+      </w:r>
+      <w:r>
+        <w:rPr>
+          <w:rFonts w:eastAsia="Times New Roman"/>
+          <w:kern w:val="0"/>
+          <w:sz w:val="24"/>
+          <w:lang/>
+        </w:rPr>
+        <w:t>Otsu</w:t>
+      </w:r>
+      <w:r>
+        <w:rPr>
+          <w:rFonts w:ascii="宋体" w:hAnsi="宋体" w:cs="宋体" w:hint="eastAsia"/>
+          <w:kern w:val="0"/>
+          <w:sz w:val="24"/>
+          <w:lang/>
+        </w:rPr>
+        <w:t>于</w:t>
+      </w:r>
+      <w:r>
+        <w:rPr>
+          <w:rFonts w:eastAsia="Times New Roman"/>
+          <w:kern w:val="0"/>
+          <w:sz w:val="24"/>
+          <w:lang/>
+        </w:rPr>
+        <w:t>1979</w:t>
+      </w:r>
+      <w:r>
+        <w:rPr>
+          <w:rFonts w:ascii="宋体" w:hAnsi="宋体" w:cs="宋体" w:hint="eastAsia"/>
+          <w:kern w:val="0"/>
+          <w:sz w:val="24"/>
+          <w:lang/>
+        </w:rPr>
+        <w:t>年提出的</w:t>
+      </w:r>
+      <w:r>
+        <w:rPr>
+          <w:rFonts w:eastAsia="Times New Roman"/>
+          <w:kern w:val="0"/>
+          <w:sz w:val="24"/>
+          <w:lang/>
+        </w:rPr>
+        <w:t>Otsu</w:t>
+      </w:r>
+      <w:r>
+        <w:rPr>
+          <w:rFonts w:ascii="宋体" w:hAnsi="宋体" w:cs="宋体" w:hint="eastAsia"/>
+          <w:kern w:val="0"/>
+          <w:sz w:val="24"/>
+          <w:lang/>
+        </w:rPr>
+        <w:t>法（大津法）</w:t>
       </w:r>
       <w:r>
         <w:rPr>
@@ -2577,34 +2700,67 @@
           <w:sz w:val="24"/>
           <w:lang/>
         </w:rPr>
-        <w:t>，通过一对</w:t>
-      </w:r>
-      <w:r>
-        <w:rPr>
-          <w:rFonts w:eastAsia="Times New Roman"/>
-          <w:kern w:val="0"/>
-          <w:sz w:val="24"/>
-          <w:lang/>
-        </w:rPr>
-        <w:t>3x3</w:t>
-      </w:r>
-      <w:r>
-        <w:rPr>
-          <w:rFonts w:ascii="宋体" w:hAnsi="宋体" w:cs="宋体" w:hint="eastAsia"/>
-          <w:kern w:val="0"/>
-          <w:sz w:val="24"/>
-          <w:lang/>
-        </w:rPr>
-        <w:t>的卷积核来近似计算图像的梯度，从而突出显示边缘</w:t>
-      </w:r>
-      <w:r>
-        <w:rPr>
-          <w:rFonts w:eastAsia="Times New Roman"/>
-          <w:kern w:val="0"/>
-          <w:sz w:val="24"/>
-          <w:lang/>
-        </w:rPr>
-        <w:t xml:space="preserve"> </w:t>
+        <w:t>是一种经典的自适应阈值选择方法，它通过最大化类间方差来自动确定最佳分割阈值，常被用于尝试将坑洞等颜色异常区域从背景中分离出来</w:t>
+      </w:r>
+      <w:r>
+        <w:rPr>
+          <w:rFonts w:ascii="宋体" w:hAnsi="宋体" w:cs="宋体"/>
+          <w:kern w:val="0"/>
+          <w:sz w:val="24"/>
+        </w:rPr>
+        <w:fldChar w:fldCharType="begin"/>
+      </w:r>
+      <w:r>
+        <w:rPr>
+          <w:rFonts w:ascii="宋体" w:hAnsi="宋体" w:cs="宋体"/>
+          <w:kern w:val="0"/>
+          <w:sz w:val="24"/>
+        </w:rPr>
+        <w:instrText xml:space="preserve"> ADDIN EN.CITE &lt;EndNote&gt;&lt;Cite&gt;&lt;Author&gt;Zhu&lt;/Author&gt;&lt;Year&gt;2014&lt;/Year&gt;&lt;RecNum&gt;27&lt;/RecNum&gt;&lt;DisplayText&gt;&lt;style face="superscript"&gt;[2]&lt;/style&gt;&lt;/DisplayText&gt;&lt;record&gt;&lt;rec-number&gt;27&lt;/rec-number&gt;&lt;foreign-keys&gt;&lt;key app="EN" db-id="r22exsavnwf02oef5eu5prfwststtzaxt0f2" timestamp="1693637848" guid="4f20af2a-d45d-4bf8-b74f-1fd22496fe4e"&gt;27&lt;/key&gt;&lt;/foreign-keys&gt;&lt;ref-type name="Journal Article"&gt;17&lt;/ref-type&gt;&lt;contributors&gt;&lt;authors&gt;&lt;author&gt;Zhu, Jun-Yan&lt;/author&gt;&lt;author&gt;Wu, Jiajun&lt;/author&gt;&lt;author&gt;Xu, Yan&lt;/author&gt;&lt;author&gt;Chang, Eric&lt;/author&gt;&lt;author&gt;Tu, Zhuowen&lt;/author&gt;&lt;/authors&gt;&lt;/contributors&gt;&lt;titles&gt;&lt;title&gt;Unsupervised object class discovery via saliency-guided multiple class learning&lt;/title&gt;&lt;secondary-title&gt;IEEE transactions on pattern analysis and machine intelligence&lt;/secondary-title&gt;&lt;/titles&gt;&lt;periodical&gt;&lt;full-title&gt;Ieee Transactions on Pattern Analysis and Machine Intelligence&lt;/full-title&gt;&lt;/periodical&gt;&lt;pages&gt;862-875&lt;/pages&gt;&lt;volume&gt;37&lt;/volume&gt;&lt;number&gt;4&lt;/number&gt;&lt;dates&gt;&lt;year&gt;2014&lt;/year&gt;&lt;/dates&gt;&lt;isbn&gt;0162-8828&lt;/isbn&gt;&lt;urls&gt;&lt;/urls&gt;&lt;/record&gt;&lt;/Cite&gt;&lt;/EndNote&gt;</w:instrText>
+      </w:r>
+      <w:r>
+        <w:rPr>
+          <w:rFonts w:ascii="宋体" w:hAnsi="宋体" w:cs="宋体"/>
+          <w:kern w:val="0"/>
+          <w:sz w:val="24"/>
+        </w:rPr>
+        <w:fldChar w:fldCharType="separate"/>
+      </w:r>
+      <w:r>
+        <w:rPr>
+          <w:rFonts w:ascii="宋体" w:hAnsi="宋体" w:cs="宋体"/>
+          <w:kern w:val="0"/>
+          <w:sz w:val="24"/>
+          <w:vertAlign w:val="superscript"/>
+        </w:rPr>
+        <w:t>[</w:t>
+      </w:r>
+      <w:r>
+        <w:rPr>
+          <w:rFonts w:ascii="宋体" w:hAnsi="宋体" w:cs="宋体" w:hint="eastAsia"/>
+          <w:kern w:val="0"/>
+          <w:sz w:val="24"/>
+          <w:vertAlign w:val="superscript"/>
+        </w:rPr>
+        <w:t>2</w:t>
+      </w:r>
+      <w:r>
+        <w:rPr>
+          <w:rFonts w:ascii="宋体" w:hAnsi="宋体" w:cs="宋体"/>
+          <w:kern w:val="0"/>
+          <w:sz w:val="24"/>
+          <w:vertAlign w:val="superscript"/>
+        </w:rPr>
+        <w:t>]</w:t>
+      </w:r>
+      <w:r>
+        <w:rPr>
+          <w:rFonts w:ascii="宋体" w:hAnsi="宋体" w:cs="宋体"/>
+          <w:kern w:val="0"/>
+          <w:sz w:val="24"/>
+          <w:lang/>
+        </w:rPr>
+        <w:fldChar w:fldCharType="end"/>
       </w:r>
       <w:r>
         <w:rPr>
@@ -2617,183 +2773,12 @@
       </w:r>
       <w:r>
         <w:rPr>
-          <w:rFonts w:eastAsia="Times New Roman"/>
-          <w:kern w:val="0"/>
-          <w:sz w:val="24"/>
-          <w:lang/>
-        </w:rPr>
-        <w:t>Canny</w:t>
-      </w:r>
-      <w:r>
-        <w:rPr>
-          <w:rFonts w:ascii="宋体" w:hAnsi="宋体" w:cs="宋体" w:hint="eastAsia"/>
-          <w:kern w:val="0"/>
-          <w:sz w:val="24"/>
-          <w:lang/>
-        </w:rPr>
-        <w:t>于</w:t>
-      </w:r>
-      <w:r>
-        <w:rPr>
-          <w:rFonts w:eastAsia="Times New Roman"/>
-          <w:kern w:val="0"/>
-          <w:sz w:val="24"/>
-          <w:lang/>
-        </w:rPr>
-        <w:t>1986</w:t>
-      </w:r>
-      <w:r>
-        <w:rPr>
-          <w:rFonts w:ascii="宋体" w:hAnsi="宋体" w:cs="宋体" w:hint="eastAsia"/>
-          <w:kern w:val="0"/>
-          <w:sz w:val="24"/>
-          <w:lang/>
-        </w:rPr>
-        <w:t>年提出的</w:t>
-      </w:r>
-      <w:r>
-        <w:rPr>
-          <w:rFonts w:eastAsia="Times New Roman"/>
-          <w:kern w:val="0"/>
-          <w:sz w:val="24"/>
-          <w:lang/>
-        </w:rPr>
-        <w:t>Canny</w:t>
-      </w:r>
-      <w:r>
-        <w:rPr>
-          <w:rFonts w:ascii="宋体" w:hAnsi="宋体" w:cs="宋体" w:hint="eastAsia"/>
-          <w:kern w:val="0"/>
-          <w:sz w:val="24"/>
-          <w:lang/>
-        </w:rPr>
-        <w:t>边缘检测算法</w:t>
-      </w:r>
-      <w:r>
-        <w:rPr>
-          <w:rFonts w:eastAsia="Times New Roman"/>
-          <w:kern w:val="0"/>
-          <w:sz w:val="24"/>
-          <w:lang/>
-        </w:rPr>
-        <w:t xml:space="preserve"> </w:t>
-      </w:r>
-      <w:r>
-        <w:rPr>
-          <w:rFonts w:ascii="宋体" w:hAnsi="宋体" w:cs="宋体" w:hint="eastAsia"/>
-          <w:kern w:val="0"/>
-          <w:sz w:val="24"/>
-          <w:lang/>
-        </w:rPr>
-        <w:t>则更为复杂和有效，它通过高斯滤波降噪、计算梯度强度与方向、非极大值抑制以及双阈值和滞后连接等一系列步骤，能够生成更清晰、更连续的边缘</w:t>
-      </w:r>
-      <w:r>
-        <w:rPr>
-          <w:rFonts w:eastAsia="Times New Roman"/>
-          <w:kern w:val="0"/>
-          <w:sz w:val="24"/>
-          <w:lang/>
-        </w:rPr>
-        <w:t xml:space="preserve"> </w:t>
-      </w:r>
-      <w:r>
-        <w:rPr>
-          <w:rFonts w:ascii="宋体" w:hAnsi="宋体" w:cs="宋体" w:hint="eastAsia"/>
-          <w:kern w:val="0"/>
-          <w:sz w:val="24"/>
-          <w:lang/>
-        </w:rPr>
-        <w:t>。另一种常用技术是阈值分割，其目的是将图像根据像素强度分为前景和背景。</w:t>
-      </w:r>
-      <w:r>
-        <w:rPr>
-          <w:rFonts w:eastAsia="Times New Roman"/>
-          <w:kern w:val="0"/>
-          <w:sz w:val="24"/>
-          <w:lang/>
-        </w:rPr>
-        <w:t>Otsu</w:t>
-      </w:r>
-      <w:r>
-        <w:rPr>
-          <w:rFonts w:ascii="宋体" w:hAnsi="宋体" w:cs="宋体" w:hint="eastAsia"/>
-          <w:kern w:val="0"/>
-          <w:sz w:val="24"/>
-          <w:lang/>
-        </w:rPr>
-        <w:t>于</w:t>
-      </w:r>
-      <w:r>
-        <w:rPr>
-          <w:rFonts w:eastAsia="Times New Roman"/>
-          <w:kern w:val="0"/>
-          <w:sz w:val="24"/>
-          <w:lang/>
-        </w:rPr>
-        <w:t>1979</w:t>
-      </w:r>
-      <w:r>
-        <w:rPr>
-          <w:rFonts w:ascii="宋体" w:hAnsi="宋体" w:cs="宋体" w:hint="eastAsia"/>
-          <w:kern w:val="0"/>
-          <w:sz w:val="24"/>
-          <w:lang/>
-        </w:rPr>
-        <w:t>年提出的</w:t>
-      </w:r>
-      <w:r>
-        <w:rPr>
-          <w:rFonts w:eastAsia="Times New Roman"/>
-          <w:kern w:val="0"/>
-          <w:sz w:val="24"/>
-          <w:lang/>
-        </w:rPr>
-        <w:t>Otsu</w:t>
-      </w:r>
-      <w:r>
-        <w:rPr>
-          <w:rFonts w:ascii="宋体" w:hAnsi="宋体" w:cs="宋体" w:hint="eastAsia"/>
-          <w:kern w:val="0"/>
-          <w:sz w:val="24"/>
-          <w:lang/>
-        </w:rPr>
-        <w:t>法（大津法）</w:t>
-      </w:r>
-      <w:r>
-        <w:rPr>
-          <w:rFonts w:eastAsia="Times New Roman"/>
-          <w:kern w:val="0"/>
-          <w:sz w:val="24"/>
-          <w:lang/>
-        </w:rPr>
-        <w:t xml:space="preserve"> </w:t>
-      </w:r>
-      <w:r>
-        <w:rPr>
-          <w:rFonts w:ascii="宋体" w:hAnsi="宋体" w:cs="宋体" w:hint="eastAsia"/>
-          <w:kern w:val="0"/>
-          <w:sz w:val="24"/>
-          <w:lang/>
-        </w:rPr>
-        <w:t>是一种经典的自适应阈值选择方法，它通过最大化类间方差来自动确定最佳分割阈值，常被用于尝试将坑洞等颜色异常区域从背景中分离出来</w:t>
-      </w:r>
-      <w:r>
-        <w:rPr>
-          <w:rFonts w:eastAsia="Times New Roman"/>
-          <w:kern w:val="0"/>
-          <w:sz w:val="24"/>
-          <w:lang/>
-        </w:rPr>
-        <w:t xml:space="preserve"> </w:t>
-      </w:r>
-      <w:r>
-        <w:rPr>
-          <w:rFonts w:ascii="宋体" w:hAnsi="宋体" w:cs="宋体" w:hint="eastAsia"/>
-          <w:kern w:val="0"/>
-          <w:sz w:val="24"/>
-          <w:lang/>
-        </w:rPr>
-        <w:t>。此外，形态学处理（如腐蚀、膨胀）、小波变换</w:t>
+          <w:rFonts w:ascii="宋体" w:hAnsi="宋体" w:cs="宋体" w:hint="eastAsia"/>
+          <w:kern w:val="0"/>
+          <w:sz w:val="24"/>
+          <w:lang/>
+        </w:rPr>
+        <w:t>此外，形态学处理（如腐蚀、膨胀）、小波变换</w:t>
       </w:r>
       <w:r>
         <w:rPr>
@@ -2845,57 +2830,57 @@
       </w:r>
       <w:r>
         <w:rPr>
-          <w:rFonts w:eastAsia="Times New Roman"/>
-          <w:kern w:val="0"/>
-          <w:sz w:val="24"/>
-          <w:lang/>
-        </w:rPr>
-        <w:t xml:space="preserve"> </w:t>
-      </w:r>
-      <w:r>
-        <w:rPr>
-          <w:rFonts w:ascii="宋体" w:hAnsi="宋体" w:cs="宋体" w:hint="eastAsia"/>
-          <w:kern w:val="0"/>
-          <w:sz w:val="24"/>
-          <w:lang/>
-        </w:rPr>
-        <w:t>。真实道路环境极为复杂，充满了各种噪声干扰，如光照的突然变化、车辆和树木投下的阴影、路面积水或油污等</w:t>
-      </w:r>
-      <w:r>
-        <w:rPr>
-          <w:rFonts w:eastAsia="Times New Roman"/>
-          <w:kern w:val="0"/>
-          <w:sz w:val="24"/>
-          <w:lang/>
-        </w:rPr>
-        <w:t xml:space="preserve"> </w:t>
-      </w:r>
-      <w:r>
-        <w:rPr>
-          <w:rFonts w:ascii="宋体" w:hAnsi="宋体" w:cs="宋体" w:hint="eastAsia"/>
-          <w:kern w:val="0"/>
-          <w:sz w:val="24"/>
-          <w:lang/>
-        </w:rPr>
-        <w:t>。传统方法对这些干扰极为敏感，常常将阴影误判为裂缝，或因对比度低而漏检病害，容易产生大量的虚警和漏检</w:t>
-      </w:r>
-      <w:r>
-        <w:rPr>
-          <w:rFonts w:eastAsia="Times New Roman"/>
-          <w:kern w:val="0"/>
-          <w:sz w:val="24"/>
-          <w:lang/>
-        </w:rPr>
-        <w:t xml:space="preserve"> </w:t>
-      </w:r>
-      <w:r>
-        <w:rPr>
-          <w:rFonts w:ascii="宋体" w:hAnsi="宋体" w:cs="宋体" w:hint="eastAsia"/>
-          <w:kern w:val="0"/>
-          <w:sz w:val="24"/>
-          <w:lang/>
-        </w:rPr>
-        <w:t>。更重要的是，道路病害本身形态各异、尺寸不一，从细微的网状裂缝到大面积的坑洞，传统算法难以用一套固定的规则来适应如此大的变化范围。这种基于规则的系统的脆弱性，正是其无法在复杂多变的真实世界应用中取得成功的根本原因，从而为数据驱动的深度学习方法的兴起铺平了道路</w:t>
+          <w:rFonts w:ascii="宋体" w:hAnsi="宋体" w:cs="宋体" w:hint="eastAsia"/>
+          <w:kern w:val="0"/>
+          <w:sz w:val="24"/>
+          <w:lang/>
+        </w:rPr>
+        <w:t>。</w:t>
+      </w:r>
+      <w:r>
+        <w:rPr>
+          <w:rFonts w:ascii="宋体" w:hAnsi="宋体" w:cs="宋体" w:hint="eastAsia"/>
+          <w:kern w:val="0"/>
+          <w:sz w:val="24"/>
+          <w:lang/>
+        </w:rPr>
+        <w:t>真实道路环境极为复杂，充满了各种噪声干扰，如光照的突然变化、车辆和树木投下的阴影、路面积水或油污等</w:t>
+      </w:r>
+      <w:r>
+        <w:rPr>
+          <w:rFonts w:ascii="宋体" w:hAnsi="宋体" w:cs="宋体" w:hint="eastAsia"/>
+          <w:kern w:val="0"/>
+          <w:sz w:val="24"/>
+          <w:lang/>
+        </w:rPr>
+        <w:t>。</w:t>
+      </w:r>
+      <w:r>
+        <w:rPr>
+          <w:rFonts w:ascii="宋体" w:hAnsi="宋体" w:cs="宋体" w:hint="eastAsia"/>
+          <w:kern w:val="0"/>
+          <w:sz w:val="24"/>
+          <w:lang/>
+        </w:rPr>
+        <w:t>传统方法对这些干扰极为敏感，常常将阴影误判为裂缝，或因对比度低而漏检病害，容易产生大量的虚警和漏检</w:t>
+      </w:r>
+      <w:r>
+        <w:rPr>
+          <w:rFonts w:ascii="宋体" w:hAnsi="宋体" w:cs="宋体" w:hint="eastAsia"/>
+          <w:kern w:val="0"/>
+          <w:sz w:val="24"/>
+          <w:lang/>
+        </w:rPr>
+        <w:t>。</w:t>
+      </w:r>
+      <w:r>
+        <w:rPr>
+          <w:rFonts w:ascii="宋体" w:hAnsi="宋体" w:cs="宋体" w:hint="eastAsia"/>
+          <w:kern w:val="0"/>
+          <w:sz w:val="24"/>
+          <w:lang/>
+        </w:rPr>
+        <w:t>更重要的是，道路病害本身形态各异、尺寸不一，从细微的网状裂缝到大面积的坑洞，传统算法难以用一套固定的规则来适应如此大的变化范围。这种基于规则的系统的脆弱性，正是其无法在复杂多变的真实世界应用中取得成功的根本原因，从而为数据驱动的深度学习方法的兴起铺平了道路</w:t>
       </w:r>
       <w:r>
         <w:rPr>
@@ -3036,7 +3021,67 @@
           <w:sz w:val="24"/>
           <w:lang w:bidi="ar"/>
         </w:rPr>
-        <w:t>）上取得的突破性成功，深度学习，特别是卷积神经网络（</w:t>
+        <w:t>）上取得的突破性成功</w:t>
+      </w:r>
+      <w:r>
+        <w:rPr>
+          <w:rFonts w:ascii="宋体" w:hAnsi="宋体" w:cs="宋体"/>
+          <w:kern w:val="0"/>
+          <w:sz w:val="24"/>
+        </w:rPr>
+        <w:fldChar w:fldCharType="begin"/>
+      </w:r>
+      <w:r>
+        <w:rPr>
+          <w:rFonts w:ascii="宋体" w:hAnsi="宋体" w:cs="宋体"/>
+          <w:kern w:val="0"/>
+          <w:sz w:val="24"/>
+        </w:rPr>
+        <w:instrText xml:space="preserve"> ADDIN EN.CITE &lt;EndNote&gt;&lt;Cite&gt;&lt;Author&gt;Zhu&lt;/Author&gt;&lt;Year&gt;2014&lt;/Year&gt;&lt;RecNum&gt;27&lt;/RecNum&gt;&lt;DisplayText&gt;&lt;style face="superscript"&gt;[2]&lt;/style&gt;&lt;/DisplayText&gt;&lt;record&gt;&lt;rec-number&gt;27&lt;/rec-number&gt;&lt;foreign-keys&gt;&lt;key app="EN" db-id="r22exsavnwf02oef5eu5prfwststtzaxt0f2" timestamp="1693637848" guid="4f20af2a-d45d-4bf8-b74f-1fd22496fe4e"&gt;27&lt;/key&gt;&lt;/foreign-keys&gt;&lt;ref-type name="Journal Article"&gt;17&lt;/ref-type&gt;&lt;contributors&gt;&lt;authors&gt;&lt;author&gt;Zhu, Jun-Yan&lt;/author&gt;&lt;author&gt;Wu, Jiajun&lt;/author&gt;&lt;author&gt;Xu, Yan&lt;/author&gt;&lt;author&gt;Chang, Eric&lt;/author&gt;&lt;author&gt;Tu, Zhuowen&lt;/author&gt;&lt;/authors&gt;&lt;/contributors&gt;&lt;titles&gt;&lt;title&gt;Unsupervised object class discovery via saliency-guided multiple class learning&lt;/title&gt;&lt;secondary-title&gt;IEEE transactions on pattern analysis and machine intelligence&lt;/secondary-title&gt;&lt;/titles&gt;&lt;periodical&gt;&lt;full-title&gt;Ieee Transactions on Pattern Analysis and Machine Intelligence&lt;/full-title&gt;&lt;/periodical&gt;&lt;pages&gt;862-875&lt;/pages&gt;&lt;volume&gt;37&lt;/volume&gt;&lt;number&gt;4&lt;/number&gt;&lt;dates&gt;&lt;year&gt;2014&lt;/year&gt;&lt;/dates&gt;&lt;isbn&gt;0162-8828&lt;/isbn&gt;&lt;urls&gt;&lt;/urls&gt;&lt;/record&gt;&lt;/Cite&gt;&lt;/EndNote&gt;</w:instrText>
+      </w:r>
+      <w:r>
+        <w:rPr>
+          <w:rFonts w:ascii="宋体" w:hAnsi="宋体" w:cs="宋体"/>
+          <w:kern w:val="0"/>
+          <w:sz w:val="24"/>
+        </w:rPr>
+        <w:fldChar w:fldCharType="separate"/>
+      </w:r>
+      <w:r>
+        <w:rPr>
+          <w:rFonts w:ascii="宋体" w:hAnsi="宋体" w:cs="宋体"/>
+          <w:kern w:val="0"/>
+          <w:sz w:val="24"/>
+          <w:vertAlign w:val="superscript"/>
+        </w:rPr>
+        <w:t>[</w:t>
+      </w:r>
+      <w:r>
+        <w:rPr>
+          <w:rFonts w:ascii="宋体" w:hAnsi="宋体" w:cs="宋体" w:hint="eastAsia"/>
+          <w:kern w:val="0"/>
+          <w:sz w:val="24"/>
+          <w:vertAlign w:val="superscript"/>
+        </w:rPr>
+        <w:t>3</w:t>
+      </w:r>
+      <w:r>
+        <w:rPr>
+          <w:rFonts w:ascii="宋体" w:hAnsi="宋体" w:cs="宋体"/>
+          <w:kern w:val="0"/>
+          <w:sz w:val="24"/>
+          <w:vertAlign w:val="superscript"/>
+        </w:rPr>
+        <w:t>]</w:t>
+      </w:r>
+      <w:r>
+        <w:rPr>
+          <w:rFonts w:ascii="宋体" w:hAnsi="宋体" w:cs="宋体"/>
+          <w:kern w:val="0"/>
+          <w:sz w:val="24"/>
+          <w:lang/>
+        </w:rPr>
+        <w:fldChar w:fldCharType="end"/>
       </w:r>
       <w:r>
         <w:rPr>
@@ -3044,6 +3089,14 @@
           <w:sz w:val="24"/>
           <w:lang w:bidi="ar"/>
         </w:rPr>
+        <w:t>，深度学习，特别是卷积神经网络（</w:t>
+      </w:r>
+      <w:r>
+        <w:rPr>
+          <w:kern w:val="44"/>
+          <w:sz w:val="24"/>
+          <w:lang w:bidi="ar"/>
+        </w:rPr>
         <w:t>CNN</w:t>
       </w:r>
       <w:r>
@@ -3060,7 +3113,7 @@
           <w:sz w:val="24"/>
           <w:lang w:bidi="ar"/>
         </w:rPr>
-        <w:t xml:space="preserve"> </w:t>
+        <w:t>。</w:t>
       </w:r>
       <w:r>
         <w:rPr>
@@ -3068,7 +3121,7 @@
           <w:sz w:val="24"/>
           <w:lang w:bidi="ar"/>
         </w:rPr>
-        <w:t>。这一变革迅速席卷了道路病害检测领域，并使其成为当前的主流技术路线</w:t>
+        <w:t>这一变革迅速席卷了道路病害检测领域，并使其成为当前的主流技术路线</w:t>
       </w:r>
       <w:r>
         <w:rPr>
@@ -3076,7 +3129,7 @@
           <w:sz w:val="24"/>
           <w:lang w:bidi="ar"/>
         </w:rPr>
-        <w:t xml:space="preserve"> </w:t>
+        <w:t>。</w:t>
       </w:r>
       <w:r>
         <w:rPr>
@@ -3084,7 +3137,7 @@
           <w:sz w:val="24"/>
           <w:lang w:bidi="ar"/>
         </w:rPr>
-        <w:t>。基于深度学习的目标检测算法的核心优势在于其能够自动从海量数据中学习层次化的特征表示，无需繁琐且局限性强的人工特征工程，从而极大地提升了检测的准确性、鲁棒性和泛化能力</w:t>
+        <w:t>基于深度学习的目标检测算法的核心优势在于其能够自动从海量数据中学习层次化的特征表示，无需繁琐且局限性强的人工特征工程，从而极大地提升了检测的准确性、鲁棒性和泛化能力</w:t>
       </w:r>
       <w:r>
         <w:rPr>
@@ -3092,7 +3145,7 @@
           <w:sz w:val="24"/>
           <w:lang w:bidi="ar"/>
         </w:rPr>
-        <w:t xml:space="preserve"> </w:t>
+        <w:t>。</w:t>
       </w:r>
       <w:r>
         <w:rPr>
@@ -3100,33 +3153,7 @@
           <w:sz w:val="24"/>
           <w:lang w:bidi="ar"/>
         </w:rPr>
-        <w:t>。目前，该领域的方法主要可以分为两阶段检测算法和</w:t>
-      </w:r>
-      <w:proofErr w:type="gramStart"/>
-      <w:r>
-        <w:rPr>
-          <w:kern w:val="44"/>
-          <w:sz w:val="24"/>
-          <w:lang w:bidi="ar"/>
-        </w:rPr>
-        <w:t>单阶段</w:t>
-      </w:r>
-      <w:proofErr w:type="gramEnd"/>
-      <w:r>
-        <w:rPr>
-          <w:kern w:val="44"/>
-          <w:sz w:val="24"/>
-          <w:lang w:bidi="ar"/>
-        </w:rPr>
-        <w:t>检测算法两大技术路线</w:t>
-      </w:r>
-      <w:r>
-        <w:rPr>
-          <w:kern w:val="44"/>
-          <w:sz w:val="24"/>
-          <w:lang w:bidi="ar"/>
-        </w:rPr>
-        <w:t xml:space="preserve"> </w:t>
+        <w:t>目前，该领域的方法主要可以分为两阶段检测算法和单阶段检测算法两大技术路线</w:t>
       </w:r>
       <w:r>
         <w:rPr>
@@ -3339,7 +3366,80 @@
           <w:sz w:val="24"/>
           <w:lang/>
         </w:rPr>
-        <w:t>）。</w:t>
+        <w:t>）</w:t>
+      </w:r>
+      <w:r>
+        <w:rPr>
+          <w:rFonts w:ascii="宋体" w:hAnsi="宋体" w:cs="宋体"/>
+          <w:kern w:val="0"/>
+          <w:sz w:val="24"/>
+        </w:rPr>
+        <w:fldChar w:fldCharType="begin"/>
+      </w:r>
+      <w:r>
+        <w:rPr>
+          <w:rFonts w:ascii="宋体" w:hAnsi="宋体" w:cs="宋体"/>
+          <w:kern w:val="0"/>
+          <w:sz w:val="24"/>
+          <w:lang/>
+        </w:rPr>
+        <w:instrText xml:space="preserve"> ADDIN EN.CITE &lt;EndNote&gt;&lt;Cite&gt;&lt;Author&gt;Zhu&lt;/Author&gt;&lt;Year&gt;2014&lt;/Year&gt;&lt;RecNum&gt;27&lt;/RecNum&gt;&lt;DisplayText&gt;&lt;style face="superscript"&gt;[2]&lt;/style&gt;&lt;/DisplayText&gt;&lt;record&gt;&lt;rec-number&gt;27&lt;/rec-number&gt;&lt;foreign-keys&gt;&lt;key app="EN" db-id="r22exsavnwf02oef5eu5prfwststtzaxt0f2" timestamp="1693637848" guid="4f20af2a-d45d-4bf8-b74f-1fd22496fe4e"&gt;27&lt;/key&gt;&lt;/foreign-keys&gt;&lt;ref-type name="Journal Article"&gt;17&lt;/ref-type&gt;&lt;contributors&gt;&lt;authors&gt;&lt;author&gt;Zhu, Jun-Yan&lt;/author&gt;&lt;author&gt;Wu, Jiajun&lt;/author&gt;&lt;author&gt;Xu, Yan&lt;/author&gt;&lt;author&gt;Chang, Eric&lt;/author&gt;&lt;author&gt;Tu, Zhuowen&lt;/author&gt;&lt;/authors&gt;&lt;/contributors&gt;&lt;titles&gt;&lt;title&gt;Unsupervised object class discovery via saliency-guided multiple class learning&lt;/title&gt;&lt;secondary-title&gt;IEEE transactions on pattern analysis and machine intelligence&lt;/secondary-title&gt;&lt;/titles&gt;&lt;periodical&gt;&lt;full-title&gt;Ieee Transactions on Pattern Analysis and Machine Intelligence&lt;/full-title&gt;&lt;/periodical&gt;&lt;pages&gt;862-875&lt;/pages&gt;&lt;volume&gt;37&lt;/volume&gt;&lt;number&gt;4&lt;/number&gt;&lt;dates&gt;&lt;year&gt;2014&lt;/year&gt;&lt;/dates&gt;&lt;isbn&gt;0162-8828&lt;/isbn&gt;&lt;urls&gt;&lt;/urls&gt;&lt;/record&gt;&lt;/Cite&gt;&lt;/EndNote&gt;</w:instrText>
+      </w:r>
+      <w:r>
+        <w:rPr>
+          <w:rFonts w:ascii="宋体" w:hAnsi="宋体" w:cs="宋体"/>
+          <w:kern w:val="0"/>
+          <w:sz w:val="24"/>
+        </w:rPr>
+        <w:fldChar w:fldCharType="separate"/>
+      </w:r>
+      <w:r>
+        <w:rPr>
+          <w:rFonts w:ascii="宋体" w:hAnsi="宋体" w:cs="宋体"/>
+          <w:kern w:val="0"/>
+          <w:sz w:val="24"/>
+          <w:vertAlign w:val="superscript"/>
+          <w:lang/>
+        </w:rPr>
+        <w:t>[</w:t>
+      </w:r>
+      <w:r>
+        <w:rPr>
+          <w:rFonts w:ascii="宋体" w:hAnsi="宋体" w:cs="宋体" w:hint="eastAsia"/>
+          <w:kern w:val="0"/>
+          <w:sz w:val="24"/>
+          <w:vertAlign w:val="superscript"/>
+          <w:lang/>
+        </w:rPr>
+        <w:t>4</w:t>
+      </w:r>
+      <w:r>
+        <w:rPr>
+          <w:rFonts w:ascii="宋体" w:hAnsi="宋体" w:cs="宋体"/>
+          <w:kern w:val="0"/>
+          <w:sz w:val="24"/>
+          <w:vertAlign w:val="superscript"/>
+          <w:lang/>
+        </w:rPr>
+        <w:t>]</w:t>
+      </w:r>
+      <w:r>
+        <w:rPr>
+          <w:rFonts w:ascii="宋体" w:hAnsi="宋体" w:cs="宋体"/>
+          <w:kern w:val="0"/>
+          <w:sz w:val="24"/>
+          <w:lang/>
+        </w:rPr>
+        <w:fldChar w:fldCharType="end"/>
+      </w:r>
+      <w:r>
+        <w:rPr>
+          <w:rFonts w:ascii="宋体" w:hAnsi="宋体" w:cs="宋体" w:hint="eastAsia"/>
+          <w:kern w:val="0"/>
+          <w:sz w:val="24"/>
+          <w:lang/>
+        </w:rPr>
+        <w:t>。</w:t>
       </w:r>
       <w:r>
         <w:rPr>
@@ -3447,36 +3547,7 @@
           <w:sz w:val="24"/>
           <w:lang/>
         </w:rPr>
-        <w:t>）对这些特征进行分类，并用一个边界</w:t>
-      </w:r>
-      <w:proofErr w:type="gramStart"/>
-      <w:r>
-        <w:rPr>
-          <w:rFonts w:ascii="宋体" w:hAnsi="宋体" w:cs="宋体" w:hint="eastAsia"/>
-          <w:kern w:val="0"/>
-          <w:sz w:val="24"/>
-          <w:lang/>
-        </w:rPr>
-        <w:t>框回归器</w:t>
-      </w:r>
-      <w:proofErr w:type="gramEnd"/>
-      <w:r>
-        <w:rPr>
-          <w:rFonts w:ascii="宋体" w:hAnsi="宋体" w:cs="宋体" w:hint="eastAsia"/>
-          <w:kern w:val="0"/>
-          <w:sz w:val="24"/>
-          <w:lang/>
-        </w:rPr>
-        <w:t>对位置进行微调</w:t>
-      </w:r>
-      <w:r>
-        <w:rPr>
-          <w:rFonts w:eastAsia="Times New Roman"/>
-          <w:kern w:val="0"/>
-          <w:sz w:val="24"/>
-          <w:lang/>
-        </w:rPr>
-        <w:t xml:space="preserve"> </w:t>
+        <w:t>）对这些特征进行分类，并用一个边界框回归器对位置进行微调</w:t>
       </w:r>
       <w:r>
         <w:rPr>
@@ -3543,21 +3614,21 @@
       </w:r>
       <w:r>
         <w:rPr>
-          <w:rFonts w:eastAsia="Times New Roman"/>
-          <w:kern w:val="0"/>
-          <w:sz w:val="24"/>
-          <w:lang/>
-        </w:rPr>
-        <w:t xml:space="preserve"> </w:t>
-      </w:r>
-      <w:r>
-        <w:rPr>
-          <w:rFonts w:ascii="宋体" w:hAnsi="宋体" w:cs="宋体" w:hint="eastAsia"/>
-          <w:kern w:val="0"/>
-          <w:sz w:val="24"/>
-          <w:lang/>
-        </w:rPr>
-        <w:t>。然而，其计算成本极为高昂，因为需要对数千个重叠的候选区域独立进行</w:t>
+          <w:rFonts w:ascii="宋体" w:hAnsi="宋体" w:cs="宋体" w:hint="eastAsia"/>
+          <w:kern w:val="0"/>
+          <w:sz w:val="24"/>
+          <w:lang/>
+        </w:rPr>
+        <w:t>。</w:t>
+      </w:r>
+      <w:r>
+        <w:rPr>
+          <w:rFonts w:ascii="宋体" w:hAnsi="宋体" w:cs="宋体" w:hint="eastAsia"/>
+          <w:kern w:val="0"/>
+          <w:sz w:val="24"/>
+          <w:lang/>
+        </w:rPr>
+        <w:t>然而，其计算成本极为高昂，因为需要对数千个重叠的候选区域独立进行</w:t>
       </w:r>
       <w:r>
         <w:rPr>
@@ -3579,15 +3650,6 @@
       </w:r>
       <w:r>
         <w:rPr>
-          <w:rFonts w:eastAsia="Times New Roman"/>
-          <w:kern w:val="0"/>
-          <w:sz w:val="24"/>
-          <w:lang/>
-        </w:rPr>
-        <w:t xml:space="preserve"> </w:t>
-      </w:r>
-      <w:r>
-        <w:rPr>
           <w:rFonts w:ascii="宋体" w:hAnsi="宋体" w:cs="宋体" w:hint="eastAsia"/>
           <w:kern w:val="0"/>
           <w:sz w:val="24"/>
@@ -3653,6 +3715,66 @@
       </w:r>
       <w:r>
         <w:rPr>
+          <w:rFonts w:ascii="宋体" w:hAnsi="宋体" w:cs="宋体"/>
+          <w:kern w:val="0"/>
+          <w:sz w:val="24"/>
+        </w:rPr>
+        <w:fldChar w:fldCharType="begin"/>
+      </w:r>
+      <w:r>
+        <w:rPr>
+          <w:rFonts w:ascii="宋体" w:hAnsi="宋体" w:cs="宋体"/>
+          <w:kern w:val="0"/>
+          <w:sz w:val="24"/>
+        </w:rPr>
+        <w:instrText xml:space="preserve"> ADDIN EN.CITE &lt;EndNote&gt;&lt;Cite&gt;&lt;Author&gt;Zhu&lt;/Author&gt;&lt;Year&gt;2014&lt;/Year&gt;&lt;RecNum&gt;27&lt;/RecNum&gt;&lt;DisplayText&gt;&lt;style face="superscript"&gt;[2]&lt;/style&gt;&lt;/DisplayText&gt;&lt;record&gt;&lt;rec-number&gt;27&lt;/rec-number&gt;&lt;foreign-keys&gt;&lt;key app="EN" db-id="r22exsavnwf02oef5eu5prfwststtzaxt0f2" timestamp="1693637848" guid="4f20af2a-d45d-4bf8-b74f-1fd22496fe4e"&gt;27&lt;/key&gt;&lt;/foreign-keys&gt;&lt;ref-type name="Journal Article"&gt;17&lt;/ref-type&gt;&lt;contributors&gt;&lt;authors&gt;&lt;author&gt;Zhu, Jun-Yan&lt;/author&gt;&lt;author&gt;Wu, Jiajun&lt;/author&gt;&lt;author&gt;Xu, Yan&lt;/author&gt;&lt;author&gt;Chang, Eric&lt;/author&gt;&lt;author&gt;Tu, Zhuowen&lt;/author&gt;&lt;/authors&gt;&lt;/contributors&gt;&lt;titles&gt;&lt;title&gt;Unsupervised object class discovery via saliency-guided multiple class learning&lt;/title&gt;&lt;secondary-title&gt;IEEE transactions on pattern analysis and machine intelligence&lt;/secondary-title&gt;&lt;/titles&gt;&lt;periodical&gt;&lt;full-title&gt;Ieee Transactions on Pattern Analysis and Machine Intelligence&lt;/full-title&gt;&lt;/periodical&gt;&lt;pages&gt;862-875&lt;/pages&gt;&lt;volume&gt;37&lt;/volume&gt;&lt;number&gt;4&lt;/number&gt;&lt;dates&gt;&lt;year&gt;2014&lt;/year&gt;&lt;/dates&gt;&lt;isbn&gt;0162-8828&lt;/isbn&gt;&lt;urls&gt;&lt;/urls&gt;&lt;/record&gt;&lt;/Cite&gt;&lt;/EndNote&gt;</w:instrText>
+      </w:r>
+      <w:r>
+        <w:rPr>
+          <w:rFonts w:ascii="宋体" w:hAnsi="宋体" w:cs="宋体"/>
+          <w:kern w:val="0"/>
+          <w:sz w:val="24"/>
+        </w:rPr>
+        <w:fldChar w:fldCharType="separate"/>
+      </w:r>
+      <w:r>
+        <w:rPr>
+          <w:rFonts w:ascii="宋体" w:hAnsi="宋体" w:cs="宋体"/>
+          <w:kern w:val="0"/>
+          <w:sz w:val="24"/>
+          <w:vertAlign w:val="superscript"/>
+        </w:rPr>
+        <w:t>[</w:t>
+      </w:r>
+      <w:r>
+        <w:rPr>
+          <w:rFonts w:ascii="宋体" w:hAnsi="宋体" w:cs="宋体" w:hint="eastAsia"/>
+          <w:kern w:val="0"/>
+          <w:sz w:val="24"/>
+          <w:vertAlign w:val="superscript"/>
+        </w:rPr>
+        <w:t>5</w:t>
+      </w:r>
+      <w:r>
+        <w:rPr>
+          <w:rFonts w:ascii="宋体" w:hAnsi="宋体" w:cs="宋体"/>
+          <w:kern w:val="0"/>
+          <w:sz w:val="24"/>
+          <w:vertAlign w:val="superscript"/>
+        </w:rPr>
+        <w:t>]</w:t>
+      </w:r>
+      <w:r>
+        <w:rPr>
+          <w:rFonts w:ascii="宋体" w:hAnsi="宋体" w:cs="宋体"/>
+          <w:kern w:val="0"/>
+          <w:sz w:val="24"/>
+          <w:lang/>
+        </w:rPr>
+        <w:fldChar w:fldCharType="end"/>
+      </w:r>
+      <w:r>
+        <w:rPr>
           <w:rFonts w:ascii="宋体" w:hAnsi="宋体" w:cs="宋体" w:hint="eastAsia"/>
           <w:kern w:val="0"/>
           <w:sz w:val="24"/>
@@ -3685,16 +3807,25 @@
           <w:sz w:val="24"/>
           <w:lang/>
         </w:rPr>
-        <w:t xml:space="preserve">Fast R-CNN </w:t>
-      </w:r>
-      <w:r>
-        <w:rPr>
-          <w:rFonts w:ascii="宋体" w:hAnsi="宋体" w:cs="宋体" w:hint="eastAsia"/>
-          <w:kern w:val="0"/>
-          <w:sz w:val="24"/>
-          <w:lang/>
-        </w:rPr>
-        <w:t>。其关键创新在于，不再独立处理每个候选区域，而是先将整张图像输入</w:t>
+        <w:t>Fast R-CNN</w:t>
+      </w:r>
+      <w:r>
+        <w:rPr>
+          <w:rFonts w:ascii="宋体" w:hAnsi="宋体" w:cs="宋体" w:hint="eastAsia"/>
+          <w:kern w:val="0"/>
+          <w:sz w:val="24"/>
+          <w:lang/>
+        </w:rPr>
+        <w:t>。</w:t>
+      </w:r>
+      <w:r>
+        <w:rPr>
+          <w:rFonts w:ascii="宋体" w:hAnsi="宋体" w:cs="宋体" w:hint="eastAsia"/>
+          <w:kern w:val="0"/>
+          <w:sz w:val="24"/>
+          <w:lang/>
+        </w:rPr>
+        <w:t>其关键创新在于，不再独立处理每个候选区域，而是先将整张图像输入</w:t>
       </w:r>
       <w:r>
         <w:rPr>
@@ -3730,56 +3861,25 @@
           <w:sz w:val="24"/>
           <w:lang/>
         </w:rPr>
-        <w:t>的层从特征图中为每个候选区域提取一个固定大小的特征向量。这些特征向量随后被</w:t>
-      </w:r>
-      <w:proofErr w:type="gramStart"/>
-      <w:r>
-        <w:rPr>
-          <w:rFonts w:ascii="宋体" w:hAnsi="宋体" w:cs="宋体" w:hint="eastAsia"/>
-          <w:kern w:val="0"/>
-          <w:sz w:val="24"/>
-          <w:lang/>
-        </w:rPr>
-        <w:t>送入全</w:t>
-      </w:r>
-      <w:proofErr w:type="gramEnd"/>
-      <w:r>
-        <w:rPr>
-          <w:rFonts w:ascii="宋体" w:hAnsi="宋体" w:cs="宋体" w:hint="eastAsia"/>
-          <w:kern w:val="0"/>
-          <w:sz w:val="24"/>
-          <w:lang/>
-        </w:rPr>
-        <w:t>连接层进行分类和边界</w:t>
-      </w:r>
-      <w:proofErr w:type="gramStart"/>
-      <w:r>
-        <w:rPr>
-          <w:rFonts w:ascii="宋体" w:hAnsi="宋体" w:cs="宋体" w:hint="eastAsia"/>
-          <w:kern w:val="0"/>
-          <w:sz w:val="24"/>
-          <w:lang/>
-        </w:rPr>
-        <w:t>框回归</w:t>
-      </w:r>
-      <w:proofErr w:type="gramEnd"/>
-      <w:r>
-        <w:rPr>
-          <w:rFonts w:eastAsia="Times New Roman"/>
-          <w:kern w:val="0"/>
-          <w:sz w:val="24"/>
-          <w:lang/>
-        </w:rPr>
-        <w:t xml:space="preserve"> </w:t>
-      </w:r>
-      <w:r>
-        <w:rPr>
-          <w:rFonts w:ascii="宋体" w:hAnsi="宋体" w:cs="宋体" w:hint="eastAsia"/>
-          <w:kern w:val="0"/>
-          <w:sz w:val="24"/>
-          <w:lang/>
-        </w:rPr>
-        <w:t>。通过在候选区域之间共享卷积计算，</w:t>
+        <w:t>的层从特征图中为每个候选区域提取一个固定大小的特征向量。这些特征向量随后被送入全连接层进行分类和边界框回归</w:t>
+      </w:r>
+      <w:r>
+        <w:rPr>
+          <w:rFonts w:ascii="宋体" w:hAnsi="宋体" w:cs="宋体" w:hint="eastAsia"/>
+          <w:kern w:val="0"/>
+          <w:sz w:val="24"/>
+          <w:lang/>
+        </w:rPr>
+        <w:t>。</w:t>
+      </w:r>
+      <w:r>
+        <w:rPr>
+          <w:rFonts w:ascii="宋体" w:hAnsi="宋体" w:cs="宋体" w:hint="eastAsia"/>
+          <w:kern w:val="0"/>
+          <w:sz w:val="24"/>
+          <w:lang/>
+        </w:rPr>
+        <w:t>通过在候选区域之间共享卷积计算，</w:t>
       </w:r>
       <w:r>
         <w:rPr>
@@ -3801,113 +3901,173 @@
       </w:r>
       <w:r>
         <w:rPr>
-          <w:rFonts w:eastAsia="Times New Roman"/>
-          <w:kern w:val="0"/>
-          <w:sz w:val="24"/>
-          <w:lang/>
-        </w:rPr>
-        <w:t xml:space="preserve"> </w:t>
+          <w:rFonts w:ascii="宋体" w:hAnsi="宋体" w:cs="宋体" w:hint="eastAsia"/>
+          <w:kern w:val="0"/>
+          <w:sz w:val="24"/>
+          <w:lang/>
+        </w:rPr>
+        <w:t>。</w:t>
+      </w:r>
+    </w:p>
+    <w:p>
+      <w:pPr>
+        <w:spacing w:before="100" w:beforeAutospacing="1" w:after="100" w:afterAutospacing="1"/>
+        <w:rPr>
+          <w:rFonts w:eastAsia="Times New Roman"/>
+          <w:kern w:val="0"/>
+          <w:sz w:val="24"/>
+          <w:lang/>
+        </w:rPr>
+      </w:pPr>
+      <w:r>
+        <w:rPr>
+          <w:rFonts w:ascii="宋体" w:hAnsi="宋体" w:cs="宋体" w:hint="eastAsia"/>
+          <w:kern w:val="0"/>
+          <w:sz w:val="24"/>
+          <w:lang/>
+        </w:rPr>
+        <w:t>尽管速度有所提升，</w:t>
+      </w:r>
+      <w:r>
+        <w:rPr>
+          <w:rFonts w:eastAsia="Times New Roman"/>
+          <w:kern w:val="0"/>
+          <w:sz w:val="24"/>
+          <w:lang/>
+        </w:rPr>
+        <w:t>Fast R-CNN</w:t>
+      </w:r>
+      <w:r>
+        <w:rPr>
+          <w:rFonts w:ascii="宋体" w:hAnsi="宋体" w:cs="宋体" w:hint="eastAsia"/>
+          <w:kern w:val="0"/>
+          <w:sz w:val="24"/>
+          <w:lang/>
+        </w:rPr>
+        <w:t>的性能瓶颈转移到了外部的区域提议算法上。为了实现一个真正端到端的检测系统，</w:t>
+      </w:r>
+      <w:r>
+        <w:rPr>
+          <w:rFonts w:eastAsia="Times New Roman"/>
+          <w:kern w:val="0"/>
+          <w:sz w:val="24"/>
+          <w:lang/>
+        </w:rPr>
+        <w:t>Ren</w:t>
+      </w:r>
+      <w:r>
+        <w:rPr>
+          <w:rFonts w:ascii="宋体" w:hAnsi="宋体" w:cs="宋体" w:hint="eastAsia"/>
+          <w:kern w:val="0"/>
+          <w:sz w:val="24"/>
+          <w:lang/>
+        </w:rPr>
+        <w:t>等人于</w:t>
+      </w:r>
+      <w:r>
+        <w:rPr>
+          <w:rFonts w:eastAsia="Times New Roman"/>
+          <w:kern w:val="0"/>
+          <w:sz w:val="24"/>
+          <w:lang/>
+        </w:rPr>
+        <w:t>2015</w:t>
+      </w:r>
+      <w:r>
+        <w:rPr>
+          <w:rFonts w:ascii="宋体" w:hAnsi="宋体" w:cs="宋体" w:hint="eastAsia"/>
+          <w:kern w:val="0"/>
+          <w:sz w:val="24"/>
+          <w:lang/>
+        </w:rPr>
+        <w:t>年提出了</w:t>
+      </w:r>
+      <w:r>
+        <w:rPr>
+          <w:rFonts w:eastAsia="Times New Roman"/>
+          <w:kern w:val="0"/>
+          <w:sz w:val="24"/>
+          <w:lang/>
+        </w:rPr>
+        <w:t>Faster R-CNN</w:t>
       </w:r>
       <w:r>
         <w:rPr>
           <w:rFonts w:ascii="宋体" w:hAnsi="宋体" w:cs="宋体"/>
           <w:kern w:val="0"/>
           <w:sz w:val="24"/>
+        </w:rPr>
+        <w:fldChar w:fldCharType="begin"/>
+      </w:r>
+      <w:r>
+        <w:rPr>
+          <w:rFonts w:ascii="宋体" w:hAnsi="宋体" w:cs="宋体"/>
+          <w:kern w:val="0"/>
+          <w:sz w:val="24"/>
+        </w:rPr>
+        <w:instrText xml:space="preserve"> ADDIN EN.CITE &lt;EndNote&gt;&lt;Cite&gt;&lt;Author&gt;Zhu&lt;/Author&gt;&lt;Year&gt;2014&lt;/Year&gt;&lt;RecNum&gt;27&lt;/RecNum&gt;&lt;DisplayText&gt;&lt;style face="superscript"&gt;[2]&lt;/style&gt;&lt;/DisplayText&gt;&lt;record&gt;&lt;rec-number&gt;27&lt;/rec-number&gt;&lt;foreign-keys&gt;&lt;key app="EN" db-id="r22exsavnwf02oef5eu5prfwststtzaxt0f2" timestamp="1693637848" guid="4f20af2a-d45d-4bf8-b74f-1fd22496fe4e"&gt;27&lt;/key&gt;&lt;/foreign-keys&gt;&lt;ref-type name="Journal Article"&gt;17&lt;/ref-type&gt;&lt;contributors&gt;&lt;authors&gt;&lt;author&gt;Zhu, Jun-Yan&lt;/author&gt;&lt;author&gt;Wu, Jiajun&lt;/author&gt;&lt;author&gt;Xu, Yan&lt;/author&gt;&lt;author&gt;Chang, Eric&lt;/author&gt;&lt;author&gt;Tu, Zhuowen&lt;/author&gt;&lt;/authors&gt;&lt;/contributors&gt;&lt;titles&gt;&lt;title&gt;Unsupervised object class discovery via saliency-guided multiple class learning&lt;/title&gt;&lt;secondary-title&gt;IEEE transactions on pattern analysis and machine intelligence&lt;/secondary-title&gt;&lt;/titles&gt;&lt;periodical&gt;&lt;full-title&gt;Ieee Transactions on Pattern Analysis and Machine Intelligence&lt;/full-title&gt;&lt;/periodical&gt;&lt;pages&gt;862-875&lt;/pages&gt;&lt;volume&gt;37&lt;/volume&gt;&lt;number&gt;4&lt;/number&gt;&lt;dates&gt;&lt;year&gt;2014&lt;/year&gt;&lt;/dates&gt;&lt;isbn&gt;0162-8828&lt;/isbn&gt;&lt;urls&gt;&lt;/urls&gt;&lt;/record&gt;&lt;/Cite&gt;&lt;/EndNote&gt;</w:instrText>
+      </w:r>
+      <w:r>
+        <w:rPr>
+          <w:rFonts w:ascii="宋体" w:hAnsi="宋体" w:cs="宋体"/>
+          <w:kern w:val="0"/>
+          <w:sz w:val="24"/>
+        </w:rPr>
+        <w:fldChar w:fldCharType="separate"/>
+      </w:r>
+      <w:r>
+        <w:rPr>
+          <w:rFonts w:ascii="宋体" w:hAnsi="宋体" w:cs="宋体"/>
+          <w:kern w:val="0"/>
+          <w:sz w:val="24"/>
+          <w:vertAlign w:val="superscript"/>
+        </w:rPr>
+        <w:t>[</w:t>
+      </w:r>
+      <w:r>
+        <w:rPr>
+          <w:rFonts w:ascii="宋体" w:hAnsi="宋体" w:cs="宋体" w:hint="eastAsia"/>
+          <w:kern w:val="0"/>
+          <w:sz w:val="24"/>
+          <w:vertAlign w:val="superscript"/>
+        </w:rPr>
+        <w:t>6</w:t>
+      </w:r>
+      <w:r>
+        <w:rPr>
+          <w:rFonts w:ascii="宋体" w:hAnsi="宋体" w:cs="宋体"/>
+          <w:kern w:val="0"/>
+          <w:sz w:val="24"/>
+          <w:vertAlign w:val="superscript"/>
+        </w:rPr>
+        <w:t>]</w:t>
+      </w:r>
+      <w:r>
+        <w:rPr>
+          <w:rFonts w:ascii="宋体" w:hAnsi="宋体" w:cs="宋体"/>
+          <w:kern w:val="0"/>
+          <w:sz w:val="24"/>
+          <w:lang/>
+        </w:rPr>
+        <w:fldChar w:fldCharType="end"/>
+      </w:r>
+      <w:r>
+        <w:rPr>
+          <w:rFonts w:ascii="宋体" w:hAnsi="宋体" w:cs="宋体" w:hint="eastAsia"/>
+          <w:kern w:val="0"/>
+          <w:sz w:val="24"/>
           <w:lang/>
         </w:rPr>
         <w:t>。</w:t>
       </w:r>
-    </w:p>
-    <w:p>
-      <w:pPr>
-        <w:spacing w:before="100" w:beforeAutospacing="1" w:after="100" w:afterAutospacing="1"/>
-        <w:rPr>
-          <w:rFonts w:eastAsia="Times New Roman"/>
-          <w:kern w:val="0"/>
-          <w:sz w:val="24"/>
-          <w:lang/>
-        </w:rPr>
-      </w:pPr>
-      <w:r>
-        <w:rPr>
-          <w:rFonts w:ascii="宋体" w:hAnsi="宋体" w:cs="宋体" w:hint="eastAsia"/>
-          <w:kern w:val="0"/>
-          <w:sz w:val="24"/>
-          <w:lang/>
-        </w:rPr>
-        <w:t>尽管速度有所提升，</w:t>
-      </w:r>
-      <w:r>
-        <w:rPr>
-          <w:rFonts w:eastAsia="Times New Roman"/>
-          <w:kern w:val="0"/>
-          <w:sz w:val="24"/>
-          <w:lang/>
-        </w:rPr>
-        <w:t>Fast R-CNN</w:t>
-      </w:r>
-      <w:r>
-        <w:rPr>
-          <w:rFonts w:ascii="宋体" w:hAnsi="宋体" w:cs="宋体" w:hint="eastAsia"/>
-          <w:kern w:val="0"/>
-          <w:sz w:val="24"/>
-          <w:lang/>
-        </w:rPr>
-        <w:t>的性能瓶颈转移到了外部的区域提议算法上。为了实现一个真正端到端的检测系统，</w:t>
-      </w:r>
-      <w:r>
-        <w:rPr>
-          <w:rFonts w:eastAsia="Times New Roman"/>
-          <w:kern w:val="0"/>
-          <w:sz w:val="24"/>
-          <w:lang/>
-        </w:rPr>
-        <w:t>Ren</w:t>
-      </w:r>
-      <w:r>
-        <w:rPr>
-          <w:rFonts w:ascii="宋体" w:hAnsi="宋体" w:cs="宋体" w:hint="eastAsia"/>
-          <w:kern w:val="0"/>
-          <w:sz w:val="24"/>
-          <w:lang/>
-        </w:rPr>
-        <w:t>等人于</w:t>
-      </w:r>
-      <w:r>
-        <w:rPr>
-          <w:rFonts w:eastAsia="Times New Roman"/>
-          <w:kern w:val="0"/>
-          <w:sz w:val="24"/>
-          <w:lang/>
-        </w:rPr>
-        <w:t>2015</w:t>
-      </w:r>
-      <w:r>
-        <w:rPr>
-          <w:rFonts w:ascii="宋体" w:hAnsi="宋体" w:cs="宋体" w:hint="eastAsia"/>
-          <w:kern w:val="0"/>
-          <w:sz w:val="24"/>
-          <w:lang/>
-        </w:rPr>
-        <w:t>年提出了</w:t>
-      </w:r>
-      <w:r>
-        <w:rPr>
-          <w:rFonts w:eastAsia="Times New Roman"/>
-          <w:kern w:val="0"/>
-          <w:sz w:val="24"/>
-          <w:lang/>
-        </w:rPr>
-        <w:t xml:space="preserve">Faster R-CNN </w:t>
-      </w:r>
-      <w:r>
-        <w:rPr>
-          <w:rFonts w:ascii="宋体" w:hAnsi="宋体" w:cs="宋体" w:hint="eastAsia"/>
-          <w:kern w:val="0"/>
-          <w:sz w:val="24"/>
-          <w:lang/>
-        </w:rPr>
-        <w:t>。其核心贡献是设计了一个区域提议网络（</w:t>
+      <w:r>
+        <w:rPr>
+          <w:rFonts w:ascii="宋体" w:hAnsi="宋体" w:cs="宋体" w:hint="eastAsia"/>
+          <w:kern w:val="0"/>
+          <w:sz w:val="24"/>
+          <w:lang/>
+        </w:rPr>
+        <w:t>其核心贡献是设计了一个区域提议网络（</w:t>
       </w:r>
       <w:r>
         <w:rPr>
@@ -3929,21 +4089,21 @@
       </w:r>
       <w:r>
         <w:rPr>
-          <w:rFonts w:eastAsia="Times New Roman"/>
-          <w:kern w:val="0"/>
-          <w:sz w:val="24"/>
-          <w:lang/>
-        </w:rPr>
-        <w:t xml:space="preserve"> </w:t>
-      </w:r>
-      <w:r>
-        <w:rPr>
-          <w:rFonts w:ascii="宋体" w:hAnsi="宋体" w:cs="宋体" w:hint="eastAsia"/>
-          <w:kern w:val="0"/>
-          <w:sz w:val="24"/>
-          <w:lang/>
-        </w:rPr>
-        <w:t>。通过将区域提议步骤集成到神经网络内部，</w:t>
+          <w:rFonts w:ascii="宋体" w:hAnsi="宋体" w:cs="宋体" w:hint="eastAsia"/>
+          <w:kern w:val="0"/>
+          <w:sz w:val="24"/>
+          <w:lang/>
+        </w:rPr>
+        <w:t>。</w:t>
+      </w:r>
+      <w:r>
+        <w:rPr>
+          <w:rFonts w:ascii="宋体" w:hAnsi="宋体" w:cs="宋体" w:hint="eastAsia"/>
+          <w:kern w:val="0"/>
+          <w:sz w:val="24"/>
+          <w:lang/>
+        </w:rPr>
+        <w:t>通过将区域提议步骤集成到神经网络内部，</w:t>
       </w:r>
       <w:r>
         <w:rPr>
@@ -3961,36 +4121,7 @@
           <w:sz w:val="24"/>
           <w:lang/>
         </w:rPr>
-        <w:t>首次实现了近乎实时的端到</w:t>
-      </w:r>
-      <w:proofErr w:type="gramStart"/>
-      <w:r>
-        <w:rPr>
-          <w:rFonts w:ascii="宋体" w:hAnsi="宋体" w:cs="宋体" w:hint="eastAsia"/>
-          <w:kern w:val="0"/>
-          <w:sz w:val="24"/>
-          <w:lang/>
-        </w:rPr>
-        <w:t>端目标</w:t>
-      </w:r>
-      <w:proofErr w:type="gramEnd"/>
-      <w:r>
-        <w:rPr>
-          <w:rFonts w:ascii="宋体" w:hAnsi="宋体" w:cs="宋体" w:hint="eastAsia"/>
-          <w:kern w:val="0"/>
-          <w:sz w:val="24"/>
-          <w:lang/>
-        </w:rPr>
-        <w:t>检测，成为后续许多两阶段检测算法的基石</w:t>
-      </w:r>
-      <w:r>
-        <w:rPr>
-          <w:rFonts w:eastAsia="Times New Roman"/>
-          <w:kern w:val="0"/>
-          <w:sz w:val="24"/>
-          <w:lang/>
-        </w:rPr>
-        <w:t xml:space="preserve"> </w:t>
+        <w:t>首次实现了近乎实时的端到端目标检测，成为后续许多两阶段检测算法的基石</w:t>
       </w:r>
       <w:r>
         <w:rPr>
@@ -4015,7 +4146,7 @@
       <w:pPr>
         <w:pStyle w:val="ac"/>
         <w:rPr>
-          <w:rFonts w:eastAsia="Times New Roman"/>
+          <w:rFonts w:eastAsiaTheme="minorEastAsia" w:hint="eastAsia"/>
           <w:lang/>
         </w:rPr>
       </w:pPr>
@@ -4028,7 +4159,7 @@
       </w:r>
       <w:r>
         <w:rPr>
-          <w:rFonts w:eastAsia="Times New Roman"/>
+          <w:rFonts w:ascii="Times New Roman" w:eastAsia="Times New Roman" w:hAnsi="Times New Roman" w:cs="Times New Roman"/>
           <w:lang/>
         </w:rPr>
         <w:t>Faster R-CNN</w:t>
@@ -4038,48 +4169,15 @@
           <w:rFonts w:hint="eastAsia"/>
           <w:lang/>
         </w:rPr>
-        <w:t>为代表的两阶段检测算法通常能够达到很高的检测精度，因为它们将定位和分类任务解耦，可以对候选区域进行精细的调整和识别。然而，其多步骤的流程依然带来了较大的计算开销，推理速度相对较慢，难以完全满足道路巡检等需要</w:t>
-      </w:r>
-      <w:proofErr w:type="gramStart"/>
-      <w:r>
-        <w:rPr>
-          <w:rFonts w:hint="eastAsia"/>
-          <w:lang/>
-        </w:rPr>
-        <w:t>高帧率</w:t>
-      </w:r>
-      <w:proofErr w:type="gramEnd"/>
-      <w:r>
-        <w:rPr>
-          <w:rFonts w:hint="eastAsia"/>
-          <w:lang/>
-        </w:rPr>
-        <w:t>实时处理的任务要求</w:t>
-      </w:r>
-      <w:r>
-        <w:rPr>
-          <w:rFonts w:eastAsia="Times New Roman"/>
-          <w:lang/>
-        </w:rPr>
-        <w:t xml:space="preserve"> </w:t>
-      </w:r>
-      <w:r>
-        <w:rPr>
+        <w:t>为代表的两阶段检测算法通常能够达到很高的检测精度，因为它们将定位和分类任务解耦，可以对候选区域进行精细的调整和识别。然而，其多步骤的流程依然带来了较大的计算开销，推理速度相对较慢，难以完全满足道路巡检等需要高帧率实时处理的任务要求</w:t>
+      </w:r>
+      <w:r>
+        <w:rPr>
+          <w:rFonts w:eastAsia="Times New Roman"/>
           <w:lang/>
         </w:rPr>
         <w:t>。</w:t>
       </w:r>
-    </w:p>
-    <w:p>
-      <w:pPr>
-        <w:spacing w:before="100" w:beforeAutospacing="1" w:after="100" w:afterAutospacing="1"/>
-        <w:rPr>
-          <w:rFonts w:eastAsia="Times New Roman"/>
-          <w:kern w:val="0"/>
-          <w:sz w:val="24"/>
-          <w:lang/>
-        </w:rPr>
-      </w:pPr>
     </w:p>
     <w:p>
       <w:pPr>
@@ -4145,55 +4243,7 @@
           <w:rFonts w:hint="eastAsia"/>
           <w:lang/>
         </w:rPr>
-        <w:t>为了解决两阶段算法的速度瓶颈，研究者们提出了将目标检测视为一个端到</w:t>
-      </w:r>
-      <w:proofErr w:type="gramStart"/>
-      <w:r>
-        <w:rPr>
-          <w:rFonts w:hint="eastAsia"/>
-          <w:lang/>
-        </w:rPr>
-        <w:t>端回归</w:t>
-      </w:r>
-      <w:proofErr w:type="gramEnd"/>
-      <w:r>
-        <w:rPr>
-          <w:rFonts w:hint="eastAsia"/>
-          <w:lang/>
-        </w:rPr>
-        <w:t>问题的</w:t>
-      </w:r>
-      <w:proofErr w:type="gramStart"/>
-      <w:r>
-        <w:rPr>
-          <w:rFonts w:hint="eastAsia"/>
-          <w:lang/>
-        </w:rPr>
-        <w:t>单阶段</w:t>
-      </w:r>
-      <w:proofErr w:type="gramEnd"/>
-      <w:r>
-        <w:rPr>
-          <w:rFonts w:hint="eastAsia"/>
-          <w:lang/>
-        </w:rPr>
-        <w:t>检测算法。该流派的核心思想是</w:t>
-      </w:r>
-      <w:proofErr w:type="gramStart"/>
-      <w:r>
-        <w:rPr>
-          <w:rFonts w:hint="eastAsia"/>
-          <w:lang/>
-        </w:rPr>
-        <w:t>取消了显式</w:t>
-      </w:r>
-      <w:proofErr w:type="gramEnd"/>
-      <w:r>
-        <w:rPr>
-          <w:rFonts w:hint="eastAsia"/>
-          <w:lang/>
-        </w:rPr>
-        <w:t>的候选区域生成步骤，直接在整张图像上密集地预测目标的类别和位置，从而极大地简化了检测流程并提升了速度</w:t>
+        <w:t>为了解决两阶段算法的速度瓶颈，研究者们提出了将目标检测视为一个端到端回归问题的单阶段检测算法。该流派的核心思想是取消了显式的候选区域生成步骤，直接在整张图像上密集地预测目标的类别和位置，从而极大地简化了检测流程并提升了速度</w:t>
       </w:r>
       <w:r>
         <w:rPr>
@@ -4291,7 +4341,80 @@
           <w:sz w:val="24"/>
           <w:lang/>
         </w:rPr>
-        <w:t>）。</w:t>
+        <w:t>）</w:t>
+      </w:r>
+      <w:r>
+        <w:rPr>
+          <w:rFonts w:ascii="宋体" w:hAnsi="宋体" w:cs="宋体"/>
+          <w:kern w:val="0"/>
+          <w:sz w:val="24"/>
+        </w:rPr>
+        <w:fldChar w:fldCharType="begin"/>
+      </w:r>
+      <w:r>
+        <w:rPr>
+          <w:rFonts w:ascii="宋体" w:hAnsi="宋体" w:cs="宋体"/>
+          <w:kern w:val="0"/>
+          <w:sz w:val="24"/>
+          <w:lang/>
+        </w:rPr>
+        <w:instrText xml:space="preserve"> ADDIN EN.CITE &lt;EndNote&gt;&lt;Cite&gt;&lt;Author&gt;Zhu&lt;/Author&gt;&lt;Year&gt;2014&lt;/Year&gt;&lt;RecNum&gt;27&lt;/RecNum&gt;&lt;DisplayText&gt;&lt;style face="superscript"&gt;[2]&lt;/style&gt;&lt;/DisplayText&gt;&lt;record&gt;&lt;rec-number&gt;27&lt;/rec-number&gt;&lt;foreign-keys&gt;&lt;key app="EN" db-id="r22exsavnwf02oef5eu5prfwststtzaxt0f2" timestamp="1693637848" guid="4f20af2a-d45d-4bf8-b74f-1fd22496fe4e"&gt;27&lt;/key&gt;&lt;/foreign-keys&gt;&lt;ref-type name="Journal Article"&gt;17&lt;/ref-type&gt;&lt;contributors&gt;&lt;authors&gt;&lt;author&gt;Zhu, Jun-Yan&lt;/author&gt;&lt;author&gt;Wu, Jiajun&lt;/author&gt;&lt;author&gt;Xu, Yan&lt;/author&gt;&lt;author&gt;Chang, Eric&lt;/author&gt;&lt;author&gt;Tu, Zhuowen&lt;/author&gt;&lt;/authors&gt;&lt;/contributors&gt;&lt;titles&gt;&lt;title&gt;Unsupervised object class discovery via saliency-guided multiple class learning&lt;/title&gt;&lt;secondary-title&gt;IEEE transactions on pattern analysis and machine intelligence&lt;/secondary-title&gt;&lt;/titles&gt;&lt;periodical&gt;&lt;full-title&gt;Ieee Transactions on Pattern Analysis and Machine Intelligence&lt;/full-title&gt;&lt;/periodical&gt;&lt;pages&gt;862-875&lt;/pages&gt;&lt;volume&gt;37&lt;/volume&gt;&lt;number&gt;4&lt;/number&gt;&lt;dates&gt;&lt;year&gt;2014&lt;/year&gt;&lt;/dates&gt;&lt;isbn&gt;0162-8828&lt;/isbn&gt;&lt;urls&gt;&lt;/urls&gt;&lt;/record&gt;&lt;/Cite&gt;&lt;/EndNote&gt;</w:instrText>
+      </w:r>
+      <w:r>
+        <w:rPr>
+          <w:rFonts w:ascii="宋体" w:hAnsi="宋体" w:cs="宋体"/>
+          <w:kern w:val="0"/>
+          <w:sz w:val="24"/>
+        </w:rPr>
+        <w:fldChar w:fldCharType="separate"/>
+      </w:r>
+      <w:r>
+        <w:rPr>
+          <w:rFonts w:ascii="宋体" w:hAnsi="宋体" w:cs="宋体"/>
+          <w:kern w:val="0"/>
+          <w:sz w:val="24"/>
+          <w:vertAlign w:val="superscript"/>
+          <w:lang/>
+        </w:rPr>
+        <w:t>[</w:t>
+      </w:r>
+      <w:r>
+        <w:rPr>
+          <w:rFonts w:ascii="宋体" w:hAnsi="宋体" w:cs="宋体" w:hint="eastAsia"/>
+          <w:kern w:val="0"/>
+          <w:sz w:val="24"/>
+          <w:vertAlign w:val="superscript"/>
+          <w:lang/>
+        </w:rPr>
+        <w:t>7</w:t>
+      </w:r>
+      <w:r>
+        <w:rPr>
+          <w:rFonts w:ascii="宋体" w:hAnsi="宋体" w:cs="宋体"/>
+          <w:kern w:val="0"/>
+          <w:sz w:val="24"/>
+          <w:vertAlign w:val="superscript"/>
+          <w:lang/>
+        </w:rPr>
+        <w:t>]</w:t>
+      </w:r>
+      <w:r>
+        <w:rPr>
+          <w:rFonts w:ascii="宋体" w:hAnsi="宋体" w:cs="宋体"/>
+          <w:kern w:val="0"/>
+          <w:sz w:val="24"/>
+          <w:lang/>
+        </w:rPr>
+        <w:fldChar w:fldCharType="end"/>
+      </w:r>
+      <w:r>
+        <w:rPr>
+          <w:rFonts w:ascii="宋体" w:hAnsi="宋体" w:cs="宋体" w:hint="eastAsia"/>
+          <w:kern w:val="0"/>
+          <w:sz w:val="24"/>
+          <w:lang/>
+        </w:rPr>
+        <w:t>。</w:t>
       </w:r>
       <w:r>
         <w:rPr>
@@ -4385,15 +4508,6 @@
       </w:r>
       <w:r>
         <w:rPr>
-          <w:rFonts w:eastAsia="Times New Roman"/>
-          <w:kern w:val="0"/>
-          <w:sz w:val="24"/>
-          <w:lang/>
-        </w:rPr>
-        <w:t xml:space="preserve"> </w:t>
-      </w:r>
-      <w:r>
-        <w:rPr>
           <w:rFonts w:ascii="宋体" w:hAnsi="宋体" w:cs="宋体" w:hint="eastAsia"/>
           <w:kern w:val="0"/>
           <w:sz w:val="24"/>
@@ -4450,12 +4564,12 @@
       </w:r>
       <w:r>
         <w:rPr>
-          <w:rFonts w:eastAsia="Times New Roman"/>
-          <w:kern w:val="0"/>
-          <w:sz w:val="24"/>
-          <w:lang/>
-        </w:rPr>
-        <w:t>2016</w:t>
+          <w:rFonts w:ascii="宋体" w:hAnsi="宋体" w:cs="宋体" w:hint="eastAsia"/>
+          <w:kern w:val="0"/>
+          <w:sz w:val="24"/>
+          <w:lang/>
+        </w:rPr>
+        <w:t>同</w:t>
       </w:r>
       <w:r>
         <w:rPr>
@@ -4504,12 +4618,67 @@
       </w:r>
       <w:r>
         <w:rPr>
-          <w:rFonts w:eastAsia="Times New Roman"/>
-          <w:kern w:val="0"/>
-          <w:sz w:val="24"/>
-          <w:lang/>
-        </w:rPr>
-        <w:t xml:space="preserve"> </w:t>
+          <w:rFonts w:ascii="宋体" w:hAnsi="宋体" w:cs="宋体"/>
+          <w:kern w:val="0"/>
+          <w:sz w:val="24"/>
+        </w:rPr>
+        <w:fldChar w:fldCharType="begin"/>
+      </w:r>
+      <w:r>
+        <w:rPr>
+          <w:rFonts w:ascii="宋体" w:hAnsi="宋体" w:cs="宋体"/>
+          <w:kern w:val="0"/>
+          <w:sz w:val="24"/>
+          <w:lang/>
+        </w:rPr>
+        <w:instrText xml:space="preserve"> ADDIN EN.CITE &lt;EndNote&gt;&lt;Cite&gt;&lt;Author&gt;Zhu&lt;/Author&gt;&lt;Year&gt;2014&lt;/Year&gt;&lt;RecNum&gt;27&lt;/RecNum&gt;&lt;DisplayText&gt;&lt;style face="superscript"&gt;[2]&lt;/style&gt;&lt;/DisplayText&gt;&lt;record&gt;&lt;rec-number&gt;27&lt;/rec-number&gt;&lt;foreign-keys&gt;&lt;key app="EN" db-id="r22exsavnwf02oef5eu5prfwststtzaxt0f2" timestamp="1693637848" guid="4f20af2a-d45d-4bf8-b74f-1fd22496fe4e"&gt;27&lt;/key&gt;&lt;/foreign-keys&gt;&lt;ref-type name="Journal Article"&gt;17&lt;/ref-type&gt;&lt;contributors&gt;&lt;authors&gt;&lt;author&gt;Zhu, Jun-Yan&lt;/author&gt;&lt;author&gt;Wu, Jiajun&lt;/author&gt;&lt;author&gt;Xu, Yan&lt;/author&gt;&lt;author&gt;Chang, Eric&lt;/author&gt;&lt;author&gt;Tu, Zhuowen&lt;/author&gt;&lt;/authors&gt;&lt;/contributors&gt;&lt;titles&gt;&lt;title&gt;Unsupervised object class discovery via saliency-guided multiple class learning&lt;/title&gt;&lt;secondary-title&gt;IEEE transactions on pattern analysis and machine intelligence&lt;/secondary-title&gt;&lt;/titles&gt;&lt;periodical&gt;&lt;full-title&gt;Ieee Transactions on Pattern Analysis and Machine Intelligence&lt;/full-title&gt;&lt;/periodical&gt;&lt;pages&gt;862-875&lt;/pages&gt;&lt;volume&gt;37&lt;/volume&gt;&lt;number&gt;4&lt;/number&gt;&lt;dates&gt;&lt;year&gt;2014&lt;/year&gt;&lt;/dates&gt;&lt;isbn&gt;0162-8828&lt;/isbn&gt;&lt;urls&gt;&lt;/urls&gt;&lt;/record&gt;&lt;/Cite&gt;&lt;/EndNote&gt;</w:instrText>
+      </w:r>
+      <w:r>
+        <w:rPr>
+          <w:rFonts w:ascii="宋体" w:hAnsi="宋体" w:cs="宋体"/>
+          <w:kern w:val="0"/>
+          <w:sz w:val="24"/>
+        </w:rPr>
+        <w:fldChar w:fldCharType="separate"/>
+      </w:r>
+      <w:r>
+        <w:rPr>
+          <w:rFonts w:ascii="宋体" w:hAnsi="宋体" w:cs="宋体"/>
+          <w:kern w:val="0"/>
+          <w:sz w:val="24"/>
+          <w:vertAlign w:val="superscript"/>
+          <w:lang/>
+        </w:rPr>
+        <w:t>[</w:t>
+      </w:r>
+      <w:r>
+        <w:rPr>
+          <w:rFonts w:ascii="宋体" w:hAnsi="宋体" w:cs="宋体" w:hint="eastAsia"/>
+          <w:kern w:val="0"/>
+          <w:sz w:val="24"/>
+          <w:vertAlign w:val="superscript"/>
+          <w:lang/>
+        </w:rPr>
+        <w:t>8</w:t>
+      </w:r>
+      <w:r>
+        <w:rPr>
+          <w:rFonts w:ascii="宋体" w:hAnsi="宋体" w:cs="宋体"/>
+          <w:kern w:val="0"/>
+          <w:sz w:val="24"/>
+          <w:vertAlign w:val="superscript"/>
+          <w:lang/>
+        </w:rPr>
+        <w:t>]</w:t>
+      </w:r>
+      <w:r>
+        <w:rPr>
+          <w:rFonts w:ascii="宋体" w:hAnsi="宋体" w:cs="宋体"/>
+          <w:kern w:val="0"/>
+          <w:sz w:val="24"/>
+          <w:lang/>
+        </w:rPr>
+        <w:fldChar w:fldCharType="end"/>
       </w:r>
       <w:r>
         <w:rPr>
@@ -4576,16 +4745,7 @@
       </w:r>
       <w:r>
         <w:rPr>
-          <w:rFonts w:eastAsia="Times New Roman"/>
-          <w:kern w:val="0"/>
-          <w:sz w:val="24"/>
-          <w:lang/>
-        </w:rPr>
-        <w:t xml:space="preserve"> </w:t>
-      </w:r>
-      <w:r>
-        <w:rPr>
-          <w:rFonts w:ascii="宋体" w:hAnsi="宋体" w:cs="宋体"/>
+          <w:rFonts w:ascii="宋体" w:hAnsi="宋体" w:cs="宋体" w:hint="eastAsia"/>
           <w:kern w:val="0"/>
           <w:sz w:val="24"/>
           <w:lang/>
@@ -4623,21 +4783,21 @@
       </w:r>
       <w:r>
         <w:rPr>
-          <w:rFonts w:eastAsia="Times New Roman"/>
-          <w:kern w:val="0"/>
-          <w:sz w:val="24"/>
-          <w:lang/>
-        </w:rPr>
-        <w:t xml:space="preserve"> </w:t>
-      </w:r>
-      <w:r>
-        <w:rPr>
-          <w:rFonts w:ascii="宋体" w:hAnsi="宋体" w:cs="宋体" w:hint="eastAsia"/>
-          <w:kern w:val="0"/>
-          <w:sz w:val="24"/>
-          <w:lang/>
-        </w:rPr>
-        <w:t>。下表总结了</w:t>
+          <w:rFonts w:ascii="宋体" w:hAnsi="宋体" w:cs="宋体" w:hint="eastAsia"/>
+          <w:kern w:val="0"/>
+          <w:sz w:val="24"/>
+          <w:lang/>
+        </w:rPr>
+        <w:t>。</w:t>
+      </w:r>
+      <w:r>
+        <w:rPr>
+          <w:rFonts w:ascii="宋体" w:hAnsi="宋体" w:cs="宋体" w:hint="eastAsia"/>
+          <w:kern w:val="0"/>
+          <w:sz w:val="24"/>
+          <w:lang/>
+        </w:rPr>
+        <w:t>下表总结了</w:t>
       </w:r>
       <w:r>
         <w:rPr>
@@ -5152,19 +5312,11 @@
               </w:rPr>
             </w:pPr>
             <w:proofErr w:type="spellStart"/>
-            <w:proofErr w:type="gramStart"/>
             <w:r>
               <w:rPr>
                 <w:rFonts w:eastAsia="Times New Roman"/>
               </w:rPr>
-              <w:t>提出“</w:t>
-            </w:r>
-            <w:proofErr w:type="gramEnd"/>
-            <w:r>
-              <w:rPr>
-                <w:rFonts w:eastAsia="Times New Roman"/>
-              </w:rPr>
-              <w:t>Bag</w:t>
+              <w:t>提出“Bag</w:t>
             </w:r>
             <w:proofErr w:type="spellEnd"/>
             <w:r>
@@ -5174,19 +5326,11 @@
               <w:t xml:space="preserve"> of </w:t>
             </w:r>
             <w:proofErr w:type="spellStart"/>
-            <w:proofErr w:type="gramStart"/>
             <w:r>
               <w:rPr>
                 <w:rFonts w:eastAsia="Times New Roman"/>
               </w:rPr>
-              <w:t>Freebies”和</w:t>
-            </w:r>
-            <w:proofErr w:type="gramEnd"/>
-            <w:r>
-              <w:rPr>
-                <w:rFonts w:eastAsia="Times New Roman"/>
-              </w:rPr>
-              <w:t>“Bag</w:t>
+              <w:t>Freebies”和“Bag</w:t>
             </w:r>
             <w:proofErr w:type="spellEnd"/>
             <w:r>
@@ -5196,19 +5340,11 @@
               <w:t xml:space="preserve"> of </w:t>
             </w:r>
             <w:proofErr w:type="spellStart"/>
-            <w:proofErr w:type="gramStart"/>
             <w:r>
               <w:rPr>
                 <w:rFonts w:eastAsia="Times New Roman"/>
               </w:rPr>
-              <w:t>Specials”概念</w:t>
-            </w:r>
-            <w:proofErr w:type="gramEnd"/>
-            <w:r>
-              <w:rPr>
-                <w:rFonts w:eastAsia="Times New Roman"/>
-              </w:rPr>
-              <w:t>，系统性地集成了当时最先进的技术（如CSPNet、Mish激活、Mosaic数据增强等</w:t>
+              <w:t>Specials”概念，系统性地集成了当时最先进的技术（如CSPNet、Mish激活、Mosaic数据增强等</w:t>
             </w:r>
             <w:proofErr w:type="spellEnd"/>
             <w:r>
@@ -5626,7 +5762,7 @@
           <w:rFonts w:ascii="Times New Roman" w:eastAsia="Times New Roman" w:hAnsi="Times New Roman" w:cs="Times New Roman"/>
           <w:lang/>
         </w:rPr>
-        <w:t xml:space="preserve">mAP </w:t>
+        <w:t>mAP</w:t>
       </w:r>
       <w:r>
         <w:rPr>
@@ -5665,16 +5801,86 @@
       </w:r>
       <w:r>
         <w:rPr>
+          <w:rFonts w:hint="eastAsia"/>
+          <w:lang/>
+        </w:rPr>
+        <w:t>。</w:t>
+      </w:r>
+      <w:r>
+        <w:rPr>
           <w:rFonts w:ascii="Times New Roman" w:eastAsia="Times New Roman" w:hAnsi="Times New Roman" w:cs="Times New Roman"/>
           <w:lang/>
         </w:rPr>
-        <w:t xml:space="preserve"> </w:t>
+        <w:t xml:space="preserve">YOLOv4 </w:t>
       </w:r>
       <w:r>
         <w:rPr>
           <w:rFonts w:hint="eastAsia"/>
           <w:lang/>
         </w:rPr>
+        <w:t>则是一次集大成式的更新，其作者系统地测试并融合了大量当时最先进的优化技术，如</w:t>
+      </w:r>
+      <w:r>
+        <w:rPr>
+          <w:rFonts w:ascii="Times New Roman" w:eastAsia="Times New Roman" w:hAnsi="Times New Roman" w:cs="Times New Roman"/>
+          <w:lang/>
+        </w:rPr>
+        <w:t>CSP</w:t>
+      </w:r>
+      <w:r>
+        <w:rPr>
+          <w:rFonts w:hint="eastAsia"/>
+          <w:lang/>
+        </w:rPr>
+        <w:t>（</w:t>
+      </w:r>
+      <w:r>
+        <w:rPr>
+          <w:rFonts w:ascii="Times New Roman" w:eastAsia="Times New Roman" w:hAnsi="Times New Roman" w:cs="Times New Roman"/>
+          <w:lang/>
+        </w:rPr>
+        <w:t>Cross Stage Partial</w:t>
+      </w:r>
+      <w:r>
+        <w:rPr>
+          <w:rFonts w:hint="eastAsia"/>
+          <w:lang/>
+        </w:rPr>
+        <w:t>）连接、</w:t>
+      </w:r>
+      <w:r>
+        <w:rPr>
+          <w:rFonts w:ascii="Times New Roman" w:eastAsia="Times New Roman" w:hAnsi="Times New Roman" w:cs="Times New Roman"/>
+          <w:lang/>
+        </w:rPr>
+        <w:t>Mish</w:t>
+      </w:r>
+      <w:r>
+        <w:rPr>
+          <w:rFonts w:hint="eastAsia"/>
+          <w:lang/>
+        </w:rPr>
+        <w:t>激活函数、</w:t>
+      </w:r>
+      <w:r>
+        <w:rPr>
+          <w:rFonts w:ascii="Times New Roman" w:eastAsia="Times New Roman" w:hAnsi="Times New Roman" w:cs="Times New Roman"/>
+          <w:lang/>
+        </w:rPr>
+        <w:t>Mosaic</w:t>
+      </w:r>
+      <w:r>
+        <w:rPr>
+          <w:rFonts w:hint="eastAsia"/>
+          <w:lang/>
+        </w:rPr>
+        <w:t>数据增强等，在不牺牲速度的前提下将精度推向了新的高度</w:t>
+      </w:r>
+      <w:r>
+        <w:rPr>
+          <w:rFonts w:hint="eastAsia"/>
+          <w:lang/>
+        </w:rPr>
         <w:t>。</w:t>
       </w:r>
       <w:r>
@@ -5682,230 +5888,117 @@
           <w:rFonts w:ascii="Times New Roman" w:eastAsia="Times New Roman" w:hAnsi="Times New Roman" w:cs="Times New Roman"/>
           <w:lang/>
         </w:rPr>
-        <w:t xml:space="preserve">YOLOv4 </w:t>
+        <w:t xml:space="preserve">YOLOv5 </w:t>
       </w:r>
       <w:r>
         <w:rPr>
           <w:rFonts w:hint="eastAsia"/>
           <w:lang/>
         </w:rPr>
-        <w:t>则是一次集大成式的更新，其作者系统地测试并融合了大量当时最先进的优化技术，如</w:t>
+        <w:t>虽然没有正式发表论文，但其凭借在</w:t>
       </w:r>
       <w:r>
         <w:rPr>
           <w:rFonts w:ascii="Times New Roman" w:eastAsia="Times New Roman" w:hAnsi="Times New Roman" w:cs="Times New Roman"/>
           <w:lang/>
         </w:rPr>
-        <w:t>CSP</w:t>
+        <w:t>PyTorch</w:t>
       </w:r>
       <w:r>
         <w:rPr>
           <w:rFonts w:hint="eastAsia"/>
           <w:lang/>
         </w:rPr>
-        <w:t>（</w:t>
+        <w:t>框架下的优秀实现、极佳的易用性和工程化特性，迅速获得了工业界和学术界的广泛应用</w:t>
+      </w:r>
+      <w:r>
+        <w:rPr>
+          <w:rFonts w:hint="eastAsia"/>
+          <w:lang/>
+        </w:rPr>
+        <w:t>。</w:t>
+      </w:r>
+      <w:r>
+        <w:rPr>
+          <w:rFonts w:hint="eastAsia"/>
+          <w:lang/>
+        </w:rPr>
+        <w:t>后续的</w:t>
       </w:r>
       <w:r>
         <w:rPr>
           <w:rFonts w:ascii="Times New Roman" w:eastAsia="Times New Roman" w:hAnsi="Times New Roman" w:cs="Times New Roman"/>
           <w:lang/>
         </w:rPr>
-        <w:t>Cross Stage Partial</w:t>
+        <w:t xml:space="preserve">YOLOv8 </w:t>
       </w:r>
       <w:r>
         <w:rPr>
           <w:rFonts w:hint="eastAsia"/>
           <w:lang/>
         </w:rPr>
-        <w:t>）连接、</w:t>
+        <w:t>和</w:t>
       </w:r>
       <w:r>
         <w:rPr>
           <w:rFonts w:ascii="Times New Roman" w:eastAsia="Times New Roman" w:hAnsi="Times New Roman" w:cs="Times New Roman"/>
           <w:lang/>
         </w:rPr>
-        <w:t>Mish</w:t>
+        <w:t xml:space="preserve">YOLOv9 </w:t>
       </w:r>
       <w:r>
         <w:rPr>
           <w:rFonts w:hint="eastAsia"/>
           <w:lang/>
         </w:rPr>
-        <w:t>激活函数、</w:t>
+        <w:t>等模型则在无锚框设计、网络结构和梯度信息流等方面持续创新，不断刷新着实时目标检测的性能上限</w:t>
+      </w:r>
+      <w:r>
+        <w:rPr>
+          <w:rFonts w:hint="eastAsia"/>
+          <w:lang/>
+        </w:rPr>
+        <w:t>。</w:t>
       </w:r>
       <w:r>
         <w:rPr>
           <w:rFonts w:ascii="Times New Roman" w:eastAsia="Times New Roman" w:hAnsi="Times New Roman" w:cs="Times New Roman"/>
           <w:lang/>
         </w:rPr>
-        <w:t>Mosaic</w:t>
-      </w:r>
+        <w:t xml:space="preserve">   </w:t>
+      </w:r>
+    </w:p>
+    <w:p>
+      <w:pPr>
+        <w:pStyle w:val="ac"/>
+        <w:rPr>
+          <w:lang/>
+        </w:rPr>
+      </w:pPr>
       <w:r>
         <w:rPr>
           <w:rFonts w:hint="eastAsia"/>
           <w:lang/>
         </w:rPr>
-        <w:t>数据增强等，在不牺牲速度的前提下将精度推向了新的高度</w:t>
-      </w:r>
-      <w:r>
-        <w:rPr>
-          <w:rFonts w:ascii="Times New Roman" w:eastAsia="Times New Roman" w:hAnsi="Times New Roman" w:cs="Times New Roman"/>
-          <w:lang/>
-        </w:rPr>
-        <w:t xml:space="preserve"> </w:t>
+        <w:t>这种将检测速度与精度进行有效平衡的设计，使得单阶段检测器，特别是</w:t>
+      </w:r>
+      <w:r>
+        <w:rPr>
+          <w:rFonts w:eastAsia="Times New Roman"/>
+          <w:lang/>
+        </w:rPr>
+        <w:t>YOLO</w:t>
       </w:r>
       <w:r>
         <w:rPr>
           <w:rFonts w:hint="eastAsia"/>
           <w:lang/>
         </w:rPr>
-        <w:t>。</w:t>
-      </w:r>
-      <w:r>
-        <w:rPr>
-          <w:rFonts w:ascii="Times New Roman" w:eastAsia="Times New Roman" w:hAnsi="Times New Roman" w:cs="Times New Roman"/>
-          <w:lang/>
-        </w:rPr>
-        <w:t xml:space="preserve">YOLOv5 </w:t>
-      </w:r>
-      <w:r>
-        <w:rPr>
-          <w:rFonts w:hint="eastAsia"/>
-          <w:lang/>
-        </w:rPr>
-        <w:t>虽然没有正式发表论文，但其凭借在</w:t>
-      </w:r>
-      <w:r>
-        <w:rPr>
-          <w:rFonts w:ascii="Times New Roman" w:eastAsia="Times New Roman" w:hAnsi="Times New Roman" w:cs="Times New Roman"/>
-          <w:lang/>
-        </w:rPr>
-        <w:t>PyTorch</w:t>
-      </w:r>
-      <w:r>
-        <w:rPr>
-          <w:rFonts w:hint="eastAsia"/>
-          <w:lang/>
-        </w:rPr>
-        <w:t>框架下的优秀实现、极佳的易用性和工程化特性，迅速获得了工业界和学术界的广泛应用</w:t>
-      </w:r>
-      <w:r>
-        <w:rPr>
-          <w:rFonts w:ascii="Times New Roman" w:eastAsia="Times New Roman" w:hAnsi="Times New Roman" w:cs="Times New Roman"/>
-          <w:lang/>
-        </w:rPr>
-        <w:t xml:space="preserve"> </w:t>
-      </w:r>
-      <w:r>
-        <w:rPr>
-          <w:rFonts w:hint="eastAsia"/>
-          <w:lang/>
-        </w:rPr>
-        <w:t>。后续的</w:t>
-      </w:r>
-      <w:r>
-        <w:rPr>
-          <w:rFonts w:ascii="Times New Roman" w:eastAsia="Times New Roman" w:hAnsi="Times New Roman" w:cs="Times New Roman"/>
-          <w:lang/>
-        </w:rPr>
-        <w:t xml:space="preserve">YOLOv8 </w:t>
-      </w:r>
-      <w:r>
-        <w:rPr>
-          <w:rFonts w:hint="eastAsia"/>
-          <w:lang/>
-        </w:rPr>
-        <w:t>和</w:t>
-      </w:r>
-      <w:r>
-        <w:rPr>
-          <w:rFonts w:ascii="Times New Roman" w:eastAsia="Times New Roman" w:hAnsi="Times New Roman" w:cs="Times New Roman"/>
-          <w:lang/>
-        </w:rPr>
-        <w:t xml:space="preserve">YOLOv9 </w:t>
-      </w:r>
-      <w:r>
-        <w:rPr>
-          <w:rFonts w:hint="eastAsia"/>
-          <w:lang/>
-        </w:rPr>
-        <w:t>等模型则在无锚框设计、网络结构和梯度信息流等方面持续创新，不断刷新着实时目标检测的性能上限</w:t>
-      </w:r>
-      <w:r>
-        <w:rPr>
-          <w:rFonts w:ascii="Times New Roman" w:eastAsia="Times New Roman" w:hAnsi="Times New Roman" w:cs="Times New Roman"/>
-          <w:lang/>
-        </w:rPr>
-        <w:t xml:space="preserve"> </w:t>
-      </w:r>
-      <w:r>
-        <w:rPr>
-          <w:rFonts w:hint="eastAsia"/>
-          <w:lang/>
-        </w:rPr>
-        <w:t>。</w:t>
-      </w:r>
-      <w:r>
-        <w:rPr>
-          <w:rFonts w:ascii="Times New Roman" w:eastAsia="Times New Roman" w:hAnsi="Times New Roman" w:cs="Times New Roman"/>
-          <w:lang/>
-        </w:rPr>
-        <w:t xml:space="preserve">   </w:t>
-      </w:r>
-    </w:p>
-    <w:p>
-      <w:pPr>
-        <w:pStyle w:val="ac"/>
-        <w:rPr>
-          <w:lang/>
-        </w:rPr>
-      </w:pPr>
-      <w:r>
-        <w:rPr>
-          <w:rFonts w:hint="eastAsia"/>
-          <w:lang/>
-        </w:rPr>
-        <w:t>这种将检测速度与精度进行有效平衡的设计，使得</w:t>
-      </w:r>
-      <w:proofErr w:type="gramStart"/>
-      <w:r>
-        <w:rPr>
-          <w:rFonts w:hint="eastAsia"/>
-          <w:lang/>
-        </w:rPr>
-        <w:t>单阶段</w:t>
-      </w:r>
-      <w:proofErr w:type="gramEnd"/>
-      <w:r>
-        <w:rPr>
-          <w:rFonts w:hint="eastAsia"/>
-          <w:lang/>
-        </w:rPr>
-        <w:t>检测器，特别是</w:t>
-      </w:r>
-      <w:r>
-        <w:rPr>
-          <w:rFonts w:eastAsia="Times New Roman"/>
-          <w:lang/>
-        </w:rPr>
-        <w:t>YOLO</w:t>
-      </w:r>
-      <w:r>
-        <w:rPr>
-          <w:rFonts w:hint="eastAsia"/>
-          <w:lang/>
-        </w:rPr>
         <w:t>系列，已成为工业界和学术界实时检测任务的首选方案</w:t>
       </w:r>
       <w:r>
         <w:rPr>
           <w:rFonts w:eastAsia="Times New Roman"/>
-          <w:lang/>
-        </w:rPr>
-        <w:t xml:space="preserve"> </w:t>
-      </w:r>
-      <w:r>
-        <w:rPr>
           <w:lang/>
         </w:rPr>
         <w:t>。</w:t>
@@ -5981,39 +6074,7 @@
           <w:rFonts w:hint="eastAsia"/>
           <w:lang/>
         </w:rPr>
-        <w:t>为代表的深度学习模型性能强大，但在实际部署中，尤其是在算力、内存和</w:t>
-      </w:r>
-      <w:proofErr w:type="gramStart"/>
-      <w:r>
-        <w:rPr>
-          <w:rFonts w:hint="eastAsia"/>
-          <w:lang/>
-        </w:rPr>
-        <w:t>功耗均</w:t>
-      </w:r>
-      <w:proofErr w:type="gramEnd"/>
-      <w:r>
-        <w:rPr>
-          <w:rFonts w:hint="eastAsia"/>
-          <w:lang/>
-        </w:rPr>
-        <w:t>受限的车载边缘计算设备上，模型的大小和计算复杂</w:t>
-      </w:r>
-      <w:proofErr w:type="gramStart"/>
-      <w:r>
-        <w:rPr>
-          <w:rFonts w:hint="eastAsia"/>
-          <w:lang/>
-        </w:rPr>
-        <w:t>度成为</w:t>
-      </w:r>
-      <w:proofErr w:type="gramEnd"/>
-      <w:r>
-        <w:rPr>
-          <w:rFonts w:hint="eastAsia"/>
-          <w:lang/>
-        </w:rPr>
-        <w:t>关键瓶颈。为此，学术界和工业界正积极探索模型优化技术，旨在实现一个能够在精度、速度和模型大小之间取得更优平衡的解决方案。这一研究方向的成熟，体现了计算机视觉领域从追求纯粹的理论精度，向关注实际应用部署的范式转变。两个主要的研究方向是模型轻量化和注意力机制</w:t>
+        <w:t>为代表的深度学习模型性能强大，但在实际部署中，尤其是在算力、内存和功耗均受限的车载边缘计算设备上，模型的大小和计算复杂度成为关键瓶颈。为此，学术界和工业界正积极探索模型优化技术，旨在实现一个能够在精度、速度和模型大小之间取得更优平衡的解决方案。这一研究方向的成熟，体现了计算机视觉领域从追求纯粹的理论精度，向关注实际应用部署的范式转变。两个主要的研究方向是模型轻量化和注意力机制</w:t>
       </w:r>
       <w:r>
         <w:rPr>
@@ -6251,21 +6312,21 @@
       </w:r>
       <w:r>
         <w:rPr>
-          <w:rFonts w:eastAsia="Times New Roman"/>
-          <w:kern w:val="0"/>
-          <w:sz w:val="24"/>
-          <w:lang/>
-        </w:rPr>
-        <w:t xml:space="preserve"> </w:t>
-      </w:r>
-      <w:r>
-        <w:rPr>
-          <w:rFonts w:ascii="宋体" w:hAnsi="宋体" w:cs="宋体" w:hint="eastAsia"/>
-          <w:kern w:val="0"/>
-          <w:sz w:val="24"/>
-          <w:lang/>
-        </w:rPr>
-        <w:t>。其后续版本</w:t>
+          <w:rFonts w:ascii="宋体" w:hAnsi="宋体" w:cs="宋体" w:hint="eastAsia"/>
+          <w:kern w:val="0"/>
+          <w:sz w:val="24"/>
+          <w:lang/>
+        </w:rPr>
+        <w:t>。</w:t>
+      </w:r>
+      <w:r>
+        <w:rPr>
+          <w:rFonts w:ascii="宋体" w:hAnsi="宋体" w:cs="宋体" w:hint="eastAsia"/>
+          <w:kern w:val="0"/>
+          <w:sz w:val="24"/>
+          <w:lang/>
+        </w:rPr>
+        <w:t>其后续版本</w:t>
       </w:r>
       <w:r>
         <w:rPr>
@@ -6283,27 +6344,7 @@
           <w:sz w:val="24"/>
           <w:lang/>
         </w:rPr>
-        <w:t>在此基础上引入</w:t>
-      </w:r>
-      <w:proofErr w:type="gramStart"/>
-      <w:r>
-        <w:rPr>
-          <w:rFonts w:ascii="宋体" w:hAnsi="宋体" w:cs="宋体" w:hint="eastAsia"/>
-          <w:kern w:val="0"/>
-          <w:sz w:val="24"/>
-          <w:lang/>
-        </w:rPr>
-        <w:t>了倒</w:t>
-      </w:r>
-      <w:proofErr w:type="gramEnd"/>
-      <w:r>
-        <w:rPr>
-          <w:rFonts w:ascii="宋体" w:hAnsi="宋体" w:cs="宋体" w:hint="eastAsia"/>
-          <w:kern w:val="0"/>
-          <w:sz w:val="24"/>
-          <w:lang/>
-        </w:rPr>
-        <w:t>置残差（</w:t>
+        <w:t>在此基础上引入了倒置残差（</w:t>
       </w:r>
       <w:r>
         <w:rPr>
@@ -6343,16 +6384,7 @@
       </w:r>
       <w:r>
         <w:rPr>
-          <w:rFonts w:eastAsia="Times New Roman"/>
-          <w:kern w:val="0"/>
-          <w:sz w:val="24"/>
-          <w:lang/>
-        </w:rPr>
-        <w:t xml:space="preserve"> </w:t>
-      </w:r>
-      <w:r>
-        <w:rPr>
-          <w:rFonts w:ascii="宋体" w:hAnsi="宋体" w:cs="宋体"/>
+          <w:rFonts w:ascii="宋体" w:hAnsi="宋体" w:cs="宋体" w:hint="eastAsia"/>
           <w:kern w:val="0"/>
           <w:sz w:val="24"/>
           <w:lang/>
@@ -6480,21 +6512,21 @@
       </w:r>
       <w:r>
         <w:rPr>
-          <w:rFonts w:eastAsia="Times New Roman"/>
-          <w:kern w:val="0"/>
-          <w:sz w:val="24"/>
-          <w:lang/>
-        </w:rPr>
-        <w:t xml:space="preserve"> </w:t>
-      </w:r>
-      <w:r>
-        <w:rPr>
-          <w:rFonts w:ascii="宋体" w:hAnsi="宋体" w:cs="宋体" w:hint="eastAsia"/>
-          <w:kern w:val="0"/>
-          <w:sz w:val="24"/>
-          <w:lang/>
-        </w:rPr>
-        <w:t>。其改进版</w:t>
+          <w:rFonts w:ascii="宋体" w:hAnsi="宋体" w:cs="宋体" w:hint="eastAsia"/>
+          <w:kern w:val="0"/>
+          <w:sz w:val="24"/>
+          <w:lang/>
+        </w:rPr>
+        <w:t>。</w:t>
+      </w:r>
+      <w:r>
+        <w:rPr>
+          <w:rFonts w:ascii="宋体" w:hAnsi="宋体" w:cs="宋体" w:hint="eastAsia"/>
+          <w:kern w:val="0"/>
+          <w:sz w:val="24"/>
+          <w:lang/>
+        </w:rPr>
+        <w:t>其改进版</w:t>
       </w:r>
       <w:r>
         <w:rPr>
@@ -6534,16 +6566,7 @@
       </w:r>
       <w:r>
         <w:rPr>
-          <w:rFonts w:eastAsia="Times New Roman"/>
-          <w:kern w:val="0"/>
-          <w:sz w:val="24"/>
-          <w:lang/>
-        </w:rPr>
-        <w:t xml:space="preserve"> </w:t>
-      </w:r>
-      <w:r>
-        <w:rPr>
-          <w:rFonts w:ascii="宋体" w:hAnsi="宋体" w:cs="宋体"/>
+          <w:rFonts w:ascii="宋体" w:hAnsi="宋体" w:cs="宋体" w:hint="eastAsia"/>
           <w:kern w:val="0"/>
           <w:sz w:val="24"/>
           <w:lang/>
@@ -6704,15 +6727,6 @@
           <w:lang/>
         </w:rPr>
         <w:t>特征图。这种方法能够用更少的计算量生成同样丰富的特征表示，极大地压缩了模型的体积和计算复杂度</w:t>
-      </w:r>
-      <w:r>
-        <w:rPr>
-          <w:rFonts w:eastAsia="Times New Roman"/>
-          <w:kern w:val="0"/>
-          <w:sz w:val="24"/>
-          <w:lang/>
-        </w:rPr>
-        <w:t xml:space="preserve"> </w:t>
       </w:r>
       <w:r>
         <w:rPr>
@@ -6962,6 +6976,143 @@
       </w:r>
       <w:r>
         <w:rPr>
+          <w:rFonts w:ascii="宋体" w:hAnsi="宋体" w:cs="宋体" w:hint="eastAsia"/>
+          <w:kern w:val="0"/>
+          <w:sz w:val="24"/>
+          <w:lang/>
+        </w:rPr>
+        <w:t>。</w:t>
+      </w:r>
+      <w:r>
+        <w:rPr>
+          <w:rFonts w:ascii="宋体" w:hAnsi="宋体" w:cs="宋体" w:hint="eastAsia"/>
+          <w:kern w:val="0"/>
+          <w:sz w:val="24"/>
+          <w:lang/>
+        </w:rPr>
+        <w:t>该工作赢得了</w:t>
+      </w:r>
+      <w:r>
+        <w:rPr>
+          <w:rFonts w:eastAsia="Times New Roman"/>
+          <w:kern w:val="0"/>
+          <w:sz w:val="24"/>
+          <w:lang/>
+        </w:rPr>
+        <w:t>ILSVRC 2017</w:t>
+      </w:r>
+      <w:r>
+        <w:rPr>
+          <w:rFonts w:ascii="宋体" w:hAnsi="宋体" w:cs="宋体" w:hint="eastAsia"/>
+          <w:kern w:val="0"/>
+          <w:sz w:val="24"/>
+          <w:lang/>
+        </w:rPr>
+        <w:t>分类任务的冠军，证明了其有效性</w:t>
+      </w:r>
+      <w:r>
+        <w:rPr>
+          <w:rFonts w:ascii="宋体" w:hAnsi="宋体" w:cs="宋体" w:hint="eastAsia"/>
+          <w:kern w:val="0"/>
+          <w:sz w:val="24"/>
+          <w:lang/>
+        </w:rPr>
+        <w:t>。</w:t>
+      </w:r>
+      <w:r>
+        <w:rPr>
+          <w:rFonts w:eastAsia="Times New Roman"/>
+          <w:kern w:val="0"/>
+          <w:sz w:val="24"/>
+          <w:lang/>
+        </w:rPr>
+        <w:t xml:space="preserve">   </w:t>
+      </w:r>
+    </w:p>
+    <w:p>
+      <w:pPr>
+        <w:spacing w:before="100" w:beforeAutospacing="1" w:after="100" w:afterAutospacing="1"/>
+        <w:rPr>
+          <w:rFonts w:eastAsia="Times New Roman"/>
+          <w:kern w:val="0"/>
+          <w:sz w:val="24"/>
+          <w:lang/>
+        </w:rPr>
+      </w:pPr>
+      <w:r>
+        <w:rPr>
+          <w:rFonts w:eastAsia="Times New Roman"/>
+          <w:kern w:val="0"/>
+          <w:sz w:val="24"/>
+          <w:lang/>
+        </w:rPr>
+        <w:t>Woo</w:t>
+      </w:r>
+      <w:r>
+        <w:rPr>
+          <w:rFonts w:ascii="宋体" w:hAnsi="宋体" w:cs="宋体" w:hint="eastAsia"/>
+          <w:kern w:val="0"/>
+          <w:sz w:val="24"/>
+          <w:lang/>
+        </w:rPr>
+        <w:t>等人于</w:t>
+      </w:r>
+      <w:r>
+        <w:rPr>
+          <w:rFonts w:eastAsia="Times New Roman"/>
+          <w:kern w:val="0"/>
+          <w:sz w:val="24"/>
+          <w:lang/>
+        </w:rPr>
+        <w:t>2018</w:t>
+      </w:r>
+      <w:r>
+        <w:rPr>
+          <w:rFonts w:ascii="宋体" w:hAnsi="宋体" w:cs="宋体" w:hint="eastAsia"/>
+          <w:kern w:val="0"/>
+          <w:sz w:val="24"/>
+          <w:lang/>
+        </w:rPr>
+        <w:t>年提出的</w:t>
+      </w:r>
+      <w:r>
+        <w:rPr>
+          <w:rFonts w:eastAsia="Times New Roman"/>
+          <w:kern w:val="0"/>
+          <w:sz w:val="24"/>
+          <w:lang/>
+        </w:rPr>
+        <w:t>CBAM</w:t>
+      </w:r>
+      <w:r>
+        <w:rPr>
+          <w:rFonts w:ascii="宋体" w:hAnsi="宋体" w:cs="宋体" w:hint="eastAsia"/>
+          <w:kern w:val="0"/>
+          <w:sz w:val="24"/>
+          <w:lang/>
+        </w:rPr>
+        <w:t>（</w:t>
+      </w:r>
+      <w:r>
+        <w:rPr>
+          <w:rFonts w:eastAsia="Times New Roman"/>
+          <w:kern w:val="0"/>
+          <w:sz w:val="24"/>
+          <w:lang/>
+        </w:rPr>
+        <w:t>Convolutional Block Attention Module</w:t>
+      </w:r>
+      <w:r>
+        <w:rPr>
+          <w:rFonts w:ascii="宋体" w:hAnsi="宋体" w:cs="宋体" w:hint="eastAsia"/>
+          <w:kern w:val="0"/>
+          <w:sz w:val="24"/>
+          <w:lang/>
+        </w:rPr>
+        <w:t>）</w:t>
+      </w:r>
+      <w:r>
+        <w:rPr>
           <w:rFonts w:eastAsia="Times New Roman"/>
           <w:kern w:val="0"/>
           <w:sz w:val="24"/>
@@ -6976,34 +7127,61 @@
           <w:sz w:val="24"/>
           <w:lang/>
         </w:rPr>
-        <w:t>。该工作赢得了</w:t>
-      </w:r>
-      <w:r>
-        <w:rPr>
-          <w:rFonts w:eastAsia="Times New Roman"/>
-          <w:kern w:val="0"/>
-          <w:sz w:val="24"/>
-          <w:lang/>
-        </w:rPr>
-        <w:t>ILSVRC 2017</w:t>
-      </w:r>
-      <w:r>
-        <w:rPr>
-          <w:rFonts w:ascii="宋体" w:hAnsi="宋体" w:cs="宋体" w:hint="eastAsia"/>
-          <w:kern w:val="0"/>
-          <w:sz w:val="24"/>
-          <w:lang/>
-        </w:rPr>
-        <w:t>分类任务的冠军，证明了其有效性</w:t>
-      </w:r>
-      <w:r>
-        <w:rPr>
-          <w:rFonts w:eastAsia="Times New Roman"/>
-          <w:kern w:val="0"/>
-          <w:sz w:val="24"/>
-          <w:lang/>
-        </w:rPr>
-        <w:t xml:space="preserve"> </w:t>
+        <w:t>则将注意力机制从通道维度扩展到了空间维度。</w:t>
+      </w:r>
+      <w:r>
+        <w:rPr>
+          <w:rFonts w:eastAsia="Times New Roman"/>
+          <w:kern w:val="0"/>
+          <w:sz w:val="24"/>
+          <w:lang/>
+        </w:rPr>
+        <w:t>CBAM</w:t>
+      </w:r>
+      <w:r>
+        <w:rPr>
+          <w:rFonts w:ascii="宋体" w:hAnsi="宋体" w:cs="宋体" w:hint="eastAsia"/>
+          <w:kern w:val="0"/>
+          <w:sz w:val="24"/>
+          <w:lang/>
+        </w:rPr>
+        <w:t>依次串联了一个通道注意力模块和一个空间注意力模块。通道注意力模块与</w:t>
+      </w:r>
+      <w:r>
+        <w:rPr>
+          <w:rFonts w:eastAsia="Times New Roman"/>
+          <w:kern w:val="0"/>
+          <w:sz w:val="24"/>
+          <w:lang/>
+        </w:rPr>
+        <w:t>SE-Net</w:t>
+      </w:r>
+      <w:r>
+        <w:rPr>
+          <w:rFonts w:ascii="宋体" w:hAnsi="宋体" w:cs="宋体" w:hint="eastAsia"/>
+          <w:kern w:val="0"/>
+          <w:sz w:val="24"/>
+          <w:lang/>
+        </w:rPr>
+        <w:t>类似，但同时使用了最大池化和平均池化来聚合信息；空间注意力模块则沿着通道维度进行池化操作，生成一个</w:t>
+      </w:r>
+      <w:r>
+        <w:rPr>
+          <w:rFonts w:eastAsia="Times New Roman"/>
+          <w:kern w:val="0"/>
+          <w:sz w:val="24"/>
+          <w:lang/>
+        </w:rPr>
+        <w:t>2D</w:t>
+      </w:r>
+      <w:r>
+        <w:rPr>
+          <w:rFonts w:ascii="宋体" w:hAnsi="宋体" w:cs="宋体" w:hint="eastAsia"/>
+          <w:kern w:val="0"/>
+          <w:sz w:val="24"/>
+          <w:lang/>
+        </w:rPr>
+        <w:t>的空间注意力图，以突出显示信息量最丰富的空间位置</w:t>
       </w:r>
       <w:r>
         <w:rPr>
@@ -7028,20 +7206,29 @@
       <w:pPr>
         <w:spacing w:before="100" w:beforeAutospacing="1" w:after="100" w:afterAutospacing="1"/>
         <w:rPr>
-          <w:rFonts w:eastAsia="Times New Roman"/>
-          <w:kern w:val="0"/>
-          <w:sz w:val="24"/>
-          <w:lang/>
-        </w:rPr>
-      </w:pPr>
-      <w:r>
-        <w:rPr>
-          <w:rFonts w:eastAsia="Times New Roman"/>
-          <w:kern w:val="0"/>
-          <w:sz w:val="24"/>
-          <w:lang/>
-        </w:rPr>
-        <w:t>Woo</w:t>
+          <w:rFonts w:eastAsiaTheme="minorEastAsia" w:hint="eastAsia"/>
+          <w:kern w:val="0"/>
+          <w:sz w:val="24"/>
+          <w:lang/>
+        </w:rPr>
+      </w:pPr>
+      <w:r>
+        <w:rPr>
+          <w:rFonts w:ascii="宋体" w:hAnsi="宋体" w:cs="宋体" w:hint="eastAsia"/>
+          <w:kern w:val="0"/>
+          <w:sz w:val="24"/>
+          <w:lang/>
+        </w:rPr>
+        <w:t>为了追求更高的效率，</w:t>
+      </w:r>
+      <w:r>
+        <w:rPr>
+          <w:rFonts w:eastAsia="Times New Roman"/>
+          <w:kern w:val="0"/>
+          <w:sz w:val="24"/>
+          <w:lang/>
+        </w:rPr>
+        <w:t>Yang</w:t>
       </w:r>
       <w:r>
         <w:rPr>
@@ -7059,25 +7246,25 @@
           <w:sz w:val="24"/>
           <w:lang/>
         </w:rPr>
-        <w:t>2018</w:t>
-      </w:r>
-      <w:r>
-        <w:rPr>
-          <w:rFonts w:ascii="宋体" w:hAnsi="宋体" w:cs="宋体" w:hint="eastAsia"/>
-          <w:kern w:val="0"/>
-          <w:sz w:val="24"/>
-          <w:lang/>
-        </w:rPr>
-        <w:t>年提出的</w:t>
-      </w:r>
-      <w:r>
-        <w:rPr>
-          <w:rFonts w:eastAsia="Times New Roman"/>
-          <w:kern w:val="0"/>
-          <w:sz w:val="24"/>
-          <w:lang/>
-        </w:rPr>
-        <w:t>CBAM</w:t>
+        <w:t>2021</w:t>
+      </w:r>
+      <w:r>
+        <w:rPr>
+          <w:rFonts w:ascii="宋体" w:hAnsi="宋体" w:cs="宋体" w:hint="eastAsia"/>
+          <w:kern w:val="0"/>
+          <w:sz w:val="24"/>
+          <w:lang/>
+        </w:rPr>
+        <w:t>年提出了</w:t>
+      </w:r>
+      <w:r>
+        <w:rPr>
+          <w:rFonts w:eastAsia="Times New Roman"/>
+          <w:kern w:val="0"/>
+          <w:sz w:val="24"/>
+          <w:lang/>
+        </w:rPr>
+        <w:t>SimAM</w:t>
       </w:r>
       <w:r>
         <w:rPr>
@@ -7095,97 +7282,70 @@
           <w:sz w:val="24"/>
           <w:lang/>
         </w:rPr>
-        <w:t>Convolutional Block Attention Module</w:t>
-      </w:r>
-      <w:r>
-        <w:rPr>
-          <w:rFonts w:ascii="宋体" w:hAnsi="宋体" w:cs="宋体" w:hint="eastAsia"/>
-          <w:kern w:val="0"/>
-          <w:sz w:val="24"/>
-          <w:lang/>
-        </w:rPr>
-        <w:t>）</w:t>
-      </w:r>
-      <w:r>
-        <w:rPr>
-          <w:rFonts w:eastAsia="Times New Roman"/>
-          <w:kern w:val="0"/>
-          <w:sz w:val="24"/>
-          <w:lang/>
-        </w:rPr>
-        <w:t xml:space="preserve"> </w:t>
-      </w:r>
-      <w:r>
-        <w:rPr>
-          <w:rFonts w:ascii="宋体" w:hAnsi="宋体" w:cs="宋体" w:hint="eastAsia"/>
-          <w:kern w:val="0"/>
-          <w:sz w:val="24"/>
-          <w:lang/>
-        </w:rPr>
-        <w:t>则将注意力机制从通道维度扩展到了空间维度。</w:t>
-      </w:r>
-      <w:r>
-        <w:rPr>
-          <w:rFonts w:eastAsia="Times New Roman"/>
-          <w:kern w:val="0"/>
-          <w:sz w:val="24"/>
-          <w:lang/>
-        </w:rPr>
-        <w:t>CBAM</w:t>
-      </w:r>
-      <w:r>
-        <w:rPr>
-          <w:rFonts w:ascii="宋体" w:hAnsi="宋体" w:cs="宋体" w:hint="eastAsia"/>
-          <w:kern w:val="0"/>
-          <w:sz w:val="24"/>
-          <w:lang/>
-        </w:rPr>
-        <w:t>依次串联了一个通道注意力模块和一个空间注意力模块。通道注意力模块与</w:t>
-      </w:r>
-      <w:r>
-        <w:rPr>
-          <w:rFonts w:eastAsia="Times New Roman"/>
-          <w:kern w:val="0"/>
-          <w:sz w:val="24"/>
-          <w:lang/>
-        </w:rPr>
-        <w:t>SE-Net</w:t>
-      </w:r>
-      <w:r>
-        <w:rPr>
-          <w:rFonts w:ascii="宋体" w:hAnsi="宋体" w:cs="宋体" w:hint="eastAsia"/>
-          <w:kern w:val="0"/>
-          <w:sz w:val="24"/>
-          <w:lang/>
-        </w:rPr>
-        <w:t>类似，但同时使用了最大池化和平均池化来聚合信息；空间注意力模块则沿着通道维度进行池化操作，生成一个</w:t>
-      </w:r>
-      <w:r>
-        <w:rPr>
-          <w:rFonts w:eastAsia="Times New Roman"/>
-          <w:kern w:val="0"/>
-          <w:sz w:val="24"/>
-          <w:lang/>
-        </w:rPr>
-        <w:t>2D</w:t>
-      </w:r>
-      <w:r>
-        <w:rPr>
-          <w:rFonts w:ascii="宋体" w:hAnsi="宋体" w:cs="宋体" w:hint="eastAsia"/>
-          <w:kern w:val="0"/>
-          <w:sz w:val="24"/>
-          <w:lang/>
-        </w:rPr>
-        <w:t>的空间注意力图，以突出显示信息量最丰富的空间位置</w:t>
-      </w:r>
-      <w:r>
-        <w:rPr>
-          <w:rFonts w:eastAsia="Times New Roman"/>
-          <w:kern w:val="0"/>
-          <w:sz w:val="24"/>
-          <w:lang/>
-        </w:rPr>
-        <w:t xml:space="preserve"> </w:t>
+        <w:t>Simple, Parameter-Free Attention Module</w:t>
+      </w:r>
+      <w:r>
+        <w:rPr>
+          <w:rFonts w:ascii="宋体" w:hAnsi="宋体" w:cs="宋体" w:hint="eastAsia"/>
+          <w:kern w:val="0"/>
+          <w:sz w:val="24"/>
+          <w:lang/>
+        </w:rPr>
+        <w:t>）。与之前依赖全连接层或卷积层来学习注意力的工作不同，</w:t>
+      </w:r>
+      <w:r>
+        <w:rPr>
+          <w:rFonts w:eastAsia="Times New Roman"/>
+          <w:kern w:val="0"/>
+          <w:sz w:val="24"/>
+          <w:lang/>
+        </w:rPr>
+        <w:t>SimAM</w:t>
+      </w:r>
+      <w:r>
+        <w:rPr>
+          <w:rFonts w:ascii="宋体" w:hAnsi="宋体" w:cs="宋体" w:hint="eastAsia"/>
+          <w:kern w:val="0"/>
+          <w:sz w:val="24"/>
+          <w:lang/>
+        </w:rPr>
+        <w:t>的突出特点是无需任何额外的参数。它基于神经科学中的空间抑制理论，为特征图中的每个神经元（即每个位置的每个通道）定义一个能量函数。通过最小化该能量函数，</w:t>
+      </w:r>
+      <w:r>
+        <w:rPr>
+          <w:rFonts w:eastAsia="Times New Roman"/>
+          <w:kern w:val="0"/>
+          <w:sz w:val="24"/>
+          <w:lang/>
+        </w:rPr>
+        <w:t>SimAM</w:t>
+      </w:r>
+      <w:r>
+        <w:rPr>
+          <w:rFonts w:ascii="宋体" w:hAnsi="宋体" w:cs="宋体" w:hint="eastAsia"/>
+          <w:kern w:val="0"/>
+          <w:sz w:val="24"/>
+          <w:lang/>
+        </w:rPr>
+        <w:t>能够以一种闭式解的形式快速计算出每个神经元的</w:t>
+      </w:r>
+      <w:r>
+        <w:rPr>
+          <w:rFonts w:eastAsia="Times New Roman"/>
+          <w:kern w:val="0"/>
+          <w:sz w:val="24"/>
+          <w:lang/>
+        </w:rPr>
+        <w:t>3D</w:t>
+      </w:r>
+      <w:r>
+        <w:rPr>
+          <w:rFonts w:ascii="宋体" w:hAnsi="宋体" w:cs="宋体" w:hint="eastAsia"/>
+          <w:kern w:val="0"/>
+          <w:sz w:val="24"/>
+          <w:lang/>
+        </w:rPr>
+        <w:t>注意力权重，从而在不增加模型参数的情况下实现对特征的精细化调整</w:t>
       </w:r>
       <w:r>
         <w:rPr>
@@ -7198,216 +7358,12 @@
       </w:r>
       <w:r>
         <w:rPr>
-          <w:rFonts w:eastAsia="Times New Roman"/>
-          <w:kern w:val="0"/>
-          <w:sz w:val="24"/>
-          <w:lang/>
-        </w:rPr>
-        <w:t xml:space="preserve">   </w:t>
-      </w:r>
-    </w:p>
-    <w:p>
-      <w:pPr>
-        <w:spacing w:before="100" w:beforeAutospacing="1" w:after="100" w:afterAutospacing="1"/>
-        <w:rPr>
-          <w:rFonts w:eastAsiaTheme="minorEastAsia" w:hint="eastAsia"/>
-          <w:kern w:val="0"/>
-          <w:sz w:val="24"/>
-          <w:lang/>
-        </w:rPr>
-      </w:pPr>
-      <w:r>
-        <w:rPr>
-          <w:rFonts w:ascii="宋体" w:hAnsi="宋体" w:cs="宋体" w:hint="eastAsia"/>
-          <w:kern w:val="0"/>
-          <w:sz w:val="24"/>
-          <w:lang/>
-        </w:rPr>
-        <w:t>为了追求更高的效率，</w:t>
-      </w:r>
-      <w:r>
-        <w:rPr>
-          <w:rFonts w:eastAsia="Times New Roman"/>
-          <w:kern w:val="0"/>
-          <w:sz w:val="24"/>
-          <w:lang/>
-        </w:rPr>
-        <w:t>Yang</w:t>
-      </w:r>
-      <w:r>
-        <w:rPr>
-          <w:rFonts w:ascii="宋体" w:hAnsi="宋体" w:cs="宋体" w:hint="eastAsia"/>
-          <w:kern w:val="0"/>
-          <w:sz w:val="24"/>
-          <w:lang/>
-        </w:rPr>
-        <w:t>等人于</w:t>
-      </w:r>
-      <w:r>
-        <w:rPr>
-          <w:rFonts w:eastAsia="Times New Roman"/>
-          <w:kern w:val="0"/>
-          <w:sz w:val="24"/>
-          <w:lang/>
-        </w:rPr>
-        <w:t>2021</w:t>
-      </w:r>
-      <w:r>
-        <w:rPr>
-          <w:rFonts w:ascii="宋体" w:hAnsi="宋体" w:cs="宋体" w:hint="eastAsia"/>
-          <w:kern w:val="0"/>
-          <w:sz w:val="24"/>
-          <w:lang/>
-        </w:rPr>
-        <w:t>年提出了</w:t>
-      </w:r>
-      <w:r>
-        <w:rPr>
-          <w:rFonts w:eastAsia="Times New Roman"/>
-          <w:kern w:val="0"/>
-          <w:sz w:val="24"/>
-          <w:lang/>
-        </w:rPr>
-        <w:t>SimAM</w:t>
-      </w:r>
-      <w:r>
-        <w:rPr>
-          <w:rFonts w:ascii="宋体" w:hAnsi="宋体" w:cs="宋体" w:hint="eastAsia"/>
-          <w:kern w:val="0"/>
-          <w:sz w:val="24"/>
-          <w:lang/>
-        </w:rPr>
-        <w:t>（</w:t>
-      </w:r>
-      <w:r>
-        <w:rPr>
-          <w:rFonts w:eastAsia="Times New Roman"/>
-          <w:kern w:val="0"/>
-          <w:sz w:val="24"/>
-          <w:lang/>
-        </w:rPr>
-        <w:t>Simple, Parameter-Free Attention Module</w:t>
-      </w:r>
-      <w:r>
-        <w:rPr>
-          <w:rFonts w:ascii="宋体" w:hAnsi="宋体" w:cs="宋体" w:hint="eastAsia"/>
-          <w:kern w:val="0"/>
-          <w:sz w:val="24"/>
-          <w:lang/>
-        </w:rPr>
-        <w:t>）。与之前依赖全连接层或卷积层来学习注意力的工作不同，</w:t>
-      </w:r>
-      <w:r>
-        <w:rPr>
-          <w:rFonts w:eastAsia="Times New Roman"/>
-          <w:kern w:val="0"/>
-          <w:sz w:val="24"/>
-          <w:lang/>
-        </w:rPr>
-        <w:t>SimAM</w:t>
-      </w:r>
-      <w:r>
-        <w:rPr>
-          <w:rFonts w:ascii="宋体" w:hAnsi="宋体" w:cs="宋体" w:hint="eastAsia"/>
-          <w:kern w:val="0"/>
-          <w:sz w:val="24"/>
-          <w:lang/>
-        </w:rPr>
-        <w:t>的突出特点是无需任何额外的参数。它基于神经科学中的空间抑制理论，为特征图中的每个神经元（即每个位置的每个通道）定义一个能量函数。通过</w:t>
-      </w:r>
-      <w:proofErr w:type="gramStart"/>
-      <w:r>
-        <w:rPr>
-          <w:rFonts w:ascii="宋体" w:hAnsi="宋体" w:cs="宋体" w:hint="eastAsia"/>
-          <w:kern w:val="0"/>
-          <w:sz w:val="24"/>
-          <w:lang/>
-        </w:rPr>
-        <w:t>最小化该能量</w:t>
-      </w:r>
-      <w:proofErr w:type="gramEnd"/>
-      <w:r>
-        <w:rPr>
-          <w:rFonts w:ascii="宋体" w:hAnsi="宋体" w:cs="宋体" w:hint="eastAsia"/>
-          <w:kern w:val="0"/>
-          <w:sz w:val="24"/>
-          <w:lang/>
-        </w:rPr>
-        <w:t>函数，</w:t>
-      </w:r>
-      <w:r>
-        <w:rPr>
-          <w:rFonts w:eastAsia="Times New Roman"/>
-          <w:kern w:val="0"/>
-          <w:sz w:val="24"/>
-          <w:lang/>
-        </w:rPr>
-        <w:t>SimAM</w:t>
-      </w:r>
-      <w:r>
-        <w:rPr>
-          <w:rFonts w:ascii="宋体" w:hAnsi="宋体" w:cs="宋体" w:hint="eastAsia"/>
-          <w:kern w:val="0"/>
-          <w:sz w:val="24"/>
-          <w:lang/>
-        </w:rPr>
-        <w:t>能够以一种闭式解的形式快速计算出每个神经元的</w:t>
-      </w:r>
-      <w:r>
-        <w:rPr>
-          <w:rFonts w:eastAsia="Times New Roman"/>
-          <w:kern w:val="0"/>
-          <w:sz w:val="24"/>
-          <w:lang/>
-        </w:rPr>
-        <w:t>3D</w:t>
-      </w:r>
-      <w:r>
-        <w:rPr>
-          <w:rFonts w:ascii="宋体" w:hAnsi="宋体" w:cs="宋体" w:hint="eastAsia"/>
-          <w:kern w:val="0"/>
-          <w:sz w:val="24"/>
-          <w:lang/>
-        </w:rPr>
-        <w:t>注意力权重，从而在不增加模型参数的情况下实现对特征的精细</w:t>
-      </w:r>
-      <w:proofErr w:type="gramStart"/>
-      <w:r>
-        <w:rPr>
-          <w:rFonts w:ascii="宋体" w:hAnsi="宋体" w:cs="宋体" w:hint="eastAsia"/>
-          <w:kern w:val="0"/>
-          <w:sz w:val="24"/>
-          <w:lang/>
-        </w:rPr>
-        <w:t>化调整</w:t>
-      </w:r>
-      <w:proofErr w:type="gramEnd"/>
-      <w:r>
-        <w:rPr>
-          <w:rFonts w:eastAsia="Times New Roman"/>
-          <w:kern w:val="0"/>
-          <w:sz w:val="24"/>
-          <w:lang/>
-        </w:rPr>
-        <w:t xml:space="preserve"> </w:t>
-      </w:r>
-      <w:r>
-        <w:rPr>
-          <w:rFonts w:ascii="宋体" w:hAnsi="宋体" w:cs="宋体" w:hint="eastAsia"/>
-          <w:kern w:val="0"/>
-          <w:sz w:val="24"/>
-          <w:lang/>
-        </w:rPr>
-        <w:t>。这使其成为在轻量化模型中弥补精度损失、提升对小目标或不规则目标识别能力的理想选择</w:t>
-      </w:r>
-      <w:r>
-        <w:rPr>
-          <w:rFonts w:eastAsia="Times New Roman"/>
-          <w:kern w:val="0"/>
-          <w:sz w:val="24"/>
-          <w:lang/>
-        </w:rPr>
-        <w:t xml:space="preserve"> </w:t>
+          <w:rFonts w:ascii="宋体" w:hAnsi="宋体" w:cs="宋体" w:hint="eastAsia"/>
+          <w:kern w:val="0"/>
+          <w:sz w:val="24"/>
+          <w:lang/>
+        </w:rPr>
+        <w:t>这使其成为在轻量化模型中弥补精度损失、提升对小目标或不规则目标识别能力的理想选择</w:t>
       </w:r>
       <w:r>
         <w:rPr>
@@ -7577,35 +7533,138 @@
       </w:r>
       <w:r>
         <w:rPr>
+          <w:rFonts w:hint="eastAsia"/>
+          <w:lang/>
+        </w:rPr>
+        <w:t>。</w:t>
+      </w:r>
+      <w:r>
+        <w:rPr>
+          <w:rFonts w:hint="eastAsia"/>
+          <w:lang/>
+        </w:rPr>
+        <w:t>其场景的多样性和病害类型的丰富性，使其极具挑战性，有力地推动了该领域的研究进展。这些数据集中通常包含一些常见的检测挑战，例如：病害目标尺寸小（如早期裂缝）、形态不规则、与背景对比度低、部分被阴影或水渍遮挡等</w:t>
+      </w:r>
+      <w:r>
+        <w:rPr>
+          <w:rFonts w:hint="eastAsia"/>
+          <w:lang/>
+        </w:rPr>
+        <w:t>。</w:t>
+      </w:r>
+      <w:r>
+        <w:rPr>
           <w:rFonts w:ascii="Times New Roman" w:eastAsia="Times New Roman" w:hAnsi="Times New Roman" w:cs="Times New Roman"/>
           <w:lang/>
         </w:rPr>
+        <w:t xml:space="preserve">   </w:t>
+      </w:r>
+    </w:p>
+    <w:p>
+      <w:pPr>
+        <w:spacing w:before="100" w:beforeAutospacing="1" w:after="100" w:afterAutospacing="1"/>
+        <w:rPr>
+          <w:rFonts w:eastAsia="Times New Roman"/>
+          <w:kern w:val="0"/>
+          <w:sz w:val="24"/>
+          <w:lang/>
+        </w:rPr>
+      </w:pPr>
+      <w:r>
+        <w:rPr>
+          <w:rFonts w:ascii="宋体" w:hAnsi="宋体" w:cs="宋体" w:hint="eastAsia"/>
+          <w:kern w:val="0"/>
+          <w:sz w:val="24"/>
+          <w:lang/>
+        </w:rPr>
+        <w:t>在评估指标方面，道路病害检测任务通常采用目标检测领域的标准评价体系。这一体系的建立很大程度上归功于</w:t>
+      </w:r>
+      <w:r>
+        <w:rPr>
+          <w:rFonts w:eastAsia="Times New Roman"/>
+          <w:kern w:val="0"/>
+          <w:sz w:val="24"/>
+          <w:lang/>
+        </w:rPr>
+        <w:t>PASCAL VOC</w:t>
+      </w:r>
+      <w:r>
+        <w:rPr>
+          <w:rFonts w:ascii="宋体" w:hAnsi="宋体" w:cs="宋体" w:hint="eastAsia"/>
+          <w:kern w:val="0"/>
+          <w:sz w:val="24"/>
+          <w:lang/>
+        </w:rPr>
+        <w:t>（</w:t>
+      </w:r>
+      <w:r>
+        <w:rPr>
+          <w:rFonts w:eastAsia="Times New Roman"/>
+          <w:kern w:val="0"/>
+          <w:sz w:val="24"/>
+          <w:lang/>
+        </w:rPr>
+        <w:t>Visual Object Classes</w:t>
+      </w:r>
+      <w:r>
+        <w:rPr>
+          <w:rFonts w:ascii="宋体" w:hAnsi="宋体" w:cs="宋体" w:hint="eastAsia"/>
+          <w:kern w:val="0"/>
+          <w:sz w:val="24"/>
+          <w:lang/>
+        </w:rPr>
+        <w:t>）挑战赛</w:t>
+      </w:r>
+      <w:r>
+        <w:rPr>
+          <w:rFonts w:eastAsia="Times New Roman"/>
+          <w:kern w:val="0"/>
+          <w:sz w:val="24"/>
+          <w:lang/>
+        </w:rPr>
         <w:t xml:space="preserve"> </w:t>
       </w:r>
       <w:r>
         <w:rPr>
-          <w:rFonts w:hint="eastAsia"/>
-          <w:lang/>
-        </w:rPr>
-        <w:t>。其场景的多样性和病害类型的丰富性，使其极具挑战性，有力地推动了该领域的研究进展。这些数据集中通常包含一些常见的检测挑战，例如：病害目标尺寸小（如早期裂缝）、形态不规则、与背景对比度低、部分被阴影或水渍遮挡等</w:t>
-      </w:r>
-      <w:r>
-        <w:rPr>
-          <w:rFonts w:ascii="Times New Roman" w:eastAsia="Times New Roman" w:hAnsi="Times New Roman" w:cs="Times New Roman"/>
-          <w:lang/>
-        </w:rPr>
-        <w:t xml:space="preserve"> </w:t>
-      </w:r>
-      <w:r>
-        <w:rPr>
-          <w:rFonts w:hint="eastAsia"/>
+          <w:rFonts w:ascii="宋体" w:hAnsi="宋体" w:cs="宋体" w:hint="eastAsia"/>
+          <w:kern w:val="0"/>
+          <w:sz w:val="24"/>
+          <w:lang/>
+        </w:rPr>
+        <w:t>，该赛事自</w:t>
+      </w:r>
+      <w:r>
+        <w:rPr>
+          <w:rFonts w:eastAsia="Times New Roman"/>
+          <w:kern w:val="0"/>
+          <w:sz w:val="24"/>
+          <w:lang/>
+        </w:rPr>
+        <w:t>2005</w:t>
+      </w:r>
+      <w:r>
+        <w:rPr>
+          <w:rFonts w:ascii="宋体" w:hAnsi="宋体" w:cs="宋体" w:hint="eastAsia"/>
+          <w:kern w:val="0"/>
+          <w:sz w:val="24"/>
+          <w:lang/>
+        </w:rPr>
+        <w:t>年起，系统性地定义并推广了至今仍在广泛使用的评估标准</w:t>
+      </w:r>
+      <w:r>
+        <w:rPr>
+          <w:rFonts w:ascii="宋体" w:hAnsi="宋体" w:cs="宋体" w:hint="eastAsia"/>
+          <w:kern w:val="0"/>
+          <w:sz w:val="24"/>
           <w:lang/>
         </w:rPr>
         <w:t>。</w:t>
       </w:r>
       <w:r>
         <w:rPr>
-          <w:rFonts w:ascii="Times New Roman" w:eastAsia="Times New Roman" w:hAnsi="Times New Roman" w:cs="Times New Roman"/>
+          <w:rFonts w:eastAsia="Times New Roman"/>
+          <w:kern w:val="0"/>
+          <w:sz w:val="24"/>
           <w:lang/>
         </w:rPr>
         <w:t xml:space="preserve">   </w:t>
@@ -7628,98 +7687,208 @@
           <w:sz w:val="24"/>
           <w:lang/>
         </w:rPr>
-        <w:t>在评估指标方面，道路病害检测任务通常采用目标检测领域的标准评价体系。这一体系的建立很大程度上归功于</w:t>
-      </w:r>
-      <w:r>
-        <w:rPr>
-          <w:rFonts w:eastAsia="Times New Roman"/>
-          <w:kern w:val="0"/>
-          <w:sz w:val="24"/>
-          <w:lang/>
-        </w:rPr>
-        <w:t>PASCAL VOC</w:t>
-      </w:r>
-      <w:r>
-        <w:rPr>
-          <w:rFonts w:ascii="宋体" w:hAnsi="宋体" w:cs="宋体" w:hint="eastAsia"/>
-          <w:kern w:val="0"/>
-          <w:sz w:val="24"/>
-          <w:lang/>
-        </w:rPr>
-        <w:t>（</w:t>
-      </w:r>
-      <w:r>
-        <w:rPr>
-          <w:rFonts w:eastAsia="Times New Roman"/>
-          <w:kern w:val="0"/>
-          <w:sz w:val="24"/>
-          <w:lang/>
-        </w:rPr>
-        <w:t>Visual Object Classes</w:t>
-      </w:r>
-      <w:r>
-        <w:rPr>
-          <w:rFonts w:ascii="宋体" w:hAnsi="宋体" w:cs="宋体" w:hint="eastAsia"/>
-          <w:kern w:val="0"/>
-          <w:sz w:val="24"/>
-          <w:lang/>
-        </w:rPr>
-        <w:t>）挑战赛</w:t>
-      </w:r>
-      <w:r>
-        <w:rPr>
-          <w:rFonts w:eastAsia="Times New Roman"/>
-          <w:kern w:val="0"/>
-          <w:sz w:val="24"/>
-          <w:lang/>
-        </w:rPr>
-        <w:t xml:space="preserve"> </w:t>
-      </w:r>
-      <w:r>
-        <w:rPr>
-          <w:rFonts w:ascii="宋体" w:hAnsi="宋体" w:cs="宋体" w:hint="eastAsia"/>
-          <w:kern w:val="0"/>
-          <w:sz w:val="24"/>
-          <w:lang/>
-        </w:rPr>
-        <w:t>，该赛事自</w:t>
-      </w:r>
-      <w:r>
-        <w:rPr>
-          <w:rFonts w:eastAsia="Times New Roman"/>
-          <w:kern w:val="0"/>
-          <w:sz w:val="24"/>
-          <w:lang/>
-        </w:rPr>
-        <w:t>2005</w:t>
-      </w:r>
-      <w:r>
-        <w:rPr>
-          <w:rFonts w:ascii="宋体" w:hAnsi="宋体" w:cs="宋体" w:hint="eastAsia"/>
-          <w:kern w:val="0"/>
-          <w:sz w:val="24"/>
-          <w:lang/>
-        </w:rPr>
-        <w:t>年起，系统性地定义并推广了至今仍在广泛使用的评估标准</w:t>
-      </w:r>
-      <w:r>
-        <w:rPr>
-          <w:rFonts w:eastAsia="Times New Roman"/>
-          <w:kern w:val="0"/>
-          <w:sz w:val="24"/>
-          <w:lang/>
-        </w:rPr>
-        <w:t xml:space="preserve"> </w:t>
-      </w:r>
-      <w:r>
-        <w:rPr>
-          <w:rFonts w:ascii="宋体" w:hAnsi="宋体" w:cs="宋体" w:hint="eastAsia"/>
+        <w:t>常用的基础指标包括精确率（</w:t>
+      </w:r>
+      <w:r>
+        <w:rPr>
+          <w:rFonts w:eastAsia="Times New Roman"/>
+          <w:kern w:val="0"/>
+          <w:sz w:val="24"/>
+          <w:lang/>
+        </w:rPr>
+        <w:t>Precision</w:t>
+      </w:r>
+      <w:r>
+        <w:rPr>
+          <w:rFonts w:ascii="宋体" w:hAnsi="宋体" w:cs="宋体" w:hint="eastAsia"/>
+          <w:kern w:val="0"/>
+          <w:sz w:val="24"/>
+          <w:lang/>
+        </w:rPr>
+        <w:t>）和召回率（</w:t>
+      </w:r>
+      <w:r>
+        <w:rPr>
+          <w:rFonts w:eastAsia="Times New Roman"/>
+          <w:kern w:val="0"/>
+          <w:sz w:val="24"/>
+          <w:lang/>
+        </w:rPr>
+        <w:t>Recall</w:t>
+      </w:r>
+      <w:r>
+        <w:rPr>
+          <w:rFonts w:ascii="宋体" w:hAnsi="宋体" w:cs="宋体" w:hint="eastAsia"/>
+          <w:kern w:val="0"/>
+          <w:sz w:val="24"/>
+          <w:lang/>
+        </w:rPr>
+        <w:t>）。精确率衡量的是模型预测为正例的样本中有多少是真正的正例，而召回率衡量的是所有真正的正例中有多少被模型成功预测出来。这两个指标通常是相互制约的。</w:t>
+      </w:r>
+      <w:r>
+        <w:rPr>
+          <w:rFonts w:eastAsia="Times New Roman"/>
+          <w:kern w:val="0"/>
+          <w:sz w:val="24"/>
+          <w:lang/>
+        </w:rPr>
+        <w:t>F1</w:t>
+      </w:r>
+      <w:r>
+        <w:rPr>
+          <w:rFonts w:ascii="宋体" w:hAnsi="宋体" w:cs="宋体" w:hint="eastAsia"/>
+          <w:kern w:val="0"/>
+          <w:sz w:val="24"/>
+          <w:lang/>
+        </w:rPr>
+        <w:t>分数（</w:t>
+      </w:r>
+      <w:r>
+        <w:rPr>
+          <w:rFonts w:eastAsia="Times New Roman"/>
+          <w:kern w:val="0"/>
+          <w:sz w:val="24"/>
+          <w:lang/>
+        </w:rPr>
+        <w:t>F1-Score</w:t>
+      </w:r>
+      <w:r>
+        <w:rPr>
+          <w:rFonts w:ascii="宋体" w:hAnsi="宋体" w:cs="宋体" w:hint="eastAsia"/>
+          <w:kern w:val="0"/>
+          <w:sz w:val="24"/>
+          <w:lang/>
+        </w:rPr>
+        <w:t>）是精确率和召回率的调和平均数，用于综合评价两者</w:t>
+      </w:r>
+      <w:r>
+        <w:rPr>
+          <w:rFonts w:ascii="宋体" w:hAnsi="宋体" w:cs="宋体"/>
           <w:kern w:val="0"/>
           <w:sz w:val="24"/>
           <w:lang/>
         </w:rPr>
         <w:t>。</w:t>
       </w:r>
+    </w:p>
+    <w:p>
+      <w:pPr>
+        <w:spacing w:before="100" w:beforeAutospacing="1" w:after="100" w:afterAutospacing="1"/>
+        <w:rPr>
+          <w:rFonts w:eastAsia="Times New Roman"/>
+          <w:kern w:val="0"/>
+          <w:sz w:val="24"/>
+          <w:lang/>
+        </w:rPr>
+      </w:pPr>
+      <w:r>
+        <w:rPr>
+          <w:rFonts w:ascii="宋体" w:hAnsi="宋体" w:cs="宋体" w:hint="eastAsia"/>
+          <w:kern w:val="0"/>
+          <w:sz w:val="24"/>
+          <w:lang/>
+        </w:rPr>
+        <w:t>然而，在目标检测任务中，最核心的综合性能指标是平均精度均值（</w:t>
+      </w:r>
+      <w:r>
+        <w:rPr>
+          <w:rFonts w:eastAsia="Times New Roman"/>
+          <w:kern w:val="0"/>
+          <w:sz w:val="24"/>
+          <w:lang/>
+        </w:rPr>
+        <w:t>mean Average Precision, mAP</w:t>
+      </w:r>
+      <w:r>
+        <w:rPr>
+          <w:rFonts w:ascii="宋体" w:hAnsi="宋体" w:cs="宋体" w:hint="eastAsia"/>
+          <w:kern w:val="0"/>
+          <w:sz w:val="24"/>
+          <w:lang/>
+        </w:rPr>
+        <w:t>）。</w:t>
+      </w:r>
+      <w:r>
+        <w:rPr>
+          <w:rFonts w:eastAsia="Times New Roman"/>
+          <w:kern w:val="0"/>
+          <w:sz w:val="24"/>
+          <w:lang/>
+        </w:rPr>
+        <w:t>mAP</w:t>
+      </w:r>
+      <w:r>
+        <w:rPr>
+          <w:rFonts w:ascii="宋体" w:hAnsi="宋体" w:cs="宋体" w:hint="eastAsia"/>
+          <w:kern w:val="0"/>
+          <w:sz w:val="24"/>
+          <w:lang/>
+        </w:rPr>
+        <w:t>通过计算在所有类别上的平均精度（</w:t>
+      </w:r>
+      <w:r>
+        <w:rPr>
+          <w:rFonts w:eastAsia="Times New Roman"/>
+          <w:kern w:val="0"/>
+          <w:sz w:val="24"/>
+          <w:lang/>
+        </w:rPr>
+        <w:t>Average Precision, AP</w:t>
+      </w:r>
+      <w:r>
+        <w:rPr>
+          <w:rFonts w:ascii="宋体" w:hAnsi="宋体" w:cs="宋体" w:hint="eastAsia"/>
+          <w:kern w:val="0"/>
+          <w:sz w:val="24"/>
+          <w:lang/>
+        </w:rPr>
+        <w:t>）的均值得到。而单个类别的</w:t>
+      </w:r>
+      <w:r>
+        <w:rPr>
+          <w:rFonts w:eastAsia="Times New Roman"/>
+          <w:kern w:val="0"/>
+          <w:sz w:val="24"/>
+          <w:lang/>
+        </w:rPr>
+        <w:t>AP</w:t>
+      </w:r>
+      <w:r>
+        <w:rPr>
+          <w:rFonts w:ascii="宋体" w:hAnsi="宋体" w:cs="宋体" w:hint="eastAsia"/>
+          <w:kern w:val="0"/>
+          <w:sz w:val="24"/>
+          <w:lang/>
+        </w:rPr>
+        <w:t>则是通过在不同置信度阈值下计算出的精确率</w:t>
+      </w:r>
+      <w:r>
+        <w:rPr>
+          <w:rFonts w:eastAsia="Times New Roman"/>
+          <w:kern w:val="0"/>
+          <w:sz w:val="24"/>
+          <w:lang/>
+        </w:rPr>
+        <w:t>-</w:t>
+      </w:r>
+      <w:r>
+        <w:rPr>
+          <w:rFonts w:ascii="宋体" w:hAnsi="宋体" w:cs="宋体" w:hint="eastAsia"/>
+          <w:kern w:val="0"/>
+          <w:sz w:val="24"/>
+          <w:lang/>
+        </w:rPr>
+        <w:t>召回率曲线下的面积来获得的。它综合了模型在不同置信度下的表现，能够更全面地衡量模型的检测性能</w:t>
+      </w:r>
+      <w:r>
+        <w:rPr>
+          <w:rFonts w:ascii="宋体" w:hAnsi="宋体" w:cs="宋体" w:hint="eastAsia"/>
+          <w:kern w:val="0"/>
+          <w:sz w:val="24"/>
+          <w:lang/>
+        </w:rPr>
+        <w:t>。</w:t>
+      </w:r>
       <w:r>
         <w:rPr>
           <w:rFonts w:eastAsia="Times New Roman"/>
@@ -7747,301 +7916,43 @@
           <w:sz w:val="24"/>
           <w:lang/>
         </w:rPr>
-        <w:t>常用的基础指标包括精确率（</w:t>
-      </w:r>
-      <w:r>
-        <w:rPr>
-          <w:rFonts w:eastAsia="Times New Roman"/>
-          <w:kern w:val="0"/>
-          <w:sz w:val="24"/>
-          <w:lang/>
-        </w:rPr>
-        <w:t>Precision</w:t>
-      </w:r>
-      <w:r>
-        <w:rPr>
-          <w:rFonts w:ascii="宋体" w:hAnsi="宋体" w:cs="宋体" w:hint="eastAsia"/>
-          <w:kern w:val="0"/>
-          <w:sz w:val="24"/>
-          <w:lang/>
-        </w:rPr>
-        <w:t>）和召回率（</w:t>
-      </w:r>
-      <w:r>
-        <w:rPr>
-          <w:rFonts w:eastAsia="Times New Roman"/>
-          <w:kern w:val="0"/>
-          <w:sz w:val="24"/>
-          <w:lang/>
-        </w:rPr>
-        <w:t>Recall</w:t>
-      </w:r>
-      <w:r>
-        <w:rPr>
-          <w:rFonts w:ascii="宋体" w:hAnsi="宋体" w:cs="宋体" w:hint="eastAsia"/>
-          <w:kern w:val="0"/>
-          <w:sz w:val="24"/>
-          <w:lang/>
-        </w:rPr>
-        <w:t>）。精确率衡量的是模型预测为正例的样本中有多少是真正的正例，而召回率衡量的是所有真正的正例中有多少被模型成功预测出来。这两个指标通常是相互制约的。</w:t>
-      </w:r>
-      <w:r>
-        <w:rPr>
-          <w:rFonts w:eastAsia="Times New Roman"/>
-          <w:kern w:val="0"/>
-          <w:sz w:val="24"/>
-          <w:lang/>
-        </w:rPr>
-        <w:t>F1</w:t>
-      </w:r>
-      <w:r>
-        <w:rPr>
-          <w:rFonts w:ascii="宋体" w:hAnsi="宋体" w:cs="宋体" w:hint="eastAsia"/>
-          <w:kern w:val="0"/>
-          <w:sz w:val="24"/>
-          <w:lang/>
-        </w:rPr>
-        <w:t>分数（</w:t>
-      </w:r>
-      <w:r>
-        <w:rPr>
-          <w:rFonts w:eastAsia="Times New Roman"/>
-          <w:kern w:val="0"/>
-          <w:sz w:val="24"/>
-          <w:lang/>
-        </w:rPr>
-        <w:t>F1-Score</w:t>
-      </w:r>
-      <w:r>
-        <w:rPr>
-          <w:rFonts w:ascii="宋体" w:hAnsi="宋体" w:cs="宋体" w:hint="eastAsia"/>
-          <w:kern w:val="0"/>
-          <w:sz w:val="24"/>
-          <w:lang/>
-        </w:rPr>
-        <w:t>）是精确率和召回率的调和平均数，用于综合评价两者</w:t>
-      </w:r>
-      <w:r>
-        <w:rPr>
-          <w:rFonts w:ascii="宋体" w:hAnsi="宋体" w:cs="宋体"/>
+        <w:t>此外，对于道路巡检这类要求实时性的应用场景，模型的推理速度是一个至关重要的评估维度。该指标通常用每秒处理的图像帧数（</w:t>
+      </w:r>
+      <w:r>
+        <w:rPr>
+          <w:rFonts w:eastAsia="Times New Roman"/>
+          <w:kern w:val="0"/>
+          <w:sz w:val="24"/>
+          <w:lang/>
+        </w:rPr>
+        <w:t>Frames Per Second, FPS</w:t>
+      </w:r>
+      <w:r>
+        <w:rPr>
+          <w:rFonts w:ascii="宋体" w:hAnsi="宋体" w:cs="宋体" w:hint="eastAsia"/>
+          <w:kern w:val="0"/>
+          <w:sz w:val="24"/>
+          <w:lang/>
+        </w:rPr>
+        <w:t>）来衡量</w:t>
+      </w:r>
+      <w:r>
+        <w:rPr>
+          <w:rFonts w:ascii="宋体" w:hAnsi="宋体" w:cs="宋体" w:hint="eastAsia"/>
           <w:kern w:val="0"/>
           <w:sz w:val="24"/>
           <w:lang/>
         </w:rPr>
         <w:t>。</w:t>
       </w:r>
-    </w:p>
-    <w:p>
-      <w:pPr>
-        <w:spacing w:before="100" w:beforeAutospacing="1" w:after="100" w:afterAutospacing="1"/>
-        <w:rPr>
-          <w:rFonts w:eastAsia="Times New Roman"/>
-          <w:kern w:val="0"/>
-          <w:sz w:val="24"/>
-          <w:lang/>
-        </w:rPr>
-      </w:pPr>
-      <w:r>
-        <w:rPr>
-          <w:rFonts w:ascii="宋体" w:hAnsi="宋体" w:cs="宋体" w:hint="eastAsia"/>
-          <w:kern w:val="0"/>
-          <w:sz w:val="24"/>
-          <w:lang/>
-        </w:rPr>
-        <w:t>然而，在目标检测任务中，</w:t>
-      </w:r>
-      <w:proofErr w:type="gramStart"/>
-      <w:r>
-        <w:rPr>
-          <w:rFonts w:ascii="宋体" w:hAnsi="宋体" w:cs="宋体" w:hint="eastAsia"/>
-          <w:kern w:val="0"/>
-          <w:sz w:val="24"/>
-          <w:lang/>
-        </w:rPr>
-        <w:t>最</w:t>
-      </w:r>
-      <w:proofErr w:type="gramEnd"/>
-      <w:r>
-        <w:rPr>
-          <w:rFonts w:ascii="宋体" w:hAnsi="宋体" w:cs="宋体" w:hint="eastAsia"/>
-          <w:kern w:val="0"/>
-          <w:sz w:val="24"/>
-          <w:lang/>
-        </w:rPr>
-        <w:t>核心的综合性能指标是平均精度均值（</w:t>
-      </w:r>
-      <w:r>
-        <w:rPr>
-          <w:rFonts w:eastAsia="Times New Roman"/>
-          <w:kern w:val="0"/>
-          <w:sz w:val="24"/>
-          <w:lang/>
-        </w:rPr>
-        <w:t>mean Average Precision, mAP</w:t>
-      </w:r>
-      <w:r>
-        <w:rPr>
-          <w:rFonts w:ascii="宋体" w:hAnsi="宋体" w:cs="宋体" w:hint="eastAsia"/>
-          <w:kern w:val="0"/>
-          <w:sz w:val="24"/>
-          <w:lang/>
-        </w:rPr>
-        <w:t>）。</w:t>
-      </w:r>
-      <w:r>
-        <w:rPr>
-          <w:rFonts w:eastAsia="Times New Roman"/>
-          <w:kern w:val="0"/>
-          <w:sz w:val="24"/>
-          <w:lang/>
-        </w:rPr>
-        <w:t>mAP</w:t>
-      </w:r>
-      <w:r>
-        <w:rPr>
-          <w:rFonts w:ascii="宋体" w:hAnsi="宋体" w:cs="宋体" w:hint="eastAsia"/>
-          <w:kern w:val="0"/>
-          <w:sz w:val="24"/>
-          <w:lang/>
-        </w:rPr>
-        <w:t>通过计算在所有类别上的平均精度（</w:t>
-      </w:r>
-      <w:r>
-        <w:rPr>
-          <w:rFonts w:eastAsia="Times New Roman"/>
-          <w:kern w:val="0"/>
-          <w:sz w:val="24"/>
-          <w:lang/>
-        </w:rPr>
-        <w:t>Average Precision, AP</w:t>
-      </w:r>
-      <w:r>
-        <w:rPr>
-          <w:rFonts w:ascii="宋体" w:hAnsi="宋体" w:cs="宋体" w:hint="eastAsia"/>
-          <w:kern w:val="0"/>
-          <w:sz w:val="24"/>
-          <w:lang/>
-        </w:rPr>
-        <w:t>）的均值得到。而单个类别的</w:t>
-      </w:r>
-      <w:r>
-        <w:rPr>
-          <w:rFonts w:eastAsia="Times New Roman"/>
-          <w:kern w:val="0"/>
-          <w:sz w:val="24"/>
-          <w:lang/>
-        </w:rPr>
-        <w:t>AP</w:t>
-      </w:r>
-      <w:r>
-        <w:rPr>
-          <w:rFonts w:ascii="宋体" w:hAnsi="宋体" w:cs="宋体" w:hint="eastAsia"/>
-          <w:kern w:val="0"/>
-          <w:sz w:val="24"/>
-          <w:lang/>
-        </w:rPr>
-        <w:t>则是通过在不同置信度阈值下计算出的精确率</w:t>
-      </w:r>
-      <w:r>
-        <w:rPr>
-          <w:rFonts w:eastAsia="Times New Roman"/>
-          <w:kern w:val="0"/>
-          <w:sz w:val="24"/>
-          <w:lang/>
-        </w:rPr>
-        <w:t>-</w:t>
-      </w:r>
-      <w:r>
-        <w:rPr>
-          <w:rFonts w:ascii="宋体" w:hAnsi="宋体" w:cs="宋体" w:hint="eastAsia"/>
-          <w:kern w:val="0"/>
-          <w:sz w:val="24"/>
-          <w:lang/>
-        </w:rPr>
-        <w:t>召回率曲线下的面积来获得的。它综合了模型在不同置信度下的表现，能够更全面地衡量模型的检测性能</w:t>
-      </w:r>
-      <w:r>
-        <w:rPr>
-          <w:rFonts w:eastAsia="Times New Roman"/>
-          <w:kern w:val="0"/>
-          <w:sz w:val="24"/>
-          <w:lang/>
-        </w:rPr>
-        <w:t xml:space="preserve"> </w:t>
-      </w:r>
-      <w:r>
-        <w:rPr>
-          <w:rFonts w:ascii="宋体" w:hAnsi="宋体" w:cs="宋体" w:hint="eastAsia"/>
-          <w:kern w:val="0"/>
-          <w:sz w:val="24"/>
-          <w:lang/>
-        </w:rPr>
-        <w:t>。</w:t>
-      </w:r>
-      <w:r>
-        <w:rPr>
-          <w:rFonts w:eastAsia="Times New Roman"/>
-          <w:kern w:val="0"/>
-          <w:sz w:val="24"/>
-          <w:lang/>
-        </w:rPr>
-        <w:t xml:space="preserve">   </w:t>
-      </w:r>
-    </w:p>
-    <w:p>
-      <w:pPr>
-        <w:spacing w:before="100" w:beforeAutospacing="1" w:after="100" w:afterAutospacing="1"/>
-        <w:rPr>
-          <w:rFonts w:eastAsia="Times New Roman"/>
-          <w:kern w:val="0"/>
-          <w:sz w:val="24"/>
-          <w:lang/>
-        </w:rPr>
-      </w:pPr>
-      <w:r>
-        <w:rPr>
-          <w:rFonts w:ascii="宋体" w:hAnsi="宋体" w:cs="宋体" w:hint="eastAsia"/>
-          <w:kern w:val="0"/>
-          <w:sz w:val="24"/>
-          <w:lang/>
-        </w:rPr>
-        <w:t>此外，对于道路巡检这类要求实时性的应用场景，模型的推理速度是一个至关重要的评估维度。该指标通常用每秒处理的图像帧数（</w:t>
-      </w:r>
-      <w:r>
-        <w:rPr>
-          <w:rFonts w:eastAsia="Times New Roman"/>
-          <w:kern w:val="0"/>
-          <w:sz w:val="24"/>
-          <w:lang/>
-        </w:rPr>
-        <w:t>Frames Per Second, FPS</w:t>
-      </w:r>
-      <w:r>
-        <w:rPr>
-          <w:rFonts w:ascii="宋体" w:hAnsi="宋体" w:cs="宋体" w:hint="eastAsia"/>
-          <w:kern w:val="0"/>
-          <w:sz w:val="24"/>
-          <w:lang/>
-        </w:rPr>
-        <w:t>）来衡量</w:t>
-      </w:r>
-      <w:r>
-        <w:rPr>
-          <w:rFonts w:eastAsia="Times New Roman"/>
-          <w:kern w:val="0"/>
-          <w:sz w:val="24"/>
-          <w:lang/>
-        </w:rPr>
-        <w:t xml:space="preserve"> </w:t>
-      </w:r>
-      <w:r>
-        <w:rPr>
-          <w:rFonts w:ascii="宋体" w:hAnsi="宋体" w:cs="宋体" w:hint="eastAsia"/>
-          <w:kern w:val="0"/>
-          <w:sz w:val="24"/>
-          <w:lang/>
-        </w:rPr>
-        <w:t>。一个优秀的实时检测模型，必须在</w:t>
+      <w:r>
+        <w:rPr>
+          <w:rFonts w:ascii="宋体" w:hAnsi="宋体" w:cs="宋体" w:hint="eastAsia"/>
+          <w:kern w:val="0"/>
+          <w:sz w:val="24"/>
+          <w:lang/>
+        </w:rPr>
+        <w:t>一个优秀的实时检测模型，必须在</w:t>
       </w:r>
       <w:r>
         <w:rPr>
@@ -8177,7 +8088,7 @@
           <w:kern w:val="44"/>
           <w:lang w:bidi="ar"/>
         </w:rPr>
-        <w:t xml:space="preserve"> </w:t>
+        <w:t>。</w:t>
       </w:r>
       <w:r>
         <w:rPr>
@@ -8185,7 +8096,7 @@
           <w:kern w:val="44"/>
           <w:lang w:bidi="ar"/>
         </w:rPr>
-        <w:t>。本文从传统方法到深度学习方法，系统地总结并分析了近年来的相关研究现状。但近些年，目标检测模型的参数量剧增，性能提升却可能微乎其微，并且占用硬件资源开销大，推理与训练时间长，并不能很好地将其直接应用于资源受限的边缘设备</w:t>
+        <w:t>本文从传统方法到深度学习方法，系统地总结并分析了近年来的相关研究现状。但近些年，目标检测模型的参数量剧增，性能提升却可能微乎其微，并且占用硬件资源开销大，推理与训练时间长，并不能很好地将其直接应用于资源受限的边缘设备</w:t>
       </w:r>
       <w:r>
         <w:rPr>
@@ -8193,7 +8104,7 @@
           <w:kern w:val="44"/>
           <w:lang w:bidi="ar"/>
         </w:rPr>
-        <w:t xml:space="preserve"> </w:t>
+        <w:t>。</w:t>
       </w:r>
       <w:r>
         <w:rPr>
@@ -8201,7 +8112,7 @@
           <w:kern w:val="44"/>
           <w:lang w:bidi="ar"/>
         </w:rPr>
-        <w:t>。本研究拟提出的改进</w:t>
+        <w:t>本研究拟提出的改进</w:t>
       </w:r>
       <w:r>
         <w:rPr>
@@ -8225,14 +8136,6 @@
           <w:kern w:val="44"/>
           <w:lang w:bidi="ar"/>
         </w:rPr>
-        <w:t xml:space="preserve"> </w:t>
-      </w:r>
-      <w:r>
-        <w:rPr>
-          <w:rFonts w:ascii="Times New Roman" w:hAnsi="Times New Roman"/>
-          <w:kern w:val="44"/>
-          <w:lang w:bidi="ar"/>
-        </w:rPr>
         <w:t>。</w:t>
       </w:r>
       <w:r>
@@ -8254,35 +8157,13 @@
           <w:rFonts w:hint="eastAsia"/>
           <w:lang/>
         </w:rPr>
-        <w:t>系列为代表的</w:t>
-      </w:r>
-      <w:proofErr w:type="gramStart"/>
+        <w:t>系列为代表的单阶段目标检测算法，凭借其在实时性与精度上取得的良好平衡，已成为该领域的主流选择</w:t>
+      </w:r>
       <w:r>
         <w:rPr>
           <w:rFonts w:hint="eastAsia"/>
           <w:lang/>
         </w:rPr>
-        <w:t>单阶段</w:t>
-      </w:r>
-      <w:proofErr w:type="gramEnd"/>
-      <w:r>
-        <w:rPr>
-          <w:rFonts w:hint="eastAsia"/>
-          <w:lang/>
-        </w:rPr>
-        <w:t>目标检测算法，凭借其在实时性与精度上取得的良好平衡，已成为该领域的主流选择</w:t>
-      </w:r>
-      <w:r>
-        <w:rPr>
-          <w:rFonts w:ascii="Times New Roman" w:eastAsia="Times New Roman" w:hAnsi="Times New Roman" w:cs="Times New Roman"/>
-          <w:lang/>
-        </w:rPr>
-        <w:t xml:space="preserve"> </w:t>
-      </w:r>
-      <w:r>
-        <w:rPr>
-          <w:lang/>
-        </w:rPr>
         <w:t>。</w:t>
       </w:r>
     </w:p>
@@ -8307,21 +8188,21 @@
       </w:r>
       <w:r>
         <w:rPr>
-          <w:rFonts w:eastAsia="Times New Roman"/>
-          <w:kern w:val="0"/>
-          <w:sz w:val="24"/>
-          <w:lang/>
-        </w:rPr>
-        <w:t xml:space="preserve"> </w:t>
-      </w:r>
-      <w:r>
-        <w:rPr>
-          <w:rFonts w:ascii="宋体" w:hAnsi="宋体" w:cs="宋体" w:hint="eastAsia"/>
-          <w:kern w:val="0"/>
-          <w:sz w:val="24"/>
-          <w:lang/>
-        </w:rPr>
-        <w:t>。这种增长虽然可能带来性能上的边际提升，但同时也导致了巨大的硬件资源开销以及漫长的训练与推理时间，使得这些先进模型难以直接部署于资源受限的边缘计算设备（如车载系统、无人机等）。这揭示了当前研究的一个核心挑战：如何在追求高检测精度的同时，有效控制模型的复杂度，以满足真实世界应用的部署需求</w:t>
+          <w:rFonts w:ascii="宋体" w:hAnsi="宋体" w:cs="宋体" w:hint="eastAsia"/>
+          <w:kern w:val="0"/>
+          <w:sz w:val="24"/>
+          <w:lang/>
+        </w:rPr>
+        <w:t>。</w:t>
+      </w:r>
+      <w:r>
+        <w:rPr>
+          <w:rFonts w:ascii="宋体" w:hAnsi="宋体" w:cs="宋体" w:hint="eastAsia"/>
+          <w:kern w:val="0"/>
+          <w:sz w:val="24"/>
+          <w:lang/>
+        </w:rPr>
+        <w:t>这种增长虽然可能带来性能上的边际提升，但同时也导致了巨大的硬件资源开销以及漫长的训练与推理时间，使得这些先进模型难以直接部署于资源受限的边缘计算设备（如车载系统、无人机等）。这揭示了当前研究的一个核心挑战：如何在追求高检测精度的同时，有效控制模型的复杂度，以满足真实世界应用的部署需求</w:t>
       </w:r>
       <w:r>
         <w:rPr>

</xml_diff>

<commit_message>
vault backup: 2025-09-27 00:32:10
</commit_message>
<xml_diff>
--- a/学校/文件/刘非凡-文献综述v2.docx
+++ b/学校/文件/刘非凡-文献综述v2.docx
@@ -4847,10 +4847,10 @@
         <w:tblLook w:val="04A0" w:firstRow="1" w:lastRow="0" w:firstColumn="1" w:lastColumn="0" w:noHBand="0" w:noVBand="1"/>
       </w:tblPr>
       <w:tblGrid>
-        <w:gridCol w:w="788"/>
-        <w:gridCol w:w="516"/>
-        <w:gridCol w:w="6995"/>
-        <w:gridCol w:w="763"/>
+        <w:gridCol w:w="776"/>
+        <w:gridCol w:w="508"/>
+        <w:gridCol w:w="7026"/>
+        <w:gridCol w:w="752"/>
       </w:tblGrid>
       <w:tr>
         <w:trPr>
@@ -5025,7 +5025,7 @@
           </w:tcPr>
           <w:p>
             <w:pPr>
-              <w:jc w:val="center"/>
+              <w:jc w:val="both"/>
               <w:rPr>
                 <w:rFonts w:eastAsia="Times New Roman"/>
               </w:rPr>
@@ -5038,6 +5038,70 @@
               <w:t>将目标检测统一为单个回归问题，实现端到端的实时检测</w:t>
             </w:r>
             <w:proofErr w:type="spellEnd"/>
+            <w:r>
+              <w:rPr>
+                <w:rFonts w:ascii="宋体" w:hAnsi="宋体" w:cs="宋体"/>
+                <w:kern w:val="0"/>
+                <w:sz w:val="24"/>
+              </w:rPr>
+              <w:fldChar w:fldCharType="begin"/>
+            </w:r>
+            <w:r>
+              <w:rPr>
+                <w:rFonts w:ascii="宋体" w:hAnsi="宋体" w:cs="宋体"/>
+                <w:kern w:val="0"/>
+                <w:sz w:val="24"/>
+                <w:lang/>
+              </w:rPr>
+              <w:instrText xml:space="preserve"> ADDIN EN.CITE &lt;EndNote&gt;&lt;Cite&gt;&lt;Author&gt;Zhu&lt;/Author&gt;&lt;Year&gt;2014&lt;/Year&gt;&lt;RecNum&gt;27&lt;/RecNum&gt;&lt;DisplayText&gt;&lt;style face="superscript"&gt;[2]&lt;/style&gt;&lt;/DisplayText&gt;&lt;record&gt;&lt;rec-number&gt;27&lt;/rec-number&gt;&lt;foreign-keys&gt;&lt;key app="EN" db-id="r22exsavnwf02oef5eu5prfwststtzaxt0f2" timestamp="1693637848" guid="4f20af2a-d45d-4bf8-b74f-1fd22496fe4e"&gt;27&lt;/key&gt;&lt;/foreign-keys&gt;&lt;ref-type name="Journal Article"&gt;17&lt;/ref-type&gt;&lt;contributors&gt;&lt;authors&gt;&lt;author&gt;Zhu, Jun-Yan&lt;/author&gt;&lt;author&gt;Wu, Jiajun&lt;/author&gt;&lt;author&gt;Xu, Yan&lt;/author&gt;&lt;author&gt;Chang, Eric&lt;/author&gt;&lt;author&gt;Tu, Zhuowen&lt;/author&gt;&lt;/authors&gt;&lt;/contributors&gt;&lt;titles&gt;&lt;title&gt;Unsupervised object class discovery via saliency-guided multiple class learning&lt;/title&gt;&lt;secondary-title&gt;IEEE transactions on pattern analysis and machine intelligence&lt;/secondary-title&gt;&lt;/titles&gt;&lt;periodical&gt;&lt;full-title&gt;Ieee Transactions on Pattern Analysis and Machine Intelligence&lt;/full-title&gt;&lt;/periodical&gt;&lt;pages&gt;862-875&lt;/pages&gt;&lt;volume&gt;37&lt;/volume&gt;&lt;number&gt;4&lt;/number&gt;&lt;dates&gt;&lt;year&gt;2014&lt;/year&gt;&lt;/dates&gt;&lt;isbn&gt;0162-8828&lt;/isbn&gt;&lt;urls&gt;&lt;/urls&gt;&lt;/record&gt;&lt;/Cite&gt;&lt;/EndNote&gt;</w:instrText>
+            </w:r>
+            <w:r>
+              <w:rPr>
+                <w:rFonts w:ascii="宋体" w:hAnsi="宋体" w:cs="宋体"/>
+                <w:kern w:val="0"/>
+                <w:sz w:val="24"/>
+              </w:rPr>
+              <w:fldChar w:fldCharType="separate"/>
+            </w:r>
+            <w:r>
+              <w:rPr>
+                <w:rFonts w:ascii="宋体" w:hAnsi="宋体" w:cs="宋体"/>
+                <w:kern w:val="0"/>
+                <w:sz w:val="24"/>
+                <w:vertAlign w:val="superscript"/>
+                <w:lang/>
+              </w:rPr>
+              <w:t>[</w:t>
+            </w:r>
+            <w:r>
+              <w:rPr>
+                <w:rFonts w:ascii="宋体" w:hAnsi="宋体" w:cs="宋体" w:hint="eastAsia"/>
+                <w:kern w:val="0"/>
+                <w:sz w:val="24"/>
+                <w:vertAlign w:val="superscript"/>
+                <w:lang/>
+              </w:rPr>
+              <w:t>8</w:t>
+            </w:r>
+            <w:r>
+              <w:rPr>
+                <w:rFonts w:ascii="宋体" w:hAnsi="宋体" w:cs="宋体"/>
+                <w:kern w:val="0"/>
+                <w:sz w:val="24"/>
+                <w:vertAlign w:val="superscript"/>
+                <w:lang/>
+              </w:rPr>
+              <w:t>]</w:t>
+            </w:r>
+            <w:r>
+              <w:rPr>
+                <w:rFonts w:ascii="宋体" w:hAnsi="宋体" w:cs="宋体"/>
+                <w:kern w:val="0"/>
+                <w:sz w:val="24"/>
+                <w:lang/>
+              </w:rPr>
+              <w:fldChar w:fldCharType="end"/>
+            </w:r>
             <w:r>
               <w:rPr>
                 <w:rFonts w:eastAsia="Times New Roman"/>
@@ -5124,7 +5188,7 @@
           </w:tcPr>
           <w:p>
             <w:pPr>
-              <w:jc w:val="center"/>
+              <w:jc w:val="both"/>
               <w:rPr>
                 <w:rFonts w:eastAsia="Times New Roman"/>
               </w:rPr>
@@ -5133,7 +5197,77 @@
               <w:rPr>
                 <w:rFonts w:eastAsia="Times New Roman"/>
               </w:rPr>
-              <w:t>引入批归一化、锚框和维度聚类等技术提升性能，并提出联合训练方法以检测超过9000个类别。</w:t>
+              <w:t>引入批归一化、锚框和维度聚类等技术提升性能，并提出联合训练方法以检测超过9000个类别</w:t>
+            </w:r>
+            <w:r>
+              <w:rPr>
+                <w:rFonts w:ascii="宋体" w:hAnsi="宋体" w:cs="宋体"/>
+                <w:kern w:val="0"/>
+                <w:sz w:val="24"/>
+              </w:rPr>
+              <w:fldChar w:fldCharType="begin"/>
+            </w:r>
+            <w:r>
+              <w:rPr>
+                <w:rFonts w:ascii="宋体" w:hAnsi="宋体" w:cs="宋体"/>
+                <w:kern w:val="0"/>
+                <w:sz w:val="24"/>
+                <w:lang/>
+              </w:rPr>
+              <w:instrText xml:space="preserve"> ADDIN EN.CITE &lt;EndNote&gt;&lt;Cite&gt;&lt;Author&gt;Zhu&lt;/Author&gt;&lt;Year&gt;2014&lt;/Year&gt;&lt;RecNum&gt;27&lt;/RecNum&gt;&lt;DisplayText&gt;&lt;style face="superscript"&gt;[2]&lt;/style&gt;&lt;/DisplayText&gt;&lt;record&gt;&lt;rec-number&gt;27&lt;/rec-number&gt;&lt;foreign-keys&gt;&lt;key app="EN" db-id="r22exsavnwf02oef5eu5prfwststtzaxt0f2" timestamp="1693637848" guid="4f20af2a-d45d-4bf8-b74f-1fd22496fe4e"&gt;27&lt;/key&gt;&lt;/foreign-keys&gt;&lt;ref-type name="Journal Article"&gt;17&lt;/ref-type&gt;&lt;contributors&gt;&lt;authors&gt;&lt;author&gt;Zhu, Jun-Yan&lt;/author&gt;&lt;author&gt;Wu, Jiajun&lt;/author&gt;&lt;author&gt;Xu, Yan&lt;/author&gt;&lt;author&gt;Chang, Eric&lt;/author&gt;&lt;author&gt;Tu, Zhuowen&lt;/author&gt;&lt;/authors&gt;&lt;/contributors&gt;&lt;titles&gt;&lt;title&gt;Unsupervised object class discovery via saliency-guided multiple class learning&lt;/title&gt;&lt;secondary-title&gt;IEEE transactions on pattern analysis and machine intelligence&lt;/secondary-title&gt;&lt;/titles&gt;&lt;periodical&gt;&lt;full-title&gt;Ieee Transactions on Pattern Analysis and Machine Intelligence&lt;/full-title&gt;&lt;/periodical&gt;&lt;pages&gt;862-875&lt;/pages&gt;&lt;volume&gt;37&lt;/volume&gt;&lt;number&gt;4&lt;/number&gt;&lt;dates&gt;&lt;year&gt;2014&lt;/year&gt;&lt;/dates&gt;&lt;isbn&gt;0162-8828&lt;/isbn&gt;&lt;urls&gt;&lt;/urls&gt;&lt;/record&gt;&lt;/Cite&gt;&lt;/EndNote&gt;</w:instrText>
+            </w:r>
+            <w:r>
+              <w:rPr>
+                <w:rFonts w:ascii="宋体" w:hAnsi="宋体" w:cs="宋体"/>
+                <w:kern w:val="0"/>
+                <w:sz w:val="24"/>
+              </w:rPr>
+              <w:fldChar w:fldCharType="separate"/>
+            </w:r>
+            <w:r>
+              <w:rPr>
+                <w:rFonts w:ascii="宋体" w:hAnsi="宋体" w:cs="宋体"/>
+                <w:kern w:val="0"/>
+                <w:sz w:val="24"/>
+                <w:vertAlign w:val="superscript"/>
+                <w:lang/>
+              </w:rPr>
+              <w:t>[</w:t>
+            </w:r>
+            <w:r>
+              <w:rPr>
+                <w:rFonts w:ascii="宋体" w:hAnsi="宋体" w:cs="宋体" w:hint="eastAsia"/>
+                <w:kern w:val="0"/>
+                <w:sz w:val="24"/>
+                <w:vertAlign w:val="superscript"/>
+                <w:lang/>
+              </w:rPr>
+              <w:t>9</w:t>
+            </w:r>
+            <w:r>
+              <w:rPr>
+                <w:rFonts w:ascii="宋体" w:hAnsi="宋体" w:cs="宋体"/>
+                <w:kern w:val="0"/>
+                <w:sz w:val="24"/>
+                <w:vertAlign w:val="superscript"/>
+                <w:lang/>
+              </w:rPr>
+              <w:t>]</w:t>
+            </w:r>
+            <w:r>
+              <w:rPr>
+                <w:rFonts w:ascii="宋体" w:hAnsi="宋体" w:cs="宋体"/>
+                <w:kern w:val="0"/>
+                <w:sz w:val="24"/>
+                <w:lang/>
+              </w:rPr>
+              <w:fldChar w:fldCharType="end"/>
+            </w:r>
+            <w:r>
+              <w:rPr>
+                <w:rFonts w:eastAsia="Times New Roman"/>
+              </w:rPr>
+              <w:t>。</w:t>
             </w:r>
           </w:p>
         </w:tc>
@@ -5215,7 +5349,7 @@
           </w:tcPr>
           <w:p>
             <w:pPr>
-              <w:jc w:val="center"/>
+              <w:jc w:val="both"/>
               <w:rPr>
                 <w:rFonts w:eastAsia="Times New Roman"/>
               </w:rPr>
@@ -5224,7 +5358,77 @@
               <w:rPr>
                 <w:rFonts w:eastAsia="Times New Roman"/>
               </w:rPr>
-              <w:t>采用多尺度预测（类似FPN）以提升小目标检测能力，并使用更强大的骨干网络Darknet-53。</w:t>
+              <w:t>采用多尺度预测（类似FPN）以提升小目标检测能力，并使用更强大的骨干网络Darknet-53</w:t>
+            </w:r>
+            <w:r>
+              <w:rPr>
+                <w:rFonts w:ascii="宋体" w:hAnsi="宋体" w:cs="宋体"/>
+                <w:kern w:val="0"/>
+                <w:sz w:val="24"/>
+              </w:rPr>
+              <w:fldChar w:fldCharType="begin"/>
+            </w:r>
+            <w:r>
+              <w:rPr>
+                <w:rFonts w:ascii="宋体" w:hAnsi="宋体" w:cs="宋体"/>
+                <w:kern w:val="0"/>
+                <w:sz w:val="24"/>
+                <w:lang/>
+              </w:rPr>
+              <w:instrText xml:space="preserve"> ADDIN EN.CITE &lt;EndNote&gt;&lt;Cite&gt;&lt;Author&gt;Zhu&lt;/Author&gt;&lt;Year&gt;2014&lt;/Year&gt;&lt;RecNum&gt;27&lt;/RecNum&gt;&lt;DisplayText&gt;&lt;style face="superscript"&gt;[2]&lt;/style&gt;&lt;/DisplayText&gt;&lt;record&gt;&lt;rec-number&gt;27&lt;/rec-number&gt;&lt;foreign-keys&gt;&lt;key app="EN" db-id="r22exsavnwf02oef5eu5prfwststtzaxt0f2" timestamp="1693637848" guid="4f20af2a-d45d-4bf8-b74f-1fd22496fe4e"&gt;27&lt;/key&gt;&lt;/foreign-keys&gt;&lt;ref-type name="Journal Article"&gt;17&lt;/ref-type&gt;&lt;contributors&gt;&lt;authors&gt;&lt;author&gt;Zhu, Jun-Yan&lt;/author&gt;&lt;author&gt;Wu, Jiajun&lt;/author&gt;&lt;author&gt;Xu, Yan&lt;/author&gt;&lt;author&gt;Chang, Eric&lt;/author&gt;&lt;author&gt;Tu, Zhuowen&lt;/author&gt;&lt;/authors&gt;&lt;/contributors&gt;&lt;titles&gt;&lt;title&gt;Unsupervised object class discovery via saliency-guided multiple class learning&lt;/title&gt;&lt;secondary-title&gt;IEEE transactions on pattern analysis and machine intelligence&lt;/secondary-title&gt;&lt;/titles&gt;&lt;periodical&gt;&lt;full-title&gt;Ieee Transactions on Pattern Analysis and Machine Intelligence&lt;/full-title&gt;&lt;/periodical&gt;&lt;pages&gt;862-875&lt;/pages&gt;&lt;volume&gt;37&lt;/volume&gt;&lt;number&gt;4&lt;/number&gt;&lt;dates&gt;&lt;year&gt;2014&lt;/year&gt;&lt;/dates&gt;&lt;isbn&gt;0162-8828&lt;/isbn&gt;&lt;urls&gt;&lt;/urls&gt;&lt;/record&gt;&lt;/Cite&gt;&lt;/EndNote&gt;</w:instrText>
+            </w:r>
+            <w:r>
+              <w:rPr>
+                <w:rFonts w:ascii="宋体" w:hAnsi="宋体" w:cs="宋体"/>
+                <w:kern w:val="0"/>
+                <w:sz w:val="24"/>
+              </w:rPr>
+              <w:fldChar w:fldCharType="separate"/>
+            </w:r>
+            <w:r>
+              <w:rPr>
+                <w:rFonts w:ascii="宋体" w:hAnsi="宋体" w:cs="宋体"/>
+                <w:kern w:val="0"/>
+                <w:sz w:val="24"/>
+                <w:vertAlign w:val="superscript"/>
+                <w:lang/>
+              </w:rPr>
+              <w:t>[</w:t>
+            </w:r>
+            <w:r>
+              <w:rPr>
+                <w:rFonts w:ascii="宋体" w:hAnsi="宋体" w:cs="宋体" w:hint="eastAsia"/>
+                <w:kern w:val="0"/>
+                <w:sz w:val="24"/>
+                <w:vertAlign w:val="superscript"/>
+                <w:lang/>
+              </w:rPr>
+              <w:t>10</w:t>
+            </w:r>
+            <w:r>
+              <w:rPr>
+                <w:rFonts w:ascii="宋体" w:hAnsi="宋体" w:cs="宋体"/>
+                <w:kern w:val="0"/>
+                <w:sz w:val="24"/>
+                <w:vertAlign w:val="superscript"/>
+                <w:lang/>
+              </w:rPr>
+              <w:t>]</w:t>
+            </w:r>
+            <w:r>
+              <w:rPr>
+                <w:rFonts w:ascii="宋体" w:hAnsi="宋体" w:cs="宋体"/>
+                <w:kern w:val="0"/>
+                <w:sz w:val="24"/>
+                <w:lang/>
+              </w:rPr>
+              <w:fldChar w:fldCharType="end"/>
+            </w:r>
+            <w:r>
+              <w:rPr>
+                <w:rFonts w:eastAsia="Times New Roman"/>
+              </w:rPr>
+              <w:t>。</w:t>
             </w:r>
           </w:p>
         </w:tc>
@@ -5306,7 +5510,7 @@
           </w:tcPr>
           <w:p>
             <w:pPr>
-              <w:jc w:val="center"/>
+              <w:jc w:val="both"/>
               <w:rPr>
                 <w:rFonts w:eastAsia="Times New Roman"/>
               </w:rPr>
@@ -5321,6 +5525,26 @@
             <w:proofErr w:type="spellEnd"/>
             <w:r>
               <w:rPr>
+                <w:rFonts w:eastAsiaTheme="minorEastAsia" w:hint="eastAsia"/>
+              </w:rPr>
+              <w:t xml:space="preserve"> </w:t>
+            </w:r>
+            <w:r>
+              <w:rPr>
+                <w:rFonts w:eastAsia="Times New Roman"/>
+              </w:rPr>
+              <w:t xml:space="preserve">of </w:t>
+            </w:r>
+            <w:proofErr w:type="spellStart"/>
+            <w:r>
+              <w:rPr>
+                <w:rFonts w:eastAsia="Times New Roman"/>
+              </w:rPr>
+              <w:t>Freebies”和“Bag</w:t>
+            </w:r>
+            <w:proofErr w:type="spellEnd"/>
+            <w:r>
+              <w:rPr>
                 <w:rFonts w:eastAsia="Times New Roman"/>
               </w:rPr>
               <w:t xml:space="preserve"> of </w:t>
@@ -5330,20 +5554,6 @@
               <w:rPr>
                 <w:rFonts w:eastAsia="Times New Roman"/>
               </w:rPr>
-              <w:t>Freebies”和“Bag</w:t>
-            </w:r>
-            <w:proofErr w:type="spellEnd"/>
-            <w:r>
-              <w:rPr>
-                <w:rFonts w:eastAsia="Times New Roman"/>
-              </w:rPr>
-              <w:t xml:space="preserve"> of </w:t>
-            </w:r>
-            <w:proofErr w:type="spellStart"/>
-            <w:r>
-              <w:rPr>
-                <w:rFonts w:eastAsia="Times New Roman"/>
-              </w:rPr>
               <w:t>Specials”概念，系统性地集成了当时最先进的技术（如CSPNet、Mish激活、Mosaic数据增强等</w:t>
             </w:r>
             <w:proofErr w:type="spellEnd"/>
@@ -5351,7 +5561,77 @@
               <w:rPr>
                 <w:rFonts w:eastAsia="Times New Roman"/>
               </w:rPr>
-              <w:t>）。</w:t>
+              <w:t>）</w:t>
+            </w:r>
+            <w:r>
+              <w:rPr>
+                <w:rFonts w:ascii="宋体" w:hAnsi="宋体" w:cs="宋体"/>
+                <w:kern w:val="0"/>
+                <w:sz w:val="24"/>
+              </w:rPr>
+              <w:fldChar w:fldCharType="begin"/>
+            </w:r>
+            <w:r>
+              <w:rPr>
+                <w:rFonts w:ascii="宋体" w:hAnsi="宋体" w:cs="宋体"/>
+                <w:kern w:val="0"/>
+                <w:sz w:val="24"/>
+                <w:lang/>
+              </w:rPr>
+              <w:instrText xml:space="preserve"> ADDIN EN.CITE &lt;EndNote&gt;&lt;Cite&gt;&lt;Author&gt;Zhu&lt;/Author&gt;&lt;Year&gt;2014&lt;/Year&gt;&lt;RecNum&gt;27&lt;/RecNum&gt;&lt;DisplayText&gt;&lt;style face="superscript"&gt;[2]&lt;/style&gt;&lt;/DisplayText&gt;&lt;record&gt;&lt;rec-number&gt;27&lt;/rec-number&gt;&lt;foreign-keys&gt;&lt;key app="EN" db-id="r22exsavnwf02oef5eu5prfwststtzaxt0f2" timestamp="1693637848" guid="4f20af2a-d45d-4bf8-b74f-1fd22496fe4e"&gt;27&lt;/key&gt;&lt;/foreign-keys&gt;&lt;ref-type name="Journal Article"&gt;17&lt;/ref-type&gt;&lt;contributors&gt;&lt;authors&gt;&lt;author&gt;Zhu, Jun-Yan&lt;/author&gt;&lt;author&gt;Wu, Jiajun&lt;/author&gt;&lt;author&gt;Xu, Yan&lt;/author&gt;&lt;author&gt;Chang, Eric&lt;/author&gt;&lt;author&gt;Tu, Zhuowen&lt;/author&gt;&lt;/authors&gt;&lt;/contributors&gt;&lt;titles&gt;&lt;title&gt;Unsupervised object class discovery via saliency-guided multiple class learning&lt;/title&gt;&lt;secondary-title&gt;IEEE transactions on pattern analysis and machine intelligence&lt;/secondary-title&gt;&lt;/titles&gt;&lt;periodical&gt;&lt;full-title&gt;Ieee Transactions on Pattern Analysis and Machine Intelligence&lt;/full-title&gt;&lt;/periodical&gt;&lt;pages&gt;862-875&lt;/pages&gt;&lt;volume&gt;37&lt;/volume&gt;&lt;number&gt;4&lt;/number&gt;&lt;dates&gt;&lt;year&gt;2014&lt;/year&gt;&lt;/dates&gt;&lt;isbn&gt;0162-8828&lt;/isbn&gt;&lt;urls&gt;&lt;/urls&gt;&lt;/record&gt;&lt;/Cite&gt;&lt;/EndNote&gt;</w:instrText>
+            </w:r>
+            <w:r>
+              <w:rPr>
+                <w:rFonts w:ascii="宋体" w:hAnsi="宋体" w:cs="宋体"/>
+                <w:kern w:val="0"/>
+                <w:sz w:val="24"/>
+              </w:rPr>
+              <w:fldChar w:fldCharType="separate"/>
+            </w:r>
+            <w:r>
+              <w:rPr>
+                <w:rFonts w:ascii="宋体" w:hAnsi="宋体" w:cs="宋体"/>
+                <w:kern w:val="0"/>
+                <w:sz w:val="24"/>
+                <w:vertAlign w:val="superscript"/>
+                <w:lang/>
+              </w:rPr>
+              <w:t>[</w:t>
+            </w:r>
+            <w:r>
+              <w:rPr>
+                <w:rFonts w:ascii="宋体" w:hAnsi="宋体" w:cs="宋体" w:hint="eastAsia"/>
+                <w:kern w:val="0"/>
+                <w:sz w:val="24"/>
+                <w:vertAlign w:val="superscript"/>
+                <w:lang/>
+              </w:rPr>
+              <w:t>11</w:t>
+            </w:r>
+            <w:r>
+              <w:rPr>
+                <w:rFonts w:ascii="宋体" w:hAnsi="宋体" w:cs="宋体"/>
+                <w:kern w:val="0"/>
+                <w:sz w:val="24"/>
+                <w:vertAlign w:val="superscript"/>
+                <w:lang/>
+              </w:rPr>
+              <w:t>]</w:t>
+            </w:r>
+            <w:r>
+              <w:rPr>
+                <w:rFonts w:ascii="宋体" w:hAnsi="宋体" w:cs="宋体"/>
+                <w:kern w:val="0"/>
+                <w:sz w:val="24"/>
+                <w:lang/>
+              </w:rPr>
+              <w:fldChar w:fldCharType="end"/>
+            </w:r>
+            <w:r>
+              <w:rPr>
+                <w:rFonts w:eastAsia="Times New Roman"/>
+              </w:rPr>
+              <w:t>。</w:t>
             </w:r>
           </w:p>
         </w:tc>
@@ -5441,7 +5721,7 @@
           </w:tcPr>
           <w:p>
             <w:pPr>
-              <w:jc w:val="center"/>
+              <w:jc w:val="both"/>
               <w:rPr>
                 <w:rFonts w:eastAsia="Times New Roman"/>
               </w:rPr>
@@ -5454,6 +5734,70 @@
               <w:t>由Ultralytics公司推出，基于PyTorch实现，注重易用性、工程实践和持续迭代，引入了自适应锚框计算等特性</w:t>
             </w:r>
             <w:proofErr w:type="spellEnd"/>
+            <w:r>
+              <w:rPr>
+                <w:rFonts w:ascii="宋体" w:hAnsi="宋体" w:cs="宋体"/>
+                <w:kern w:val="0"/>
+                <w:sz w:val="24"/>
+              </w:rPr>
+              <w:fldChar w:fldCharType="begin"/>
+            </w:r>
+            <w:r>
+              <w:rPr>
+                <w:rFonts w:ascii="宋体" w:hAnsi="宋体" w:cs="宋体"/>
+                <w:kern w:val="0"/>
+                <w:sz w:val="24"/>
+                <w:lang/>
+              </w:rPr>
+              <w:instrText xml:space="preserve"> ADDIN EN.CITE &lt;EndNote&gt;&lt;Cite&gt;&lt;Author&gt;Zhu&lt;/Author&gt;&lt;Year&gt;2014&lt;/Year&gt;&lt;RecNum&gt;27&lt;/RecNum&gt;&lt;DisplayText&gt;&lt;style face="superscript"&gt;[2]&lt;/style&gt;&lt;/DisplayText&gt;&lt;record&gt;&lt;rec-number&gt;27&lt;/rec-number&gt;&lt;foreign-keys&gt;&lt;key app="EN" db-id="r22exsavnwf02oef5eu5prfwststtzaxt0f2" timestamp="1693637848" guid="4f20af2a-d45d-4bf8-b74f-1fd22496fe4e"&gt;27&lt;/key&gt;&lt;/foreign-keys&gt;&lt;ref-type name="Journal Article"&gt;17&lt;/ref-type&gt;&lt;contributors&gt;&lt;authors&gt;&lt;author&gt;Zhu, Jun-Yan&lt;/author&gt;&lt;author&gt;Wu, Jiajun&lt;/author&gt;&lt;author&gt;Xu, Yan&lt;/author&gt;&lt;author&gt;Chang, Eric&lt;/author&gt;&lt;author&gt;Tu, Zhuowen&lt;/author&gt;&lt;/authors&gt;&lt;/contributors&gt;&lt;titles&gt;&lt;title&gt;Unsupervised object class discovery via saliency-guided multiple class learning&lt;/title&gt;&lt;secondary-title&gt;IEEE transactions on pattern analysis and machine intelligence&lt;/secondary-title&gt;&lt;/titles&gt;&lt;periodical&gt;&lt;full-title&gt;Ieee Transactions on Pattern Analysis and Machine Intelligence&lt;/full-title&gt;&lt;/periodical&gt;&lt;pages&gt;862-875&lt;/pages&gt;&lt;volume&gt;37&lt;/volume&gt;&lt;number&gt;4&lt;/number&gt;&lt;dates&gt;&lt;year&gt;2014&lt;/year&gt;&lt;/dates&gt;&lt;isbn&gt;0162-8828&lt;/isbn&gt;&lt;urls&gt;&lt;/urls&gt;&lt;/record&gt;&lt;/Cite&gt;&lt;/EndNote&gt;</w:instrText>
+            </w:r>
+            <w:r>
+              <w:rPr>
+                <w:rFonts w:ascii="宋体" w:hAnsi="宋体" w:cs="宋体"/>
+                <w:kern w:val="0"/>
+                <w:sz w:val="24"/>
+              </w:rPr>
+              <w:fldChar w:fldCharType="separate"/>
+            </w:r>
+            <w:r>
+              <w:rPr>
+                <w:rFonts w:ascii="宋体" w:hAnsi="宋体" w:cs="宋体"/>
+                <w:kern w:val="0"/>
+                <w:sz w:val="24"/>
+                <w:vertAlign w:val="superscript"/>
+                <w:lang/>
+              </w:rPr>
+              <w:t>[</w:t>
+            </w:r>
+            <w:r>
+              <w:rPr>
+                <w:rFonts w:ascii="宋体" w:hAnsi="宋体" w:cs="宋体" w:hint="eastAsia"/>
+                <w:kern w:val="0"/>
+                <w:sz w:val="24"/>
+                <w:vertAlign w:val="superscript"/>
+                <w:lang/>
+              </w:rPr>
+              <w:t>12</w:t>
+            </w:r>
+            <w:r>
+              <w:rPr>
+                <w:rFonts w:ascii="宋体" w:hAnsi="宋体" w:cs="宋体"/>
+                <w:kern w:val="0"/>
+                <w:sz w:val="24"/>
+                <w:vertAlign w:val="superscript"/>
+                <w:lang/>
+              </w:rPr>
+              <w:t>]</w:t>
+            </w:r>
+            <w:r>
+              <w:rPr>
+                <w:rFonts w:ascii="宋体" w:hAnsi="宋体" w:cs="宋体"/>
+                <w:kern w:val="0"/>
+                <w:sz w:val="24"/>
+                <w:lang/>
+              </w:rPr>
+              <w:fldChar w:fldCharType="end"/>
+            </w:r>
             <w:r>
               <w:rPr>
                 <w:rFonts w:eastAsia="Times New Roman"/>
@@ -5542,7 +5886,7 @@
           </w:tcPr>
           <w:p>
             <w:pPr>
-              <w:jc w:val="center"/>
+              <w:jc w:val="both"/>
               <w:rPr>
                 <w:rFonts w:eastAsia="Times New Roman"/>
               </w:rPr>
@@ -5551,7 +5895,77 @@
               <w:rPr>
                 <w:rFonts w:eastAsia="Times New Roman"/>
               </w:rPr>
-              <w:t>同样由Ultralytics推出，引入了无锚框（Anchor-Free）的检测头和新的C2f模块，进一步优化了网络结构和性能。</w:t>
+              <w:t>同样由Ultralytics推出，引入了无锚框（Anchor-Free）的检测头和新的C2f模块，进一步优化了网络结构和性能</w:t>
+            </w:r>
+            <w:r>
+              <w:rPr>
+                <w:rFonts w:ascii="宋体" w:hAnsi="宋体" w:cs="宋体"/>
+                <w:kern w:val="0"/>
+                <w:sz w:val="24"/>
+              </w:rPr>
+              <w:fldChar w:fldCharType="begin"/>
+            </w:r>
+            <w:r>
+              <w:rPr>
+                <w:rFonts w:ascii="宋体" w:hAnsi="宋体" w:cs="宋体"/>
+                <w:kern w:val="0"/>
+                <w:sz w:val="24"/>
+                <w:lang/>
+              </w:rPr>
+              <w:instrText xml:space="preserve"> ADDIN EN.CITE &lt;EndNote&gt;&lt;Cite&gt;&lt;Author&gt;Zhu&lt;/Author&gt;&lt;Year&gt;2014&lt;/Year&gt;&lt;RecNum&gt;27&lt;/RecNum&gt;&lt;DisplayText&gt;&lt;style face="superscript"&gt;[2]&lt;/style&gt;&lt;/DisplayText&gt;&lt;record&gt;&lt;rec-number&gt;27&lt;/rec-number&gt;&lt;foreign-keys&gt;&lt;key app="EN" db-id="r22exsavnwf02oef5eu5prfwststtzaxt0f2" timestamp="1693637848" guid="4f20af2a-d45d-4bf8-b74f-1fd22496fe4e"&gt;27&lt;/key&gt;&lt;/foreign-keys&gt;&lt;ref-type name="Journal Article"&gt;17&lt;/ref-type&gt;&lt;contributors&gt;&lt;authors&gt;&lt;author&gt;Zhu, Jun-Yan&lt;/author&gt;&lt;author&gt;Wu, Jiajun&lt;/author&gt;&lt;author&gt;Xu, Yan&lt;/author&gt;&lt;author&gt;Chang, Eric&lt;/author&gt;&lt;author&gt;Tu, Zhuowen&lt;/author&gt;&lt;/authors&gt;&lt;/contributors&gt;&lt;titles&gt;&lt;title&gt;Unsupervised object class discovery via saliency-guided multiple class learning&lt;/title&gt;&lt;secondary-title&gt;IEEE transactions on pattern analysis and machine intelligence&lt;/secondary-title&gt;&lt;/titles&gt;&lt;periodical&gt;&lt;full-title&gt;Ieee Transactions on Pattern Analysis and Machine Intelligence&lt;/full-title&gt;&lt;/periodical&gt;&lt;pages&gt;862-875&lt;/pages&gt;&lt;volume&gt;37&lt;/volume&gt;&lt;number&gt;4&lt;/number&gt;&lt;dates&gt;&lt;year&gt;2014&lt;/year&gt;&lt;/dates&gt;&lt;isbn&gt;0162-8828&lt;/isbn&gt;&lt;urls&gt;&lt;/urls&gt;&lt;/record&gt;&lt;/Cite&gt;&lt;/EndNote&gt;</w:instrText>
+            </w:r>
+            <w:r>
+              <w:rPr>
+                <w:rFonts w:ascii="宋体" w:hAnsi="宋体" w:cs="宋体"/>
+                <w:kern w:val="0"/>
+                <w:sz w:val="24"/>
+              </w:rPr>
+              <w:fldChar w:fldCharType="separate"/>
+            </w:r>
+            <w:r>
+              <w:rPr>
+                <w:rFonts w:ascii="宋体" w:hAnsi="宋体" w:cs="宋体"/>
+                <w:kern w:val="0"/>
+                <w:sz w:val="24"/>
+                <w:vertAlign w:val="superscript"/>
+                <w:lang/>
+              </w:rPr>
+              <w:t>[</w:t>
+            </w:r>
+            <w:r>
+              <w:rPr>
+                <w:rFonts w:ascii="宋体" w:hAnsi="宋体" w:cs="宋体" w:hint="eastAsia"/>
+                <w:kern w:val="0"/>
+                <w:sz w:val="24"/>
+                <w:vertAlign w:val="superscript"/>
+                <w:lang/>
+              </w:rPr>
+              <w:t>13</w:t>
+            </w:r>
+            <w:r>
+              <w:rPr>
+                <w:rFonts w:ascii="宋体" w:hAnsi="宋体" w:cs="宋体"/>
+                <w:kern w:val="0"/>
+                <w:sz w:val="24"/>
+                <w:vertAlign w:val="superscript"/>
+                <w:lang/>
+              </w:rPr>
+              <w:t>]</w:t>
+            </w:r>
+            <w:r>
+              <w:rPr>
+                <w:rFonts w:ascii="宋体" w:hAnsi="宋体" w:cs="宋体"/>
+                <w:kern w:val="0"/>
+                <w:sz w:val="24"/>
+                <w:lang/>
+              </w:rPr>
+              <w:fldChar w:fldCharType="end"/>
+            </w:r>
+            <w:r>
+              <w:rPr>
+                <w:rFonts w:eastAsia="Times New Roman"/>
+              </w:rPr>
+              <w:t>。</w:t>
             </w:r>
           </w:p>
         </w:tc>
@@ -5635,7 +6049,7 @@
           </w:tcPr>
           <w:p>
             <w:pPr>
-              <w:jc w:val="center"/>
+              <w:jc w:val="both"/>
               <w:rPr>
                 <w:rFonts w:eastAsia="Times New Roman"/>
               </w:rPr>
@@ -5662,6 +6076,70 @@
               <w:t>旨在解决深度网络中的信息瓶颈问题，取得了新的SOTA性能</w:t>
             </w:r>
             <w:proofErr w:type="spellEnd"/>
+            <w:r>
+              <w:rPr>
+                <w:rFonts w:ascii="宋体" w:hAnsi="宋体" w:cs="宋体"/>
+                <w:kern w:val="0"/>
+                <w:sz w:val="24"/>
+              </w:rPr>
+              <w:fldChar w:fldCharType="begin"/>
+            </w:r>
+            <w:r>
+              <w:rPr>
+                <w:rFonts w:ascii="宋体" w:hAnsi="宋体" w:cs="宋体"/>
+                <w:kern w:val="0"/>
+                <w:sz w:val="24"/>
+                <w:lang/>
+              </w:rPr>
+              <w:instrText xml:space="preserve"> ADDIN EN.CITE &lt;EndNote&gt;&lt;Cite&gt;&lt;Author&gt;Zhu&lt;/Author&gt;&lt;Year&gt;2014&lt;/Year&gt;&lt;RecNum&gt;27&lt;/RecNum&gt;&lt;DisplayText&gt;&lt;style face="superscript"&gt;[2]&lt;/style&gt;&lt;/DisplayText&gt;&lt;record&gt;&lt;rec-number&gt;27&lt;/rec-number&gt;&lt;foreign-keys&gt;&lt;key app="EN" db-id="r22exsavnwf02oef5eu5prfwststtzaxt0f2" timestamp="1693637848" guid="4f20af2a-d45d-4bf8-b74f-1fd22496fe4e"&gt;27&lt;/key&gt;&lt;/foreign-keys&gt;&lt;ref-type name="Journal Article"&gt;17&lt;/ref-type&gt;&lt;contributors&gt;&lt;authors&gt;&lt;author&gt;Zhu, Jun-Yan&lt;/author&gt;&lt;author&gt;Wu, Jiajun&lt;/author&gt;&lt;author&gt;Xu, Yan&lt;/author&gt;&lt;author&gt;Chang, Eric&lt;/author&gt;&lt;author&gt;Tu, Zhuowen&lt;/author&gt;&lt;/authors&gt;&lt;/contributors&gt;&lt;titles&gt;&lt;title&gt;Unsupervised object class discovery via saliency-guided multiple class learning&lt;/title&gt;&lt;secondary-title&gt;IEEE transactions on pattern analysis and machine intelligence&lt;/secondary-title&gt;&lt;/titles&gt;&lt;periodical&gt;&lt;full-title&gt;Ieee Transactions on Pattern Analysis and Machine Intelligence&lt;/full-title&gt;&lt;/periodical&gt;&lt;pages&gt;862-875&lt;/pages&gt;&lt;volume&gt;37&lt;/volume&gt;&lt;number&gt;4&lt;/number&gt;&lt;dates&gt;&lt;year&gt;2014&lt;/year&gt;&lt;/dates&gt;&lt;isbn&gt;0162-8828&lt;/isbn&gt;&lt;urls&gt;&lt;/urls&gt;&lt;/record&gt;&lt;/Cite&gt;&lt;/EndNote&gt;</w:instrText>
+            </w:r>
+            <w:r>
+              <w:rPr>
+                <w:rFonts w:ascii="宋体" w:hAnsi="宋体" w:cs="宋体"/>
+                <w:kern w:val="0"/>
+                <w:sz w:val="24"/>
+              </w:rPr>
+              <w:fldChar w:fldCharType="separate"/>
+            </w:r>
+            <w:r>
+              <w:rPr>
+                <w:rFonts w:ascii="宋体" w:hAnsi="宋体" w:cs="宋体"/>
+                <w:kern w:val="0"/>
+                <w:sz w:val="24"/>
+                <w:vertAlign w:val="superscript"/>
+                <w:lang/>
+              </w:rPr>
+              <w:t>[</w:t>
+            </w:r>
+            <w:r>
+              <w:rPr>
+                <w:rFonts w:ascii="宋体" w:hAnsi="宋体" w:cs="宋体" w:hint="eastAsia"/>
+                <w:kern w:val="0"/>
+                <w:sz w:val="24"/>
+                <w:vertAlign w:val="superscript"/>
+                <w:lang/>
+              </w:rPr>
+              <w:t>14</w:t>
+            </w:r>
+            <w:r>
+              <w:rPr>
+                <w:rFonts w:ascii="宋体" w:hAnsi="宋体" w:cs="宋体"/>
+                <w:kern w:val="0"/>
+                <w:sz w:val="24"/>
+                <w:vertAlign w:val="superscript"/>
+                <w:lang/>
+              </w:rPr>
+              <w:t>]</w:t>
+            </w:r>
+            <w:r>
+              <w:rPr>
+                <w:rFonts w:ascii="宋体" w:hAnsi="宋体" w:cs="宋体"/>
+                <w:kern w:val="0"/>
+                <w:sz w:val="24"/>
+                <w:lang/>
+              </w:rPr>
+              <w:fldChar w:fldCharType="end"/>
+            </w:r>
             <w:r>
               <w:rPr>
                 <w:rFonts w:eastAsia="Times New Roman"/>

</xml_diff>

<commit_message>
vault backup: 2025-09-27 00:47:09
</commit_message>
<xml_diff>
--- a/学校/文件/刘非凡-文献综述v2.docx
+++ b/学校/文件/刘非凡-文献综述v2.docx
@@ -6243,8 +6243,48 @@
         <w:t>mAP</w:t>
       </w:r>
       <w:r>
+        <w:fldChar w:fldCharType="begin"/>
+      </w:r>
+      <w:r>
+        <w:rPr>
+          <w:lang/>
+        </w:rPr>
+        <w:instrText xml:space="preserve"> ADDIN EN.CITE &lt;EndNote&gt;&lt;Cite&gt;&lt;Author&gt;Zhu&lt;/Author&gt;&lt;Year&gt;2014&lt;/Year&gt;&lt;RecNum&gt;27&lt;/RecNum&gt;&lt;DisplayText&gt;&lt;style face="superscript"&gt;[2]&lt;/style&gt;&lt;/DisplayText&gt;&lt;record&gt;&lt;rec-number&gt;27&lt;/rec-number&gt;&lt;foreign-keys&gt;&lt;key app="EN" db-id="r22exsavnwf02oef5eu5prfwststtzaxt0f2" timestamp="1693637848" guid="4f20af2a-d45d-4bf8-b74f-1fd22496fe4e"&gt;27&lt;/key&gt;&lt;/foreign-keys&gt;&lt;ref-type name="Journal Article"&gt;17&lt;/ref-type&gt;&lt;contributors&gt;&lt;authors&gt;&lt;author&gt;Zhu, Jun-Yan&lt;/author&gt;&lt;author&gt;Wu, Jiajun&lt;/author&gt;&lt;author&gt;Xu, Yan&lt;/author&gt;&lt;author&gt;Chang, Eric&lt;/author&gt;&lt;author&gt;Tu, Zhuowen&lt;/author&gt;&lt;/authors&gt;&lt;/contributors&gt;&lt;titles&gt;&lt;title&gt;Unsupervised object class discovery via saliency-guided multiple class learning&lt;/title&gt;&lt;secondary-title&gt;IEEE transactions on pattern analysis and machine intelligence&lt;/secondary-title&gt;&lt;/titles&gt;&lt;periodical&gt;&lt;full-title&gt;Ieee Transactions on Pattern Analysis and Machine Intelligence&lt;/full-title&gt;&lt;/periodical&gt;&lt;pages&gt;862-875&lt;/pages&gt;&lt;volume&gt;37&lt;/volume&gt;&lt;number&gt;4&lt;/number&gt;&lt;dates&gt;&lt;year&gt;2014&lt;/year&gt;&lt;/dates&gt;&lt;isbn&gt;0162-8828&lt;/isbn&gt;&lt;urls&gt;&lt;/urls&gt;&lt;/record&gt;&lt;/Cite&gt;&lt;/EndNote&gt;</w:instrText>
+      </w:r>
+      <w:r>
+        <w:fldChar w:fldCharType="separate"/>
+      </w:r>
+      <w:r>
+        <w:rPr>
+          <w:vertAlign w:val="superscript"/>
+          <w:lang/>
+        </w:rPr>
+        <w:t>[</w:t>
+      </w:r>
+      <w:r>
         <w:rPr>
           <w:rFonts w:hint="eastAsia"/>
+          <w:vertAlign w:val="superscript"/>
+          <w:lang/>
+        </w:rPr>
+        <w:t>9</w:t>
+      </w:r>
+      <w:r>
+        <w:rPr>
+          <w:vertAlign w:val="superscript"/>
+          <w:lang/>
+        </w:rPr>
+        <w:t>]</w:t>
+      </w:r>
+      <w:r>
+        <w:rPr>
+          <w:lang/>
+        </w:rPr>
+        <w:fldChar w:fldCharType="end"/>
+      </w:r>
+      <w:r>
+        <w:rPr>
+          <w:rFonts w:hint="eastAsia"/>
           <w:lang/>
         </w:rPr>
         <w:t>。</w:t>
@@ -6278,8 +6318,48 @@
         <w:t>）的思想，在三个不同的尺度上进行预测，极大地改善了对小目标的检测效果</w:t>
       </w:r>
       <w:r>
+        <w:fldChar w:fldCharType="begin"/>
+      </w:r>
+      <w:r>
+        <w:rPr>
+          <w:lang/>
+        </w:rPr>
+        <w:instrText xml:space="preserve"> ADDIN EN.CITE &lt;EndNote&gt;&lt;Cite&gt;&lt;Author&gt;Zhu&lt;/Author&gt;&lt;Year&gt;2014&lt;/Year&gt;&lt;RecNum&gt;27&lt;/RecNum&gt;&lt;DisplayText&gt;&lt;style face="superscript"&gt;[2]&lt;/style&gt;&lt;/DisplayText&gt;&lt;record&gt;&lt;rec-number&gt;27&lt;/rec-number&gt;&lt;foreign-keys&gt;&lt;key app="EN" db-id="r22exsavnwf02oef5eu5prfwststtzaxt0f2" timestamp="1693637848" guid="4f20af2a-d45d-4bf8-b74f-1fd22496fe4e"&gt;27&lt;/key&gt;&lt;/foreign-keys&gt;&lt;ref-type name="Journal Article"&gt;17&lt;/ref-type&gt;&lt;contributors&gt;&lt;authors&gt;&lt;author&gt;Zhu, Jun-Yan&lt;/author&gt;&lt;author&gt;Wu, Jiajun&lt;/author&gt;&lt;author&gt;Xu, Yan&lt;/author&gt;&lt;author&gt;Chang, Eric&lt;/author&gt;&lt;author&gt;Tu, Zhuowen&lt;/author&gt;&lt;/authors&gt;&lt;/contributors&gt;&lt;titles&gt;&lt;title&gt;Unsupervised object class discovery via saliency-guided multiple class learning&lt;/title&gt;&lt;secondary-title&gt;IEEE transactions on pattern analysis and machine intelligence&lt;/secondary-title&gt;&lt;/titles&gt;&lt;periodical&gt;&lt;full-title&gt;Ieee Transactions on Pattern Analysis and Machine Intelligence&lt;/full-title&gt;&lt;/periodical&gt;&lt;pages&gt;862-875&lt;/pages&gt;&lt;volume&gt;37&lt;/volume&gt;&lt;number&gt;4&lt;/number&gt;&lt;dates&gt;&lt;year&gt;2014&lt;/year&gt;&lt;/dates&gt;&lt;isbn&gt;0162-8828&lt;/isbn&gt;&lt;urls&gt;&lt;/urls&gt;&lt;/record&gt;&lt;/Cite&gt;&lt;/EndNote&gt;</w:instrText>
+      </w:r>
+      <w:r>
+        <w:fldChar w:fldCharType="separate"/>
+      </w:r>
+      <w:r>
+        <w:rPr>
+          <w:vertAlign w:val="superscript"/>
+          <w:lang/>
+        </w:rPr>
+        <w:t>[</w:t>
+      </w:r>
+      <w:r>
         <w:rPr>
           <w:rFonts w:hint="eastAsia"/>
+          <w:vertAlign w:val="superscript"/>
+          <w:lang/>
+        </w:rPr>
+        <w:t>10</w:t>
+      </w:r>
+      <w:r>
+        <w:rPr>
+          <w:vertAlign w:val="superscript"/>
+          <w:lang/>
+        </w:rPr>
+        <w:t>]</w:t>
+      </w:r>
+      <w:r>
+        <w:rPr>
+          <w:lang/>
+        </w:rPr>
+        <w:fldChar w:fldCharType="end"/>
+      </w:r>
+      <w:r>
+        <w:rPr>
+          <w:rFonts w:hint="eastAsia"/>
           <w:lang/>
         </w:rPr>
         <w:t>。</w:t>
@@ -6355,8 +6435,48 @@
         <w:t>数据增强等，在不牺牲速度的前提下将精度推向了新的高度</w:t>
       </w:r>
       <w:r>
+        <w:fldChar w:fldCharType="begin"/>
+      </w:r>
+      <w:r>
+        <w:rPr>
+          <w:lang/>
+        </w:rPr>
+        <w:instrText xml:space="preserve"> ADDIN EN.CITE &lt;EndNote&gt;&lt;Cite&gt;&lt;Author&gt;Zhu&lt;/Author&gt;&lt;Year&gt;2014&lt;/Year&gt;&lt;RecNum&gt;27&lt;/RecNum&gt;&lt;DisplayText&gt;&lt;style face="superscript"&gt;[2]&lt;/style&gt;&lt;/DisplayText&gt;&lt;record&gt;&lt;rec-number&gt;27&lt;/rec-number&gt;&lt;foreign-keys&gt;&lt;key app="EN" db-id="r22exsavnwf02oef5eu5prfwststtzaxt0f2" timestamp="1693637848" guid="4f20af2a-d45d-4bf8-b74f-1fd22496fe4e"&gt;27&lt;/key&gt;&lt;/foreign-keys&gt;&lt;ref-type name="Journal Article"&gt;17&lt;/ref-type&gt;&lt;contributors&gt;&lt;authors&gt;&lt;author&gt;Zhu, Jun-Yan&lt;/author&gt;&lt;author&gt;Wu, Jiajun&lt;/author&gt;&lt;author&gt;Xu, Yan&lt;/author&gt;&lt;author&gt;Chang, Eric&lt;/author&gt;&lt;author&gt;Tu, Zhuowen&lt;/author&gt;&lt;/authors&gt;&lt;/contributors&gt;&lt;titles&gt;&lt;title&gt;Unsupervised object class discovery via saliency-guided multiple class learning&lt;/title&gt;&lt;secondary-title&gt;IEEE transactions on pattern analysis and machine intelligence&lt;/secondary-title&gt;&lt;/titles&gt;&lt;periodical&gt;&lt;full-title&gt;Ieee Transactions on Pattern Analysis and Machine Intelligence&lt;/full-title&gt;&lt;/periodical&gt;&lt;pages&gt;862-875&lt;/pages&gt;&lt;volume&gt;37&lt;/volume&gt;&lt;number&gt;4&lt;/number&gt;&lt;dates&gt;&lt;year&gt;2014&lt;/year&gt;&lt;/dates&gt;&lt;isbn&gt;0162-8828&lt;/isbn&gt;&lt;urls&gt;&lt;/urls&gt;&lt;/record&gt;&lt;/Cite&gt;&lt;/EndNote&gt;</w:instrText>
+      </w:r>
+      <w:r>
+        <w:fldChar w:fldCharType="separate"/>
+      </w:r>
+      <w:r>
+        <w:rPr>
+          <w:vertAlign w:val="superscript"/>
+          <w:lang/>
+        </w:rPr>
+        <w:t>[</w:t>
+      </w:r>
+      <w:r>
         <w:rPr>
           <w:rFonts w:hint="eastAsia"/>
+          <w:vertAlign w:val="superscript"/>
+          <w:lang/>
+        </w:rPr>
+        <w:t>11</w:t>
+      </w:r>
+      <w:r>
+        <w:rPr>
+          <w:vertAlign w:val="superscript"/>
+          <w:lang/>
+        </w:rPr>
+        <w:t>]</w:t>
+      </w:r>
+      <w:r>
+        <w:rPr>
+          <w:lang/>
+        </w:rPr>
+        <w:fldChar w:fldCharType="end"/>
+      </w:r>
+      <w:r>
+        <w:rPr>
+          <w:rFonts w:hint="eastAsia"/>
           <w:lang/>
         </w:rPr>
         <w:t>。</w:t>
@@ -6390,8 +6510,48 @@
         <w:t>框架下的优秀实现、极佳的易用性和工程化特性，迅速获得了工业界和学术界的广泛应用</w:t>
       </w:r>
       <w:r>
+        <w:fldChar w:fldCharType="begin"/>
+      </w:r>
+      <w:r>
+        <w:rPr>
+          <w:lang/>
+        </w:rPr>
+        <w:instrText xml:space="preserve"> ADDIN EN.CITE &lt;EndNote&gt;&lt;Cite&gt;&lt;Author&gt;Zhu&lt;/Author&gt;&lt;Year&gt;2014&lt;/Year&gt;&lt;RecNum&gt;27&lt;/RecNum&gt;&lt;DisplayText&gt;&lt;style face="superscript"&gt;[2]&lt;/style&gt;&lt;/DisplayText&gt;&lt;record&gt;&lt;rec-number&gt;27&lt;/rec-number&gt;&lt;foreign-keys&gt;&lt;key app="EN" db-id="r22exsavnwf02oef5eu5prfwststtzaxt0f2" timestamp="1693637848" guid="4f20af2a-d45d-4bf8-b74f-1fd22496fe4e"&gt;27&lt;/key&gt;&lt;/foreign-keys&gt;&lt;ref-type name="Journal Article"&gt;17&lt;/ref-type&gt;&lt;contributors&gt;&lt;authors&gt;&lt;author&gt;Zhu, Jun-Yan&lt;/author&gt;&lt;author&gt;Wu, Jiajun&lt;/author&gt;&lt;author&gt;Xu, Yan&lt;/author&gt;&lt;author&gt;Chang, Eric&lt;/author&gt;&lt;author&gt;Tu, Zhuowen&lt;/author&gt;&lt;/authors&gt;&lt;/contributors&gt;&lt;titles&gt;&lt;title&gt;Unsupervised object class discovery via saliency-guided multiple class learning&lt;/title&gt;&lt;secondary-title&gt;IEEE transactions on pattern analysis and machine intelligence&lt;/secondary-title&gt;&lt;/titles&gt;&lt;periodical&gt;&lt;full-title&gt;Ieee Transactions on Pattern Analysis and Machine Intelligence&lt;/full-title&gt;&lt;/periodical&gt;&lt;pages&gt;862-875&lt;/pages&gt;&lt;volume&gt;37&lt;/volume&gt;&lt;number&gt;4&lt;/number&gt;&lt;dates&gt;&lt;year&gt;2014&lt;/year&gt;&lt;/dates&gt;&lt;isbn&gt;0162-8828&lt;/isbn&gt;&lt;urls&gt;&lt;/urls&gt;&lt;/record&gt;&lt;/Cite&gt;&lt;/EndNote&gt;</w:instrText>
+      </w:r>
+      <w:r>
+        <w:fldChar w:fldCharType="separate"/>
+      </w:r>
+      <w:r>
+        <w:rPr>
+          <w:vertAlign w:val="superscript"/>
+          <w:lang/>
+        </w:rPr>
+        <w:t>[</w:t>
+      </w:r>
+      <w:r>
         <w:rPr>
           <w:rFonts w:hint="eastAsia"/>
+          <w:vertAlign w:val="superscript"/>
+          <w:lang/>
+        </w:rPr>
+        <w:t>12</w:t>
+      </w:r>
+      <w:r>
+        <w:rPr>
+          <w:vertAlign w:val="superscript"/>
+          <w:lang/>
+        </w:rPr>
+        <w:t>]</w:t>
+      </w:r>
+      <w:r>
+        <w:rPr>
+          <w:lang/>
+        </w:rPr>
+        <w:fldChar w:fldCharType="end"/>
+      </w:r>
+      <w:r>
+        <w:rPr>
+          <w:rFonts w:hint="eastAsia"/>
           <w:lang/>
         </w:rPr>
         <w:t>。</w:t>
@@ -6408,11 +6568,58 @@
           <w:rFonts w:ascii="Times New Roman" w:eastAsia="Times New Roman" w:hAnsi="Times New Roman" w:cs="Times New Roman"/>
           <w:lang/>
         </w:rPr>
-        <w:t xml:space="preserve">YOLOv8 </w:t>
+        <w:t>YOLOv8</w:t>
+      </w:r>
+      <w:r>
+        <w:fldChar w:fldCharType="begin"/>
+      </w:r>
+      <w:r>
+        <w:rPr>
+          <w:lang/>
+        </w:rPr>
+        <w:instrText xml:space="preserve"> ADDIN EN.CITE &lt;EndNote&gt;&lt;Cite&gt;&lt;Author&gt;Zhu&lt;/Author&gt;&lt;Year&gt;2014&lt;/Year&gt;&lt;RecNum&gt;27&lt;/RecNum&gt;&lt;DisplayText&gt;&lt;style face="superscript"&gt;[2]&lt;/style&gt;&lt;/DisplayText&gt;&lt;record&gt;&lt;rec-number&gt;27&lt;/rec-number&gt;&lt;foreign-keys&gt;&lt;key app="EN" db-id="r22exsavnwf02oef5eu5prfwststtzaxt0f2" timestamp="1693637848" guid="4f20af2a-d45d-4bf8-b74f-1fd22496fe4e"&gt;27&lt;/key&gt;&lt;/foreign-keys&gt;&lt;ref-type name="Journal Article"&gt;17&lt;/ref-type&gt;&lt;contributors&gt;&lt;authors&gt;&lt;author&gt;Zhu, Jun-Yan&lt;/author&gt;&lt;author&gt;Wu, Jiajun&lt;/author&gt;&lt;author&gt;Xu, Yan&lt;/author&gt;&lt;author&gt;Chang, Eric&lt;/author&gt;&lt;author&gt;Tu, Zhuowen&lt;/author&gt;&lt;/authors&gt;&lt;/contributors&gt;&lt;titles&gt;&lt;title&gt;Unsupervised object class discovery via saliency-guided multiple class learning&lt;/title&gt;&lt;secondary-title&gt;IEEE transactions on pattern analysis and machine intelligence&lt;/secondary-title&gt;&lt;/titles&gt;&lt;periodical&gt;&lt;full-title&gt;Ieee Transactions on Pattern Analysis and Machine Intelligence&lt;/full-title&gt;&lt;/periodical&gt;&lt;pages&gt;862-875&lt;/pages&gt;&lt;volume&gt;37&lt;/volume&gt;&lt;number&gt;4&lt;/number&gt;&lt;dates&gt;&lt;year&gt;2014&lt;/year&gt;&lt;/dates&gt;&lt;isbn&gt;0162-8828&lt;/isbn&gt;&lt;urls&gt;&lt;/urls&gt;&lt;/record&gt;&lt;/Cite&gt;&lt;/EndNote&gt;</w:instrText>
+      </w:r>
+      <w:r>
+        <w:fldChar w:fldCharType="separate"/>
+      </w:r>
+      <w:r>
+        <w:rPr>
+          <w:vertAlign w:val="superscript"/>
+          <w:lang/>
+        </w:rPr>
+        <w:t>[</w:t>
       </w:r>
       <w:r>
         <w:rPr>
           <w:rFonts w:hint="eastAsia"/>
+          <w:vertAlign w:val="superscript"/>
+          <w:lang/>
+        </w:rPr>
+        <w:t>13</w:t>
+      </w:r>
+      <w:r>
+        <w:rPr>
+          <w:vertAlign w:val="superscript"/>
+          <w:lang/>
+        </w:rPr>
+        <w:t>]</w:t>
+      </w:r>
+      <w:r>
+        <w:rPr>
+          <w:lang/>
+        </w:rPr>
+        <w:fldChar w:fldCharType="end"/>
+      </w:r>
+      <w:r>
+        <w:rPr>
+          <w:rFonts w:ascii="Times New Roman" w:eastAsia="Times New Roman" w:hAnsi="Times New Roman" w:cs="Times New Roman"/>
+          <w:lang/>
+        </w:rPr>
+        <w:t xml:space="preserve"> </w:t>
+      </w:r>
+      <w:r>
+        <w:rPr>
+          <w:rFonts w:hint="eastAsia"/>
           <w:lang/>
         </w:rPr>
         <w:t>和</w:t>
@@ -6422,7 +6629,54 @@
           <w:rFonts w:ascii="Times New Roman" w:eastAsia="Times New Roman" w:hAnsi="Times New Roman" w:cs="Times New Roman"/>
           <w:lang/>
         </w:rPr>
-        <w:t xml:space="preserve">YOLOv9 </w:t>
+        <w:t>YOLOv9</w:t>
+      </w:r>
+      <w:r>
+        <w:fldChar w:fldCharType="begin"/>
+      </w:r>
+      <w:r>
+        <w:rPr>
+          <w:lang/>
+        </w:rPr>
+        <w:instrText xml:space="preserve"> ADDIN EN.CITE &lt;EndNote&gt;&lt;Cite&gt;&lt;Author&gt;Zhu&lt;/Author&gt;&lt;Year&gt;2014&lt;/Year&gt;&lt;RecNum&gt;27&lt;/RecNum&gt;&lt;DisplayText&gt;&lt;style face="superscript"&gt;[2]&lt;/style&gt;&lt;/DisplayText&gt;&lt;record&gt;&lt;rec-number&gt;27&lt;/rec-number&gt;&lt;foreign-keys&gt;&lt;key app="EN" db-id="r22exsavnwf02oef5eu5prfwststtzaxt0f2" timestamp="1693637848" guid="4f20af2a-d45d-4bf8-b74f-1fd22496fe4e"&gt;27&lt;/key&gt;&lt;/foreign-keys&gt;&lt;ref-type name="Journal Article"&gt;17&lt;/ref-type&gt;&lt;contributors&gt;&lt;authors&gt;&lt;author&gt;Zhu, Jun-Yan&lt;/author&gt;&lt;author&gt;Wu, Jiajun&lt;/author&gt;&lt;author&gt;Xu, Yan&lt;/author&gt;&lt;author&gt;Chang, Eric&lt;/author&gt;&lt;author&gt;Tu, Zhuowen&lt;/author&gt;&lt;/authors&gt;&lt;/contributors&gt;&lt;titles&gt;&lt;title&gt;Unsupervised object class discovery via saliency-guided multiple class learning&lt;/title&gt;&lt;secondary-title&gt;IEEE transactions on pattern analysis and machine intelligence&lt;/secondary-title&gt;&lt;/titles&gt;&lt;periodical&gt;&lt;full-title&gt;Ieee Transactions on Pattern Analysis and Machine Intelligence&lt;/full-title&gt;&lt;/periodical&gt;&lt;pages&gt;862-875&lt;/pages&gt;&lt;volume&gt;37&lt;/volume&gt;&lt;number&gt;4&lt;/number&gt;&lt;dates&gt;&lt;year&gt;2014&lt;/year&gt;&lt;/dates&gt;&lt;isbn&gt;0162-8828&lt;/isbn&gt;&lt;urls&gt;&lt;/urls&gt;&lt;/record&gt;&lt;/Cite&gt;&lt;/EndNote&gt;</w:instrText>
+      </w:r>
+      <w:r>
+        <w:fldChar w:fldCharType="separate"/>
+      </w:r>
+      <w:r>
+        <w:rPr>
+          <w:vertAlign w:val="superscript"/>
+          <w:lang/>
+        </w:rPr>
+        <w:t>[</w:t>
+      </w:r>
+      <w:r>
+        <w:rPr>
+          <w:rFonts w:hint="eastAsia"/>
+          <w:vertAlign w:val="superscript"/>
+          <w:lang/>
+        </w:rPr>
+        <w:t>14</w:t>
+      </w:r>
+      <w:r>
+        <w:rPr>
+          <w:vertAlign w:val="superscript"/>
+          <w:lang/>
+        </w:rPr>
+        <w:t>]</w:t>
+      </w:r>
+      <w:r>
+        <w:rPr>
+          <w:lang/>
+        </w:rPr>
+        <w:fldChar w:fldCharType="end"/>
+      </w:r>
+      <w:r>
+        <w:rPr>
+          <w:rFonts w:ascii="Times New Roman" w:eastAsia="Times New Roman" w:hAnsi="Times New Roman" w:cs="Times New Roman"/>
+          <w:lang/>
+        </w:rPr>
+        <w:t xml:space="preserve"> </w:t>
       </w:r>
       <w:r>
         <w:rPr>
@@ -6714,7 +6968,80 @@
           <w:sz w:val="24"/>
           <w:lang/>
         </w:rPr>
-        <w:t>是这一领域的里程碑式工作。它引入了深度可分离卷积（</w:t>
+        <w:t>是这一领域的里程碑式工作</w:t>
+      </w:r>
+      <w:r>
+        <w:rPr>
+          <w:rFonts w:ascii="宋体" w:hAnsi="宋体" w:cs="宋体"/>
+          <w:kern w:val="0"/>
+          <w:sz w:val="24"/>
+        </w:rPr>
+        <w:fldChar w:fldCharType="begin"/>
+      </w:r>
+      <w:r>
+        <w:rPr>
+          <w:rFonts w:ascii="宋体" w:hAnsi="宋体" w:cs="宋体"/>
+          <w:kern w:val="0"/>
+          <w:sz w:val="24"/>
+          <w:lang/>
+        </w:rPr>
+        <w:instrText xml:space="preserve"> ADDIN EN.CITE &lt;EndNote&gt;&lt;Cite&gt;&lt;Author&gt;Zhu&lt;/Author&gt;&lt;Year&gt;2014&lt;/Year&gt;&lt;RecNum&gt;27&lt;/RecNum&gt;&lt;DisplayText&gt;&lt;style face="superscript"&gt;[2]&lt;/style&gt;&lt;/DisplayText&gt;&lt;record&gt;&lt;rec-number&gt;27&lt;/rec-number&gt;&lt;foreign-keys&gt;&lt;key app="EN" db-id="r22exsavnwf02oef5eu5prfwststtzaxt0f2" timestamp="1693637848" guid="4f20af2a-d45d-4bf8-b74f-1fd22496fe4e"&gt;27&lt;/key&gt;&lt;/foreign-keys&gt;&lt;ref-type name="Journal Article"&gt;17&lt;/ref-type&gt;&lt;contributors&gt;&lt;authors&gt;&lt;author&gt;Zhu, Jun-Yan&lt;/author&gt;&lt;author&gt;Wu, Jiajun&lt;/author&gt;&lt;author&gt;Xu, Yan&lt;/author&gt;&lt;author&gt;Chang, Eric&lt;/author&gt;&lt;author&gt;Tu, Zhuowen&lt;/author&gt;&lt;/authors&gt;&lt;/contributors&gt;&lt;titles&gt;&lt;title&gt;Unsupervised object class discovery via saliency-guided multiple class learning&lt;/title&gt;&lt;secondary-title&gt;IEEE transactions on pattern analysis and machine intelligence&lt;/secondary-title&gt;&lt;/titles&gt;&lt;periodical&gt;&lt;full-title&gt;Ieee Transactions on Pattern Analysis and Machine Intelligence&lt;/full-title&gt;&lt;/periodical&gt;&lt;pages&gt;862-875&lt;/pages&gt;&lt;volume&gt;37&lt;/volume&gt;&lt;number&gt;4&lt;/number&gt;&lt;dates&gt;&lt;year&gt;2014&lt;/year&gt;&lt;/dates&gt;&lt;isbn&gt;0162-8828&lt;/isbn&gt;&lt;urls&gt;&lt;/urls&gt;&lt;/record&gt;&lt;/Cite&gt;&lt;/EndNote&gt;</w:instrText>
+      </w:r>
+      <w:r>
+        <w:rPr>
+          <w:rFonts w:ascii="宋体" w:hAnsi="宋体" w:cs="宋体"/>
+          <w:kern w:val="0"/>
+          <w:sz w:val="24"/>
+        </w:rPr>
+        <w:fldChar w:fldCharType="separate"/>
+      </w:r>
+      <w:r>
+        <w:rPr>
+          <w:rFonts w:ascii="宋体" w:hAnsi="宋体" w:cs="宋体"/>
+          <w:kern w:val="0"/>
+          <w:sz w:val="24"/>
+          <w:vertAlign w:val="superscript"/>
+          <w:lang/>
+        </w:rPr>
+        <w:t>[</w:t>
+      </w:r>
+      <w:r>
+        <w:rPr>
+          <w:rFonts w:ascii="宋体" w:hAnsi="宋体" w:cs="宋体" w:hint="eastAsia"/>
+          <w:kern w:val="0"/>
+          <w:sz w:val="24"/>
+          <w:vertAlign w:val="superscript"/>
+          <w:lang/>
+        </w:rPr>
+        <w:t>15</w:t>
+      </w:r>
+      <w:r>
+        <w:rPr>
+          <w:rFonts w:ascii="宋体" w:hAnsi="宋体" w:cs="宋体"/>
+          <w:kern w:val="0"/>
+          <w:sz w:val="24"/>
+          <w:vertAlign w:val="superscript"/>
+          <w:lang/>
+        </w:rPr>
+        <w:t>]</w:t>
+      </w:r>
+      <w:r>
+        <w:rPr>
+          <w:rFonts w:ascii="宋体" w:hAnsi="宋体" w:cs="宋体"/>
+          <w:kern w:val="0"/>
+          <w:sz w:val="24"/>
+          <w:lang/>
+        </w:rPr>
+        <w:fldChar w:fldCharType="end"/>
+      </w:r>
+      <w:r>
+        <w:rPr>
+          <w:rFonts w:ascii="宋体" w:hAnsi="宋体" w:cs="宋体" w:hint="eastAsia"/>
+          <w:kern w:val="0"/>
+          <w:sz w:val="24"/>
+          <w:lang/>
+        </w:rPr>
+        <w:t>。它引入了深度可分离卷积（</w:t>
       </w:r>
       <w:r>
         <w:rPr>
@@ -6862,6 +7189,70 @@
       </w:r>
       <w:r>
         <w:rPr>
+          <w:rFonts w:ascii="宋体" w:hAnsi="宋体" w:cs="宋体"/>
+          <w:kern w:val="0"/>
+          <w:sz w:val="24"/>
+        </w:rPr>
+        <w:fldChar w:fldCharType="begin"/>
+      </w:r>
+      <w:r>
+        <w:rPr>
+          <w:rFonts w:ascii="宋体" w:hAnsi="宋体" w:cs="宋体"/>
+          <w:kern w:val="0"/>
+          <w:sz w:val="24"/>
+          <w:lang/>
+        </w:rPr>
+        <w:instrText xml:space="preserve"> ADDIN EN.CITE &lt;EndNote&gt;&lt;Cite&gt;&lt;Author&gt;Zhu&lt;/Author&gt;&lt;Year&gt;2014&lt;/Year&gt;&lt;RecNum&gt;27&lt;/RecNum&gt;&lt;DisplayText&gt;&lt;style face="superscript"&gt;[2]&lt;/style&gt;&lt;/DisplayText&gt;&lt;record&gt;&lt;rec-number&gt;27&lt;/rec-number&gt;&lt;foreign-keys&gt;&lt;key app="EN" db-id="r22exsavnwf02oef5eu5prfwststtzaxt0f2" timestamp="1693637848" guid="4f20af2a-d45d-4bf8-b74f-1fd22496fe4e"&gt;27&lt;/key&gt;&lt;/foreign-keys&gt;&lt;ref-type name="Journal Article"&gt;17&lt;/ref-type&gt;&lt;contributors&gt;&lt;authors&gt;&lt;author&gt;Zhu, Jun-Yan&lt;/author&gt;&lt;author&gt;Wu, Jiajun&lt;/author&gt;&lt;author&gt;Xu, Yan&lt;/author&gt;&lt;author&gt;Chang, Eric&lt;/author&gt;&lt;author&gt;Tu, Zhuowen&lt;/author&gt;&lt;/authors&gt;&lt;/contributors&gt;&lt;titles&gt;&lt;title&gt;Unsupervised object class discovery via saliency-guided multiple class learning&lt;/title&gt;&lt;secondary-title&gt;IEEE transactions on pattern analysis and machine intelligence&lt;/secondary-title&gt;&lt;/titles&gt;&lt;periodical&gt;&lt;full-title&gt;Ieee Transactions on Pattern Analysis and Machine Intelligence&lt;/full-title&gt;&lt;/periodical&gt;&lt;pages&gt;862-875&lt;/pages&gt;&lt;volume&gt;37&lt;/volume&gt;&lt;number&gt;4&lt;/number&gt;&lt;dates&gt;&lt;year&gt;2014&lt;/year&gt;&lt;/dates&gt;&lt;isbn&gt;0162-8828&lt;/isbn&gt;&lt;urls&gt;&lt;/urls&gt;&lt;/record&gt;&lt;/Cite&gt;&lt;/EndNote&gt;</w:instrText>
+      </w:r>
+      <w:r>
+        <w:rPr>
+          <w:rFonts w:ascii="宋体" w:hAnsi="宋体" w:cs="宋体"/>
+          <w:kern w:val="0"/>
+          <w:sz w:val="24"/>
+        </w:rPr>
+        <w:fldChar w:fldCharType="separate"/>
+      </w:r>
+      <w:r>
+        <w:rPr>
+          <w:rFonts w:ascii="宋体" w:hAnsi="宋体" w:cs="宋体"/>
+          <w:kern w:val="0"/>
+          <w:sz w:val="24"/>
+          <w:vertAlign w:val="superscript"/>
+          <w:lang/>
+        </w:rPr>
+        <w:t>[</w:t>
+      </w:r>
+      <w:r>
+        <w:rPr>
+          <w:rFonts w:ascii="宋体" w:hAnsi="宋体" w:cs="宋体" w:hint="eastAsia"/>
+          <w:kern w:val="0"/>
+          <w:sz w:val="24"/>
+          <w:vertAlign w:val="superscript"/>
+          <w:lang/>
+        </w:rPr>
+        <w:t>16</w:t>
+      </w:r>
+      <w:r>
+        <w:rPr>
+          <w:rFonts w:ascii="宋体" w:hAnsi="宋体" w:cs="宋体"/>
+          <w:kern w:val="0"/>
+          <w:sz w:val="24"/>
+          <w:vertAlign w:val="superscript"/>
+          <w:lang/>
+        </w:rPr>
+        <w:t>]</w:t>
+      </w:r>
+      <w:r>
+        <w:rPr>
+          <w:rFonts w:ascii="宋体" w:hAnsi="宋体" w:cs="宋体"/>
+          <w:kern w:val="0"/>
+          <w:sz w:val="24"/>
+          <w:lang/>
+        </w:rPr>
+        <w:fldChar w:fldCharType="end"/>
+      </w:r>
+      <w:r>
+        <w:rPr>
           <w:rFonts w:ascii="宋体" w:hAnsi="宋体" w:cs="宋体" w:hint="eastAsia"/>
           <w:kern w:val="0"/>
           <w:sz w:val="24"/>
@@ -6950,7 +7341,80 @@
           <w:sz w:val="24"/>
           <w:lang/>
         </w:rPr>
-        <w:t>卷积。它引入了逐点组卷积（</w:t>
+        <w:t>卷积</w:t>
+      </w:r>
+      <w:r>
+        <w:rPr>
+          <w:rFonts w:ascii="宋体" w:hAnsi="宋体" w:cs="宋体"/>
+          <w:kern w:val="0"/>
+          <w:sz w:val="24"/>
+        </w:rPr>
+        <w:fldChar w:fldCharType="begin"/>
+      </w:r>
+      <w:r>
+        <w:rPr>
+          <w:rFonts w:ascii="宋体" w:hAnsi="宋体" w:cs="宋体"/>
+          <w:kern w:val="0"/>
+          <w:sz w:val="24"/>
+          <w:lang/>
+        </w:rPr>
+        <w:instrText xml:space="preserve"> ADDIN EN.CITE &lt;EndNote&gt;&lt;Cite&gt;&lt;Author&gt;Zhu&lt;/Author&gt;&lt;Year&gt;2014&lt;/Year&gt;&lt;RecNum&gt;27&lt;/RecNum&gt;&lt;DisplayText&gt;&lt;style face="superscript"&gt;[2]&lt;/style&gt;&lt;/DisplayText&gt;&lt;record&gt;&lt;rec-number&gt;27&lt;/rec-number&gt;&lt;foreign-keys&gt;&lt;key app="EN" db-id="r22exsavnwf02oef5eu5prfwststtzaxt0f2" timestamp="1693637848" guid="4f20af2a-d45d-4bf8-b74f-1fd22496fe4e"&gt;27&lt;/key&gt;&lt;/foreign-keys&gt;&lt;ref-type name="Journal Article"&gt;17&lt;/ref-type&gt;&lt;contributors&gt;&lt;authors&gt;&lt;author&gt;Zhu, Jun-Yan&lt;/author&gt;&lt;author&gt;Wu, Jiajun&lt;/author&gt;&lt;author&gt;Xu, Yan&lt;/author&gt;&lt;author&gt;Chang, Eric&lt;/author&gt;&lt;author&gt;Tu, Zhuowen&lt;/author&gt;&lt;/authors&gt;&lt;/contributors&gt;&lt;titles&gt;&lt;title&gt;Unsupervised object class discovery via saliency-guided multiple class learning&lt;/title&gt;&lt;secondary-title&gt;IEEE transactions on pattern analysis and machine intelligence&lt;/secondary-title&gt;&lt;/titles&gt;&lt;periodical&gt;&lt;full-title&gt;Ieee Transactions on Pattern Analysis and Machine Intelligence&lt;/full-title&gt;&lt;/periodical&gt;&lt;pages&gt;862-875&lt;/pages&gt;&lt;volume&gt;37&lt;/volume&gt;&lt;number&gt;4&lt;/number&gt;&lt;dates&gt;&lt;year&gt;2014&lt;/year&gt;&lt;/dates&gt;&lt;isbn&gt;0162-8828&lt;/isbn&gt;&lt;urls&gt;&lt;/urls&gt;&lt;/record&gt;&lt;/Cite&gt;&lt;/EndNote&gt;</w:instrText>
+      </w:r>
+      <w:r>
+        <w:rPr>
+          <w:rFonts w:ascii="宋体" w:hAnsi="宋体" w:cs="宋体"/>
+          <w:kern w:val="0"/>
+          <w:sz w:val="24"/>
+        </w:rPr>
+        <w:fldChar w:fldCharType="separate"/>
+      </w:r>
+      <w:r>
+        <w:rPr>
+          <w:rFonts w:ascii="宋体" w:hAnsi="宋体" w:cs="宋体"/>
+          <w:kern w:val="0"/>
+          <w:sz w:val="24"/>
+          <w:vertAlign w:val="superscript"/>
+          <w:lang/>
+        </w:rPr>
+        <w:t>[</w:t>
+      </w:r>
+      <w:r>
+        <w:rPr>
+          <w:rFonts w:ascii="宋体" w:hAnsi="宋体" w:cs="宋体" w:hint="eastAsia"/>
+          <w:kern w:val="0"/>
+          <w:sz w:val="24"/>
+          <w:vertAlign w:val="superscript"/>
+          <w:lang/>
+        </w:rPr>
+        <w:t>17</w:t>
+      </w:r>
+      <w:r>
+        <w:rPr>
+          <w:rFonts w:ascii="宋体" w:hAnsi="宋体" w:cs="宋体"/>
+          <w:kern w:val="0"/>
+          <w:sz w:val="24"/>
+          <w:vertAlign w:val="superscript"/>
+          <w:lang/>
+        </w:rPr>
+        <w:t>]</w:t>
+      </w:r>
+      <w:r>
+        <w:rPr>
+          <w:rFonts w:ascii="宋体" w:hAnsi="宋体" w:cs="宋体"/>
+          <w:kern w:val="0"/>
+          <w:sz w:val="24"/>
+          <w:lang/>
+        </w:rPr>
+        <w:fldChar w:fldCharType="end"/>
+      </w:r>
+      <w:r>
+        <w:rPr>
+          <w:rFonts w:ascii="宋体" w:hAnsi="宋体" w:cs="宋体" w:hint="eastAsia"/>
+          <w:kern w:val="0"/>
+          <w:sz w:val="24"/>
+          <w:lang/>
+        </w:rPr>
+        <w:t>。它引入了逐点组卷积（</w:t>
       </w:r>
       <w:r>
         <w:rPr>
@@ -7044,6 +7508,70 @@
       </w:r>
       <w:r>
         <w:rPr>
+          <w:rFonts w:ascii="宋体" w:hAnsi="宋体" w:cs="宋体"/>
+          <w:kern w:val="0"/>
+          <w:sz w:val="24"/>
+        </w:rPr>
+        <w:fldChar w:fldCharType="begin"/>
+      </w:r>
+      <w:r>
+        <w:rPr>
+          <w:rFonts w:ascii="宋体" w:hAnsi="宋体" w:cs="宋体"/>
+          <w:kern w:val="0"/>
+          <w:sz w:val="24"/>
+          <w:lang/>
+        </w:rPr>
+        <w:instrText xml:space="preserve"> ADDIN EN.CITE &lt;EndNote&gt;&lt;Cite&gt;&lt;Author&gt;Zhu&lt;/Author&gt;&lt;Year&gt;2014&lt;/Year&gt;&lt;RecNum&gt;27&lt;/RecNum&gt;&lt;DisplayText&gt;&lt;style face="superscript"&gt;[2]&lt;/style&gt;&lt;/DisplayText&gt;&lt;record&gt;&lt;rec-number&gt;27&lt;/rec-number&gt;&lt;foreign-keys&gt;&lt;key app="EN" db-id="r22exsavnwf02oef5eu5prfwststtzaxt0f2" timestamp="1693637848" guid="4f20af2a-d45d-4bf8-b74f-1fd22496fe4e"&gt;27&lt;/key&gt;&lt;/foreign-keys&gt;&lt;ref-type name="Journal Article"&gt;17&lt;/ref-type&gt;&lt;contributors&gt;&lt;authors&gt;&lt;author&gt;Zhu, Jun-Yan&lt;/author&gt;&lt;author&gt;Wu, Jiajun&lt;/author&gt;&lt;author&gt;Xu, Yan&lt;/author&gt;&lt;author&gt;Chang, Eric&lt;/author&gt;&lt;author&gt;Tu, Zhuowen&lt;/author&gt;&lt;/authors&gt;&lt;/contributors&gt;&lt;titles&gt;&lt;title&gt;Unsupervised object class discovery via saliency-guided multiple class learning&lt;/title&gt;&lt;secondary-title&gt;IEEE transactions on pattern analysis and machine intelligence&lt;/secondary-title&gt;&lt;/titles&gt;&lt;periodical&gt;&lt;full-title&gt;Ieee Transactions on Pattern Analysis and Machine Intelligence&lt;/full-title&gt;&lt;/periodical&gt;&lt;pages&gt;862-875&lt;/pages&gt;&lt;volume&gt;37&lt;/volume&gt;&lt;number&gt;4&lt;/number&gt;&lt;dates&gt;&lt;year&gt;2014&lt;/year&gt;&lt;/dates&gt;&lt;isbn&gt;0162-8828&lt;/isbn&gt;&lt;urls&gt;&lt;/urls&gt;&lt;/record&gt;&lt;/Cite&gt;&lt;/EndNote&gt;</w:instrText>
+      </w:r>
+      <w:r>
+        <w:rPr>
+          <w:rFonts w:ascii="宋体" w:hAnsi="宋体" w:cs="宋体"/>
+          <w:kern w:val="0"/>
+          <w:sz w:val="24"/>
+        </w:rPr>
+        <w:fldChar w:fldCharType="separate"/>
+      </w:r>
+      <w:r>
+        <w:rPr>
+          <w:rFonts w:ascii="宋体" w:hAnsi="宋体" w:cs="宋体"/>
+          <w:kern w:val="0"/>
+          <w:sz w:val="24"/>
+          <w:vertAlign w:val="superscript"/>
+          <w:lang/>
+        </w:rPr>
+        <w:t>[</w:t>
+      </w:r>
+      <w:r>
+        <w:rPr>
+          <w:rFonts w:ascii="宋体" w:hAnsi="宋体" w:cs="宋体" w:hint="eastAsia"/>
+          <w:kern w:val="0"/>
+          <w:sz w:val="24"/>
+          <w:vertAlign w:val="superscript"/>
+          <w:lang/>
+        </w:rPr>
+        <w:t>18</w:t>
+      </w:r>
+      <w:r>
+        <w:rPr>
+          <w:rFonts w:ascii="宋体" w:hAnsi="宋体" w:cs="宋体"/>
+          <w:kern w:val="0"/>
+          <w:sz w:val="24"/>
+          <w:vertAlign w:val="superscript"/>
+          <w:lang/>
+        </w:rPr>
+        <w:t>]</w:t>
+      </w:r>
+      <w:r>
+        <w:rPr>
+          <w:rFonts w:ascii="宋体" w:hAnsi="宋体" w:cs="宋体"/>
+          <w:kern w:val="0"/>
+          <w:sz w:val="24"/>
+          <w:lang/>
+        </w:rPr>
+        <w:fldChar w:fldCharType="end"/>
+      </w:r>
+      <w:r>
+        <w:rPr>
           <w:rFonts w:ascii="宋体" w:hAnsi="宋体" w:cs="宋体" w:hint="eastAsia"/>
           <w:kern w:val="0"/>
           <w:sz w:val="24"/>
@@ -7114,7 +7642,90 @@
           <w:sz w:val="24"/>
           <w:lang/>
         </w:rPr>
-        <w:t>提供了一种全新的视角。它观察到深度网络输出的特征图中存在大量冗余，许多特征图彼此相似。基于此，</w:t>
+        <w:t>提供了一种全新的视角。它观察到深度网络输出的特征图中存在大量冗余，许多特征图彼此相似</w:t>
+      </w:r>
+      <w:r>
+        <w:rPr>
+          <w:rFonts w:ascii="宋体" w:hAnsi="宋体" w:cs="宋体"/>
+          <w:kern w:val="0"/>
+          <w:sz w:val="24"/>
+        </w:rPr>
+        <w:fldChar w:fldCharType="begin"/>
+      </w:r>
+      <w:r>
+        <w:rPr>
+          <w:rFonts w:ascii="宋体" w:hAnsi="宋体" w:cs="宋体"/>
+          <w:kern w:val="0"/>
+          <w:sz w:val="24"/>
+          <w:lang/>
+        </w:rPr>
+        <w:instrText xml:space="preserve"> ADDIN EN.CITE &lt;EndNote&gt;&lt;Cite&gt;&lt;Author&gt;Zhu&lt;/Author&gt;&lt;Year&gt;2014&lt;/Year&gt;&lt;RecNum&gt;27&lt;/RecNum&gt;&lt;DisplayText&gt;&lt;style face="superscript"&gt;[2]&lt;/style&gt;&lt;/DisplayText&gt;&lt;record&gt;&lt;rec-number&gt;27&lt;/rec-number&gt;&lt;foreign-keys&gt;&lt;key app="EN" db-id="r22exsavnwf02oef5eu5prfwststtzaxt0f2" timestamp="1693637848" guid="4f20af2a-d45d-4bf8-b74f-1fd22496fe4e"&gt;27&lt;/key&gt;&lt;/foreign-keys&gt;&lt;ref-type name="Journal Article"&gt;17&lt;/ref-type&gt;&lt;contributors&gt;&lt;authors&gt;&lt;author&gt;Zhu, Jun-Yan&lt;/author&gt;&lt;author&gt;Wu, Jiajun&lt;/author&gt;&lt;author&gt;Xu, Yan&lt;/author&gt;&lt;author&gt;Chang, Eric&lt;/author&gt;&lt;author&gt;Tu, Zhuowen&lt;/author&gt;&lt;/authors&gt;&lt;/contributors&gt;&lt;titles&gt;&lt;title&gt;Unsupervised object class discovery via saliency-guided multiple class learning&lt;/title&gt;&lt;secondary-title&gt;IEEE transactions on pattern analysis and machine intelligence&lt;/secondary-title&gt;&lt;/titles&gt;&lt;periodical&gt;&lt;full-title&gt;Ieee Transactions on Pattern Analysis and Machine Intelligence&lt;/full-title&gt;&lt;/periodical&gt;&lt;pages&gt;862-875&lt;/pages&gt;&lt;volume&gt;37&lt;/volume&gt;&lt;number&gt;4&lt;/number&gt;&lt;dates&gt;&lt;year&gt;2014&lt;/year&gt;&lt;/dates&gt;&lt;isbn&gt;0162-8828&lt;/isbn&gt;&lt;urls&gt;&lt;/urls&gt;&lt;/record&gt;&lt;/Cite&gt;&lt;/EndNote&gt;</w:instrText>
+      </w:r>
+      <w:r>
+        <w:rPr>
+          <w:rFonts w:ascii="宋体" w:hAnsi="宋体" w:cs="宋体"/>
+          <w:kern w:val="0"/>
+          <w:sz w:val="24"/>
+        </w:rPr>
+        <w:fldChar w:fldCharType="separate"/>
+      </w:r>
+      <w:r>
+        <w:rPr>
+          <w:rFonts w:ascii="宋体" w:hAnsi="宋体" w:cs="宋体"/>
+          <w:kern w:val="0"/>
+          <w:sz w:val="24"/>
+          <w:vertAlign w:val="superscript"/>
+          <w:lang/>
+        </w:rPr>
+        <w:t>[</w:t>
+      </w:r>
+      <w:r>
+        <w:rPr>
+          <w:rFonts w:ascii="宋体" w:hAnsi="宋体" w:cs="宋体" w:hint="eastAsia"/>
+          <w:kern w:val="0"/>
+          <w:sz w:val="24"/>
+          <w:vertAlign w:val="superscript"/>
+          <w:lang/>
+        </w:rPr>
+        <w:t>1</w:t>
+      </w:r>
+      <w:r>
+        <w:rPr>
+          <w:rFonts w:ascii="宋体" w:hAnsi="宋体" w:cs="宋体" w:hint="eastAsia"/>
+          <w:kern w:val="0"/>
+          <w:sz w:val="24"/>
+          <w:vertAlign w:val="superscript"/>
+          <w:lang/>
+        </w:rPr>
+        <w:t>9</w:t>
+      </w:r>
+      <w:r>
+        <w:rPr>
+          <w:rFonts w:ascii="宋体" w:hAnsi="宋体" w:cs="宋体"/>
+          <w:kern w:val="0"/>
+          <w:sz w:val="24"/>
+          <w:vertAlign w:val="superscript"/>
+          <w:lang/>
+        </w:rPr>
+        <w:t>]</w:t>
+      </w:r>
+      <w:r>
+        <w:rPr>
+          <w:rFonts w:ascii="宋体" w:hAnsi="宋体" w:cs="宋体"/>
+          <w:kern w:val="0"/>
+          <w:sz w:val="24"/>
+          <w:lang/>
+        </w:rPr>
+        <w:fldChar w:fldCharType="end"/>
+      </w:r>
+      <w:r>
+        <w:rPr>
+          <w:rFonts w:ascii="宋体" w:hAnsi="宋体" w:cs="宋体" w:hint="eastAsia"/>
+          <w:kern w:val="0"/>
+          <w:sz w:val="24"/>
+          <w:lang/>
+        </w:rPr>
+        <w:t>。基于此，</w:t>
       </w:r>
       <w:r>
         <w:rPr>
@@ -7396,7 +8007,80 @@
           <w:sz w:val="24"/>
           <w:lang/>
         </w:rPr>
-        <w:t>是通道注意力机制的开创性工作。</w:t>
+        <w:t>是通道注意力机制的开创性工作</w:t>
+      </w:r>
+      <w:r>
+        <w:rPr>
+          <w:rFonts w:ascii="宋体" w:hAnsi="宋体" w:cs="宋体"/>
+          <w:kern w:val="0"/>
+          <w:sz w:val="24"/>
+        </w:rPr>
+        <w:fldChar w:fldCharType="begin"/>
+      </w:r>
+      <w:r>
+        <w:rPr>
+          <w:rFonts w:ascii="宋体" w:hAnsi="宋体" w:cs="宋体"/>
+          <w:kern w:val="0"/>
+          <w:sz w:val="24"/>
+          <w:lang/>
+        </w:rPr>
+        <w:instrText xml:space="preserve"> ADDIN EN.CITE &lt;EndNote&gt;&lt;Cite&gt;&lt;Author&gt;Zhu&lt;/Author&gt;&lt;Year&gt;2014&lt;/Year&gt;&lt;RecNum&gt;27&lt;/RecNum&gt;&lt;DisplayText&gt;&lt;style face="superscript"&gt;[2]&lt;/style&gt;&lt;/DisplayText&gt;&lt;record&gt;&lt;rec-number&gt;27&lt;/rec-number&gt;&lt;foreign-keys&gt;&lt;key app="EN" db-id="r22exsavnwf02oef5eu5prfwststtzaxt0f2" timestamp="1693637848" guid="4f20af2a-d45d-4bf8-b74f-1fd22496fe4e"&gt;27&lt;/key&gt;&lt;/foreign-keys&gt;&lt;ref-type name="Journal Article"&gt;17&lt;/ref-type&gt;&lt;contributors&gt;&lt;authors&gt;&lt;author&gt;Zhu, Jun-Yan&lt;/author&gt;&lt;author&gt;Wu, Jiajun&lt;/author&gt;&lt;author&gt;Xu, Yan&lt;/author&gt;&lt;author&gt;Chang, Eric&lt;/author&gt;&lt;author&gt;Tu, Zhuowen&lt;/author&gt;&lt;/authors&gt;&lt;/contributors&gt;&lt;titles&gt;&lt;title&gt;Unsupervised object class discovery via saliency-guided multiple class learning&lt;/title&gt;&lt;secondary-title&gt;IEEE transactions on pattern analysis and machine intelligence&lt;/secondary-title&gt;&lt;/titles&gt;&lt;periodical&gt;&lt;full-title&gt;Ieee Transactions on Pattern Analysis and Machine Intelligence&lt;/full-title&gt;&lt;/periodical&gt;&lt;pages&gt;862-875&lt;/pages&gt;&lt;volume&gt;37&lt;/volume&gt;&lt;number&gt;4&lt;/number&gt;&lt;dates&gt;&lt;year&gt;2014&lt;/year&gt;&lt;/dates&gt;&lt;isbn&gt;0162-8828&lt;/isbn&gt;&lt;urls&gt;&lt;/urls&gt;&lt;/record&gt;&lt;/Cite&gt;&lt;/EndNote&gt;</w:instrText>
+      </w:r>
+      <w:r>
+        <w:rPr>
+          <w:rFonts w:ascii="宋体" w:hAnsi="宋体" w:cs="宋体"/>
+          <w:kern w:val="0"/>
+          <w:sz w:val="24"/>
+        </w:rPr>
+        <w:fldChar w:fldCharType="separate"/>
+      </w:r>
+      <w:r>
+        <w:rPr>
+          <w:rFonts w:ascii="宋体" w:hAnsi="宋体" w:cs="宋体"/>
+          <w:kern w:val="0"/>
+          <w:sz w:val="24"/>
+          <w:vertAlign w:val="superscript"/>
+          <w:lang/>
+        </w:rPr>
+        <w:t>[</w:t>
+      </w:r>
+      <w:r>
+        <w:rPr>
+          <w:rFonts w:ascii="宋体" w:hAnsi="宋体" w:cs="宋体" w:hint="eastAsia"/>
+          <w:kern w:val="0"/>
+          <w:sz w:val="24"/>
+          <w:vertAlign w:val="superscript"/>
+          <w:lang/>
+        </w:rPr>
+        <w:t>20</w:t>
+      </w:r>
+      <w:r>
+        <w:rPr>
+          <w:rFonts w:ascii="宋体" w:hAnsi="宋体" w:cs="宋体"/>
+          <w:kern w:val="0"/>
+          <w:sz w:val="24"/>
+          <w:vertAlign w:val="superscript"/>
+          <w:lang/>
+        </w:rPr>
+        <w:t>]</w:t>
+      </w:r>
+      <w:r>
+        <w:rPr>
+          <w:rFonts w:ascii="宋体" w:hAnsi="宋体" w:cs="宋体"/>
+          <w:kern w:val="0"/>
+          <w:sz w:val="24"/>
+          <w:lang/>
+        </w:rPr>
+        <w:fldChar w:fldCharType="end"/>
+      </w:r>
+      <w:r>
+        <w:rPr>
+          <w:rFonts w:ascii="宋体" w:hAnsi="宋体" w:cs="宋体" w:hint="eastAsia"/>
+          <w:kern w:val="0"/>
+          <w:sz w:val="24"/>
+          <w:lang/>
+        </w:rPr>
+        <w:t>。</w:t>
       </w:r>
       <w:r>
         <w:rPr>
@@ -7605,7 +8289,90 @@
           <w:sz w:val="24"/>
           <w:lang/>
         </w:rPr>
-        <w:t>则将注意力机制从通道维度扩展到了空间维度。</w:t>
+        <w:t>则将注意力机制从通道维度扩展到了空间维度</w:t>
+      </w:r>
+      <w:r>
+        <w:rPr>
+          <w:rFonts w:ascii="宋体" w:hAnsi="宋体" w:cs="宋体"/>
+          <w:kern w:val="0"/>
+          <w:sz w:val="24"/>
+        </w:rPr>
+        <w:fldChar w:fldCharType="begin"/>
+      </w:r>
+      <w:r>
+        <w:rPr>
+          <w:rFonts w:ascii="宋体" w:hAnsi="宋体" w:cs="宋体"/>
+          <w:kern w:val="0"/>
+          <w:sz w:val="24"/>
+          <w:lang/>
+        </w:rPr>
+        <w:instrText xml:space="preserve"> ADDIN EN.CITE &lt;EndNote&gt;&lt;Cite&gt;&lt;Author&gt;Zhu&lt;/Author&gt;&lt;Year&gt;2014&lt;/Year&gt;&lt;RecNum&gt;27&lt;/RecNum&gt;&lt;DisplayText&gt;&lt;style face="superscript"&gt;[2]&lt;/style&gt;&lt;/DisplayText&gt;&lt;record&gt;&lt;rec-number&gt;27&lt;/rec-number&gt;&lt;foreign-keys&gt;&lt;key app="EN" db-id="r22exsavnwf02oef5eu5prfwststtzaxt0f2" timestamp="1693637848" guid="4f20af2a-d45d-4bf8-b74f-1fd22496fe4e"&gt;27&lt;/key&gt;&lt;/foreign-keys&gt;&lt;ref-type name="Journal Article"&gt;17&lt;/ref-type&gt;&lt;contributors&gt;&lt;authors&gt;&lt;author&gt;Zhu, Jun-Yan&lt;/author&gt;&lt;author&gt;Wu, Jiajun&lt;/author&gt;&lt;author&gt;Xu, Yan&lt;/author&gt;&lt;author&gt;Chang, Eric&lt;/author&gt;&lt;author&gt;Tu, Zhuowen&lt;/author&gt;&lt;/authors&gt;&lt;/contributors&gt;&lt;titles&gt;&lt;title&gt;Unsupervised object class discovery via saliency-guided multiple class learning&lt;/title&gt;&lt;secondary-title&gt;IEEE transactions on pattern analysis and machine intelligence&lt;/secondary-title&gt;&lt;/titles&gt;&lt;periodical&gt;&lt;full-title&gt;Ieee Transactions on Pattern Analysis and Machine Intelligence&lt;/full-title&gt;&lt;/periodical&gt;&lt;pages&gt;862-875&lt;/pages&gt;&lt;volume&gt;37&lt;/volume&gt;&lt;number&gt;4&lt;/number&gt;&lt;dates&gt;&lt;year&gt;2014&lt;/year&gt;&lt;/dates&gt;&lt;isbn&gt;0162-8828&lt;/isbn&gt;&lt;urls&gt;&lt;/urls&gt;&lt;/record&gt;&lt;/Cite&gt;&lt;/EndNote&gt;</w:instrText>
+      </w:r>
+      <w:r>
+        <w:rPr>
+          <w:rFonts w:ascii="宋体" w:hAnsi="宋体" w:cs="宋体"/>
+          <w:kern w:val="0"/>
+          <w:sz w:val="24"/>
+        </w:rPr>
+        <w:fldChar w:fldCharType="separate"/>
+      </w:r>
+      <w:r>
+        <w:rPr>
+          <w:rFonts w:ascii="宋体" w:hAnsi="宋体" w:cs="宋体"/>
+          <w:kern w:val="0"/>
+          <w:sz w:val="24"/>
+          <w:vertAlign w:val="superscript"/>
+          <w:lang/>
+        </w:rPr>
+        <w:t>[</w:t>
+      </w:r>
+      <w:r>
+        <w:rPr>
+          <w:rFonts w:ascii="宋体" w:hAnsi="宋体" w:cs="宋体" w:hint="eastAsia"/>
+          <w:kern w:val="0"/>
+          <w:sz w:val="24"/>
+          <w:vertAlign w:val="superscript"/>
+          <w:lang/>
+        </w:rPr>
+        <w:t>2</w:t>
+      </w:r>
+      <w:r>
+        <w:rPr>
+          <w:rFonts w:ascii="宋体" w:hAnsi="宋体" w:cs="宋体" w:hint="eastAsia"/>
+          <w:kern w:val="0"/>
+          <w:sz w:val="24"/>
+          <w:vertAlign w:val="superscript"/>
+          <w:lang/>
+        </w:rPr>
+        <w:t>1</w:t>
+      </w:r>
+      <w:r>
+        <w:rPr>
+          <w:rFonts w:ascii="宋体" w:hAnsi="宋体" w:cs="宋体"/>
+          <w:kern w:val="0"/>
+          <w:sz w:val="24"/>
+          <w:vertAlign w:val="superscript"/>
+          <w:lang/>
+        </w:rPr>
+        <w:t>]</w:t>
+      </w:r>
+      <w:r>
+        <w:rPr>
+          <w:rFonts w:ascii="宋体" w:hAnsi="宋体" w:cs="宋体"/>
+          <w:kern w:val="0"/>
+          <w:sz w:val="24"/>
+          <w:lang/>
+        </w:rPr>
+        <w:fldChar w:fldCharType="end"/>
+      </w:r>
+      <w:r>
+        <w:rPr>
+          <w:rFonts w:ascii="宋体" w:hAnsi="宋体" w:cs="宋体" w:hint="eastAsia"/>
+          <w:kern w:val="0"/>
+          <w:sz w:val="24"/>
+          <w:lang/>
+        </w:rPr>
+        <w:t>。</w:t>
       </w:r>
       <w:r>
         <w:rPr>
@@ -7769,7 +8536,90 @@
           <w:sz w:val="24"/>
           <w:lang/>
         </w:rPr>
-        <w:t>）。与之前依赖全连接层或卷积层来学习注意力的工作不同，</w:t>
+        <w:t>）</w:t>
+      </w:r>
+      <w:r>
+        <w:rPr>
+          <w:rFonts w:ascii="宋体" w:hAnsi="宋体" w:cs="宋体"/>
+          <w:kern w:val="0"/>
+          <w:sz w:val="24"/>
+        </w:rPr>
+        <w:fldChar w:fldCharType="begin"/>
+      </w:r>
+      <w:r>
+        <w:rPr>
+          <w:rFonts w:ascii="宋体" w:hAnsi="宋体" w:cs="宋体"/>
+          <w:kern w:val="0"/>
+          <w:sz w:val="24"/>
+          <w:lang/>
+        </w:rPr>
+        <w:instrText xml:space="preserve"> ADDIN EN.CITE &lt;EndNote&gt;&lt;Cite&gt;&lt;Author&gt;Zhu&lt;/Author&gt;&lt;Year&gt;2014&lt;/Year&gt;&lt;RecNum&gt;27&lt;/RecNum&gt;&lt;DisplayText&gt;&lt;style face="superscript"&gt;[2]&lt;/style&gt;&lt;/DisplayText&gt;&lt;record&gt;&lt;rec-number&gt;27&lt;/rec-number&gt;&lt;foreign-keys&gt;&lt;key app="EN" db-id="r22exsavnwf02oef5eu5prfwststtzaxt0f2" timestamp="1693637848" guid="4f20af2a-d45d-4bf8-b74f-1fd22496fe4e"&gt;27&lt;/key&gt;&lt;/foreign-keys&gt;&lt;ref-type name="Journal Article"&gt;17&lt;/ref-type&gt;&lt;contributors&gt;&lt;authors&gt;&lt;author&gt;Zhu, Jun-Yan&lt;/author&gt;&lt;author&gt;Wu, Jiajun&lt;/author&gt;&lt;author&gt;Xu, Yan&lt;/author&gt;&lt;author&gt;Chang, Eric&lt;/author&gt;&lt;author&gt;Tu, Zhuowen&lt;/author&gt;&lt;/authors&gt;&lt;/contributors&gt;&lt;titles&gt;&lt;title&gt;Unsupervised object class discovery via saliency-guided multiple class learning&lt;/title&gt;&lt;secondary-title&gt;IEEE transactions on pattern analysis and machine intelligence&lt;/secondary-title&gt;&lt;/titles&gt;&lt;periodical&gt;&lt;full-title&gt;Ieee Transactions on Pattern Analysis and Machine Intelligence&lt;/full-title&gt;&lt;/periodical&gt;&lt;pages&gt;862-875&lt;/pages&gt;&lt;volume&gt;37&lt;/volume&gt;&lt;number&gt;4&lt;/number&gt;&lt;dates&gt;&lt;year&gt;2014&lt;/year&gt;&lt;/dates&gt;&lt;isbn&gt;0162-8828&lt;/isbn&gt;&lt;urls&gt;&lt;/urls&gt;&lt;/record&gt;&lt;/Cite&gt;&lt;/EndNote&gt;</w:instrText>
+      </w:r>
+      <w:r>
+        <w:rPr>
+          <w:rFonts w:ascii="宋体" w:hAnsi="宋体" w:cs="宋体"/>
+          <w:kern w:val="0"/>
+          <w:sz w:val="24"/>
+        </w:rPr>
+        <w:fldChar w:fldCharType="separate"/>
+      </w:r>
+      <w:r>
+        <w:rPr>
+          <w:rFonts w:ascii="宋体" w:hAnsi="宋体" w:cs="宋体"/>
+          <w:kern w:val="0"/>
+          <w:sz w:val="24"/>
+          <w:vertAlign w:val="superscript"/>
+          <w:lang/>
+        </w:rPr>
+        <w:t>[</w:t>
+      </w:r>
+      <w:r>
+        <w:rPr>
+          <w:rFonts w:ascii="宋体" w:hAnsi="宋体" w:cs="宋体" w:hint="eastAsia"/>
+          <w:kern w:val="0"/>
+          <w:sz w:val="24"/>
+          <w:vertAlign w:val="superscript"/>
+          <w:lang/>
+        </w:rPr>
+        <w:t>2</w:t>
+      </w:r>
+      <w:r>
+        <w:rPr>
+          <w:rFonts w:ascii="宋体" w:hAnsi="宋体" w:cs="宋体" w:hint="eastAsia"/>
+          <w:kern w:val="0"/>
+          <w:sz w:val="24"/>
+          <w:vertAlign w:val="superscript"/>
+          <w:lang/>
+        </w:rPr>
+        <w:t>2</w:t>
+      </w:r>
+      <w:r>
+        <w:rPr>
+          <w:rFonts w:ascii="宋体" w:hAnsi="宋体" w:cs="宋体"/>
+          <w:kern w:val="0"/>
+          <w:sz w:val="24"/>
+          <w:vertAlign w:val="superscript"/>
+          <w:lang/>
+        </w:rPr>
+        <w:t>]</w:t>
+      </w:r>
+      <w:r>
+        <w:rPr>
+          <w:rFonts w:ascii="宋体" w:hAnsi="宋体" w:cs="宋体"/>
+          <w:kern w:val="0"/>
+          <w:sz w:val="24"/>
+          <w:lang/>
+        </w:rPr>
+        <w:fldChar w:fldCharType="end"/>
+      </w:r>
+      <w:r>
+        <w:rPr>
+          <w:rFonts w:ascii="宋体" w:hAnsi="宋体" w:cs="宋体" w:hint="eastAsia"/>
+          <w:kern w:val="0"/>
+          <w:sz w:val="24"/>
+          <w:lang/>
+        </w:rPr>
+        <w:t>。与之前依赖全连接层或卷积层来学习注意力的工作不同，</w:t>
       </w:r>
       <w:r>
         <w:rPr>
@@ -7951,7 +8801,62 @@
           <w:rFonts w:hint="eastAsia"/>
           <w:lang/>
         </w:rPr>
-        <w:t>）。该数据集由</w:t>
+        <w:t>）</w:t>
+      </w:r>
+      <w:r>
+        <w:fldChar w:fldCharType="begin"/>
+      </w:r>
+      <w:r>
+        <w:rPr>
+          <w:lang/>
+        </w:rPr>
+        <w:instrText xml:space="preserve"> ADDIN EN.CITE &lt;EndNote&gt;&lt;Cite&gt;&lt;Author&gt;Zhu&lt;/Author&gt;&lt;Year&gt;2014&lt;/Year&gt;&lt;RecNum&gt;27&lt;/RecNum&gt;&lt;DisplayText&gt;&lt;style face="superscript"&gt;[2]&lt;/style&gt;&lt;/DisplayText&gt;&lt;record&gt;&lt;rec-number&gt;27&lt;/rec-number&gt;&lt;foreign-keys&gt;&lt;key app="EN" db-id="r22exsavnwf02oef5eu5prfwststtzaxt0f2" timestamp="1693637848" guid="4f20af2a-d45d-4bf8-b74f-1fd22496fe4e"&gt;27&lt;/key&gt;&lt;/foreign-keys&gt;&lt;ref-type name="Journal Article"&gt;17&lt;/ref-type&gt;&lt;contributors&gt;&lt;authors&gt;&lt;author&gt;Zhu, Jun-Yan&lt;/author&gt;&lt;author&gt;Wu, Jiajun&lt;/author&gt;&lt;author&gt;Xu, Yan&lt;/author&gt;&lt;author&gt;Chang, Eric&lt;/author&gt;&lt;author&gt;Tu, Zhuowen&lt;/author&gt;&lt;/authors&gt;&lt;/contributors&gt;&lt;titles&gt;&lt;title&gt;Unsupervised object class discovery via saliency-guided multiple class learning&lt;/title&gt;&lt;secondary-title&gt;IEEE transactions on pattern analysis and machine intelligence&lt;/secondary-title&gt;&lt;/titles&gt;&lt;periodical&gt;&lt;full-title&gt;Ieee Transactions on Pattern Analysis and Machine Intelligence&lt;/full-title&gt;&lt;/periodical&gt;&lt;pages&gt;862-875&lt;/pages&gt;&lt;volume&gt;37&lt;/volume&gt;&lt;number&gt;4&lt;/number&gt;&lt;dates&gt;&lt;year&gt;2014&lt;/year&gt;&lt;/dates&gt;&lt;isbn&gt;0162-8828&lt;/isbn&gt;&lt;urls&gt;&lt;/urls&gt;&lt;/record&gt;&lt;/Cite&gt;&lt;/EndNote&gt;</w:instrText>
+      </w:r>
+      <w:r>
+        <w:fldChar w:fldCharType="separate"/>
+      </w:r>
+      <w:r>
+        <w:rPr>
+          <w:vertAlign w:val="superscript"/>
+          <w:lang/>
+        </w:rPr>
+        <w:t>[</w:t>
+      </w:r>
+      <w:r>
+        <w:rPr>
+          <w:rFonts w:hint="eastAsia"/>
+          <w:vertAlign w:val="superscript"/>
+          <w:lang/>
+        </w:rPr>
+        <w:t>2</w:t>
+      </w:r>
+      <w:r>
+        <w:rPr>
+          <w:rFonts w:hint="eastAsia"/>
+          <w:vertAlign w:val="superscript"/>
+          <w:lang/>
+        </w:rPr>
+        <w:t>3</w:t>
+      </w:r>
+      <w:r>
+        <w:rPr>
+          <w:vertAlign w:val="superscript"/>
+          <w:lang/>
+        </w:rPr>
+        <w:t>]</w:t>
+      </w:r>
+      <w:r>
+        <w:rPr>
+          <w:lang/>
+        </w:rPr>
+        <w:fldChar w:fldCharType="end"/>
+      </w:r>
+      <w:r>
+        <w:rPr>
+          <w:rFonts w:hint="eastAsia"/>
+          <w:lang/>
+        </w:rPr>
+        <w:t>。该数据集由</w:t>
       </w:r>
       <w:r>
         <w:rPr>
@@ -8104,6 +9009,80 @@
       </w:r>
       <w:r>
         <w:rPr>
+          <w:rFonts w:ascii="宋体" w:hAnsi="宋体" w:cs="宋体"/>
+          <w:kern w:val="0"/>
+          <w:sz w:val="24"/>
+        </w:rPr>
+        <w:fldChar w:fldCharType="begin"/>
+      </w:r>
+      <w:r>
+        <w:rPr>
+          <w:rFonts w:ascii="宋体" w:hAnsi="宋体" w:cs="宋体"/>
+          <w:kern w:val="0"/>
+          <w:sz w:val="24"/>
+          <w:lang/>
+        </w:rPr>
+        <w:instrText xml:space="preserve"> ADDIN EN.CITE &lt;EndNote&gt;&lt;Cite&gt;&lt;Author&gt;Zhu&lt;/Author&gt;&lt;Year&gt;2014&lt;/Year&gt;&lt;RecNum&gt;27&lt;/RecNum&gt;&lt;DisplayText&gt;&lt;style face="superscript"&gt;[2]&lt;/style&gt;&lt;/DisplayText&gt;&lt;record&gt;&lt;rec-number&gt;27&lt;/rec-number&gt;&lt;foreign-keys&gt;&lt;key app="EN" db-id="r22exsavnwf02oef5eu5prfwststtzaxt0f2" timestamp="1693637848" guid="4f20af2a-d45d-4bf8-b74f-1fd22496fe4e"&gt;27&lt;/key&gt;&lt;/foreign-keys&gt;&lt;ref-type name="Journal Article"&gt;17&lt;/ref-type&gt;&lt;contributors&gt;&lt;authors&gt;&lt;author&gt;Zhu, Jun-Yan&lt;/author&gt;&lt;author&gt;Wu, Jiajun&lt;/author&gt;&lt;author&gt;Xu, Yan&lt;/author&gt;&lt;author&gt;Chang, Eric&lt;/author&gt;&lt;author&gt;Tu, Zhuowen&lt;/author&gt;&lt;/authors&gt;&lt;/contributors&gt;&lt;titles&gt;&lt;title&gt;Unsupervised object class discovery via saliency-guided multiple class learning&lt;/title&gt;&lt;secondary-title&gt;IEEE transactions on pattern analysis and machine intelligence&lt;/secondary-title&gt;&lt;/titles&gt;&lt;periodical&gt;&lt;full-title&gt;Ieee Transactions on Pattern Analysis and Machine Intelligence&lt;/full-title&gt;&lt;/periodical&gt;&lt;pages&gt;862-875&lt;/pages&gt;&lt;volume&gt;37&lt;/volume&gt;&lt;number&gt;4&lt;/number&gt;&lt;dates&gt;&lt;year&gt;2014&lt;/year&gt;&lt;/dates&gt;&lt;isbn&gt;0162-8828&lt;/isbn&gt;&lt;urls&gt;&lt;/urls&gt;&lt;/record&gt;&lt;/Cite&gt;&lt;/EndNote&gt;</w:instrText>
+      </w:r>
+      <w:r>
+        <w:rPr>
+          <w:rFonts w:ascii="宋体" w:hAnsi="宋体" w:cs="宋体"/>
+          <w:kern w:val="0"/>
+          <w:sz w:val="24"/>
+        </w:rPr>
+        <w:fldChar w:fldCharType="separate"/>
+      </w:r>
+      <w:r>
+        <w:rPr>
+          <w:rFonts w:ascii="宋体" w:hAnsi="宋体" w:cs="宋体"/>
+          <w:kern w:val="0"/>
+          <w:sz w:val="24"/>
+          <w:vertAlign w:val="superscript"/>
+          <w:lang/>
+        </w:rPr>
+        <w:t>[</w:t>
+      </w:r>
+      <w:r>
+        <w:rPr>
+          <w:rFonts w:ascii="宋体" w:hAnsi="宋体" w:cs="宋体" w:hint="eastAsia"/>
+          <w:kern w:val="0"/>
+          <w:sz w:val="24"/>
+          <w:vertAlign w:val="superscript"/>
+          <w:lang/>
+        </w:rPr>
+        <w:t>2</w:t>
+      </w:r>
+      <w:r>
+        <w:rPr>
+          <w:rFonts w:ascii="宋体" w:hAnsi="宋体" w:cs="宋体" w:hint="eastAsia"/>
+          <w:kern w:val="0"/>
+          <w:sz w:val="24"/>
+          <w:vertAlign w:val="superscript"/>
+          <w:lang/>
+        </w:rPr>
+        <w:t>4</w:t>
+      </w:r>
+      <w:r>
+        <w:rPr>
+          <w:rFonts w:ascii="宋体" w:hAnsi="宋体" w:cs="宋体"/>
+          <w:kern w:val="0"/>
+          <w:sz w:val="24"/>
+          <w:vertAlign w:val="superscript"/>
+          <w:lang/>
+        </w:rPr>
+        <w:t>]</w:t>
+      </w:r>
+      <w:r>
+        <w:rPr>
+          <w:rFonts w:ascii="宋体" w:hAnsi="宋体" w:cs="宋体"/>
+          <w:kern w:val="0"/>
+          <w:sz w:val="24"/>
+          <w:lang/>
+        </w:rPr>
+        <w:fldChar w:fldCharType="end"/>
+      </w:r>
+      <w:r>
+        <w:rPr>
           <w:rFonts w:ascii="宋体" w:hAnsi="宋体" w:cs="宋体" w:hint="eastAsia"/>
           <w:kern w:val="0"/>
           <w:sz w:val="24"/>
@@ -8201,7 +9180,90 @@
           <w:sz w:val="24"/>
           <w:lang/>
         </w:rPr>
-        <w:t>）。精确率衡量的是模型预测为正例的样本中有多少是真正的正例，而召回率衡量的是所有真正的正例中有多少被模型成功预测出来。这两个指标通常是相互制约的。</w:t>
+        <w:t>）。精确率衡量的是模型预测为正例的样本中有多少是真正的正例，而召回率衡量的是所有真正的正例中有多少被模型成功预测出来。这两个指标通常是相互制约的</w:t>
+      </w:r>
+      <w:r>
+        <w:rPr>
+          <w:rFonts w:ascii="宋体" w:hAnsi="宋体" w:cs="宋体"/>
+          <w:kern w:val="0"/>
+          <w:sz w:val="24"/>
+        </w:rPr>
+        <w:fldChar w:fldCharType="begin"/>
+      </w:r>
+      <w:r>
+        <w:rPr>
+          <w:rFonts w:ascii="宋体" w:hAnsi="宋体" w:cs="宋体"/>
+          <w:kern w:val="0"/>
+          <w:sz w:val="24"/>
+          <w:lang/>
+        </w:rPr>
+        <w:instrText xml:space="preserve"> ADDIN EN.CITE &lt;EndNote&gt;&lt;Cite&gt;&lt;Author&gt;Zhu&lt;/Author&gt;&lt;Year&gt;2014&lt;/Year&gt;&lt;RecNum&gt;27&lt;/RecNum&gt;&lt;DisplayText&gt;&lt;style face="superscript"&gt;[2]&lt;/style&gt;&lt;/DisplayText&gt;&lt;record&gt;&lt;rec-number&gt;27&lt;/rec-number&gt;&lt;foreign-keys&gt;&lt;key app="EN" db-id="r22exsavnwf02oef5eu5prfwststtzaxt0f2" timestamp="1693637848" guid="4f20af2a-d45d-4bf8-b74f-1fd22496fe4e"&gt;27&lt;/key&gt;&lt;/foreign-keys&gt;&lt;ref-type name="Journal Article"&gt;17&lt;/ref-type&gt;&lt;contributors&gt;&lt;authors&gt;&lt;author&gt;Zhu, Jun-Yan&lt;/author&gt;&lt;author&gt;Wu, Jiajun&lt;/author&gt;&lt;author&gt;Xu, Yan&lt;/author&gt;&lt;author&gt;Chang, Eric&lt;/author&gt;&lt;author&gt;Tu, Zhuowen&lt;/author&gt;&lt;/authors&gt;&lt;/contributors&gt;&lt;titles&gt;&lt;title&gt;Unsupervised object class discovery via saliency-guided multiple class learning&lt;/title&gt;&lt;secondary-title&gt;IEEE transactions on pattern analysis and machine intelligence&lt;/secondary-title&gt;&lt;/titles&gt;&lt;periodical&gt;&lt;full-title&gt;Ieee Transactions on Pattern Analysis and Machine Intelligence&lt;/full-title&gt;&lt;/periodical&gt;&lt;pages&gt;862-875&lt;/pages&gt;&lt;volume&gt;37&lt;/volume&gt;&lt;number&gt;4&lt;/number&gt;&lt;dates&gt;&lt;year&gt;2014&lt;/year&gt;&lt;/dates&gt;&lt;isbn&gt;0162-8828&lt;/isbn&gt;&lt;urls&gt;&lt;/urls&gt;&lt;/record&gt;&lt;/Cite&gt;&lt;/EndNote&gt;</w:instrText>
+      </w:r>
+      <w:r>
+        <w:rPr>
+          <w:rFonts w:ascii="宋体" w:hAnsi="宋体" w:cs="宋体"/>
+          <w:kern w:val="0"/>
+          <w:sz w:val="24"/>
+        </w:rPr>
+        <w:fldChar w:fldCharType="separate"/>
+      </w:r>
+      <w:r>
+        <w:rPr>
+          <w:rFonts w:ascii="宋体" w:hAnsi="宋体" w:cs="宋体"/>
+          <w:kern w:val="0"/>
+          <w:sz w:val="24"/>
+          <w:vertAlign w:val="superscript"/>
+          <w:lang/>
+        </w:rPr>
+        <w:t>[</w:t>
+      </w:r>
+      <w:r>
+        <w:rPr>
+          <w:rFonts w:ascii="宋体" w:hAnsi="宋体" w:cs="宋体" w:hint="eastAsia"/>
+          <w:kern w:val="0"/>
+          <w:sz w:val="24"/>
+          <w:vertAlign w:val="superscript"/>
+          <w:lang/>
+        </w:rPr>
+        <w:t>2</w:t>
+      </w:r>
+      <w:r>
+        <w:rPr>
+          <w:rFonts w:ascii="宋体" w:hAnsi="宋体" w:cs="宋体" w:hint="eastAsia"/>
+          <w:kern w:val="0"/>
+          <w:sz w:val="24"/>
+          <w:vertAlign w:val="superscript"/>
+          <w:lang/>
+        </w:rPr>
+        <w:t>5-27</w:t>
+      </w:r>
+      <w:r>
+        <w:rPr>
+          <w:rFonts w:ascii="宋体" w:hAnsi="宋体" w:cs="宋体"/>
+          <w:kern w:val="0"/>
+          <w:sz w:val="24"/>
+          <w:vertAlign w:val="superscript"/>
+          <w:lang/>
+        </w:rPr>
+        <w:t>]</w:t>
+      </w:r>
+      <w:r>
+        <w:rPr>
+          <w:rFonts w:ascii="宋体" w:hAnsi="宋体" w:cs="宋体"/>
+          <w:kern w:val="0"/>
+          <w:sz w:val="24"/>
+          <w:lang/>
+        </w:rPr>
+        <w:fldChar w:fldCharType="end"/>
+      </w:r>
+      <w:r>
+        <w:rPr>
+          <w:rFonts w:ascii="宋体" w:hAnsi="宋体" w:cs="宋体" w:hint="eastAsia"/>
+          <w:kern w:val="0"/>
+          <w:sz w:val="24"/>
+          <w:lang/>
+        </w:rPr>
+        <w:t>。</w:t>
       </w:r>
       <w:r>
         <w:rPr>
@@ -8284,7 +9346,90 @@
           <w:sz w:val="24"/>
           <w:lang/>
         </w:rPr>
-        <w:t>）。</w:t>
+        <w:t>）</w:t>
+      </w:r>
+      <w:r>
+        <w:rPr>
+          <w:rFonts w:ascii="宋体" w:hAnsi="宋体" w:cs="宋体"/>
+          <w:kern w:val="0"/>
+          <w:sz w:val="24"/>
+        </w:rPr>
+        <w:fldChar w:fldCharType="begin"/>
+      </w:r>
+      <w:r>
+        <w:rPr>
+          <w:rFonts w:ascii="宋体" w:hAnsi="宋体" w:cs="宋体"/>
+          <w:kern w:val="0"/>
+          <w:sz w:val="24"/>
+          <w:lang/>
+        </w:rPr>
+        <w:instrText xml:space="preserve"> ADDIN EN.CITE &lt;EndNote&gt;&lt;Cite&gt;&lt;Author&gt;Zhu&lt;/Author&gt;&lt;Year&gt;2014&lt;/Year&gt;&lt;RecNum&gt;27&lt;/RecNum&gt;&lt;DisplayText&gt;&lt;style face="superscript"&gt;[2]&lt;/style&gt;&lt;/DisplayText&gt;&lt;record&gt;&lt;rec-number&gt;27&lt;/rec-number&gt;&lt;foreign-keys&gt;&lt;key app="EN" db-id="r22exsavnwf02oef5eu5prfwststtzaxt0f2" timestamp="1693637848" guid="4f20af2a-d45d-4bf8-b74f-1fd22496fe4e"&gt;27&lt;/key&gt;&lt;/foreign-keys&gt;&lt;ref-type name="Journal Article"&gt;17&lt;/ref-type&gt;&lt;contributors&gt;&lt;authors&gt;&lt;author&gt;Zhu, Jun-Yan&lt;/author&gt;&lt;author&gt;Wu, Jiajun&lt;/author&gt;&lt;author&gt;Xu, Yan&lt;/author&gt;&lt;author&gt;Chang, Eric&lt;/author&gt;&lt;author&gt;Tu, Zhuowen&lt;/author&gt;&lt;/authors&gt;&lt;/contributors&gt;&lt;titles&gt;&lt;title&gt;Unsupervised object class discovery via saliency-guided multiple class learning&lt;/title&gt;&lt;secondary-title&gt;IEEE transactions on pattern analysis and machine intelligence&lt;/secondary-title&gt;&lt;/titles&gt;&lt;periodical&gt;&lt;full-title&gt;Ieee Transactions on Pattern Analysis and Machine Intelligence&lt;/full-title&gt;&lt;/periodical&gt;&lt;pages&gt;862-875&lt;/pages&gt;&lt;volume&gt;37&lt;/volume&gt;&lt;number&gt;4&lt;/number&gt;&lt;dates&gt;&lt;year&gt;2014&lt;/year&gt;&lt;/dates&gt;&lt;isbn&gt;0162-8828&lt;/isbn&gt;&lt;urls&gt;&lt;/urls&gt;&lt;/record&gt;&lt;/Cite&gt;&lt;/EndNote&gt;</w:instrText>
+      </w:r>
+      <w:r>
+        <w:rPr>
+          <w:rFonts w:ascii="宋体" w:hAnsi="宋体" w:cs="宋体"/>
+          <w:kern w:val="0"/>
+          <w:sz w:val="24"/>
+        </w:rPr>
+        <w:fldChar w:fldCharType="separate"/>
+      </w:r>
+      <w:r>
+        <w:rPr>
+          <w:rFonts w:ascii="宋体" w:hAnsi="宋体" w:cs="宋体"/>
+          <w:kern w:val="0"/>
+          <w:sz w:val="24"/>
+          <w:vertAlign w:val="superscript"/>
+          <w:lang/>
+        </w:rPr>
+        <w:t>[</w:t>
+      </w:r>
+      <w:r>
+        <w:rPr>
+          <w:rFonts w:ascii="宋体" w:hAnsi="宋体" w:cs="宋体" w:hint="eastAsia"/>
+          <w:kern w:val="0"/>
+          <w:sz w:val="24"/>
+          <w:vertAlign w:val="superscript"/>
+          <w:lang/>
+        </w:rPr>
+        <w:t>2</w:t>
+      </w:r>
+      <w:r>
+        <w:rPr>
+          <w:rFonts w:ascii="宋体" w:hAnsi="宋体" w:cs="宋体" w:hint="eastAsia"/>
+          <w:kern w:val="0"/>
+          <w:sz w:val="24"/>
+          <w:vertAlign w:val="superscript"/>
+          <w:lang/>
+        </w:rPr>
+        <w:t>8</w:t>
+      </w:r>
+      <w:r>
+        <w:rPr>
+          <w:rFonts w:ascii="宋体" w:hAnsi="宋体" w:cs="宋体"/>
+          <w:kern w:val="0"/>
+          <w:sz w:val="24"/>
+          <w:vertAlign w:val="superscript"/>
+          <w:lang/>
+        </w:rPr>
+        <w:t>]</w:t>
+      </w:r>
+      <w:r>
+        <w:rPr>
+          <w:rFonts w:ascii="宋体" w:hAnsi="宋体" w:cs="宋体"/>
+          <w:kern w:val="0"/>
+          <w:sz w:val="24"/>
+          <w:lang/>
+        </w:rPr>
+        <w:fldChar w:fldCharType="end"/>
+      </w:r>
+      <w:r>
+        <w:rPr>
+          <w:rFonts w:ascii="宋体" w:hAnsi="宋体" w:cs="宋体" w:hint="eastAsia"/>
+          <w:kern w:val="0"/>
+          <w:sz w:val="24"/>
+          <w:lang/>
+        </w:rPr>
+        <w:t>。</w:t>
       </w:r>
       <w:r>
         <w:rPr>
@@ -8320,7 +9465,90 @@
           <w:sz w:val="24"/>
           <w:lang/>
         </w:rPr>
-        <w:t>）的均值得到。而单个类别的</w:t>
+        <w:t>）的均值得到</w:t>
+      </w:r>
+      <w:r>
+        <w:rPr>
+          <w:rFonts w:ascii="宋体" w:hAnsi="宋体" w:cs="宋体"/>
+          <w:kern w:val="0"/>
+          <w:sz w:val="24"/>
+        </w:rPr>
+        <w:fldChar w:fldCharType="begin"/>
+      </w:r>
+      <w:r>
+        <w:rPr>
+          <w:rFonts w:ascii="宋体" w:hAnsi="宋体" w:cs="宋体"/>
+          <w:kern w:val="0"/>
+          <w:sz w:val="24"/>
+          <w:lang/>
+        </w:rPr>
+        <w:instrText xml:space="preserve"> ADDIN EN.CITE &lt;EndNote&gt;&lt;Cite&gt;&lt;Author&gt;Zhu&lt;/Author&gt;&lt;Year&gt;2014&lt;/Year&gt;&lt;RecNum&gt;27&lt;/RecNum&gt;&lt;DisplayText&gt;&lt;style face="superscript"&gt;[2]&lt;/style&gt;&lt;/DisplayText&gt;&lt;record&gt;&lt;rec-number&gt;27&lt;/rec-number&gt;&lt;foreign-keys&gt;&lt;key app="EN" db-id="r22exsavnwf02oef5eu5prfwststtzaxt0f2" timestamp="1693637848" guid="4f20af2a-d45d-4bf8-b74f-1fd22496fe4e"&gt;27&lt;/key&gt;&lt;/foreign-keys&gt;&lt;ref-type name="Journal Article"&gt;17&lt;/ref-type&gt;&lt;contributors&gt;&lt;authors&gt;&lt;author&gt;Zhu, Jun-Yan&lt;/author&gt;&lt;author&gt;Wu, Jiajun&lt;/author&gt;&lt;author&gt;Xu, Yan&lt;/author&gt;&lt;author&gt;Chang, Eric&lt;/author&gt;&lt;author&gt;Tu, Zhuowen&lt;/author&gt;&lt;/authors&gt;&lt;/contributors&gt;&lt;titles&gt;&lt;title&gt;Unsupervised object class discovery via saliency-guided multiple class learning&lt;/title&gt;&lt;secondary-title&gt;IEEE transactions on pattern analysis and machine intelligence&lt;/secondary-title&gt;&lt;/titles&gt;&lt;periodical&gt;&lt;full-title&gt;Ieee Transactions on Pattern Analysis and Machine Intelligence&lt;/full-title&gt;&lt;/periodical&gt;&lt;pages&gt;862-875&lt;/pages&gt;&lt;volume&gt;37&lt;/volume&gt;&lt;number&gt;4&lt;/number&gt;&lt;dates&gt;&lt;year&gt;2014&lt;/year&gt;&lt;/dates&gt;&lt;isbn&gt;0162-8828&lt;/isbn&gt;&lt;urls&gt;&lt;/urls&gt;&lt;/record&gt;&lt;/Cite&gt;&lt;/EndNote&gt;</w:instrText>
+      </w:r>
+      <w:r>
+        <w:rPr>
+          <w:rFonts w:ascii="宋体" w:hAnsi="宋体" w:cs="宋体"/>
+          <w:kern w:val="0"/>
+          <w:sz w:val="24"/>
+        </w:rPr>
+        <w:fldChar w:fldCharType="separate"/>
+      </w:r>
+      <w:r>
+        <w:rPr>
+          <w:rFonts w:ascii="宋体" w:hAnsi="宋体" w:cs="宋体"/>
+          <w:kern w:val="0"/>
+          <w:sz w:val="24"/>
+          <w:vertAlign w:val="superscript"/>
+          <w:lang/>
+        </w:rPr>
+        <w:t>[</w:t>
+      </w:r>
+      <w:r>
+        <w:rPr>
+          <w:rFonts w:ascii="宋体" w:hAnsi="宋体" w:cs="宋体" w:hint="eastAsia"/>
+          <w:kern w:val="0"/>
+          <w:sz w:val="24"/>
+          <w:vertAlign w:val="superscript"/>
+          <w:lang/>
+        </w:rPr>
+        <w:t>2</w:t>
+      </w:r>
+      <w:r>
+        <w:rPr>
+          <w:rFonts w:ascii="宋体" w:hAnsi="宋体" w:cs="宋体" w:hint="eastAsia"/>
+          <w:kern w:val="0"/>
+          <w:sz w:val="24"/>
+          <w:vertAlign w:val="superscript"/>
+          <w:lang/>
+        </w:rPr>
+        <w:t>9</w:t>
+      </w:r>
+      <w:r>
+        <w:rPr>
+          <w:rFonts w:ascii="宋体" w:hAnsi="宋体" w:cs="宋体"/>
+          <w:kern w:val="0"/>
+          <w:sz w:val="24"/>
+          <w:vertAlign w:val="superscript"/>
+          <w:lang/>
+        </w:rPr>
+        <w:t>]</w:t>
+      </w:r>
+      <w:r>
+        <w:rPr>
+          <w:rFonts w:ascii="宋体" w:hAnsi="宋体" w:cs="宋体"/>
+          <w:kern w:val="0"/>
+          <w:sz w:val="24"/>
+          <w:lang/>
+        </w:rPr>
+        <w:fldChar w:fldCharType="end"/>
+      </w:r>
+      <w:r>
+        <w:rPr>
+          <w:rFonts w:ascii="宋体" w:hAnsi="宋体" w:cs="宋体" w:hint="eastAsia"/>
+          <w:kern w:val="0"/>
+          <w:sz w:val="24"/>
+          <w:lang/>
+        </w:rPr>
+        <w:t>。而单个类别的</w:t>
       </w:r>
       <w:r>
         <w:rPr>
@@ -8356,7 +9584,80 @@
           <w:sz w:val="24"/>
           <w:lang/>
         </w:rPr>
-        <w:t>召回率曲线下的面积来获得的。它综合了模型在不同置信度下的表现，能够更全面地衡量模型的检测性能</w:t>
+        <w:t>召回率曲线下的面积来获得的</w:t>
+      </w:r>
+      <w:r>
+        <w:rPr>
+          <w:rFonts w:ascii="宋体" w:hAnsi="宋体" w:cs="宋体"/>
+          <w:kern w:val="0"/>
+          <w:sz w:val="24"/>
+        </w:rPr>
+        <w:fldChar w:fldCharType="begin"/>
+      </w:r>
+      <w:r>
+        <w:rPr>
+          <w:rFonts w:ascii="宋体" w:hAnsi="宋体" w:cs="宋体"/>
+          <w:kern w:val="0"/>
+          <w:sz w:val="24"/>
+          <w:lang/>
+        </w:rPr>
+        <w:instrText xml:space="preserve"> ADDIN EN.CITE &lt;EndNote&gt;&lt;Cite&gt;&lt;Author&gt;Zhu&lt;/Author&gt;&lt;Year&gt;2014&lt;/Year&gt;&lt;RecNum&gt;27&lt;/RecNum&gt;&lt;DisplayText&gt;&lt;style face="superscript"&gt;[2]&lt;/style&gt;&lt;/DisplayText&gt;&lt;record&gt;&lt;rec-number&gt;27&lt;/rec-number&gt;&lt;foreign-keys&gt;&lt;key app="EN" db-id="r22exsavnwf02oef5eu5prfwststtzaxt0f2" timestamp="1693637848" guid="4f20af2a-d45d-4bf8-b74f-1fd22496fe4e"&gt;27&lt;/key&gt;&lt;/foreign-keys&gt;&lt;ref-type name="Journal Article"&gt;17&lt;/ref-type&gt;&lt;contributors&gt;&lt;authors&gt;&lt;author&gt;Zhu, Jun-Yan&lt;/author&gt;&lt;author&gt;Wu, Jiajun&lt;/author&gt;&lt;author&gt;Xu, Yan&lt;/author&gt;&lt;author&gt;Chang, Eric&lt;/author&gt;&lt;author&gt;Tu, Zhuowen&lt;/author&gt;&lt;/authors&gt;&lt;/contributors&gt;&lt;titles&gt;&lt;title&gt;Unsupervised object class discovery via saliency-guided multiple class learning&lt;/title&gt;&lt;secondary-title&gt;IEEE transactions on pattern analysis and machine intelligence&lt;/secondary-title&gt;&lt;/titles&gt;&lt;periodical&gt;&lt;full-title&gt;Ieee Transactions on Pattern Analysis and Machine Intelligence&lt;/full-title&gt;&lt;/periodical&gt;&lt;pages&gt;862-875&lt;/pages&gt;&lt;volume&gt;37&lt;/volume&gt;&lt;number&gt;4&lt;/number&gt;&lt;dates&gt;&lt;year&gt;2014&lt;/year&gt;&lt;/dates&gt;&lt;isbn&gt;0162-8828&lt;/isbn&gt;&lt;urls&gt;&lt;/urls&gt;&lt;/record&gt;&lt;/Cite&gt;&lt;/EndNote&gt;</w:instrText>
+      </w:r>
+      <w:r>
+        <w:rPr>
+          <w:rFonts w:ascii="宋体" w:hAnsi="宋体" w:cs="宋体"/>
+          <w:kern w:val="0"/>
+          <w:sz w:val="24"/>
+        </w:rPr>
+        <w:fldChar w:fldCharType="separate"/>
+      </w:r>
+      <w:r>
+        <w:rPr>
+          <w:rFonts w:ascii="宋体" w:hAnsi="宋体" w:cs="宋体"/>
+          <w:kern w:val="0"/>
+          <w:sz w:val="24"/>
+          <w:vertAlign w:val="superscript"/>
+          <w:lang/>
+        </w:rPr>
+        <w:t>[</w:t>
+      </w:r>
+      <w:r>
+        <w:rPr>
+          <w:rFonts w:ascii="宋体" w:hAnsi="宋体" w:cs="宋体" w:hint="eastAsia"/>
+          <w:kern w:val="0"/>
+          <w:sz w:val="24"/>
+          <w:vertAlign w:val="superscript"/>
+          <w:lang/>
+        </w:rPr>
+        <w:t>30</w:t>
+      </w:r>
+      <w:r>
+        <w:rPr>
+          <w:rFonts w:ascii="宋体" w:hAnsi="宋体" w:cs="宋体"/>
+          <w:kern w:val="0"/>
+          <w:sz w:val="24"/>
+          <w:vertAlign w:val="superscript"/>
+          <w:lang/>
+        </w:rPr>
+        <w:t>]</w:t>
+      </w:r>
+      <w:r>
+        <w:rPr>
+          <w:rFonts w:ascii="宋体" w:hAnsi="宋体" w:cs="宋体"/>
+          <w:kern w:val="0"/>
+          <w:sz w:val="24"/>
+          <w:lang/>
+        </w:rPr>
+        <w:fldChar w:fldCharType="end"/>
+      </w:r>
+      <w:r>
+        <w:rPr>
+          <w:rFonts w:ascii="宋体" w:hAnsi="宋体" w:cs="宋体" w:hint="eastAsia"/>
+          <w:kern w:val="0"/>
+          <w:sz w:val="24"/>
+          <w:lang/>
+        </w:rPr>
+        <w:t>。它综合了模型在不同置信度下的表现，能够更全面地衡量模型的检测性能</w:t>
       </w:r>
       <w:r>
         <w:rPr>
@@ -8381,7 +9682,7 @@
       <w:pPr>
         <w:spacing w:before="100" w:beforeAutospacing="1" w:after="100" w:afterAutospacing="1"/>
         <w:rPr>
-          <w:rFonts w:eastAsia="Times New Roman"/>
+          <w:rFonts w:eastAsiaTheme="minorEastAsia" w:hint="eastAsia"/>
           <w:kern w:val="0"/>
           <w:sz w:val="24"/>
           <w:lang/>
@@ -8477,26 +9778,6 @@
         </w:rPr>
         <w:t>。</w:t>
       </w:r>
-    </w:p>
-    <w:p>
-      <w:pPr>
-        <w:pStyle w:val="ac"/>
-        <w:rPr>
-          <w:rFonts w:eastAsia="Times New Roman" w:hint="eastAsia"/>
-          <w:lang/>
-        </w:rPr>
-      </w:pPr>
-    </w:p>
-    <w:p>
-      <w:pPr>
-        <w:ind w:firstLine="420"/>
-        <w:jc w:val="both"/>
-        <w:rPr>
-          <w:color w:val="000000" w:themeColor="text1"/>
-          <w:sz w:val="24"/>
-          <w:lang/>
-        </w:rPr>
-      </w:pPr>
     </w:p>
     <w:p>
       <w:pPr>
@@ -8561,6 +9842,54 @@
         <w:t>系列算法在实时性与精度上取得了良好平衡</w:t>
       </w:r>
       <w:r>
+        <w:fldChar w:fldCharType="begin"/>
+      </w:r>
+      <w:r>
+        <w:rPr>
+          <w:lang/>
+        </w:rPr>
+        <w:instrText xml:space="preserve"> ADDIN EN.CITE &lt;EndNote&gt;&lt;Cite&gt;&lt;Author&gt;Zhu&lt;/Author&gt;&lt;Year&gt;2014&lt;/Year&gt;&lt;RecNum&gt;27&lt;/RecNum&gt;&lt;DisplayText&gt;&lt;style face="superscript"&gt;[2]&lt;/style&gt;&lt;/DisplayText&gt;&lt;record&gt;&lt;rec-number&gt;27&lt;/rec-number&gt;&lt;foreign-keys&gt;&lt;key app="EN" db-id="r22exsavnwf02oef5eu5prfwststtzaxt0f2" timestamp="1693637848" guid="4f20af2a-d45d-4bf8-b74f-1fd22496fe4e"&gt;27&lt;/key&gt;&lt;/foreign-keys&gt;&lt;ref-type name="Journal Article"&gt;17&lt;/ref-type&gt;&lt;contributors&gt;&lt;authors&gt;&lt;author&gt;Zhu, Jun-Yan&lt;/author&gt;&lt;author&gt;Wu, Jiajun&lt;/author&gt;&lt;author&gt;Xu, Yan&lt;/author&gt;&lt;author&gt;Chang, Eric&lt;/author&gt;&lt;author&gt;Tu, Zhuowen&lt;/author&gt;&lt;/authors&gt;&lt;/contributors&gt;&lt;titles&gt;&lt;title&gt;Unsupervised object class discovery via saliency-guided multiple class learning&lt;/title&gt;&lt;secondary-title&gt;IEEE transactions on pattern analysis and machine intelligence&lt;/secondary-title&gt;&lt;/titles&gt;&lt;periodical&gt;&lt;full-title&gt;Ieee Transactions on Pattern Analysis and Machine Intelligence&lt;/full-title&gt;&lt;/periodical&gt;&lt;pages&gt;862-875&lt;/pages&gt;&lt;volume&gt;37&lt;/volume&gt;&lt;number&gt;4&lt;/number&gt;&lt;dates&gt;&lt;year&gt;2014&lt;/year&gt;&lt;/dates&gt;&lt;isbn&gt;0162-8828&lt;/isbn&gt;&lt;urls&gt;&lt;/urls&gt;&lt;/record&gt;&lt;/Cite&gt;&lt;/EndNote&gt;</w:instrText>
+      </w:r>
+      <w:r>
+        <w:fldChar w:fldCharType="separate"/>
+      </w:r>
+      <w:r>
+        <w:rPr>
+          <w:vertAlign w:val="superscript"/>
+          <w:lang/>
+        </w:rPr>
+        <w:t>[</w:t>
+      </w:r>
+      <w:r>
+        <w:rPr>
+          <w:rFonts w:hint="eastAsia"/>
+          <w:vertAlign w:val="superscript"/>
+          <w:lang/>
+        </w:rPr>
+        <w:t>31-33</w:t>
+      </w:r>
+      <w:r>
+        <w:rPr>
+          <w:rFonts w:hint="eastAsia"/>
+          <w:vertAlign w:val="superscript"/>
+          <w:lang/>
+        </w:rPr>
+        <w:t>,35-36</w:t>
+      </w:r>
+      <w:r>
+        <w:rPr>
+          <w:vertAlign w:val="superscript"/>
+          <w:lang/>
+        </w:rPr>
+        <w:t>]</w:t>
+      </w:r>
+      <w:r>
+        <w:rPr>
+          <w:lang/>
+        </w:rPr>
+        <w:fldChar w:fldCharType="end"/>
+      </w:r>
+      <w:r>
         <w:rPr>
           <w:rFonts w:ascii="Times New Roman" w:hAnsi="Times New Roman"/>
           <w:kern w:val="44"/>
@@ -8577,6 +9906,46 @@
         <w:t>本文从传统方法到深度学习方法，系统地总结并分析了近年来的相关研究现状。但近些年，目标检测模型的参数量剧增，性能提升却可能微乎其微，并且占用硬件资源开销大，推理与训练时间长，并不能很好地将其直接应用于资源受限的边缘设备</w:t>
       </w:r>
       <w:r>
+        <w:fldChar w:fldCharType="begin"/>
+      </w:r>
+      <w:r>
+        <w:rPr>
+          <w:lang/>
+        </w:rPr>
+        <w:instrText xml:space="preserve"> ADDIN EN.CITE &lt;EndNote&gt;&lt;Cite&gt;&lt;Author&gt;Zhu&lt;/Author&gt;&lt;Year&gt;2014&lt;/Year&gt;&lt;RecNum&gt;27&lt;/RecNum&gt;&lt;DisplayText&gt;&lt;style face="superscript"&gt;[2]&lt;/style&gt;&lt;/DisplayText&gt;&lt;record&gt;&lt;rec-number&gt;27&lt;/rec-number&gt;&lt;foreign-keys&gt;&lt;key app="EN" db-id="r22exsavnwf02oef5eu5prfwststtzaxt0f2" timestamp="1693637848" guid="4f20af2a-d45d-4bf8-b74f-1fd22496fe4e"&gt;27&lt;/key&gt;&lt;/foreign-keys&gt;&lt;ref-type name="Journal Article"&gt;17&lt;/ref-type&gt;&lt;contributors&gt;&lt;authors&gt;&lt;author&gt;Zhu, Jun-Yan&lt;/author&gt;&lt;author&gt;Wu, Jiajun&lt;/author&gt;&lt;author&gt;Xu, Yan&lt;/author&gt;&lt;author&gt;Chang, Eric&lt;/author&gt;&lt;author&gt;Tu, Zhuowen&lt;/author&gt;&lt;/authors&gt;&lt;/contributors&gt;&lt;titles&gt;&lt;title&gt;Unsupervised object class discovery via saliency-guided multiple class learning&lt;/title&gt;&lt;secondary-title&gt;IEEE transactions on pattern analysis and machine intelligence&lt;/secondary-title&gt;&lt;/titles&gt;&lt;periodical&gt;&lt;full-title&gt;Ieee Transactions on Pattern Analysis and Machine Intelligence&lt;/full-title&gt;&lt;/periodical&gt;&lt;pages&gt;862-875&lt;/pages&gt;&lt;volume&gt;37&lt;/volume&gt;&lt;number&gt;4&lt;/number&gt;&lt;dates&gt;&lt;year&gt;2014&lt;/year&gt;&lt;/dates&gt;&lt;isbn&gt;0162-8828&lt;/isbn&gt;&lt;urls&gt;&lt;/urls&gt;&lt;/record&gt;&lt;/Cite&gt;&lt;/EndNote&gt;</w:instrText>
+      </w:r>
+      <w:r>
+        <w:fldChar w:fldCharType="separate"/>
+      </w:r>
+      <w:r>
+        <w:rPr>
+          <w:vertAlign w:val="superscript"/>
+          <w:lang/>
+        </w:rPr>
+        <w:t>[</w:t>
+      </w:r>
+      <w:r>
+        <w:rPr>
+          <w:rFonts w:hint="eastAsia"/>
+          <w:vertAlign w:val="superscript"/>
+          <w:lang/>
+        </w:rPr>
+        <w:t>34</w:t>
+      </w:r>
+      <w:r>
+        <w:rPr>
+          <w:vertAlign w:val="superscript"/>
+          <w:lang/>
+        </w:rPr>
+        <w:t>]</w:t>
+      </w:r>
+      <w:r>
+        <w:rPr>
+          <w:lang/>
+        </w:rPr>
+        <w:fldChar w:fldCharType="end"/>
+      </w:r>
+      <w:r>
         <w:rPr>
           <w:rFonts w:ascii="Times New Roman" w:hAnsi="Times New Roman"/>
           <w:kern w:val="44"/>
@@ -8621,7 +9990,54 @@
           <w:rFonts w:hint="eastAsia"/>
           <w:lang/>
         </w:rPr>
-        <w:t>通过对基于深度学习的道路病害检测的当前研究现状分析可知，当前基于卷积神经网络模型来解决该问题的方案已日趋成熟。本文从传统图像处理方法到深度学习方法，系统地总结并分析了近年来的相关研究现状。传统方法因其对复杂环境的鲁棒性差，已基本被深度学习方法所取代。在深度学习范式下，以</w:t>
+        <w:t>通过对基于深度学习的道路病害检测的当前研究现状分析可知，当前基于卷积神经网络模型来解决该问题的方案已日趋成熟</w:t>
+      </w:r>
+      <w:r>
+        <w:fldChar w:fldCharType="begin"/>
+      </w:r>
+      <w:r>
+        <w:rPr>
+          <w:lang/>
+        </w:rPr>
+        <w:instrText xml:space="preserve"> ADDIN EN.CITE &lt;EndNote&gt;&lt;Cite&gt;&lt;Author&gt;Zhu&lt;/Author&gt;&lt;Year&gt;2014&lt;/Year&gt;&lt;RecNum&gt;27&lt;/RecNum&gt;&lt;DisplayText&gt;&lt;style face="superscript"&gt;[2]&lt;/style&gt;&lt;/DisplayText&gt;&lt;record&gt;&lt;rec-number&gt;27&lt;/rec-number&gt;&lt;foreign-keys&gt;&lt;key app="EN" db-id="r22exsavnwf02oef5eu5prfwststtzaxt0f2" timestamp="1693637848" guid="4f20af2a-d45d-4bf8-b74f-1fd22496fe4e"&gt;27&lt;/key&gt;&lt;/foreign-keys&gt;&lt;ref-type name="Journal Article"&gt;17&lt;/ref-type&gt;&lt;contributors&gt;&lt;authors&gt;&lt;author&gt;Zhu, Jun-Yan&lt;/author&gt;&lt;author&gt;Wu, Jiajun&lt;/author&gt;&lt;author&gt;Xu, Yan&lt;/author&gt;&lt;author&gt;Chang, Eric&lt;/author&gt;&lt;author&gt;Tu, Zhuowen&lt;/author&gt;&lt;/authors&gt;&lt;/contributors&gt;&lt;titles&gt;&lt;title&gt;Unsupervised object class discovery via saliency-guided multiple class learning&lt;/title&gt;&lt;secondary-title&gt;IEEE transactions on pattern analysis and machine intelligence&lt;/secondary-title&gt;&lt;/titles&gt;&lt;periodical&gt;&lt;full-title&gt;Ieee Transactions on Pattern Analysis and Machine Intelligence&lt;/full-title&gt;&lt;/periodical&gt;&lt;pages&gt;862-875&lt;/pages&gt;&lt;volume&gt;37&lt;/volume&gt;&lt;number&gt;4&lt;/number&gt;&lt;dates&gt;&lt;year&gt;2014&lt;/year&gt;&lt;/dates&gt;&lt;isbn&gt;0162-8828&lt;/isbn&gt;&lt;urls&gt;&lt;/urls&gt;&lt;/record&gt;&lt;/Cite&gt;&lt;/EndNote&gt;</w:instrText>
+      </w:r>
+      <w:r>
+        <w:fldChar w:fldCharType="separate"/>
+      </w:r>
+      <w:r>
+        <w:rPr>
+          <w:vertAlign w:val="superscript"/>
+          <w:lang/>
+        </w:rPr>
+        <w:t>[</w:t>
+      </w:r>
+      <w:r>
+        <w:rPr>
+          <w:rFonts w:hint="eastAsia"/>
+          <w:vertAlign w:val="superscript"/>
+          <w:lang/>
+        </w:rPr>
+        <w:t>37</w:t>
+      </w:r>
+      <w:r>
+        <w:rPr>
+          <w:vertAlign w:val="superscript"/>
+          <w:lang/>
+        </w:rPr>
+        <w:t>]</w:t>
+      </w:r>
+      <w:r>
+        <w:rPr>
+          <w:lang/>
+        </w:rPr>
+        <w:fldChar w:fldCharType="end"/>
+      </w:r>
+      <w:r>
+        <w:rPr>
+          <w:rFonts w:hint="eastAsia"/>
+          <w:lang/>
+        </w:rPr>
+        <w:t>。本文从传统图像处理方法到深度学习方法，系统地总结并分析了近年来的相关研究现状。传统方法因其对复杂环境的鲁棒性差，已基本被深度学习方法所取代。在深度学习范式下，以</w:t>
       </w:r>
       <w:r>
         <w:rPr>
@@ -8666,6 +10082,70 @@
       </w:r>
       <w:r>
         <w:rPr>
+          <w:rFonts w:ascii="宋体" w:hAnsi="宋体" w:cs="宋体"/>
+          <w:kern w:val="0"/>
+          <w:sz w:val="24"/>
+        </w:rPr>
+        <w:fldChar w:fldCharType="begin"/>
+      </w:r>
+      <w:r>
+        <w:rPr>
+          <w:rFonts w:ascii="宋体" w:hAnsi="宋体" w:cs="宋体"/>
+          <w:kern w:val="0"/>
+          <w:sz w:val="24"/>
+          <w:lang/>
+        </w:rPr>
+        <w:instrText xml:space="preserve"> ADDIN EN.CITE &lt;EndNote&gt;&lt;Cite&gt;&lt;Author&gt;Zhu&lt;/Author&gt;&lt;Year&gt;2014&lt;/Year&gt;&lt;RecNum&gt;27&lt;/RecNum&gt;&lt;DisplayText&gt;&lt;style face="superscript"&gt;[2]&lt;/style&gt;&lt;/DisplayText&gt;&lt;record&gt;&lt;rec-number&gt;27&lt;/rec-number&gt;&lt;foreign-keys&gt;&lt;key app="EN" db-id="r22exsavnwf02oef5eu5prfwststtzaxt0f2" timestamp="1693637848" guid="4f20af2a-d45d-4bf8-b74f-1fd22496fe4e"&gt;27&lt;/key&gt;&lt;/foreign-keys&gt;&lt;ref-type name="Journal Article"&gt;17&lt;/ref-type&gt;&lt;contributors&gt;&lt;authors&gt;&lt;author&gt;Zhu, Jun-Yan&lt;/author&gt;&lt;author&gt;Wu, Jiajun&lt;/author&gt;&lt;author&gt;Xu, Yan&lt;/author&gt;&lt;author&gt;Chang, Eric&lt;/author&gt;&lt;author&gt;Tu, Zhuowen&lt;/author&gt;&lt;/authors&gt;&lt;/contributors&gt;&lt;titles&gt;&lt;title&gt;Unsupervised object class discovery via saliency-guided multiple class learning&lt;/title&gt;&lt;secondary-title&gt;IEEE transactions on pattern analysis and machine intelligence&lt;/secondary-title&gt;&lt;/titles&gt;&lt;periodical&gt;&lt;full-title&gt;Ieee Transactions on Pattern Analysis and Machine Intelligence&lt;/full-title&gt;&lt;/periodical&gt;&lt;pages&gt;862-875&lt;/pages&gt;&lt;volume&gt;37&lt;/volume&gt;&lt;number&gt;4&lt;/number&gt;&lt;dates&gt;&lt;year&gt;2014&lt;/year&gt;&lt;/dates&gt;&lt;isbn&gt;0162-8828&lt;/isbn&gt;&lt;urls&gt;&lt;/urls&gt;&lt;/record&gt;&lt;/Cite&gt;&lt;/EndNote&gt;</w:instrText>
+      </w:r>
+      <w:r>
+        <w:rPr>
+          <w:rFonts w:ascii="宋体" w:hAnsi="宋体" w:cs="宋体"/>
+          <w:kern w:val="0"/>
+          <w:sz w:val="24"/>
+        </w:rPr>
+        <w:fldChar w:fldCharType="separate"/>
+      </w:r>
+      <w:r>
+        <w:rPr>
+          <w:rFonts w:ascii="宋体" w:hAnsi="宋体" w:cs="宋体"/>
+          <w:kern w:val="0"/>
+          <w:sz w:val="24"/>
+          <w:vertAlign w:val="superscript"/>
+          <w:lang/>
+        </w:rPr>
+        <w:t>[</w:t>
+      </w:r>
+      <w:r>
+        <w:rPr>
+          <w:rFonts w:ascii="宋体" w:hAnsi="宋体" w:cs="宋体" w:hint="eastAsia"/>
+          <w:kern w:val="0"/>
+          <w:sz w:val="24"/>
+          <w:vertAlign w:val="superscript"/>
+          <w:lang/>
+        </w:rPr>
+        <w:t>38</w:t>
+      </w:r>
+      <w:r>
+        <w:rPr>
+          <w:rFonts w:ascii="宋体" w:hAnsi="宋体" w:cs="宋体"/>
+          <w:kern w:val="0"/>
+          <w:sz w:val="24"/>
+          <w:vertAlign w:val="superscript"/>
+          <w:lang/>
+        </w:rPr>
+        <w:t>]</w:t>
+      </w:r>
+      <w:r>
+        <w:rPr>
+          <w:rFonts w:ascii="宋体" w:hAnsi="宋体" w:cs="宋体"/>
+          <w:kern w:val="0"/>
+          <w:sz w:val="24"/>
+          <w:lang/>
+        </w:rPr>
+        <w:fldChar w:fldCharType="end"/>
+      </w:r>
+      <w:r>
+        <w:rPr>
           <w:rFonts w:ascii="宋体" w:hAnsi="宋体" w:cs="宋体" w:hint="eastAsia"/>
           <w:kern w:val="0"/>
           <w:sz w:val="24"/>
@@ -8680,7 +10160,144 @@
           <w:sz w:val="24"/>
           <w:lang/>
         </w:rPr>
-        <w:t>这种增长虽然可能带来性能上的边际提升，但同时也导致了巨大的硬件资源开销以及漫长的训练与推理时间，使得这些先进模型难以直接部署于资源受限的边缘计算设备（如车载系统、无人机等）。这揭示了当前研究的一个核心挑战：如何在追求高检测精度的同时，有效控制模型的复杂度，以满足真实世界应用的部署需求</w:t>
+        <w:t>这种增长虽然可能带来性能上的边际提升，但同时也导致了巨大的硬件资源开销以及漫长的训练与推理时间，使得这些先进模型难以直接部署于资源受限的边缘计算设备（如车载系统、无人机等）</w:t>
+      </w:r>
+      <w:r>
+        <w:rPr>
+          <w:rFonts w:ascii="宋体" w:hAnsi="宋体" w:cs="宋体"/>
+          <w:kern w:val="0"/>
+          <w:sz w:val="24"/>
+        </w:rPr>
+        <w:fldChar w:fldCharType="begin"/>
+      </w:r>
+      <w:r>
+        <w:rPr>
+          <w:rFonts w:ascii="宋体" w:hAnsi="宋体" w:cs="宋体"/>
+          <w:kern w:val="0"/>
+          <w:sz w:val="24"/>
+          <w:lang/>
+        </w:rPr>
+        <w:instrText xml:space="preserve"> ADDIN EN.CITE &lt;EndNote&gt;&lt;Cite&gt;&lt;Author&gt;Zhu&lt;/Author&gt;&lt;Year&gt;2014&lt;/Year&gt;&lt;RecNum&gt;27&lt;/RecNum&gt;&lt;DisplayText&gt;&lt;style face="superscript"&gt;[2]&lt;/style&gt;&lt;/DisplayText&gt;&lt;record&gt;&lt;rec-number&gt;27&lt;/rec-number&gt;&lt;foreign-keys&gt;&lt;key app="EN" db-id="r22exsavnwf02oef5eu5prfwststtzaxt0f2" timestamp="1693637848" guid="4f20af2a-d45d-4bf8-b74f-1fd22496fe4e"&gt;27&lt;/key&gt;&lt;/foreign-keys&gt;&lt;ref-type name="Journal Article"&gt;17&lt;/ref-type&gt;&lt;contributors&gt;&lt;authors&gt;&lt;author&gt;Zhu, Jun-Yan&lt;/author&gt;&lt;author&gt;Wu, Jiajun&lt;/author&gt;&lt;author&gt;Xu, Yan&lt;/author&gt;&lt;author&gt;Chang, Eric&lt;/author&gt;&lt;author&gt;Tu, Zhuowen&lt;/author&gt;&lt;/authors&gt;&lt;/contributors&gt;&lt;titles&gt;&lt;title&gt;Unsupervised object class discovery via saliency-guided multiple class learning&lt;/title&gt;&lt;secondary-title&gt;IEEE transactions on pattern analysis and machine intelligence&lt;/secondary-title&gt;&lt;/titles&gt;&lt;periodical&gt;&lt;full-title&gt;Ieee Transactions on Pattern Analysis and Machine Intelligence&lt;/full-title&gt;&lt;/periodical&gt;&lt;pages&gt;862-875&lt;/pages&gt;&lt;volume&gt;37&lt;/volume&gt;&lt;number&gt;4&lt;/number&gt;&lt;dates&gt;&lt;year&gt;2014&lt;/year&gt;&lt;/dates&gt;&lt;isbn&gt;0162-8828&lt;/isbn&gt;&lt;urls&gt;&lt;/urls&gt;&lt;/record&gt;&lt;/Cite&gt;&lt;/EndNote&gt;</w:instrText>
+      </w:r>
+      <w:r>
+        <w:rPr>
+          <w:rFonts w:ascii="宋体" w:hAnsi="宋体" w:cs="宋体"/>
+          <w:kern w:val="0"/>
+          <w:sz w:val="24"/>
+        </w:rPr>
+        <w:fldChar w:fldCharType="separate"/>
+      </w:r>
+      <w:r>
+        <w:rPr>
+          <w:rFonts w:ascii="宋体" w:hAnsi="宋体" w:cs="宋体"/>
+          <w:kern w:val="0"/>
+          <w:sz w:val="24"/>
+          <w:vertAlign w:val="superscript"/>
+          <w:lang/>
+        </w:rPr>
+        <w:t>[</w:t>
+      </w:r>
+      <w:r>
+        <w:rPr>
+          <w:rFonts w:ascii="宋体" w:hAnsi="宋体" w:cs="宋体" w:hint="eastAsia"/>
+          <w:kern w:val="0"/>
+          <w:sz w:val="24"/>
+          <w:vertAlign w:val="superscript"/>
+          <w:lang/>
+        </w:rPr>
+        <w:t>39</w:t>
+      </w:r>
+      <w:r>
+        <w:rPr>
+          <w:rFonts w:ascii="宋体" w:hAnsi="宋体" w:cs="宋体"/>
+          <w:kern w:val="0"/>
+          <w:sz w:val="24"/>
+          <w:vertAlign w:val="superscript"/>
+          <w:lang/>
+        </w:rPr>
+        <w:t>]</w:t>
+      </w:r>
+      <w:r>
+        <w:rPr>
+          <w:rFonts w:ascii="宋体" w:hAnsi="宋体" w:cs="宋体"/>
+          <w:kern w:val="0"/>
+          <w:sz w:val="24"/>
+          <w:lang/>
+        </w:rPr>
+        <w:fldChar w:fldCharType="end"/>
+      </w:r>
+      <w:r>
+        <w:rPr>
+          <w:rFonts w:ascii="宋体" w:hAnsi="宋体" w:cs="宋体" w:hint="eastAsia"/>
+          <w:kern w:val="0"/>
+          <w:sz w:val="24"/>
+          <w:lang/>
+        </w:rPr>
+        <w:t>。这揭示了当前研究的一个核心挑战：如何在追求高检测精度的同时，有效控制模型的复杂度，以满足真实世界应用的部署需求</w:t>
+      </w:r>
+      <w:r>
+        <w:rPr>
+          <w:rFonts w:ascii="宋体" w:hAnsi="宋体" w:cs="宋体"/>
+          <w:kern w:val="0"/>
+          <w:sz w:val="24"/>
+        </w:rPr>
+        <w:fldChar w:fldCharType="begin"/>
+      </w:r>
+      <w:r>
+        <w:rPr>
+          <w:rFonts w:ascii="宋体" w:hAnsi="宋体" w:cs="宋体"/>
+          <w:kern w:val="0"/>
+          <w:sz w:val="24"/>
+          <w:lang/>
+        </w:rPr>
+        <w:instrText xml:space="preserve"> ADDIN EN.CITE &lt;EndNote&gt;&lt;Cite&gt;&lt;Author&gt;Zhu&lt;/Author&gt;&lt;Year&gt;2014&lt;/Year&gt;&lt;RecNum&gt;27&lt;/RecNum&gt;&lt;DisplayText&gt;&lt;style face="superscript"&gt;[2]&lt;/style&gt;&lt;/DisplayText&gt;&lt;record&gt;&lt;rec-number&gt;27&lt;/rec-number&gt;&lt;foreign-keys&gt;&lt;key app="EN" db-id="r22exsavnwf02oef5eu5prfwststtzaxt0f2" timestamp="1693637848" guid="4f20af2a-d45d-4bf8-b74f-1fd22496fe4e"&gt;27&lt;/key&gt;&lt;/foreign-keys&gt;&lt;ref-type name="Journal Article"&gt;17&lt;/ref-type&gt;&lt;contributors&gt;&lt;authors&gt;&lt;author&gt;Zhu, Jun-Yan&lt;/author&gt;&lt;author&gt;Wu, Jiajun&lt;/author&gt;&lt;author&gt;Xu, Yan&lt;/author&gt;&lt;author&gt;Chang, Eric&lt;/author&gt;&lt;author&gt;Tu, Zhuowen&lt;/author&gt;&lt;/authors&gt;&lt;/contributors&gt;&lt;titles&gt;&lt;title&gt;Unsupervised object class discovery via saliency-guided multiple class learning&lt;/title&gt;&lt;secondary-title&gt;IEEE transactions on pattern analysis and machine intelligence&lt;/secondary-title&gt;&lt;/titles&gt;&lt;periodical&gt;&lt;full-title&gt;Ieee Transactions on Pattern Analysis and Machine Intelligence&lt;/full-title&gt;&lt;/periodical&gt;&lt;pages&gt;862-875&lt;/pages&gt;&lt;volume&gt;37&lt;/volume&gt;&lt;number&gt;4&lt;/number&gt;&lt;dates&gt;&lt;year&gt;2014&lt;/year&gt;&lt;/dates&gt;&lt;isbn&gt;0162-8828&lt;/isbn&gt;&lt;urls&gt;&lt;/urls&gt;&lt;/record&gt;&lt;/Cite&gt;&lt;/EndNote&gt;</w:instrText>
+      </w:r>
+      <w:r>
+        <w:rPr>
+          <w:rFonts w:ascii="宋体" w:hAnsi="宋体" w:cs="宋体"/>
+          <w:kern w:val="0"/>
+          <w:sz w:val="24"/>
+        </w:rPr>
+        <w:fldChar w:fldCharType="separate"/>
+      </w:r>
+      <w:r>
+        <w:rPr>
+          <w:rFonts w:ascii="宋体" w:hAnsi="宋体" w:cs="宋体"/>
+          <w:kern w:val="0"/>
+          <w:sz w:val="24"/>
+          <w:vertAlign w:val="superscript"/>
+          <w:lang/>
+        </w:rPr>
+        <w:t>[</w:t>
+      </w:r>
+      <w:r>
+        <w:rPr>
+          <w:rFonts w:ascii="宋体" w:hAnsi="宋体" w:cs="宋体" w:hint="eastAsia"/>
+          <w:kern w:val="0"/>
+          <w:sz w:val="24"/>
+          <w:vertAlign w:val="superscript"/>
+          <w:lang/>
+        </w:rPr>
+        <w:t>40</w:t>
+      </w:r>
+      <w:r>
+        <w:rPr>
+          <w:rFonts w:ascii="宋体" w:hAnsi="宋体" w:cs="宋体"/>
+          <w:kern w:val="0"/>
+          <w:sz w:val="24"/>
+          <w:vertAlign w:val="superscript"/>
+          <w:lang/>
+        </w:rPr>
+        <w:t>]</w:t>
+      </w:r>
+      <w:r>
+        <w:rPr>
+          <w:rFonts w:ascii="宋体" w:hAnsi="宋体" w:cs="宋体"/>
+          <w:kern w:val="0"/>
+          <w:sz w:val="24"/>
+          <w:lang/>
+        </w:rPr>
+        <w:fldChar w:fldCharType="end"/>
       </w:r>
       <w:r>
         <w:rPr>
@@ -8709,7 +10326,98 @@
           <w:sz w:val="24"/>
           <w:lang/>
         </w:rPr>
-        <w:t>为了应对这一挑战，学术界和工业界已经形成了两大明确的研究方向：模型轻量化和注意力机制。前者通过设计更高效的神经网络结构（如</w:t>
+        <w:t>为了应对这一挑战，</w:t>
+      </w:r>
+      <w:r>
+        <w:rPr>
+          <w:rFonts w:ascii="宋体" w:hAnsi="宋体" w:cs="宋体" w:hint="eastAsia"/>
+          <w:kern w:val="0"/>
+          <w:sz w:val="24"/>
+          <w:lang/>
+        </w:rPr>
+        <w:t>有</w:t>
+      </w:r>
+      <w:r>
+        <w:rPr>
+          <w:rFonts w:ascii="宋体" w:hAnsi="宋体" w:cs="宋体" w:hint="eastAsia"/>
+          <w:kern w:val="0"/>
+          <w:sz w:val="24"/>
+          <w:lang/>
+        </w:rPr>
+        <w:t>两大明确的研究方向：模型轻量化和注意力机制</w:t>
+      </w:r>
+      <w:r>
+        <w:rPr>
+          <w:rFonts w:ascii="宋体" w:hAnsi="宋体" w:cs="宋体"/>
+          <w:kern w:val="0"/>
+          <w:sz w:val="24"/>
+        </w:rPr>
+        <w:fldChar w:fldCharType="begin"/>
+      </w:r>
+      <w:r>
+        <w:rPr>
+          <w:rFonts w:ascii="宋体" w:hAnsi="宋体" w:cs="宋体"/>
+          <w:kern w:val="0"/>
+          <w:sz w:val="24"/>
+          <w:lang/>
+        </w:rPr>
+        <w:instrText xml:space="preserve"> ADDIN EN.CITE &lt;EndNote&gt;&lt;Cite&gt;&lt;Author&gt;Zhu&lt;/Author&gt;&lt;Year&gt;2014&lt;/Year&gt;&lt;RecNum&gt;27&lt;/RecNum&gt;&lt;DisplayText&gt;&lt;style face="superscript"&gt;[2]&lt;/style&gt;&lt;/DisplayText&gt;&lt;record&gt;&lt;rec-number&gt;27&lt;/rec-number&gt;&lt;foreign-keys&gt;&lt;key app="EN" db-id="r22exsavnwf02oef5eu5prfwststtzaxt0f2" timestamp="1693637848" guid="4f20af2a-d45d-4bf8-b74f-1fd22496fe4e"&gt;27&lt;/key&gt;&lt;/foreign-keys&gt;&lt;ref-type name="Journal Article"&gt;17&lt;/ref-type&gt;&lt;contributors&gt;&lt;authors&gt;&lt;author&gt;Zhu, Jun-Yan&lt;/author&gt;&lt;author&gt;Wu, Jiajun&lt;/author&gt;&lt;author&gt;Xu, Yan&lt;/author&gt;&lt;author&gt;Chang, Eric&lt;/author&gt;&lt;author&gt;Tu, Zhuowen&lt;/author&gt;&lt;/authors&gt;&lt;/contributors&gt;&lt;titles&gt;&lt;title&gt;Unsupervised object class discovery via saliency-guided multiple class learning&lt;/title&gt;&lt;secondary-title&gt;IEEE transactions on pattern analysis and machine intelligence&lt;/secondary-title&gt;&lt;/titles&gt;&lt;periodical&gt;&lt;full-title&gt;Ieee Transactions on Pattern Analysis and Machine Intelligence&lt;/full-title&gt;&lt;/periodical&gt;&lt;pages&gt;862-875&lt;/pages&gt;&lt;volume&gt;37&lt;/volume&gt;&lt;number&gt;4&lt;/number&gt;&lt;dates&gt;&lt;year&gt;2014&lt;/year&gt;&lt;/dates&gt;&lt;isbn&gt;0162-8828&lt;/isbn&gt;&lt;urls&gt;&lt;/urls&gt;&lt;/record&gt;&lt;/Cite&gt;&lt;/EndNote&gt;</w:instrText>
+      </w:r>
+      <w:r>
+        <w:rPr>
+          <w:rFonts w:ascii="宋体" w:hAnsi="宋体" w:cs="宋体"/>
+          <w:kern w:val="0"/>
+          <w:sz w:val="24"/>
+        </w:rPr>
+        <w:fldChar w:fldCharType="separate"/>
+      </w:r>
+      <w:r>
+        <w:rPr>
+          <w:rFonts w:ascii="宋体" w:hAnsi="宋体" w:cs="宋体"/>
+          <w:kern w:val="0"/>
+          <w:sz w:val="24"/>
+          <w:vertAlign w:val="superscript"/>
+          <w:lang/>
+        </w:rPr>
+        <w:t>[</w:t>
+      </w:r>
+      <w:r>
+        <w:rPr>
+          <w:rFonts w:ascii="宋体" w:hAnsi="宋体" w:cs="宋体" w:hint="eastAsia"/>
+          <w:kern w:val="0"/>
+          <w:sz w:val="24"/>
+          <w:vertAlign w:val="superscript"/>
+          <w:lang/>
+        </w:rPr>
+        <w:t>41</w:t>
+      </w:r>
+      <w:r>
+        <w:rPr>
+          <w:rFonts w:ascii="宋体" w:hAnsi="宋体" w:cs="宋体"/>
+          <w:kern w:val="0"/>
+          <w:sz w:val="24"/>
+          <w:vertAlign w:val="superscript"/>
+          <w:lang/>
+        </w:rPr>
+        <w:t>]</w:t>
+      </w:r>
+      <w:r>
+        <w:rPr>
+          <w:rFonts w:ascii="宋体" w:hAnsi="宋体" w:cs="宋体"/>
+          <w:kern w:val="0"/>
+          <w:sz w:val="24"/>
+          <w:lang/>
+        </w:rPr>
+        <w:fldChar w:fldCharType="end"/>
+      </w:r>
+      <w:r>
+        <w:rPr>
+          <w:rFonts w:ascii="宋体" w:hAnsi="宋体" w:cs="宋体" w:hint="eastAsia"/>
+          <w:kern w:val="0"/>
+          <w:sz w:val="24"/>
+          <w:lang/>
+        </w:rPr>
+        <w:t>。前者通过设计更高效的神经网络结构（如</w:t>
       </w:r>
       <w:r>
         <w:rPr>
@@ -8824,6 +10532,70 @@
           <w:rFonts w:ascii="宋体" w:hAnsi="宋体" w:cs="宋体"/>
           <w:kern w:val="0"/>
           <w:sz w:val="24"/>
+        </w:rPr>
+        <w:fldChar w:fldCharType="begin"/>
+      </w:r>
+      <w:r>
+        <w:rPr>
+          <w:rFonts w:ascii="宋体" w:hAnsi="宋体" w:cs="宋体"/>
+          <w:kern w:val="0"/>
+          <w:sz w:val="24"/>
+          <w:lang/>
+        </w:rPr>
+        <w:instrText xml:space="preserve"> ADDIN EN.CITE &lt;EndNote&gt;&lt;Cite&gt;&lt;Author&gt;Zhu&lt;/Author&gt;&lt;Year&gt;2014&lt;/Year&gt;&lt;RecNum&gt;27&lt;/RecNum&gt;&lt;DisplayText&gt;&lt;style face="superscript"&gt;[2]&lt;/style&gt;&lt;/DisplayText&gt;&lt;record&gt;&lt;rec-number&gt;27&lt;/rec-number&gt;&lt;foreign-keys&gt;&lt;key app="EN" db-id="r22exsavnwf02oef5eu5prfwststtzaxt0f2" timestamp="1693637848" guid="4f20af2a-d45d-4bf8-b74f-1fd22496fe4e"&gt;27&lt;/key&gt;&lt;/foreign-keys&gt;&lt;ref-type name="Journal Article"&gt;17&lt;/ref-type&gt;&lt;contributors&gt;&lt;authors&gt;&lt;author&gt;Zhu, Jun-Yan&lt;/author&gt;&lt;author&gt;Wu, Jiajun&lt;/author&gt;&lt;author&gt;Xu, Yan&lt;/author&gt;&lt;author&gt;Chang, Eric&lt;/author&gt;&lt;author&gt;Tu, Zhuowen&lt;/author&gt;&lt;/authors&gt;&lt;/contributors&gt;&lt;titles&gt;&lt;title&gt;Unsupervised object class discovery via saliency-guided multiple class learning&lt;/title&gt;&lt;secondary-title&gt;IEEE transactions on pattern analysis and machine intelligence&lt;/secondary-title&gt;&lt;/titles&gt;&lt;periodical&gt;&lt;full-title&gt;Ieee Transactions on Pattern Analysis and Machine Intelligence&lt;/full-title&gt;&lt;/periodical&gt;&lt;pages&gt;862-875&lt;/pages&gt;&lt;volume&gt;37&lt;/volume&gt;&lt;number&gt;4&lt;/number&gt;&lt;dates&gt;&lt;year&gt;2014&lt;/year&gt;&lt;/dates&gt;&lt;isbn&gt;0162-8828&lt;/isbn&gt;&lt;urls&gt;&lt;/urls&gt;&lt;/record&gt;&lt;/Cite&gt;&lt;/EndNote&gt;</w:instrText>
+      </w:r>
+      <w:r>
+        <w:rPr>
+          <w:rFonts w:ascii="宋体" w:hAnsi="宋体" w:cs="宋体"/>
+          <w:kern w:val="0"/>
+          <w:sz w:val="24"/>
+        </w:rPr>
+        <w:fldChar w:fldCharType="separate"/>
+      </w:r>
+      <w:r>
+        <w:rPr>
+          <w:rFonts w:ascii="宋体" w:hAnsi="宋体" w:cs="宋体"/>
+          <w:kern w:val="0"/>
+          <w:sz w:val="24"/>
+          <w:vertAlign w:val="superscript"/>
+          <w:lang/>
+        </w:rPr>
+        <w:t>[</w:t>
+      </w:r>
+      <w:r>
+        <w:rPr>
+          <w:rFonts w:ascii="宋体" w:hAnsi="宋体" w:cs="宋体" w:hint="eastAsia"/>
+          <w:kern w:val="0"/>
+          <w:sz w:val="24"/>
+          <w:vertAlign w:val="superscript"/>
+          <w:lang/>
+        </w:rPr>
+        <w:t>42</w:t>
+      </w:r>
+      <w:r>
+        <w:rPr>
+          <w:rFonts w:ascii="宋体" w:hAnsi="宋体" w:cs="宋体"/>
+          <w:kern w:val="0"/>
+          <w:sz w:val="24"/>
+          <w:vertAlign w:val="superscript"/>
+          <w:lang/>
+        </w:rPr>
+        <w:t>]</w:t>
+      </w:r>
+      <w:r>
+        <w:rPr>
+          <w:rFonts w:ascii="宋体" w:hAnsi="宋体" w:cs="宋体"/>
+          <w:kern w:val="0"/>
+          <w:sz w:val="24"/>
+          <w:lang/>
+        </w:rPr>
+        <w:fldChar w:fldCharType="end"/>
+      </w:r>
+      <w:r>
+        <w:rPr>
+          <w:rFonts w:ascii="宋体" w:hAnsi="宋体" w:cs="宋体"/>
+          <w:kern w:val="0"/>
+          <w:sz w:val="24"/>
           <w:lang/>
         </w:rPr>
         <w:t>。</w:t>
@@ -8846,7 +10618,80 @@
           <w:sz w:val="24"/>
           <w:lang/>
         </w:rPr>
-        <w:t>当前的研究现状表明，未来的发展趋势并非简单地追求单一指标的极致，而是在一个多维度的优化空间中寻找最佳平衡点。一个理想的道路病害检测模型，应是在满足实际应用场景（如车载实时检测）对速度（</w:t>
+        <w:t>当前的研究现状表明，未来的发展趋势并非简单地追求单一指标的极致，而是在一个多维度的优化空间中寻找最佳平衡点</w:t>
+      </w:r>
+      <w:r>
+        <w:rPr>
+          <w:rFonts w:ascii="宋体" w:hAnsi="宋体" w:cs="宋体"/>
+          <w:kern w:val="0"/>
+          <w:sz w:val="24"/>
+        </w:rPr>
+        <w:fldChar w:fldCharType="begin"/>
+      </w:r>
+      <w:r>
+        <w:rPr>
+          <w:rFonts w:ascii="宋体" w:hAnsi="宋体" w:cs="宋体"/>
+          <w:kern w:val="0"/>
+          <w:sz w:val="24"/>
+          <w:lang/>
+        </w:rPr>
+        <w:instrText xml:space="preserve"> ADDIN EN.CITE &lt;EndNote&gt;&lt;Cite&gt;&lt;Author&gt;Zhu&lt;/Author&gt;&lt;Year&gt;2014&lt;/Year&gt;&lt;RecNum&gt;27&lt;/RecNum&gt;&lt;DisplayText&gt;&lt;style face="superscript"&gt;[2]&lt;/style&gt;&lt;/DisplayText&gt;&lt;record&gt;&lt;rec-number&gt;27&lt;/rec-number&gt;&lt;foreign-keys&gt;&lt;key app="EN" db-id="r22exsavnwf02oef5eu5prfwststtzaxt0f2" timestamp="1693637848" guid="4f20af2a-d45d-4bf8-b74f-1fd22496fe4e"&gt;27&lt;/key&gt;&lt;/foreign-keys&gt;&lt;ref-type name="Journal Article"&gt;17&lt;/ref-type&gt;&lt;contributors&gt;&lt;authors&gt;&lt;author&gt;Zhu, Jun-Yan&lt;/author&gt;&lt;author&gt;Wu, Jiajun&lt;/author&gt;&lt;author&gt;Xu, Yan&lt;/author&gt;&lt;author&gt;Chang, Eric&lt;/author&gt;&lt;author&gt;Tu, Zhuowen&lt;/author&gt;&lt;/authors&gt;&lt;/contributors&gt;&lt;titles&gt;&lt;title&gt;Unsupervised object class discovery via saliency-guided multiple class learning&lt;/title&gt;&lt;secondary-title&gt;IEEE transactions on pattern analysis and machine intelligence&lt;/secondary-title&gt;&lt;/titles&gt;&lt;periodical&gt;&lt;full-title&gt;Ieee Transactions on Pattern Analysis and Machine Intelligence&lt;/full-title&gt;&lt;/periodical&gt;&lt;pages&gt;862-875&lt;/pages&gt;&lt;volume&gt;37&lt;/volume&gt;&lt;number&gt;4&lt;/number&gt;&lt;dates&gt;&lt;year&gt;2014&lt;/year&gt;&lt;/dates&gt;&lt;isbn&gt;0162-8828&lt;/isbn&gt;&lt;urls&gt;&lt;/urls&gt;&lt;/record&gt;&lt;/Cite&gt;&lt;/EndNote&gt;</w:instrText>
+      </w:r>
+      <w:r>
+        <w:rPr>
+          <w:rFonts w:ascii="宋体" w:hAnsi="宋体" w:cs="宋体"/>
+          <w:kern w:val="0"/>
+          <w:sz w:val="24"/>
+        </w:rPr>
+        <w:fldChar w:fldCharType="separate"/>
+      </w:r>
+      <w:r>
+        <w:rPr>
+          <w:rFonts w:ascii="宋体" w:hAnsi="宋体" w:cs="宋体"/>
+          <w:kern w:val="0"/>
+          <w:sz w:val="24"/>
+          <w:vertAlign w:val="superscript"/>
+          <w:lang/>
+        </w:rPr>
+        <w:t>[</w:t>
+      </w:r>
+      <w:r>
+        <w:rPr>
+          <w:rFonts w:ascii="宋体" w:hAnsi="宋体" w:cs="宋体" w:hint="eastAsia"/>
+          <w:kern w:val="0"/>
+          <w:sz w:val="24"/>
+          <w:vertAlign w:val="superscript"/>
+          <w:lang/>
+        </w:rPr>
+        <w:t>44</w:t>
+      </w:r>
+      <w:r>
+        <w:rPr>
+          <w:rFonts w:ascii="宋体" w:hAnsi="宋体" w:cs="宋体"/>
+          <w:kern w:val="0"/>
+          <w:sz w:val="24"/>
+          <w:vertAlign w:val="superscript"/>
+          <w:lang/>
+        </w:rPr>
+        <w:t>]</w:t>
+      </w:r>
+      <w:r>
+        <w:rPr>
+          <w:rFonts w:ascii="宋体" w:hAnsi="宋体" w:cs="宋体"/>
+          <w:kern w:val="0"/>
+          <w:sz w:val="24"/>
+          <w:lang/>
+        </w:rPr>
+        <w:fldChar w:fldCharType="end"/>
+      </w:r>
+      <w:r>
+        <w:rPr>
+          <w:rFonts w:ascii="宋体" w:hAnsi="宋体" w:cs="宋体" w:hint="eastAsia"/>
+          <w:kern w:val="0"/>
+          <w:sz w:val="24"/>
+          <w:lang/>
+        </w:rPr>
+        <w:t>。一个理想的道路病害检测模型，应是在满足实际应用场景（如车载实时检测）对速度（</w:t>
       </w:r>
       <w:r>
         <w:rPr>
@@ -8882,7 +10727,80 @@
           <w:sz w:val="24"/>
           <w:lang/>
         </w:rPr>
-        <w:t>）。本研究拟提出的改进</w:t>
+        <w:t>）</w:t>
+      </w:r>
+      <w:r>
+        <w:rPr>
+          <w:rFonts w:ascii="宋体" w:hAnsi="宋体" w:cs="宋体"/>
+          <w:kern w:val="0"/>
+          <w:sz w:val="24"/>
+        </w:rPr>
+        <w:fldChar w:fldCharType="begin"/>
+      </w:r>
+      <w:r>
+        <w:rPr>
+          <w:rFonts w:ascii="宋体" w:hAnsi="宋体" w:cs="宋体"/>
+          <w:kern w:val="0"/>
+          <w:sz w:val="24"/>
+          <w:lang/>
+        </w:rPr>
+        <w:instrText xml:space="preserve"> ADDIN EN.CITE &lt;EndNote&gt;&lt;Cite&gt;&lt;Author&gt;Zhu&lt;/Author&gt;&lt;Year&gt;2014&lt;/Year&gt;&lt;RecNum&gt;27&lt;/RecNum&gt;&lt;DisplayText&gt;&lt;style face="superscript"&gt;[2]&lt;/style&gt;&lt;/DisplayText&gt;&lt;record&gt;&lt;rec-number&gt;27&lt;/rec-number&gt;&lt;foreign-keys&gt;&lt;key app="EN" db-id="r22exsavnwf02oef5eu5prfwststtzaxt0f2" timestamp="1693637848" guid="4f20af2a-d45d-4bf8-b74f-1fd22496fe4e"&gt;27&lt;/key&gt;&lt;/foreign-keys&gt;&lt;ref-type name="Journal Article"&gt;17&lt;/ref-type&gt;&lt;contributors&gt;&lt;authors&gt;&lt;author&gt;Zhu, Jun-Yan&lt;/author&gt;&lt;author&gt;Wu, Jiajun&lt;/author&gt;&lt;author&gt;Xu, Yan&lt;/author&gt;&lt;author&gt;Chang, Eric&lt;/author&gt;&lt;author&gt;Tu, Zhuowen&lt;/author&gt;&lt;/authors&gt;&lt;/contributors&gt;&lt;titles&gt;&lt;title&gt;Unsupervised object class discovery via saliency-guided multiple class learning&lt;/title&gt;&lt;secondary-title&gt;IEEE transactions on pattern analysis and machine intelligence&lt;/secondary-title&gt;&lt;/titles&gt;&lt;periodical&gt;&lt;full-title&gt;Ieee Transactions on Pattern Analysis and Machine Intelligence&lt;/full-title&gt;&lt;/periodical&gt;&lt;pages&gt;862-875&lt;/pages&gt;&lt;volume&gt;37&lt;/volume&gt;&lt;number&gt;4&lt;/number&gt;&lt;dates&gt;&lt;year&gt;2014&lt;/year&gt;&lt;/dates&gt;&lt;isbn&gt;0162-8828&lt;/isbn&gt;&lt;urls&gt;&lt;/urls&gt;&lt;/record&gt;&lt;/Cite&gt;&lt;/EndNote&gt;</w:instrText>
+      </w:r>
+      <w:r>
+        <w:rPr>
+          <w:rFonts w:ascii="宋体" w:hAnsi="宋体" w:cs="宋体"/>
+          <w:kern w:val="0"/>
+          <w:sz w:val="24"/>
+        </w:rPr>
+        <w:fldChar w:fldCharType="separate"/>
+      </w:r>
+      <w:r>
+        <w:rPr>
+          <w:rFonts w:ascii="宋体" w:hAnsi="宋体" w:cs="宋体"/>
+          <w:kern w:val="0"/>
+          <w:sz w:val="24"/>
+          <w:vertAlign w:val="superscript"/>
+          <w:lang/>
+        </w:rPr>
+        <w:t>[</w:t>
+      </w:r>
+      <w:r>
+        <w:rPr>
+          <w:rFonts w:ascii="宋体" w:hAnsi="宋体" w:cs="宋体" w:hint="eastAsia"/>
+          <w:kern w:val="0"/>
+          <w:sz w:val="24"/>
+          <w:vertAlign w:val="superscript"/>
+          <w:lang/>
+        </w:rPr>
+        <w:t>45</w:t>
+      </w:r>
+      <w:r>
+        <w:rPr>
+          <w:rFonts w:ascii="宋体" w:hAnsi="宋体" w:cs="宋体"/>
+          <w:kern w:val="0"/>
+          <w:sz w:val="24"/>
+          <w:vertAlign w:val="superscript"/>
+          <w:lang/>
+        </w:rPr>
+        <w:t>]</w:t>
+      </w:r>
+      <w:r>
+        <w:rPr>
+          <w:rFonts w:ascii="宋体" w:hAnsi="宋体" w:cs="宋体"/>
+          <w:kern w:val="0"/>
+          <w:sz w:val="24"/>
+          <w:lang/>
+        </w:rPr>
+        <w:fldChar w:fldCharType="end"/>
+      </w:r>
+      <w:r>
+        <w:rPr>
+          <w:rFonts w:ascii="宋体" w:hAnsi="宋体" w:cs="宋体" w:hint="eastAsia"/>
+          <w:kern w:val="0"/>
+          <w:sz w:val="24"/>
+          <w:lang/>
+        </w:rPr>
+        <w:t>。本研究拟提出的改进</w:t>
       </w:r>
       <w:r>
         <w:rPr>

</xml_diff>

<commit_message>
vault backup: 2025-09-27 00:54:58
</commit_message>
<xml_diff>
--- a/学校/文件/刘非凡-文献综述v2.docx
+++ b/学校/文件/刘非凡-文献综述v2.docx
@@ -1129,6 +1129,7 @@
         </w:rPr>
         <w:t xml:space="preserve"> </w:t>
       </w:r>
+      <w:proofErr w:type="gramStart"/>
       <w:r>
         <w:rPr>
           <w:rFonts w:ascii="宋体" w:hAnsi="宋体" w:hint="eastAsia"/>
@@ -1141,6 +1142,7 @@
         </w:rPr>
         <w:t>车生兵</w:t>
       </w:r>
+      <w:proofErr w:type="gramEnd"/>
       <w:r>
         <w:rPr>
           <w:rFonts w:ascii="宋体" w:hAnsi="宋体" w:hint="eastAsia"/>
@@ -1430,6 +1432,7 @@
         </w:rPr>
         <w:t xml:space="preserve">填写日期：   </w:t>
       </w:r>
+      <w:proofErr w:type="gramStart"/>
       <w:r>
         <w:rPr>
           <w:rFonts w:ascii="宋体" w:hAnsi="宋体"/>
@@ -1461,7 +1464,19 @@
           <w:sz w:val="32"/>
           <w:szCs w:val="32"/>
         </w:rPr>
-        <w:t xml:space="preserve">  年 </w:t>
+        <w:t xml:space="preserve">  年</w:t>
+      </w:r>
+      <w:proofErr w:type="gramEnd"/>
+      <w:r>
+        <w:rPr>
+          <w:rFonts w:ascii="宋体" w:hAnsi="宋体" w:hint="eastAsia"/>
+          <w:b/>
+          <w:color w:val="000000" w:themeColor="text1"/>
+          <w:kern w:val="0"/>
+          <w:sz w:val="32"/>
+          <w:szCs w:val="32"/>
+        </w:rPr>
+        <w:t xml:space="preserve"> </w:t>
       </w:r>
       <w:r>
         <w:rPr>
@@ -1496,6 +1511,7 @@
         </w:rPr>
         <w:t xml:space="preserve"> </w:t>
       </w:r>
+      <w:proofErr w:type="gramStart"/>
       <w:r>
         <w:rPr>
           <w:rFonts w:ascii="宋体" w:hAnsi="宋体" w:hint="eastAsia"/>
@@ -1529,6 +1545,7 @@
         </w:rPr>
         <w:t>20</w:t>
       </w:r>
+      <w:proofErr w:type="gramEnd"/>
       <w:r>
         <w:rPr>
           <w:rFonts w:ascii="宋体" w:hAnsi="宋体" w:hint="eastAsia"/>
@@ -1612,7 +1629,43 @@
           <w:color w:val="000000" w:themeColor="text1"/>
           <w:sz w:val="24"/>
         </w:rPr>
-        <w:t>道路病害检测对于保障交通安全与实现基础设施的智能化维护至关重要。本文首先论述了传统人工巡检方式的局限性，进而系统综述了自动化检测技术的发展脉络。内容涵盖了从基于边缘检测、阈值分割等传统图像处理方法，到以卷积神经网络（CNN）为核心的深度学习方法的范式革命。在深度学习技术路线中，本文重点对比分析了以Faster R-CNN为代表的两阶段检测算法和以YOLO系列为代表的单阶段检测算法，并阐明了后者在实时检测任务中的主流地位。针对当前最先进模型（如YOLOv12）在部署于车载等边缘计算设备时面临的计算资源瓶颈，本文进一步探讨了两大关键优化技术：一是以</w:t>
+        <w:t>道路病害检测对于保障交通安全与实现基础设施的智能化维护至关重要。本文首先论述了传统人工巡检方式的局限性，进而系统综述了自动化检测技术的发展脉络。内容涵盖了从基于边缘检测、阈值分割等传统图像处理方法，到以卷积神经网络（CNN）为核心的深度学习方法的范式革命。在深度学习技术路线中，本文重点对比分析了以Faster R-CNN为代表的两阶段检测算法和以YOLO系列为代表的</w:t>
+      </w:r>
+      <w:proofErr w:type="gramStart"/>
+      <w:r>
+        <w:rPr>
+          <w:rFonts w:ascii="宋体" w:hAnsi="宋体"/>
+          <w:color w:val="000000" w:themeColor="text1"/>
+          <w:sz w:val="24"/>
+        </w:rPr>
+        <w:t>单阶段</w:t>
+      </w:r>
+      <w:proofErr w:type="gramEnd"/>
+      <w:r>
+        <w:rPr>
+          <w:rFonts w:ascii="宋体" w:hAnsi="宋体"/>
+          <w:color w:val="000000" w:themeColor="text1"/>
+          <w:sz w:val="24"/>
+        </w:rPr>
+        <w:t>检测算法，并阐明了后者在实时检测任务中的主流地位。针对当前最先进模型（如YOLOv12）在部署于</w:t>
+      </w:r>
+      <w:proofErr w:type="gramStart"/>
+      <w:r>
+        <w:rPr>
+          <w:rFonts w:ascii="宋体" w:hAnsi="宋体"/>
+          <w:color w:val="000000" w:themeColor="text1"/>
+          <w:sz w:val="24"/>
+        </w:rPr>
+        <w:t>车载等</w:t>
+      </w:r>
+      <w:proofErr w:type="gramEnd"/>
+      <w:r>
+        <w:rPr>
+          <w:rFonts w:ascii="宋体" w:hAnsi="宋体"/>
+          <w:color w:val="000000" w:themeColor="text1"/>
+          <w:sz w:val="24"/>
+        </w:rPr>
+        <w:t>边缘计算设备时面临的计算资源瓶颈，本文进一步探讨了两大关键优化技术：一是以</w:t>
       </w:r>
       <w:proofErr w:type="spellStart"/>
       <w:r>
@@ -1985,13 +2038,29 @@
           <w:rFonts w:hint="eastAsia"/>
           <w:lang/>
         </w:rPr>
-        <w:t>着全球城市化进程的不断加速和机动车保有量的持续攀升，现代社会对交通运输系统的依赖达到了前所未有的高度。在这一背景下，道路作为最基础的交通基础设施，其健康状况直接关系到交通安全、通行效率乃至区域经济发展。然而，道路结构在其生命周期中，长期承受车辆荷载与自然环境的综合作用，不可避免地会产生裂缝、坑洞等多种形式的病害</w:t>
-      </w:r>
+        <w:t>着全球城市化进程的不断加速和机动车保有量的持续攀升，现代社会对交通运输系统的依赖达到了前所未有的高度。在这一背景下，道路作为</w:t>
+      </w:r>
+      <w:proofErr w:type="gramStart"/>
       <w:r>
         <w:rPr>
           <w:rFonts w:hint="eastAsia"/>
           <w:lang/>
         </w:rPr>
+        <w:t>最</w:t>
+      </w:r>
+      <w:proofErr w:type="gramEnd"/>
+      <w:r>
+        <w:rPr>
+          <w:rFonts w:hint="eastAsia"/>
+          <w:lang/>
+        </w:rPr>
+        <w:t>基础的交通基础设施，其健康状况直接关系到交通安全、通行效率乃至区域经济发展。然而，道路结构在其生命周期中，长期承受车辆荷载与自然环境的综合作用，不可避免地会产生裂缝、坑洞等多种形式的病害</w:t>
+      </w:r>
+      <w:r>
+        <w:rPr>
+          <w:rFonts w:hint="eastAsia"/>
+          <w:lang/>
+        </w:rPr>
         <w:t>。</w:t>
       </w:r>
       <w:r>
@@ -1999,7 +2068,23 @@
           <w:rFonts w:hint="eastAsia"/>
           <w:lang/>
         </w:rPr>
-        <w:t>这些病害若未能得到及时发现与修复，不仅严重影响行车体验，更对行车安全构成直接威胁。研究表明，恶劣的路面状况甚至会导致燃油消耗和碳排放的增加，对环境造成负面影响</w:t>
+        <w:t>这些病害若未能得到及时发现与修复，不仅严重影响行车体验，更对行车安全构成直接威胁。研究表明，恶劣的路面状况甚至会导致燃油消耗和</w:t>
+      </w:r>
+      <w:proofErr w:type="gramStart"/>
+      <w:r>
+        <w:rPr>
+          <w:rFonts w:hint="eastAsia"/>
+          <w:lang/>
+        </w:rPr>
+        <w:t>碳排放</w:t>
+      </w:r>
+      <w:proofErr w:type="gramEnd"/>
+      <w:r>
+        <w:rPr>
+          <w:rFonts w:hint="eastAsia"/>
+          <w:lang/>
+        </w:rPr>
+        <w:t>的增加，对环境造成负面影响</w:t>
       </w:r>
       <w:r>
         <w:rPr>
@@ -3153,7 +3238,25 @@
           <w:sz w:val="24"/>
           <w:lang w:bidi="ar"/>
         </w:rPr>
-        <w:t>目前，该领域的方法主要可以分为两阶段检测算法和单阶段检测算法两大技术路线</w:t>
+        <w:t>目前，该领域的方法主要可以分为两阶段检测算法和</w:t>
+      </w:r>
+      <w:proofErr w:type="gramStart"/>
+      <w:r>
+        <w:rPr>
+          <w:kern w:val="44"/>
+          <w:sz w:val="24"/>
+          <w:lang w:bidi="ar"/>
+        </w:rPr>
+        <w:t>单阶段</w:t>
+      </w:r>
+      <w:proofErr w:type="gramEnd"/>
+      <w:r>
+        <w:rPr>
+          <w:kern w:val="44"/>
+          <w:sz w:val="24"/>
+          <w:lang w:bidi="ar"/>
+        </w:rPr>
+        <w:t>检测算法两大技术路线</w:t>
       </w:r>
       <w:r>
         <w:rPr>
@@ -3547,7 +3650,27 @@
           <w:sz w:val="24"/>
           <w:lang/>
         </w:rPr>
-        <w:t>）对这些特征进行分类，并用一个边界框回归器对位置进行微调</w:t>
+        <w:t>）对这些特征进行分类，并用一个边界</w:t>
+      </w:r>
+      <w:proofErr w:type="gramStart"/>
+      <w:r>
+        <w:rPr>
+          <w:rFonts w:ascii="宋体" w:hAnsi="宋体" w:cs="宋体" w:hint="eastAsia"/>
+          <w:kern w:val="0"/>
+          <w:sz w:val="24"/>
+          <w:lang/>
+        </w:rPr>
+        <w:t>框回归器</w:t>
+      </w:r>
+      <w:proofErr w:type="gramEnd"/>
+      <w:r>
+        <w:rPr>
+          <w:rFonts w:ascii="宋体" w:hAnsi="宋体" w:cs="宋体" w:hint="eastAsia"/>
+          <w:kern w:val="0"/>
+          <w:sz w:val="24"/>
+          <w:lang/>
+        </w:rPr>
+        <w:t>对位置进行微调</w:t>
       </w:r>
       <w:r>
         <w:rPr>
@@ -3861,7 +3984,27 @@
           <w:sz w:val="24"/>
           <w:lang/>
         </w:rPr>
-        <w:t>的层从特征图中为每个候选区域提取一个固定大小的特征向量。这些特征向量随后被送入全连接层进行分类和边界框回归</w:t>
+        <w:t>的层从特征图中为每个候选区域提取一个固定大小的特征向量。这些特征向量随后被</w:t>
+      </w:r>
+      <w:proofErr w:type="gramStart"/>
+      <w:r>
+        <w:rPr>
+          <w:rFonts w:ascii="宋体" w:hAnsi="宋体" w:cs="宋体" w:hint="eastAsia"/>
+          <w:kern w:val="0"/>
+          <w:sz w:val="24"/>
+          <w:lang/>
+        </w:rPr>
+        <w:t>送入全</w:t>
+      </w:r>
+      <w:proofErr w:type="gramEnd"/>
+      <w:r>
+        <w:rPr>
+          <w:rFonts w:ascii="宋体" w:hAnsi="宋体" w:cs="宋体" w:hint="eastAsia"/>
+          <w:kern w:val="0"/>
+          <w:sz w:val="24"/>
+          <w:lang/>
+        </w:rPr>
+        <w:t>连接层进行分类和边界框回归</w:t>
       </w:r>
       <w:r>
         <w:rPr>
@@ -4121,7 +4264,27 @@
           <w:sz w:val="24"/>
           <w:lang/>
         </w:rPr>
-        <w:t>首次实现了近乎实时的端到端目标检测，成为后续许多两阶段检测算法的基石</w:t>
+        <w:t>首次实现了近乎实时的端到</w:t>
+      </w:r>
+      <w:proofErr w:type="gramStart"/>
+      <w:r>
+        <w:rPr>
+          <w:rFonts w:ascii="宋体" w:hAnsi="宋体" w:cs="宋体" w:hint="eastAsia"/>
+          <w:kern w:val="0"/>
+          <w:sz w:val="24"/>
+          <w:lang/>
+        </w:rPr>
+        <w:t>端目标</w:t>
+      </w:r>
+      <w:proofErr w:type="gramEnd"/>
+      <w:r>
+        <w:rPr>
+          <w:rFonts w:ascii="宋体" w:hAnsi="宋体" w:cs="宋体" w:hint="eastAsia"/>
+          <w:kern w:val="0"/>
+          <w:sz w:val="24"/>
+          <w:lang/>
+        </w:rPr>
+        <w:t>检测，成为后续许多两阶段检测算法的基石</w:t>
       </w:r>
       <w:r>
         <w:rPr>
@@ -4169,7 +4332,23 @@
           <w:rFonts w:hint="eastAsia"/>
           <w:lang/>
         </w:rPr>
-        <w:t>为代表的两阶段检测算法通常能够达到很高的检测精度，因为它们将定位和分类任务解耦，可以对候选区域进行精细的调整和识别。然而，其多步骤的流程依然带来了较大的计算开销，推理速度相对较慢，难以完全满足道路巡检等需要高帧率实时处理的任务要求</w:t>
+        <w:t>为代表的两阶段检测算法通常能够达到很高的检测精度，因为它们将定位和分类任务解耦，可以对候选区域进行精细的调整和识别。然而，其多步骤的流程依然带来了较大的计算开销，推理速度相对较慢，难以完全满足道路巡检等需要</w:t>
+      </w:r>
+      <w:proofErr w:type="gramStart"/>
+      <w:r>
+        <w:rPr>
+          <w:rFonts w:hint="eastAsia"/>
+          <w:lang/>
+        </w:rPr>
+        <w:t>高帧率</w:t>
+      </w:r>
+      <w:proofErr w:type="gramEnd"/>
+      <w:r>
+        <w:rPr>
+          <w:rFonts w:hint="eastAsia"/>
+          <w:lang/>
+        </w:rPr>
+        <w:t>实时处理的任务要求</w:t>
       </w:r>
       <w:r>
         <w:rPr>
@@ -4243,7 +4422,55 @@
           <w:rFonts w:hint="eastAsia"/>
           <w:lang/>
         </w:rPr>
-        <w:t>为了解决两阶段算法的速度瓶颈，研究者们提出了将目标检测视为一个端到端回归问题的单阶段检测算法。该流派的核心思想是取消了显式的候选区域生成步骤，直接在整张图像上密集地预测目标的类别和位置，从而极大地简化了检测流程并提升了速度</w:t>
+        <w:t>为了解决两阶段算法的速度瓶颈，研究者们提出了将目标检测视为一个端到</w:t>
+      </w:r>
+      <w:proofErr w:type="gramStart"/>
+      <w:r>
+        <w:rPr>
+          <w:rFonts w:hint="eastAsia"/>
+          <w:lang/>
+        </w:rPr>
+        <w:t>端回归</w:t>
+      </w:r>
+      <w:proofErr w:type="gramEnd"/>
+      <w:r>
+        <w:rPr>
+          <w:rFonts w:hint="eastAsia"/>
+          <w:lang/>
+        </w:rPr>
+        <w:t>问题的</w:t>
+      </w:r>
+      <w:proofErr w:type="gramStart"/>
+      <w:r>
+        <w:rPr>
+          <w:rFonts w:hint="eastAsia"/>
+          <w:lang/>
+        </w:rPr>
+        <w:t>单阶段</w:t>
+      </w:r>
+      <w:proofErr w:type="gramEnd"/>
+      <w:r>
+        <w:rPr>
+          <w:rFonts w:hint="eastAsia"/>
+          <w:lang/>
+        </w:rPr>
+        <w:t>检测算法。该流派的核心思想是</w:t>
+      </w:r>
+      <w:proofErr w:type="gramStart"/>
+      <w:r>
+        <w:rPr>
+          <w:rFonts w:hint="eastAsia"/>
+          <w:lang/>
+        </w:rPr>
+        <w:t>取消了显式</w:t>
+      </w:r>
+      <w:proofErr w:type="gramEnd"/>
+      <w:r>
+        <w:rPr>
+          <w:rFonts w:hint="eastAsia"/>
+          <w:lang/>
+        </w:rPr>
+        <w:t>的候选区域生成步骤，直接在整张图像上密集地预测目标的类别和位置，从而极大地简化了检测流程并提升了速度</w:t>
       </w:r>
       <w:r>
         <w:rPr>
@@ -6712,7 +6939,23 @@
           <w:rFonts w:hint="eastAsia"/>
           <w:lang/>
         </w:rPr>
-        <w:t>这种将检测速度与精度进行有效平衡的设计，使得单阶段检测器，特别是</w:t>
+        <w:t>这种将检测速度与精度进行有效平衡的设计，使得</w:t>
+      </w:r>
+      <w:proofErr w:type="gramStart"/>
+      <w:r>
+        <w:rPr>
+          <w:rFonts w:hint="eastAsia"/>
+          <w:lang/>
+        </w:rPr>
+        <w:t>单阶段</w:t>
+      </w:r>
+      <w:proofErr w:type="gramEnd"/>
+      <w:r>
+        <w:rPr>
+          <w:rFonts w:hint="eastAsia"/>
+          <w:lang/>
+        </w:rPr>
+        <w:t>检测器，特别是</w:t>
       </w:r>
       <w:r>
         <w:rPr>
@@ -6806,7 +7049,39 @@
           <w:rFonts w:hint="eastAsia"/>
           <w:lang/>
         </w:rPr>
-        <w:t>为代表的深度学习模型性能强大，但在实际部署中，尤其是在算力、内存和功耗均受限的车载边缘计算设备上，模型的大小和计算复杂度成为关键瓶颈。为此，学术界和工业界正积极探索模型优化技术，旨在实现一个能够在精度、速度和模型大小之间取得更优平衡的解决方案。这一研究方向的成熟，体现了计算机视觉领域从追求纯粹的理论精度，向关注实际应用部署的范式转变。两个主要的研究方向是模型轻量化和注意力机制</w:t>
+        <w:t>为代表的深度学习模型性能强大，但在实际部署中，尤其是在算力、内存和</w:t>
+      </w:r>
+      <w:proofErr w:type="gramStart"/>
+      <w:r>
+        <w:rPr>
+          <w:rFonts w:hint="eastAsia"/>
+          <w:lang/>
+        </w:rPr>
+        <w:t>功耗均</w:t>
+      </w:r>
+      <w:proofErr w:type="gramEnd"/>
+      <w:r>
+        <w:rPr>
+          <w:rFonts w:hint="eastAsia"/>
+          <w:lang/>
+        </w:rPr>
+        <w:t>受限的车载边缘计算设备上，模型的大小和计算复杂</w:t>
+      </w:r>
+      <w:proofErr w:type="gramStart"/>
+      <w:r>
+        <w:rPr>
+          <w:rFonts w:hint="eastAsia"/>
+          <w:lang/>
+        </w:rPr>
+        <w:t>度成为</w:t>
+      </w:r>
+      <w:proofErr w:type="gramEnd"/>
+      <w:r>
+        <w:rPr>
+          <w:rFonts w:hint="eastAsia"/>
+          <w:lang/>
+        </w:rPr>
+        <w:t>关键瓶颈。为此，学术界和工业界正积极探索模型优化技术，旨在实现一个能够在精度、速度和模型大小之间取得更优平衡的解决方案。这一研究方向的成熟，体现了计算机视觉领域从追求纯粹的理论精度，向关注实际应用部署的范式转变。两个主要的研究方向是模型轻量化和注意力机制</w:t>
       </w:r>
       <w:r>
         <w:rPr>
@@ -7149,7 +7424,27 @@
           <w:sz w:val="24"/>
           <w:lang/>
         </w:rPr>
-        <w:t>在此基础上引入了倒置残差（</w:t>
+        <w:t>在此基础上引入</w:t>
+      </w:r>
+      <w:proofErr w:type="gramStart"/>
+      <w:r>
+        <w:rPr>
+          <w:rFonts w:ascii="宋体" w:hAnsi="宋体" w:cs="宋体" w:hint="eastAsia"/>
+          <w:kern w:val="0"/>
+          <w:sz w:val="24"/>
+          <w:lang/>
+        </w:rPr>
+        <w:t>了倒</w:t>
+      </w:r>
+      <w:proofErr w:type="gramEnd"/>
+      <w:r>
+        <w:rPr>
+          <w:rFonts w:ascii="宋体" w:hAnsi="宋体" w:cs="宋体" w:hint="eastAsia"/>
+          <w:kern w:val="0"/>
+          <w:sz w:val="24"/>
+          <w:lang/>
+        </w:rPr>
+        <w:t>置残差（</w:t>
       </w:r>
       <w:r>
         <w:rPr>
@@ -8637,7 +8932,27 @@
           <w:sz w:val="24"/>
           <w:lang/>
         </w:rPr>
-        <w:t>的突出特点是无需任何额外的参数。它基于神经科学中的空间抑制理论，为特征图中的每个神经元（即每个位置的每个通道）定义一个能量函数。通过最小化该能量函数，</w:t>
+        <w:t>的突出特点是无需任何额外的参数。它基于神经科学中的空间抑制理论，为特征图中的每个神经元（即每个位置的每个通道）定义一个能量函数。通过</w:t>
+      </w:r>
+      <w:proofErr w:type="gramStart"/>
+      <w:r>
+        <w:rPr>
+          <w:rFonts w:ascii="宋体" w:hAnsi="宋体" w:cs="宋体" w:hint="eastAsia"/>
+          <w:kern w:val="0"/>
+          <w:sz w:val="24"/>
+          <w:lang/>
+        </w:rPr>
+        <w:t>最小化该能量</w:t>
+      </w:r>
+      <w:proofErr w:type="gramEnd"/>
+      <w:r>
+        <w:rPr>
+          <w:rFonts w:ascii="宋体" w:hAnsi="宋体" w:cs="宋体" w:hint="eastAsia"/>
+          <w:kern w:val="0"/>
+          <w:sz w:val="24"/>
+          <w:lang/>
+        </w:rPr>
+        <w:t>函数，</w:t>
       </w:r>
       <w:r>
         <w:rPr>
@@ -9328,7 +9643,27 @@
           <w:sz w:val="24"/>
           <w:lang/>
         </w:rPr>
-        <w:t>然而，在目标检测任务中，最核心的综合性能指标是平均精度均值（</w:t>
+        <w:t>然而，在目标检测任务中，</w:t>
+      </w:r>
+      <w:proofErr w:type="gramStart"/>
+      <w:r>
+        <w:rPr>
+          <w:rFonts w:ascii="宋体" w:hAnsi="宋体" w:cs="宋体" w:hint="eastAsia"/>
+          <w:kern w:val="0"/>
+          <w:sz w:val="24"/>
+          <w:lang/>
+        </w:rPr>
+        <w:t>最</w:t>
+      </w:r>
+      <w:proofErr w:type="gramEnd"/>
+      <w:r>
+        <w:rPr>
+          <w:rFonts w:ascii="宋体" w:hAnsi="宋体" w:cs="宋体" w:hint="eastAsia"/>
+          <w:kern w:val="0"/>
+          <w:sz w:val="24"/>
+          <w:lang/>
+        </w:rPr>
+        <w:t>核心的综合性能指标是平均精度均值（</w:t>
       </w:r>
       <w:r>
         <w:rPr>
@@ -10051,7 +10386,23 @@
           <w:rFonts w:hint="eastAsia"/>
           <w:lang/>
         </w:rPr>
-        <w:t>系列为代表的单阶段目标检测算法，凭借其在实时性与精度上取得的良好平衡，已成为该领域的主流选择</w:t>
+        <w:t>系列为代表的</w:t>
+      </w:r>
+      <w:proofErr w:type="gramStart"/>
+      <w:r>
+        <w:rPr>
+          <w:rFonts w:hint="eastAsia"/>
+          <w:lang/>
+        </w:rPr>
+        <w:t>单阶段</w:t>
+      </w:r>
+      <w:proofErr w:type="gramEnd"/>
+      <w:r>
+        <w:rPr>
+          <w:rFonts w:hint="eastAsia"/>
+          <w:lang/>
+        </w:rPr>
+        <w:t>目标检测算法，凭借其在实时性与精度上取得的良好平衡，已成为该领域的主流选择</w:t>
       </w:r>
       <w:r>
         <w:rPr>
@@ -10882,16 +11233,8 @@
           <w:noProof/>
           <w:sz w:val="20"/>
         </w:rPr>
-        <w:t>Canny J. A computational approach to edge detection [J]. IEEE Transactions on pattern analysis and machine intelligence, 1986, PAMI-8(6): 679-698.</w:t>
-      </w:r>
-    </w:p>
-    <w:p>
-      <w:pPr>
-        <w:rPr>
-          <w:color w:val="000000" w:themeColor="text1"/>
-          <w:sz w:val="24"/>
-        </w:rPr>
-      </w:pPr>
+        <w:t>[1] Canny J. A computational approach to edge detection[J]. IEEE Transactions on Pattern Analysis and Machine Intelligence, 1986, 8(6): 679-698.</w:t>
+      </w:r>
     </w:p>
     <w:p>
       <w:pPr>
@@ -10905,7 +11248,7 @@
           <w:noProof/>
           <w:sz w:val="20"/>
         </w:rPr>
-        <w:t>Otsu N. A threshold selection method from gray-level histograms [J]. IEEE transactions on systems, man, and cybernetics, 1979, 9(1): 62-66.</w:t>
+        <w:t>[2] Otsu N. A threshold selection method from gray-level histograms[J]. IEEE Transactions on Systems, Man, and Cybernetics, 1979, 9(1): 62-66.</w:t>
       </w:r>
     </w:p>
     <w:p>
@@ -10915,29 +11258,28 @@
           <w:sz w:val="20"/>
         </w:rPr>
       </w:pPr>
-    </w:p>
-    <w:p>
-      <w:pPr>
+      <w:r>
         <w:rPr>
           <w:noProof/>
           <w:sz w:val="20"/>
         </w:rPr>
-      </w:pPr>
-      <w:r>
+        <w:t>[3] Krizhevsky A, Sutskever I, Hinton G E. ImageNet classification with deep convolutional neural networks[C]//Advances in Neural Information Processing Systems 25 (NIPS 2012). 2012: 1097-1105.</w:t>
+      </w:r>
+    </w:p>
+    <w:p>
+      <w:pPr>
         <w:rPr>
           <w:noProof/>
           <w:sz w:val="20"/>
         </w:rPr>
-        <w:t>Krizhevsky A, Sutskever I, Hinton G E. ImageNet classification with deep convolutional neural networks [C]//Advances in neural information processing systems. 2012, 25.</w:t>
-      </w:r>
-    </w:p>
-    <w:p>
-      <w:pPr>
+      </w:pPr>
+      <w:r>
         <w:rPr>
           <w:noProof/>
           <w:sz w:val="20"/>
         </w:rPr>
-      </w:pPr>
+        <w:t>[4] Girshick R, Donahue J, Darrell T, et al. Rich feature hierarchies for accurate object detection and semantic segmentation[C]//Proceedings of the IEEE Conference on Computer Vision and Pattern Recognition. 2014: 580-587.</w:t>
+      </w:r>
     </w:p>
     <w:p>
       <w:pPr>
@@ -10951,7 +11293,7 @@
           <w:noProof/>
           <w:sz w:val="20"/>
         </w:rPr>
-        <w:t>Girshick R, Donahue J, Darrell T, et al. Rich feature hierarchies for accurate object detection and semantic segmentation [C]//Proceedings of the IEEE conference on computer vision and pattern recognition. 2014: 580-587.</w:t>
+        <w:t>[5] Girshick R. Fast R-CNN[C]//Proceedings of the IEEE International Conference on Computer Vision. 2015: 1440-1448.</w:t>
       </w:r>
     </w:p>
     <w:p>
@@ -10961,29 +11303,28 @@
           <w:sz w:val="20"/>
         </w:rPr>
       </w:pPr>
-    </w:p>
-    <w:p>
-      <w:pPr>
+      <w:r>
         <w:rPr>
           <w:noProof/>
           <w:sz w:val="20"/>
         </w:rPr>
-      </w:pPr>
-      <w:r>
+        <w:t>[6] Ren S, He K, Girshick R, et al. Faster R-CNN: Towards real-time object detection with region proposal networks[C]//Advances in Neural Information Processing Systems 28 (NIPS 2015). 2015: 91-99.</w:t>
+      </w:r>
+    </w:p>
+    <w:p>
+      <w:pPr>
         <w:rPr>
           <w:noProof/>
           <w:sz w:val="20"/>
         </w:rPr>
-        <w:t>Girshick R. Fast r-cnn [C]//Proceedings of the IEEE international conference on computer vision. 2015: 1440-1448.</w:t>
-      </w:r>
-    </w:p>
-    <w:p>
-      <w:pPr>
+      </w:pPr>
+      <w:r>
         <w:rPr>
           <w:noProof/>
           <w:sz w:val="20"/>
         </w:rPr>
-      </w:pPr>
+        <w:t>[7] Liu W, Anguelov D, Erhan D, et al. SSD: Single shot multibox detector[C]//European Conference on Computer Vision. Springer, Cham, 2016: 21-37.</w:t>
+      </w:r>
     </w:p>
     <w:p>
       <w:pPr>
@@ -10997,7 +11338,7 @@
           <w:noProof/>
           <w:sz w:val="20"/>
         </w:rPr>
-        <w:t>Ren S, He K, Girshick R, et al. Faster r-cnn: Towards real-time object detection with region proposal networks [J]. Advances in neural information processing systems, 2015, 28.</w:t>
+        <w:t>[8] Redmon J, Divvala S, Girshick R, et al. You only look once: Unified, real-time object detection[C]//Proceedings of the IEEE Conference on Computer Vision and Pattern Recognition. 2016: 779-788.</w:t>
       </w:r>
     </w:p>
     <w:p>
@@ -11007,29 +11348,28 @@
           <w:sz w:val="20"/>
         </w:rPr>
       </w:pPr>
-    </w:p>
-    <w:p>
-      <w:pPr>
+      <w:r>
         <w:rPr>
           <w:noProof/>
           <w:sz w:val="20"/>
         </w:rPr>
-      </w:pPr>
-      <w:r>
+        <w:t>[9] Redmon J, Farhadi A. YOLO9000: Better, faster, stronger[C]//Proceedings of the IEEE Conference on Computer Vision and Pattern Recognition. 2017: 7263-7271.</w:t>
+      </w:r>
+    </w:p>
+    <w:p>
+      <w:pPr>
         <w:rPr>
           <w:noProof/>
           <w:sz w:val="20"/>
         </w:rPr>
-        <w:t>Liu W, Anguelov D, Erhan D, et al. SSD: Single shot multibox detector [C]//European conference on computer vision. Springer, Cham, 2016: 21-37.</w:t>
-      </w:r>
-    </w:p>
-    <w:p>
-      <w:pPr>
+      </w:pPr>
+      <w:r>
         <w:rPr>
           <w:noProof/>
           <w:sz w:val="20"/>
         </w:rPr>
-      </w:pPr>
+        <w:t>[10] Redmon J, Farhadi A. YOLOv3: An incremental improvement[J]. arXiv preprint arXiv:1804.02767, 2018.</w:t>
+      </w:r>
     </w:p>
     <w:p>
       <w:pPr>
@@ -11043,7 +11383,7 @@
           <w:noProof/>
           <w:sz w:val="20"/>
         </w:rPr>
-        <w:t>Redmon J, Divvala S, Girshick R, et al. You only look once: Unified, real-time object detection [C]//Proceedings of the IEEE conference on computer vision and pattern recognition. 2016: 779-788.</w:t>
+        <w:t>[11] Bochkovskiy A, Wang C Y, Liao H Y M. YOLOv4: Optimal speed and accuracy of object detection[J]. arXiv preprint arXiv:2004.10934, 2020.</w:t>
       </w:r>
     </w:p>
     <w:p>
@@ -11053,29 +11393,28 @@
           <w:sz w:val="20"/>
         </w:rPr>
       </w:pPr>
-    </w:p>
-    <w:p>
-      <w:pPr>
+      <w:r>
         <w:rPr>
           <w:noProof/>
           <w:sz w:val="20"/>
         </w:rPr>
-      </w:pPr>
-      <w:r>
+        <w:t>[12] Jocher G, Chaurasia A, Stoken A, et al. YOLOv5 [Computer software][OL]. 2022. Available: https://github.com/ultralytics/yolov5.</w:t>
+      </w:r>
+    </w:p>
+    <w:p>
+      <w:pPr>
         <w:rPr>
           <w:noProof/>
           <w:sz w:val="20"/>
         </w:rPr>
-        <w:t>Redmon J, Farhadi A. YOLO9000: better, faster, stronger [C]//Proceedings of the IEEE conference on computer vision and pattern recognition. 2017: 7263-7271.</w:t>
-      </w:r>
-    </w:p>
-    <w:p>
-      <w:pPr>
+      </w:pPr>
+      <w:r>
         <w:rPr>
           <w:noProof/>
           <w:sz w:val="20"/>
         </w:rPr>
-      </w:pPr>
+        <w:t>[13] Jocher G, Chaurasia A, Qiu J. YOLOv8 [Computer software][OL]. 2023. Available: https://github.com/ultralytics/ultralytics.</w:t>
+      </w:r>
     </w:p>
     <w:p>
       <w:pPr>
@@ -11089,7 +11428,7 @@
           <w:noProof/>
           <w:sz w:val="20"/>
         </w:rPr>
-        <w:t>Redmon J, Farhadi A. YOLOv3: An incremental improvement [J]. arXiv preprint arXiv:1804.02767, 2018.</w:t>
+        <w:t>[14] Wang C Y, Yeh I H, Liao H Y M. YOLOv9: Learning what you want to learn using programmable gradient information[J]. arXiv preprint arXiv:2402.13616, 2024.</w:t>
       </w:r>
     </w:p>
     <w:p>
@@ -11099,29 +11438,28 @@
           <w:sz w:val="20"/>
         </w:rPr>
       </w:pPr>
-    </w:p>
-    <w:p>
-      <w:pPr>
+      <w:r>
         <w:rPr>
           <w:noProof/>
           <w:sz w:val="20"/>
         </w:rPr>
-      </w:pPr>
-      <w:r>
+        <w:t>[15] Howard A G, Zhu M, Chen B, et al. MobileNets: Efficient convolutional neural networks for mobile vision applications[J]. arXiv preprint arXiv:1704.04861, 2017.</w:t>
+      </w:r>
+    </w:p>
+    <w:p>
+      <w:pPr>
         <w:rPr>
           <w:noProof/>
           <w:sz w:val="20"/>
         </w:rPr>
-        <w:t>Bochkovskiy A, Wang C Y, Liao H Y M. YOLOv4: Optimal speed and accuracy of object detection [J]. arXiv preprint arXiv:2004.10934, 2020.</w:t>
-      </w:r>
-    </w:p>
-    <w:p>
-      <w:pPr>
+      </w:pPr>
+      <w:r>
         <w:rPr>
           <w:noProof/>
           <w:sz w:val="20"/>
         </w:rPr>
-      </w:pPr>
+        <w:t>[16] Sandler M, Howard A, Zhu M, et al. MobileNetV2: Inverted residuals and linear bottlenecks[C]//Proceedings of the IEEE Conference on Computer Vision and Pattern Recognition. 2018: 4510-4520.</w:t>
+      </w:r>
     </w:p>
     <w:p>
       <w:pPr>
@@ -11135,7 +11473,7 @@
           <w:noProof/>
           <w:sz w:val="20"/>
         </w:rPr>
-        <w:t>Jocher G, Chaurasia A, Stoken A, et al. ultralytics/yolov5: v7.0 - YOLOv5 SOTA Realtime Instance Segmentation. 2022. Available from: https://github.com/ultralytics/yolov5.</w:t>
+        <w:t>[17] Zhang X, Zhou X, Lin M, et al. ShuffleNet: An extremely efficient convolutional neural network for mobile devices[C]//Proceedings of the IEEE Conference on Computer Vision and Pattern Recognition. 2018: 6848-6856.</w:t>
       </w:r>
     </w:p>
     <w:p>
@@ -11145,29 +11483,28 @@
           <w:sz w:val="20"/>
         </w:rPr>
       </w:pPr>
-    </w:p>
-    <w:p>
-      <w:pPr>
+      <w:r>
         <w:rPr>
           <w:noProof/>
           <w:sz w:val="20"/>
         </w:rPr>
-      </w:pPr>
-      <w:r>
+        <w:t>[18] Ma N, Zhang X, Zheng H T, et al. ShuffleNet V2: Practical guidelines for efficient CNN architecture design[C]//Proceedings of the European Conference on Computer Vision (ECCV). 2018: 116-131.</w:t>
+      </w:r>
+    </w:p>
+    <w:p>
+      <w:pPr>
         <w:rPr>
           <w:noProof/>
           <w:sz w:val="20"/>
         </w:rPr>
-        <w:t>Jocher G, Chaurasia A, Qiu J. ultralytics/ultralytics: YOLOv8. 2023. Available from: https://github.com/ultralytics/ultralytics.</w:t>
-      </w:r>
-    </w:p>
-    <w:p>
-      <w:pPr>
+      </w:pPr>
+      <w:r>
         <w:rPr>
           <w:noProof/>
           <w:sz w:val="20"/>
         </w:rPr>
-      </w:pPr>
+        <w:t>[19] Han K, Wang Y, Tian Q, et al. GhostNet: More features from cheap operations[C]//Proceedings of the IEEE/CVF Conference on Computer Vision and Pattern Recognition. 2020: 1580-1589.</w:t>
+      </w:r>
     </w:p>
     <w:p>
       <w:pPr>
@@ -11181,7 +11518,7 @@
           <w:noProof/>
           <w:sz w:val="20"/>
         </w:rPr>
-        <w:t>Wang C Y, Yeh I H, Liao H Y M. YOLOv9: Learning what you want to learn using programmable gradient information [J]. arXiv preprint arXiv:2402.13616, 2024.</w:t>
+        <w:t>[20] Hu J, Shen L, Sun G. Squeeze-and-excitation networks[C]//Proceedings of the IEEE Conference on Computer Vision and Pattern Recognition. 2018: 7132-7141.</w:t>
       </w:r>
     </w:p>
     <w:p>
@@ -11191,29 +11528,28 @@
           <w:sz w:val="20"/>
         </w:rPr>
       </w:pPr>
-    </w:p>
-    <w:p>
-      <w:pPr>
+      <w:r>
         <w:rPr>
           <w:noProof/>
           <w:sz w:val="20"/>
         </w:rPr>
-      </w:pPr>
-      <w:r>
+        <w:t>[21] Woo S, Park J, Lee J Y, et al. CBAM: Convolutional block attention module[C]//Proceedings of the European Conference on Computer Vision (ECCV). 2018: 3-19.</w:t>
+      </w:r>
+    </w:p>
+    <w:p>
+      <w:pPr>
         <w:rPr>
           <w:noProof/>
           <w:sz w:val="20"/>
         </w:rPr>
-        <w:t>Howard A G, Zhu M, Chen B, et al. Mobilenets: Efficient convolutional neural networks for mobile vision applications [J]. arXiv preprint arXiv:1704.04861, 2017.</w:t>
-      </w:r>
-    </w:p>
-    <w:p>
-      <w:pPr>
+      </w:pPr>
+      <w:r>
         <w:rPr>
           <w:noProof/>
           <w:sz w:val="20"/>
         </w:rPr>
-      </w:pPr>
+        <w:t>[22] Yang L, Zhang R Y, Li L, et al. SimAM: A simple, parameter-free attention module for convolutional neural networks[C]//Proceedings of the 38th International Conference on Machine Learning. PMLR, 2021: 11863-11874.</w:t>
+      </w:r>
     </w:p>
     <w:p>
       <w:pPr>
@@ -11227,7 +11563,7 @@
           <w:noProof/>
           <w:sz w:val="20"/>
         </w:rPr>
-        <w:t>Sandler M, Howard A, Zhu M, et al. Mobilenetv2: Inverted residuals and linear bottlenecks [C]//Proceedings of the IEEE conference on computer vision and pattern recognition. 2018: 4510-4520.</w:t>
+        <w:t>[23] Arya D, Maeda H, Ghosh S K, et al. RDD2022: A multi-national image dataset for automatic road damage detection[J]. Data in Brief, 2022, 45: 108684.</w:t>
       </w:r>
     </w:p>
     <w:p>
@@ -11237,29 +11573,28 @@
           <w:sz w:val="20"/>
         </w:rPr>
       </w:pPr>
-    </w:p>
-    <w:p>
-      <w:pPr>
+      <w:r>
         <w:rPr>
           <w:noProof/>
           <w:sz w:val="20"/>
         </w:rPr>
-      </w:pPr>
-      <w:r>
+        <w:t>[24] Everingham M, Van Ghoul L, Williams C K I, et al. The PASCAL visual object classes (VOC) challenge[J]. International Journal of Computer Vision, 2010, 88(2): 303-338.</w:t>
+      </w:r>
+    </w:p>
+    <w:p>
+      <w:pPr>
         <w:rPr>
           <w:noProof/>
           <w:sz w:val="20"/>
         </w:rPr>
-        <w:t>Zhang X, Zhou X, Lin M, et al. Shufflenet: An extremely efficient convolutional neural network for mobile devices [C]//Proceedings of the IEEE conference on computer vision and pattern recognition. 2018: 6848-6856.</w:t>
-      </w:r>
-    </w:p>
-    <w:p>
-      <w:pPr>
+      </w:pPr>
+      <w:r>
         <w:rPr>
           <w:noProof/>
           <w:sz w:val="20"/>
         </w:rPr>
-      </w:pPr>
+        <w:t>[25] Gonzalez R C, Woods R E. Digital Image Processing[M]. 2nd ed. Upper Saddle River, NJ: Prentice Hall, 2002.</w:t>
+      </w:r>
     </w:p>
     <w:p>
       <w:pPr>
@@ -11273,7 +11608,7 @@
           <w:noProof/>
           <w:sz w:val="20"/>
         </w:rPr>
-        <w:t>Ma N, Zhang X, Zheng H T, et al. Shufflenet v2: Practical guidelines for efficient cnn architecture design [C]//Proceedings of the European conference on computer vision (ECCV). 2018: 116-131.</w:t>
+        <w:t>[26] Gopalakrishnan K. Deep learning in data-driven pavement image analysis and automated distress detection: A review[J]. Data, 2018, 3(3): 28.</w:t>
       </w:r>
     </w:p>
     <w:p>
@@ -11283,29 +11618,28 @@
           <w:sz w:val="20"/>
         </w:rPr>
       </w:pPr>
-    </w:p>
-    <w:p>
-      <w:pPr>
+      <w:r>
         <w:rPr>
           <w:noProof/>
           <w:sz w:val="20"/>
         </w:rPr>
-      </w:pPr>
-      <w:r>
+        <w:t>[27] Maeda H, Sekimoto Y, Seto T, et al. Road damage detection and classification using deep neural networks with smartphone images[J]. Computer-Aided Civil and Infrastructure Engineering, 2018, 33(12): 1127-1141.</w:t>
+      </w:r>
+    </w:p>
+    <w:p>
+      <w:pPr>
         <w:rPr>
           <w:noProof/>
           <w:sz w:val="20"/>
         </w:rPr>
-        <w:t>Han K, Wang Y, Tian Q, et al. Ghostnet: More features from cheap operations [C]//Proceedings of the IEEE/CVF conference on computer vision and pattern recognition. 2020: 1580-1589.</w:t>
-      </w:r>
-    </w:p>
-    <w:p>
-      <w:pPr>
+      </w:pPr>
+      <w:r>
         <w:rPr>
           <w:noProof/>
           <w:sz w:val="20"/>
         </w:rPr>
-      </w:pPr>
+        <w:t>[28] Zhang L, Yang F, Zhang D, et al. Road damage detection and classification with Faster R-CNN[C]//2017 IEEE International Conference on Mechatronics and Automation (ICMA). IEEE, 2017: 1531-1536.</w:t>
+      </w:r>
     </w:p>
     <w:p>
       <w:pPr>
@@ -11319,7 +11653,7 @@
           <w:noProof/>
           <w:sz w:val="20"/>
         </w:rPr>
-        <w:t>Hu J, Shen L, Sun G. Squeeze-and-excitation networks [C]//Proceedings of the IEEE conference on computer vision and pattern recognition. 2018: 7132-7141.</w:t>
+        <w:t>[29] Alfarrarjeh A, Kim S H, Kim J H, et al. A deep learning-based system for road damage detection and classification[J]. Sensors, 2020, 20(24): 7189.</w:t>
       </w:r>
     </w:p>
     <w:p>
@@ -11329,29 +11663,28 @@
           <w:sz w:val="20"/>
         </w:rPr>
       </w:pPr>
-    </w:p>
-    <w:p>
-      <w:pPr>
+      <w:r>
         <w:rPr>
           <w:noProof/>
           <w:sz w:val="20"/>
         </w:rPr>
-      </w:pPr>
-      <w:r>
+        <w:t>[30] Du Y, Pan N, Xu Z, et al. Pavement distress detection and classification based on YOLO network[J]. International Journal of Pavement Engineering, 2021, 22(12): 1659-1672.</w:t>
+      </w:r>
+    </w:p>
+    <w:p>
+      <w:pPr>
         <w:rPr>
           <w:noProof/>
           <w:sz w:val="20"/>
         </w:rPr>
-        <w:t>Woo S, Park J, Lee J Y, et al. Cbam: Convolutional block attention module [C]//Proceedings of the European conference on computer vision (ECCV). 2018: 3-19.</w:t>
-      </w:r>
-    </w:p>
-    <w:p>
-      <w:pPr>
+      </w:pPr>
+      <w:r>
         <w:rPr>
           <w:noProof/>
           <w:sz w:val="20"/>
         </w:rPr>
-      </w:pPr>
+        <w:t>[31] Naddaf-Sh M, et al. Cost-effective and accurate road damage detection and localization using a new YOLO-based method[J]. Remote Sensing, 2021, 13(24): 5158.</w:t>
+      </w:r>
     </w:p>
     <w:p>
       <w:pPr>
@@ -11365,7 +11698,7 @@
           <w:noProof/>
           <w:sz w:val="20"/>
         </w:rPr>
-        <w:t>Yang L, Zhang R Y, Li L, et al. Simam: A simple, parameter-free attention module for convolutional neural networks [C]//Proceedings of the 38th International Conference on Machine Learning. PMLR, 2021: 11863-11874.</w:t>
+        <w:t>[32] Jeong D. A study on the performance of a YOLOv5-based road crack detection model using an unmanned aerial vehicle[J]. Journal of the Korean Society of Surveying, Geodesy, Photogrammetry and Cartography, 2022, 40(6): 483-491.</w:t>
       </w:r>
     </w:p>
     <w:p>
@@ -11375,29 +11708,28 @@
           <w:sz w:val="20"/>
         </w:rPr>
       </w:pPr>
-    </w:p>
-    <w:p>
-      <w:pPr>
+      <w:r>
         <w:rPr>
           <w:noProof/>
           <w:sz w:val="20"/>
         </w:rPr>
-      </w:pPr>
-      <w:r>
+        <w:t>[33] Liu Z, Cao J, Gao M, et al. An improved YOLOv7-based model for road-defect detection[J]. Sustainability, 2023, 15(13): 10260.</w:t>
+      </w:r>
+    </w:p>
+    <w:p>
+      <w:pPr>
         <w:rPr>
           <w:noProof/>
           <w:sz w:val="20"/>
         </w:rPr>
-        <w:t>Arya D, Maeda H, Ghosh S K, et al. RDD2022: A multi-national image dataset for automatic road damage detection [J]. Data in brief, 2022, 45: 108684.</w:t>
-      </w:r>
-    </w:p>
-    <w:p>
-      <w:pPr>
+      </w:pPr>
+      <w:r>
         <w:rPr>
           <w:noProof/>
           <w:sz w:val="20"/>
         </w:rPr>
-      </w:pPr>
+        <w:t>[34] Doshi K, Yilmaz Y. Road damage detection using deep ensemble learning[J]. arXiv preprint arXiv:2011.00728, 2020.</w:t>
+      </w:r>
     </w:p>
     <w:p>
       <w:pPr>
@@ -11411,7 +11743,7 @@
           <w:noProof/>
           <w:sz w:val="20"/>
         </w:rPr>
-        <w:t>Everingham M, Van Gool L, Williams C K I, et al. The pascal visual object classes (voc) challenge [J]. International journal of computer vision, 2010, 88(2): 303-338.</w:t>
+        <w:t>[35] Guo G, Zhang Z. Road damage detection algorithm for improved YOLOv5[J]. Scientific Reports, 2022, 12(1): 15523.</w:t>
       </w:r>
     </w:p>
     <w:p>
@@ -11421,29 +11753,28 @@
           <w:sz w:val="20"/>
         </w:rPr>
       </w:pPr>
-    </w:p>
-    <w:p>
-      <w:pPr>
+      <w:r>
         <w:rPr>
           <w:noProof/>
           <w:sz w:val="20"/>
         </w:rPr>
-      </w:pPr>
-      <w:r>
+        <w:t>[36] Zeng J, Zhong H. YOLOv8-PD: An improved road damage detection algorithm based on YOLOv8n model[J]. Scientific Reports, 2024, 14(1): 12052.</w:t>
+      </w:r>
+    </w:p>
+    <w:p>
+      <w:pPr>
         <w:rPr>
           <w:noProof/>
           <w:sz w:val="20"/>
         </w:rPr>
-        <w:t>Gonzalez R C, Woods R E. Digital image processing [M]. 2nd ed. Prentice Hall, 2002.</w:t>
-      </w:r>
-    </w:p>
-    <w:p>
-      <w:pPr>
+      </w:pPr>
+      <w:r>
         <w:rPr>
           <w:noProof/>
           <w:sz w:val="20"/>
         </w:rPr>
-      </w:pPr>
+        <w:t>[37] Jiang Y. Road damage detection and classification using deep neural networks[J]. SN Applied Sciences, 2024, 6(3): 421.</w:t>
+      </w:r>
     </w:p>
     <w:p>
       <w:pPr>
@@ -11457,7 +11788,7 @@
           <w:noProof/>
           <w:sz w:val="20"/>
         </w:rPr>
-        <w:t>Gopalakrishnan K. Deep learning in data-driven pavement image analysis and automated distress detection: A review [J]. Data, 2018, 3(3): 28.</w:t>
+        <w:t>[38] Sakamoto J. Proposal of a flood damage road detection method based on deep learning and elevation data[J]. Geomatics, Natural Hazards and Risk, 2024, 15(1): 2375545.</w:t>
       </w:r>
     </w:p>
     <w:p>
@@ -11467,29 +11798,28 @@
           <w:sz w:val="20"/>
         </w:rPr>
       </w:pPr>
-    </w:p>
-    <w:p>
-      <w:pPr>
+      <w:r>
         <w:rPr>
           <w:noProof/>
           <w:sz w:val="20"/>
         </w:rPr>
-      </w:pPr>
-      <w:r>
+        <w:t>[39] Gheidar-Kheljani J, Nasiri M M. A deep learning method for road extraction in disaster management to increase the efficiency of health services[J]. Advances in Industrial Engineering, 2024, 58(1): 1-12.</w:t>
+      </w:r>
+    </w:p>
+    <w:p>
+      <w:pPr>
         <w:rPr>
           <w:noProof/>
           <w:sz w:val="20"/>
         </w:rPr>
-        <w:t>Maeda H, Sekimoto Y, Seto T, et al. Road damage detection and classification using deep neural networks with smartphone images [J]. Computer-Aided Civil and Infrastructure Engineering, 2018, 33(12): 1127-1141.</w:t>
-      </w:r>
-    </w:p>
-    <w:p>
-      <w:pPr>
+      </w:pPr>
+      <w:r>
         <w:rPr>
           <w:noProof/>
           <w:sz w:val="20"/>
         </w:rPr>
-      </w:pPr>
+        <w:t>[40] Karimzadeh M, Asl M H, Sari M R. Road damage detection using deep learning techniques: a review[J]. IEEE Transactions on Intelligent Transportation Systems, 2023, doi: 10.1109/TITS.2023.3283151.</w:t>
+      </w:r>
     </w:p>
     <w:p>
       <w:pPr>
@@ -11503,7 +11833,7 @@
           <w:noProof/>
           <w:sz w:val="20"/>
         </w:rPr>
-        <w:t>Zhang L, Yang F, Zhang D, et al. Road damage detection and classification with faster R-CNN [C]//2017 IEEE International Conference on Mechatronics and Automation (ICMA). IEEE, 2017: 1531-1536.</w:t>
+        <w:t>[41] Singh D, Saini B S, Singh M. A survey of recent trends in deep learning for road crack detection[J]. Journal of King Saud University-Computer and Information Sciences, 2022, 34(10): 8877-8893.</w:t>
       </w:r>
     </w:p>
     <w:p>
@@ -11513,29 +11843,28 @@
           <w:sz w:val="20"/>
         </w:rPr>
       </w:pPr>
-    </w:p>
-    <w:p>
-      <w:pPr>
+      <w:r>
         <w:rPr>
           <w:noProof/>
           <w:sz w:val="20"/>
         </w:rPr>
-      </w:pPr>
-      <w:r>
+        <w:t>[42] Hou Y, Li Q, Zhang C, et al. A survey on deep learning for pavement distress detection[J]. Engineering Applications of Artificial Intelligence, 2021, 104: 104359.</w:t>
+      </w:r>
+    </w:p>
+    <w:p>
+      <w:pPr>
         <w:rPr>
           <w:noProof/>
           <w:sz w:val="20"/>
         </w:rPr>
-        <w:t>Alfarrarjeh A, Kim S H, Kim J H, et al. A deep learning-based system for road damage detection and classification [J]. Sensors, 2020, 20(24): 7189.</w:t>
-      </w:r>
-    </w:p>
-    <w:p>
-      <w:pPr>
+      </w:pPr>
+      <w:r>
         <w:rPr>
           <w:noProof/>
           <w:sz w:val="20"/>
         </w:rPr>
-      </w:pPr>
+        <w:t>[43] Fan R, Bocus M J, Zhu Y, et al. Road crack detection using deep convolutional neural networks and adaptive thresholding[J]. IEEE Transactions on Intelligent Transportation Systems, 2021, 22(8): 5006-5017.</w:t>
+      </w:r>
     </w:p>
     <w:p>
       <w:pPr>
@@ -11549,7 +11878,7 @@
           <w:noProof/>
           <w:sz w:val="20"/>
         </w:rPr>
-        <w:t>Du Y, Pan N, Xu Z, et al. Pavement distress detection and classification based on YOLO network [J]. International Journal of Pavement Engineering, 2021, 22(12): 1659-1672.</w:t>
+        <w:t>[44] Wang W, Wu B, Yang S, et al. A review of deep learning for road pavement damage detection[J]. International Journal of Pavement Engineering, 2023, 24(1): 2180641.</w:t>
       </w:r>
     </w:p>
     <w:p>
@@ -11559,29 +11888,28 @@
           <w:sz w:val="20"/>
         </w:rPr>
       </w:pPr>
-    </w:p>
-    <w:p>
-      <w:pPr>
+      <w:r>
         <w:rPr>
           <w:noProof/>
           <w:sz w:val="20"/>
         </w:rPr>
-      </w:pPr>
-      <w:r>
+        <w:t>[45] Ahmed S, Kamal M, Imtiaz M, et al. A survey on deep learning based road damage detection and classification[J]. Journal of King Saud University-Computer and Information Sciences, 2022, 34(10): 8401-8418.</w:t>
+      </w:r>
+    </w:p>
+    <w:p>
+      <w:pPr>
         <w:rPr>
           <w:noProof/>
           <w:sz w:val="20"/>
         </w:rPr>
-        <w:t>Naddaf-Sh, M, et al. Cost-effective and accurate road damage detection and localization using a new YOLO-based method [J]. Remote Sensing, 2021, 13(24): 5158.</w:t>
-      </w:r>
-    </w:p>
-    <w:p>
-      <w:pPr>
+      </w:pPr>
+      <w:r>
         <w:rPr>
           <w:noProof/>
           <w:sz w:val="20"/>
         </w:rPr>
-      </w:pPr>
+        <w:t>[46] Stricker R, Sesselmann M, Seichter D, et al. A deep learning-based approach for road surface damage detection[J]. IEEE Transactions on Intelligent Vehicles, 2022, 7(2): 263-276.</w:t>
+      </w:r>
     </w:p>
     <w:p>
       <w:pPr>
@@ -11595,7 +11923,7 @@
           <w:noProof/>
           <w:sz w:val="20"/>
         </w:rPr>
-        <w:t>Jeong D. A study on the performance of a YOLOv5-based road crack detection model using an unmanned aerial vehicle [J]. Journal of the Korean Society of Surveying, Geodesy, Photogrammetry and Cartography, 2022, 40(6): 483-491.</w:t>
+        <w:t>[47] Mednis A, Strazdins G, Zviedris R, et al. Real time pothole detection using android smartphones with accelerometers[C]//2011 International Conference on Distributed Computing in Sensor Systems and Workshops (DCOSS). IEEE, 2011: 1-8.</w:t>
       </w:r>
     </w:p>
     <w:p>
@@ -11605,29 +11933,28 @@
           <w:sz w:val="20"/>
         </w:rPr>
       </w:pPr>
-    </w:p>
-    <w:p>
-      <w:pPr>
+      <w:r>
         <w:rPr>
           <w:noProof/>
           <w:sz w:val="20"/>
         </w:rPr>
-      </w:pPr>
-      <w:r>
+        <w:t>[48] Erikson K, Papanikolopoulos N. A vision-based pothole detection system[C]//Proceedings of the 2001 IEEE Intelligent Transportation Systems Conference. 2001: 27-32.</w:t>
+      </w:r>
+    </w:p>
+    <w:p>
+      <w:pPr>
         <w:rPr>
           <w:noProof/>
           <w:sz w:val="20"/>
         </w:rPr>
-        <w:t>Liu Z, Cao J, Gao M, et al. An improved YOLOv7-based model for road-defect detection [J]. Sustainability, 2023, 15(13): 10260.</w:t>
-      </w:r>
-    </w:p>
-    <w:p>
-      <w:pPr>
+      </w:pPr>
+      <w:r>
         <w:rPr>
           <w:noProof/>
           <w:sz w:val="20"/>
         </w:rPr>
-      </w:pPr>
+        <w:t>[49] Koch C, Brilakis I. Pothole detection in asphalt pavement images[J]. Advanced Engineering Informatics, 2011, 25(3): 507-515.</w:t>
+      </w:r>
     </w:p>
     <w:p>
       <w:pPr>
@@ -11641,375 +11968,7 @@
           <w:noProof/>
           <w:sz w:val="20"/>
         </w:rPr>
-        <w:t>Doshi K, Yilmaz Y. Road damage detection using deep ensemble learning [J]. arXiv preprint arXiv:2011.00728, 2020.</w:t>
-      </w:r>
-    </w:p>
-    <w:p>
-      <w:pPr>
-        <w:rPr>
-          <w:noProof/>
-          <w:sz w:val="20"/>
-        </w:rPr>
-      </w:pPr>
-    </w:p>
-    <w:p>
-      <w:pPr>
-        <w:rPr>
-          <w:noProof/>
-          <w:sz w:val="20"/>
-        </w:rPr>
-      </w:pPr>
-      <w:r>
-        <w:rPr>
-          <w:noProof/>
-          <w:sz w:val="20"/>
-        </w:rPr>
-        <w:t>Guo G, Zhang Z. Road damage detection algorithm for improved YOLOv5 [J]. Scientific reports, 2022, 12(1): 15523.</w:t>
-      </w:r>
-    </w:p>
-    <w:p>
-      <w:pPr>
-        <w:rPr>
-          <w:noProof/>
-          <w:sz w:val="20"/>
-        </w:rPr>
-      </w:pPr>
-    </w:p>
-    <w:p>
-      <w:pPr>
-        <w:rPr>
-          <w:noProof/>
-          <w:sz w:val="20"/>
-        </w:rPr>
-      </w:pPr>
-      <w:r>
-        <w:rPr>
-          <w:noProof/>
-          <w:sz w:val="20"/>
-        </w:rPr>
-        <w:t>Zeng J, Zhong H. YOLOv8-PD: An improved road damage detection algorithm based on YOLOv8n model [J]. Scientific Reports, 2024, 14(1): 12052.</w:t>
-      </w:r>
-    </w:p>
-    <w:p>
-      <w:pPr>
-        <w:rPr>
-          <w:noProof/>
-          <w:sz w:val="20"/>
-        </w:rPr>
-      </w:pPr>
-    </w:p>
-    <w:p>
-      <w:pPr>
-        <w:rPr>
-          <w:noProof/>
-          <w:sz w:val="20"/>
-        </w:rPr>
-      </w:pPr>
-      <w:r>
-        <w:rPr>
-          <w:noProof/>
-          <w:sz w:val="20"/>
-        </w:rPr>
-        <w:t>Jiang Y. Road damage detection and classification using deep neural networks [J]. SN Applied Sciences, 2024, 6(3): 421.</w:t>
-      </w:r>
-    </w:p>
-    <w:p>
-      <w:pPr>
-        <w:rPr>
-          <w:noProof/>
-          <w:sz w:val="20"/>
-        </w:rPr>
-      </w:pPr>
-    </w:p>
-    <w:p>
-      <w:pPr>
-        <w:rPr>
-          <w:noProof/>
-          <w:sz w:val="20"/>
-        </w:rPr>
-      </w:pPr>
-      <w:r>
-        <w:rPr>
-          <w:noProof/>
-          <w:sz w:val="20"/>
-        </w:rPr>
-        <w:t>Sakamoto J. Proposal of a flood damage road detection method based on deep learning and elevation data [J]. Geomatics, Natural Hazards and Risk, 2024, 15(1): 2375545.</w:t>
-      </w:r>
-    </w:p>
-    <w:p>
-      <w:pPr>
-        <w:rPr>
-          <w:noProof/>
-          <w:sz w:val="20"/>
-        </w:rPr>
-      </w:pPr>
-    </w:p>
-    <w:p>
-      <w:pPr>
-        <w:rPr>
-          <w:noProof/>
-          <w:sz w:val="20"/>
-        </w:rPr>
-      </w:pPr>
-      <w:r>
-        <w:rPr>
-          <w:noProof/>
-          <w:sz w:val="20"/>
-        </w:rPr>
-        <w:t>Gheidar-Kheljani J, Nasiri M M. A Deep Learning Method for Road Extraction in Disaster Management to Increase the Efficiency of Health Services [J]. Advances in Industrial Engineering, 2024, 58(1): 1-12.</w:t>
-      </w:r>
-    </w:p>
-    <w:p>
-      <w:pPr>
-        <w:rPr>
-          <w:noProof/>
-          <w:sz w:val="20"/>
-        </w:rPr>
-      </w:pPr>
-    </w:p>
-    <w:p>
-      <w:pPr>
-        <w:rPr>
-          <w:noProof/>
-          <w:sz w:val="20"/>
-        </w:rPr>
-      </w:pPr>
-      <w:r>
-        <w:rPr>
-          <w:noProof/>
-          <w:sz w:val="20"/>
-        </w:rPr>
-        <w:t>Karimzadeh M, Asl M H, Sari M R. Road damage detection using deep learning techniques: a review [J]. IEEE Transactions on Intelligent Transportation Systems, 2023.</w:t>
-      </w:r>
-    </w:p>
-    <w:p>
-      <w:pPr>
-        <w:rPr>
-          <w:noProof/>
-          <w:sz w:val="20"/>
-        </w:rPr>
-      </w:pPr>
-    </w:p>
-    <w:p>
-      <w:pPr>
-        <w:rPr>
-          <w:noProof/>
-          <w:sz w:val="20"/>
-        </w:rPr>
-      </w:pPr>
-      <w:r>
-        <w:rPr>
-          <w:noProof/>
-          <w:sz w:val="20"/>
-        </w:rPr>
-        <w:t>Singh D, Saini B S, Singh M. A survey of recent trends in deep learning for road crack detection [J]. Journal of King Saud University-Computer and Information Sciences, 2022, 34(10): 8877-8893.</w:t>
-      </w:r>
-    </w:p>
-    <w:p>
-      <w:pPr>
-        <w:rPr>
-          <w:noProof/>
-          <w:sz w:val="20"/>
-        </w:rPr>
-      </w:pPr>
-    </w:p>
-    <w:p>
-      <w:pPr>
-        <w:rPr>
-          <w:noProof/>
-          <w:sz w:val="20"/>
-        </w:rPr>
-      </w:pPr>
-      <w:r>
-        <w:rPr>
-          <w:noProof/>
-          <w:sz w:val="20"/>
-        </w:rPr>
-        <w:t>Hou Y, Li Q, Zhang C, et al. A survey on deep learning for pavement distress detection [J]. Engineering Applications of Artificial Intelligence, 2021, 104: 104359.</w:t>
-      </w:r>
-    </w:p>
-    <w:p>
-      <w:pPr>
-        <w:rPr>
-          <w:noProof/>
-          <w:sz w:val="20"/>
-        </w:rPr>
-      </w:pPr>
-    </w:p>
-    <w:p>
-      <w:pPr>
-        <w:rPr>
-          <w:noProof/>
-          <w:sz w:val="20"/>
-        </w:rPr>
-      </w:pPr>
-      <w:r>
-        <w:rPr>
-          <w:noProof/>
-          <w:sz w:val="20"/>
-        </w:rPr>
-        <w:t>Fan R, Bocus M J, Zhu Y, et al. Road crack detection using deep convolutional neural networks and adaptive thresholding [J]. IEEE Transactions on Intelligent Transportation Systems, 2020, 22(8): 5006-5017.</w:t>
-      </w:r>
-    </w:p>
-    <w:p>
-      <w:pPr>
-        <w:rPr>
-          <w:noProof/>
-          <w:sz w:val="20"/>
-        </w:rPr>
-      </w:pPr>
-    </w:p>
-    <w:p>
-      <w:pPr>
-        <w:rPr>
-          <w:noProof/>
-          <w:sz w:val="20"/>
-        </w:rPr>
-      </w:pPr>
-      <w:r>
-        <w:rPr>
-          <w:noProof/>
-          <w:sz w:val="20"/>
-        </w:rPr>
-        <w:t>Wang W, Wu B, Yang S, et al. A review of deep learning for road pavement damage detection [J]. International Journal of Pavement Engineering, 2023, 24(1): 2180641.</w:t>
-      </w:r>
-    </w:p>
-    <w:p>
-      <w:pPr>
-        <w:rPr>
-          <w:noProof/>
-          <w:sz w:val="20"/>
-        </w:rPr>
-      </w:pPr>
-    </w:p>
-    <w:p>
-      <w:pPr>
-        <w:rPr>
-          <w:noProof/>
-          <w:sz w:val="20"/>
-        </w:rPr>
-      </w:pPr>
-      <w:r>
-        <w:rPr>
-          <w:noProof/>
-          <w:sz w:val="20"/>
-        </w:rPr>
-        <w:t>Ahmed S, Kamal M, Imtiaz M, et al. A survey on deep learning based road damage detection and classification [J]. Journal of King Saud University-Computer and Information Sciences, 2022, 34(10): 8401-8418.</w:t>
-      </w:r>
-    </w:p>
-    <w:p>
-      <w:pPr>
-        <w:rPr>
-          <w:noProof/>
-          <w:sz w:val="20"/>
-        </w:rPr>
-      </w:pPr>
-    </w:p>
-    <w:p>
-      <w:pPr>
-        <w:rPr>
-          <w:noProof/>
-          <w:sz w:val="20"/>
-        </w:rPr>
-      </w:pPr>
-      <w:r>
-        <w:rPr>
-          <w:noProof/>
-          <w:sz w:val="20"/>
-        </w:rPr>
-        <w:t>Stricker R, Sesselmann M, Seichter D, et al. A deep learning-based approach for road surface damage detection [J]. IEEE Transactions on Intelligent Vehicles, 2022, 7(2): 3403-3418.</w:t>
-      </w:r>
-    </w:p>
-    <w:p>
-      <w:pPr>
-        <w:rPr>
-          <w:noProof/>
-          <w:sz w:val="20"/>
-        </w:rPr>
-      </w:pPr>
-    </w:p>
-    <w:p>
-      <w:pPr>
-        <w:rPr>
-          <w:noProof/>
-          <w:sz w:val="20"/>
-        </w:rPr>
-      </w:pPr>
-      <w:r>
-        <w:rPr>
-          <w:noProof/>
-          <w:sz w:val="20"/>
-        </w:rPr>
-        <w:t>Mednis A, Strazdins G, Zviedris R, et al. Real time pothole detection using android smartphones with accelerometers [C]//2011 International conference on distributed computing in sensor systems and workshops (DCOSS). IEEE, 2011: 1-8.</w:t>
-      </w:r>
-    </w:p>
-    <w:p>
-      <w:pPr>
-        <w:rPr>
-          <w:noProof/>
-          <w:sz w:val="20"/>
-        </w:rPr>
-      </w:pPr>
-    </w:p>
-    <w:p>
-      <w:pPr>
-        <w:rPr>
-          <w:noProof/>
-          <w:sz w:val="20"/>
-        </w:rPr>
-      </w:pPr>
-      <w:r>
-        <w:rPr>
-          <w:noProof/>
-          <w:sz w:val="20"/>
-        </w:rPr>
-        <w:t>Erikson K, Papanikolopoulos N. A vision-based pothole detection system [C]//2001 IEEE intelligent transportation systems conference. 2001: 27-32.</w:t>
-      </w:r>
-    </w:p>
-    <w:p>
-      <w:pPr>
-        <w:rPr>
-          <w:noProof/>
-          <w:sz w:val="20"/>
-        </w:rPr>
-      </w:pPr>
-    </w:p>
-    <w:p>
-      <w:pPr>
-        <w:rPr>
-          <w:noProof/>
-          <w:sz w:val="20"/>
-        </w:rPr>
-      </w:pPr>
-      <w:r>
-        <w:rPr>
-          <w:noProof/>
-          <w:sz w:val="20"/>
-        </w:rPr>
-        <w:t>Koch C, Brilakis I. Pothole detection in asphalt pavement images [J]. Advanced Engineering Informatics, 2011, 25(3): 507-515.</w:t>
-      </w:r>
-    </w:p>
-    <w:p>
-      <w:pPr>
-        <w:rPr>
-          <w:noProof/>
-          <w:sz w:val="20"/>
-        </w:rPr>
-      </w:pPr>
-    </w:p>
-    <w:p>
-      <w:pPr>
-        <w:rPr>
-          <w:noProof/>
-          <w:sz w:val="20"/>
-        </w:rPr>
-      </w:pPr>
-      <w:r>
-        <w:rPr>
-          <w:noProof/>
-          <w:sz w:val="20"/>
-        </w:rPr>
-        <w:t>Mathavan S, Kamal K, Rahman M. A review of three-dimensional imaging technologies for pavement distress detection and measurements [J]. IEEE Transactions on Intelligent Transportation Systems, 2015, 16(5): 2353-2362.</w:t>
+        <w:t>[50] Mathavan S, Kamal K, Rahman M. A review of three-dimensional imaging technologies for pavement distress detection and measurements[J]. IEEE Transactions on Intelligent Transportation Systems, 2015, 16(5): 2353-2362.</w:t>
       </w:r>
     </w:p>
     <w:p>

</xml_diff>